<commit_message>
feat: integrate docx-preview for printing inventory forms
- Added docx-preview dependency to handle printing of inventory forms directly from the browser.
- Updated InventoryForm component to fetch and print the inventory document as a Blob.
- Refactored StudentRecordsContext to provide a new fetchInventoryDocxBlob function for retrieving the document.
- Removed legacy HTML generation for PDF downloads, ensuring printed output matches the Word document.
- Introduced new styles for print layout to enhance document presentation.
- Added new template files for inventory forms.
</commit_message>
<xml_diff>
--- a/backend/templates/individual-inventory-template.docx
+++ b/backend/templates/individual-inventory-template.docx
@@ -493,25 +493,57 @@
     </w:p>
     <w:p>
       <w:pPr>
-        <w:jc w:val="right"/>
-        <w:rPr>
-          <w:rFonts w:ascii="Century" w:hAnsi="Century"/>
-          <w:sz w:val="16"/>
-          <w:szCs w:val="16"/>
-        </w:rPr>
-      </w:pPr>
-      <w:r>
-        <w:rPr>
-          <w:rFonts w:ascii="Century" w:hAnsi="Century"/>
-          <w:sz w:val="16"/>
-          <w:szCs w:val="16"/>
-        </w:rPr>
-        <w:t xml:space="preserve">Name: {fullName}          Sex: {sex}   Age: {age}</w:t>
-      </w:r>
-    </w:p>
-    <w:p>
-      <w:pPr>
-        <w:ind w:left="720" w:firstLine="720"/>
+        <w:rPr>
+          <w:rFonts w:ascii="Century" w:hAnsi="Century"/>
+          <w:sz w:val="16"/>
+          <w:szCs w:val="16"/>
+        </w:rPr>
+      </w:pPr>
+      <w:r>
+        <w:rPr>
+          <w:rFonts w:ascii="Century" w:hAnsi="Century"/>
+          <w:sz w:val="16"/>
+          <w:szCs w:val="16"/>
+        </w:rPr>
+        <w:t>Name: {</w:t>
+      </w:r>
+      <w:proofErr w:type="spellStart"/>
+      <w:r>
+        <w:rPr>
+          <w:rFonts w:ascii="Century" w:hAnsi="Century"/>
+          <w:sz w:val="16"/>
+          <w:szCs w:val="16"/>
+        </w:rPr>
+        <w:t>fullName</w:t>
+      </w:r>
+      <w:proofErr w:type="spellEnd"/>
+      <w:r>
+        <w:rPr>
+          <w:rFonts w:ascii="Century" w:hAnsi="Century"/>
+          <w:sz w:val="16"/>
+          <w:szCs w:val="16"/>
+        </w:rPr>
+        <w:t xml:space="preserve">}         </w:t>
+      </w:r>
+      <w:r>
+        <w:rPr>
+          <w:rFonts w:ascii="Century" w:hAnsi="Century"/>
+          <w:sz w:val="16"/>
+          <w:szCs w:val="16"/>
+        </w:rPr>
+        <w:t xml:space="preserve">                                                                                                               </w:t>
+      </w:r>
+      <w:r>
+        <w:rPr>
+          <w:rFonts w:ascii="Century" w:hAnsi="Century"/>
+          <w:sz w:val="16"/>
+          <w:szCs w:val="16"/>
+        </w:rPr>
+        <w:t>Sex: {sex}   Age: {age}</w:t>
+      </w:r>
+    </w:p>
+    <w:p>
+      <w:pPr>
         <w:jc w:val="both"/>
         <w:rPr>
           <w:rFonts w:ascii="Century" w:hAnsi="Century"/>
@@ -542,70 +574,254 @@
           <w:szCs w:val="16"/>
         </w:rPr>
         <w:tab/>
+        <w:t xml:space="preserve">     (First Name)                (Middle Name)</w:t>
+      </w:r>
+      <w:r>
+        <w:rPr>
+          <w:rFonts w:ascii="Century" w:hAnsi="Century"/>
+          <w:sz w:val="16"/>
+          <w:szCs w:val="16"/>
+        </w:rPr>
+        <w:tab/>
+        <w:t xml:space="preserve">           </w:t>
+      </w:r>
+    </w:p>
+    <w:p>
+      <w:pPr>
+        <w:jc w:val="both"/>
+        <w:rPr>
+          <w:rFonts w:ascii="Century" w:hAnsi="Century"/>
+          <w:sz w:val="16"/>
+          <w:szCs w:val="16"/>
+        </w:rPr>
+      </w:pPr>
+      <w:r>
+        <w:rPr>
+          <w:rFonts w:ascii="Century" w:hAnsi="Century"/>
+          <w:sz w:val="16"/>
+          <w:szCs w:val="16"/>
+        </w:rPr>
+        <w:t>Civil Status: {csSingle} Single {csMarried}Married {csSeparated}Separated {csWidow}Widow {csSoloParent}Solo Parent</w:t>
+      </w:r>
+    </w:p>
+    <w:p>
+      <w:pPr>
+        <w:jc w:val="both"/>
+        <w:rPr>
+          <w:rFonts w:ascii="Century" w:hAnsi="Century"/>
+          <w:sz w:val="16"/>
+          <w:szCs w:val="16"/>
+        </w:rPr>
+      </w:pPr>
+      <w:r>
+        <w:rPr>
+          <w:rFonts w:ascii="Century" w:hAnsi="Century"/>
+          <w:sz w:val="16"/>
+          <w:szCs w:val="16"/>
+        </w:rPr>
+        <w:t>Course: {course}     Year Level: {</w:t>
+      </w:r>
+      <w:proofErr w:type="spellStart"/>
+      <w:r>
+        <w:rPr>
+          <w:rFonts w:ascii="Century" w:hAnsi="Century"/>
+          <w:sz w:val="16"/>
+          <w:szCs w:val="16"/>
+        </w:rPr>
+        <w:t>yearLevel</w:t>
+      </w:r>
+      <w:proofErr w:type="spellEnd"/>
+      <w:r>
+        <w:rPr>
+          <w:rFonts w:ascii="Century" w:hAnsi="Century"/>
+          <w:sz w:val="16"/>
+          <w:szCs w:val="16"/>
+        </w:rPr>
+        <w:t>}</w:t>
+      </w:r>
+      <w:r>
+        <w:rPr>
+          <w:rFonts w:ascii="Century" w:hAnsi="Century"/>
+          <w:sz w:val="16"/>
+          <w:szCs w:val="16"/>
+        </w:rPr>
+        <w:tab/>
+      </w:r>
+      <w:r>
+        <w:rPr>
+          <w:rFonts w:ascii="Century" w:hAnsi="Century"/>
+          <w:sz w:val="16"/>
+          <w:szCs w:val="16"/>
+        </w:rPr>
+        <w:t xml:space="preserve">                                                     </w:t>
+      </w:r>
+      <w:r>
+        <w:rPr>
+          <w:rFonts w:ascii="Century" w:hAnsi="Century"/>
+          <w:sz w:val="16"/>
+          <w:szCs w:val="16"/>
+        </w:rPr>
+        <w:t>A.Y. {</w:t>
+      </w:r>
+      <w:proofErr w:type="spellStart"/>
+      <w:r>
+        <w:rPr>
+          <w:rFonts w:ascii="Century" w:hAnsi="Century"/>
+          <w:sz w:val="16"/>
+          <w:szCs w:val="16"/>
+        </w:rPr>
+        <w:t>academicYear</w:t>
+      </w:r>
+      <w:proofErr w:type="spellEnd"/>
+      <w:r>
+        <w:rPr>
+          <w:rFonts w:ascii="Century" w:hAnsi="Century"/>
+          <w:sz w:val="16"/>
+          <w:szCs w:val="16"/>
+        </w:rPr>
+        <w:t>}     Date of Birth: {dateOfBirth}</w:t>
+      </w:r>
+    </w:p>
+    <w:p>
+      <w:pPr>
+        <w:jc w:val="both"/>
+        <w:rPr>
+          <w:rFonts w:ascii="Century" w:hAnsi="Century"/>
+          <w:sz w:val="16"/>
+          <w:szCs w:val="16"/>
+        </w:rPr>
+      </w:pPr>
+      <w:r>
+        <w:rPr>
+          <w:rFonts w:ascii="Century" w:hAnsi="Century"/>
+          <w:sz w:val="16"/>
+          <w:szCs w:val="16"/>
+        </w:rPr>
+        <w:t>Height (m): {heightM}     Weight: {weightKg}     Place of Birth: {placeOfBirth}</w:t>
+      </w:r>
+    </w:p>
+    <w:p>
+      <w:pPr>
+        <w:rPr>
+          <w:rFonts w:ascii="Century" w:hAnsi="Century"/>
+          <w:sz w:val="16"/>
+          <w:szCs w:val="16"/>
+        </w:rPr>
+      </w:pPr>
+      <w:r>
+        <w:rPr>
+          <w:rFonts w:ascii="Century" w:hAnsi="Century"/>
+          <w:sz w:val="16"/>
+          <w:szCs w:val="16"/>
+        </w:rPr>
+        <w:t>Present Address</w:t>
+      </w:r>
+      <w:r>
+        <w:rPr>
+          <w:rFonts w:ascii="Century" w:hAnsi="Century"/>
+          <w:sz w:val="16"/>
+          <w:szCs w:val="16"/>
+        </w:rPr>
+        <w:t>(Residential/BoardingHouse/Dormitory): {presentAddress}</w:t>
+      </w:r>
+      <w:r>
+        <w:rPr>
+          <w:rFonts w:ascii="Century" w:hAnsi="Century"/>
+          <w:sz w:val="16"/>
+          <w:szCs w:val="16"/>
+        </w:rPr>
+        <w:t xml:space="preserve">                         </w:t>
+      </w:r>
+      <w:r>
+        <w:rPr>
+          <w:rFonts w:ascii="Century" w:hAnsi="Century"/>
+          <w:sz w:val="16"/>
+          <w:szCs w:val="16"/>
+        </w:rPr>
+        <w:t xml:space="preserve">          </w:t>
+      </w:r>
+      <w:r>
+        <w:rPr>
+          <w:rFonts w:ascii="Century" w:hAnsi="Century"/>
+          <w:sz w:val="16"/>
+          <w:szCs w:val="16"/>
+        </w:rPr>
         <w:t xml:space="preserve">  </w:t>
       </w:r>
-      <w:proofErr w:type="gramStart"/>
-      <w:r>
-        <w:rPr>
-          <w:rFonts w:ascii="Century" w:hAnsi="Century"/>
-          <w:sz w:val="16"/>
-          <w:szCs w:val="16"/>
-        </w:rPr>
-        <w:t xml:space="preserve">   (</w:t>
-      </w:r>
-      <w:proofErr w:type="gramEnd"/>
-      <w:r>
-        <w:rPr>
-          <w:rFonts w:ascii="Century" w:hAnsi="Century"/>
-          <w:sz w:val="16"/>
-          <w:szCs w:val="16"/>
-        </w:rPr>
-        <w:t xml:space="preserve">First </w:t>
-      </w:r>
-      <w:proofErr w:type="gramStart"/>
-      <w:r>
-        <w:rPr>
-          <w:rFonts w:ascii="Century" w:hAnsi="Century"/>
-          <w:sz w:val="16"/>
-          <w:szCs w:val="16"/>
-        </w:rPr>
-        <w:t xml:space="preserve">Name)   </w:t>
-      </w:r>
-      <w:proofErr w:type="gramEnd"/>
-      <w:r>
-        <w:rPr>
-          <w:rFonts w:ascii="Century" w:hAnsi="Century"/>
-          <w:sz w:val="16"/>
-          <w:szCs w:val="16"/>
-        </w:rPr>
-        <w:t xml:space="preserve">          </w:t>
-      </w:r>
-      <w:proofErr w:type="gramStart"/>
-      <w:r>
-        <w:rPr>
-          <w:rFonts w:ascii="Century" w:hAnsi="Century"/>
-          <w:sz w:val="16"/>
-          <w:szCs w:val="16"/>
-        </w:rPr>
-        <w:t xml:space="preserve">   (</w:t>
-      </w:r>
-      <w:proofErr w:type="gramEnd"/>
-      <w:r>
-        <w:rPr>
-          <w:rFonts w:ascii="Century" w:hAnsi="Century"/>
-          <w:sz w:val="16"/>
-          <w:szCs w:val="16"/>
-        </w:rPr>
-        <w:t>Middle Name)</w:t>
-      </w:r>
-      <w:r>
-        <w:rPr>
-          <w:rFonts w:ascii="Century" w:hAnsi="Century"/>
-          <w:sz w:val="16"/>
-          <w:szCs w:val="16"/>
-        </w:rPr>
-        <w:tab/>
-        <w:t xml:space="preserve">           </w:t>
+      <w:r>
+        <w:rPr>
+          <w:rFonts w:ascii="Century" w:hAnsi="Century"/>
+          <w:sz w:val="16"/>
+          <w:szCs w:val="16"/>
+        </w:rPr>
+        <w:t xml:space="preserve"> </w:t>
+      </w:r>
+      <w:r>
+        <w:rPr>
+          <w:rFonts w:ascii="Century" w:hAnsi="Century"/>
+          <w:sz w:val="16"/>
+          <w:szCs w:val="16"/>
+        </w:rPr>
+        <w:t>Email Address: {emailAddress}</w:t>
+      </w:r>
+    </w:p>
+    <w:p>
+      <w:pPr>
+        <w:rPr>
+          <w:rFonts w:ascii="Century" w:hAnsi="Century"/>
+          <w:sz w:val="16"/>
+          <w:szCs w:val="16"/>
+        </w:rPr>
+      </w:pPr>
+      <w:r>
+        <w:rPr>
+          <w:rFonts w:ascii="Century" w:hAnsi="Century"/>
+          <w:sz w:val="16"/>
+          <w:szCs w:val="16"/>
+        </w:rPr>
+        <w:t>Hometown Address: {</w:t>
+      </w:r>
+      <w:proofErr w:type="spellStart"/>
+      <w:r>
+        <w:rPr>
+          <w:rFonts w:ascii="Century" w:hAnsi="Century"/>
+          <w:sz w:val="16"/>
+          <w:szCs w:val="16"/>
+        </w:rPr>
+        <w:t>hometownAddress</w:t>
+      </w:r>
+      <w:proofErr w:type="spellEnd"/>
+      <w:r>
+        <w:rPr>
+          <w:rFonts w:ascii="Century" w:hAnsi="Century"/>
+          <w:sz w:val="16"/>
+          <w:szCs w:val="16"/>
+        </w:rPr>
+        <w:t>}</w:t>
+      </w:r>
+      <w:r>
+        <w:rPr>
+          <w:rFonts w:ascii="Century" w:hAnsi="Century"/>
+          <w:sz w:val="16"/>
+          <w:szCs w:val="16"/>
+        </w:rPr>
+        <w:tab/>
+      </w:r>
+      <w:r>
+        <w:rPr>
+          <w:rFonts w:ascii="Century" w:hAnsi="Century"/>
+          <w:sz w:val="16"/>
+          <w:szCs w:val="16"/>
+        </w:rPr>
+        <w:t xml:space="preserve">                                                      </w:t>
+      </w:r>
+      <w:r>
+        <w:rPr>
+          <w:rFonts w:ascii="Century" w:hAnsi="Century"/>
+          <w:sz w:val="16"/>
+          <w:szCs w:val="16"/>
+        </w:rPr>
+        <w:t>Mobile No.: {mobileNo}</w:t>
       </w:r>
     </w:p>
     <w:p>
@@ -623,122 +839,73 @@
           <w:sz w:val="16"/>
           <w:szCs w:val="16"/>
         </w:rPr>
-        <w:t xml:space="preserve">Civil Status: </w:t>
-      </w:r>
-      <w:r>
-        <w:rPr>
-          <w:rFonts w:ascii="Century" w:hAnsi="Century"/>
-          <w:sz w:val="16"/>
-          <w:szCs w:val="16"/>
-        </w:rPr>
-        <w:r>
-          <w:rPr>
-            <w:rFonts w:ascii="Century" w:hAnsi="Century"/>
-            <w:sz w:val="16"/>
-            <w:szCs w:val="16"/>
-          </w:rPr>
-          <w:t xml:space="preserve">{csSingle}</w:t>
-        </w:r>
-      </w:r>
-      <w:r>
-        <w:rPr>
-          <w:rFonts w:ascii="Century" w:hAnsi="Century"/>
-          <w:sz w:val="16"/>
-          <w:szCs w:val="16"/>
-        </w:rPr>
-        <w:t xml:space="preserve"> Single </w:t>
-      </w:r>
-      <w:r>
-        <w:rPr>
-          <w:rFonts w:ascii="Century" w:hAnsi="Century"/>
-          <w:sz w:val="16"/>
-          <w:szCs w:val="16"/>
-        </w:rPr>
-        <w:r>
-          <w:rPr>
-            <w:rFonts w:ascii="Century" w:hAnsi="Century"/>
-            <w:sz w:val="16"/>
-            <w:szCs w:val="16"/>
-          </w:rPr>
-          <w:t xml:space="preserve">{csMarried}</w:t>
-        </w:r>
-      </w:r>
-      <w:r>
-        <w:rPr>
-          <w:rFonts w:ascii="Century" w:hAnsi="Century"/>
-          <w:sz w:val="16"/>
-          <w:szCs w:val="16"/>
-        </w:rPr>
-        <w:t xml:space="preserve">Married </w:t>
-      </w:r>
-      <w:r>
-        <w:rPr>
-          <w:rFonts w:ascii="Century" w:hAnsi="Century"/>
-          <w:sz w:val="16"/>
-          <w:szCs w:val="16"/>
-        </w:rPr>
-        <w:r>
-          <w:rPr>
-            <w:rFonts w:ascii="Century" w:hAnsi="Century"/>
-            <w:sz w:val="16"/>
-            <w:szCs w:val="16"/>
-          </w:rPr>
-          <w:t xml:space="preserve">{csSeparated}</w:t>
-        </w:r>
-      </w:r>
-      <w:r>
-        <w:rPr>
-          <w:rFonts w:ascii="Century" w:hAnsi="Century"/>
-          <w:sz w:val="16"/>
-          <w:szCs w:val="16"/>
-        </w:rPr>
-        <w:t xml:space="preserve">Separated </w:t>
-      </w:r>
-      <w:r>
-        <w:rPr>
-          <w:rFonts w:ascii="Century" w:hAnsi="Century"/>
-          <w:sz w:val="16"/>
-          <w:szCs w:val="16"/>
-        </w:rPr>
-        <w:r>
-          <w:rPr>
-            <w:rFonts w:ascii="Century" w:hAnsi="Century"/>
-            <w:sz w:val="16"/>
-            <w:szCs w:val="16"/>
-          </w:rPr>
-          <w:t xml:space="preserve">{csWidow}</w:t>
-        </w:r>
-      </w:r>
-      <w:r>
-        <w:rPr>
-          <w:rFonts w:ascii="Century" w:hAnsi="Century"/>
-          <w:sz w:val="16"/>
-          <w:szCs w:val="16"/>
-        </w:rPr>
-        <w:t xml:space="preserve">Widow </w:t>
-      </w:r>
-      <w:r>
-        <w:rPr>
-          <w:rFonts w:ascii="Century" w:hAnsi="Century"/>
-          <w:sz w:val="16"/>
-          <w:szCs w:val="16"/>
-        </w:rPr>
-        <w:r>
-          <w:rPr>
-            <w:rFonts w:ascii="Century" w:hAnsi="Century"/>
-            <w:sz w:val="16"/>
-            <w:szCs w:val="16"/>
-          </w:rPr>
-          <w:t xml:space="preserve">{csSoloParent}</w:t>
-        </w:r>
-      </w:r>
-      <w:r>
-        <w:rPr>
-          <w:rFonts w:ascii="Century" w:hAnsi="Century"/>
-          <w:sz w:val="16"/>
-          <w:szCs w:val="16"/>
-        </w:rPr>
-        <w:t>Solo Parent</w:t>
+        <w:t>Grade Point Average: {</w:t>
+      </w:r>
+      <w:proofErr w:type="spellStart"/>
+      <w:r>
+        <w:rPr>
+          <w:rFonts w:ascii="Century" w:hAnsi="Century"/>
+          <w:sz w:val="16"/>
+          <w:szCs w:val="16"/>
+        </w:rPr>
+        <w:t>gpa</w:t>
+      </w:r>
+      <w:proofErr w:type="spellEnd"/>
+      <w:r>
+        <w:rPr>
+          <w:rFonts w:ascii="Century" w:hAnsi="Century"/>
+          <w:sz w:val="16"/>
+          <w:szCs w:val="16"/>
+        </w:rPr>
+        <w:t xml:space="preserve">}   </w:t>
+      </w:r>
+      <w:r>
+        <w:rPr>
+          <w:rFonts w:ascii="Century" w:hAnsi="Century"/>
+          <w:sz w:val="16"/>
+          <w:szCs w:val="16"/>
+        </w:rPr>
+        <w:t xml:space="preserve">   </w:t>
+      </w:r>
+      <w:r>
+        <w:rPr>
+          <w:rFonts w:ascii="Century" w:hAnsi="Century"/>
+          <w:sz w:val="16"/>
+          <w:szCs w:val="16"/>
+        </w:rPr>
+        <w:t>Religion: {religion}</w:t>
+      </w:r>
+      <w:r>
+        <w:rPr>
+          <w:rFonts w:ascii="Century" w:hAnsi="Century"/>
+          <w:sz w:val="16"/>
+          <w:szCs w:val="16"/>
+        </w:rPr>
+        <w:t xml:space="preserve">                   </w:t>
+      </w:r>
+      <w:r>
+        <w:rPr>
+          <w:rFonts w:ascii="Century" w:hAnsi="Century"/>
+          <w:sz w:val="16"/>
+          <w:szCs w:val="16"/>
+        </w:rPr>
+        <w:t xml:space="preserve"> Citizenship: {citizenship}   </w:t>
+      </w:r>
+      <w:r>
+        <w:rPr>
+          <w:rFonts w:ascii="Century" w:hAnsi="Century"/>
+          <w:sz w:val="16"/>
+          <w:szCs w:val="16"/>
+        </w:rPr>
+        <w:t xml:space="preserve">                </w:t>
+      </w:r>
+      <w:r>
+        <w:rPr>
+          <w:rFonts w:ascii="Century" w:hAnsi="Century"/>
+          <w:sz w:val="16"/>
+          <w:szCs w:val="16"/>
+        </w:rPr>
+        <w:t>Tribe: {tribe}</w:t>
       </w:r>
     </w:p>
     <w:p>
@@ -756,16 +923,7 @@
           <w:sz w:val="16"/>
           <w:szCs w:val="16"/>
         </w:rPr>
-        <w:t xml:space="preserve">Course: {course}     Year Level: {yearLevel}</w:t>
-      </w:r>
-      <w:r>
-        <w:rPr>
-          <w:rFonts w:ascii="Century" w:hAnsi="Century"/>
-          <w:sz w:val="16"/>
-          <w:szCs w:val="16"/>
-        </w:rPr>
-        <w:tab/>
-        <w:t xml:space="preserve">A.Y. {academicYear}     Date of Birth: {dateOfBirth}</w:t>
+        <w:t>If working, please indicate the name and address of employer: {employerNameAddress}</w:t>
       </w:r>
     </w:p>
     <w:p>
@@ -783,154 +941,41 @@
           <w:sz w:val="16"/>
           <w:szCs w:val="16"/>
         </w:rPr>
-        <w:t>Height (m</w:t>
-      </w:r>
-      <w:proofErr w:type="gramStart"/>
-      <w:r>
-        <w:rPr>
-          <w:rFonts w:ascii="Century" w:hAnsi="Century"/>
-          <w:sz w:val="16"/>
-          <w:szCs w:val="16"/>
-        </w:rPr>
-        <w:t xml:space="preserve">): </w:t>
-      </w:r>
-      <w:proofErr w:type="gramEnd"/>
-      <w:r>
-        <w:rPr>
-          <w:rFonts w:ascii="Century" w:hAnsi="Century"/>
-          <w:sz w:val="16"/>
-          <w:szCs w:val="16"/>
-        </w:rPr>
-        <w:t xml:space="preserve">{heightM}     Weight: {weightKg}     Place of Birth: {placeOfBirth}</w:t>
-      </w:r>
-    </w:p>
-    <w:p>
-      <w:pPr>
-        <w:rPr>
-          <w:rFonts w:ascii="Century" w:hAnsi="Century"/>
-          <w:sz w:val="16"/>
-          <w:szCs w:val="16"/>
-        </w:rPr>
-      </w:pPr>
-      <w:r>
-        <w:rPr>
-          <w:rFonts w:ascii="Century" w:hAnsi="Century"/>
-          <w:sz w:val="16"/>
-          <w:szCs w:val="16"/>
-        </w:rPr>
-        <w:t xml:space="preserve">Present </w:t>
-      </w:r>
-      <w:proofErr w:type="gramStart"/>
-      <w:r>
-        <w:rPr>
-          <w:rFonts w:ascii="Century" w:hAnsi="Century"/>
-          <w:sz w:val="16"/>
-          <w:szCs w:val="16"/>
-        </w:rPr>
-        <w:t>Address</w:t>
-      </w:r>
-      <w:r>
-        <w:rPr>
-          <w:rFonts w:ascii="Century" w:hAnsi="Century"/>
-          <w:sz w:val="16"/>
-          <w:szCs w:val="16"/>
-        </w:rPr>
-        <w:t>(</w:t>
-      </w:r>
-      <w:proofErr w:type="gramEnd"/>
-      <w:r>
-        <w:rPr>
-          <w:rFonts w:ascii="Century" w:hAnsi="Century"/>
-          <w:sz w:val="16"/>
-          <w:szCs w:val="16"/>
-        </w:rPr>
-        <w:t>Residential/BoardingHouse/Dormitory</w:t>
-      </w:r>
-      <w:proofErr w:type="gramStart"/>
-      <w:r>
-        <w:rPr>
-          <w:rFonts w:ascii="Century" w:hAnsi="Century"/>
-          <w:sz w:val="16"/>
-          <w:szCs w:val="16"/>
-        </w:rPr>
-        <w:t>):</w:t>
-      </w:r>
-      <w:r>
-        <w:rPr>
-          <w:rFonts w:ascii="Century" w:hAnsi="Century"/>
-          <w:sz w:val="16"/>
-          <w:szCs w:val="16"/>
-        </w:rPr>
-        <w:t xml:space="preserve"/>
-      </w:r>
-      <w:proofErr w:type="gramEnd"/>
-      <w:r>
-        <w:rPr>
-          <w:rFonts w:ascii="Century" w:hAnsi="Century"/>
-          <w:sz w:val="16"/>
-          <w:szCs w:val="16"/>
-        </w:rPr>
-        <w:t xml:space="preserve"/>
-      </w:r>
-      <w:r>
-        <w:rPr>
-          <w:rFonts w:ascii="Century" w:hAnsi="Century"/>
-          <w:sz w:val="16"/>
-          <w:szCs w:val="16"/>
-        </w:rPr>
-        <w:t xml:space="preserve"> {presentAddress}</w:t>
-      </w:r>
-      <w:proofErr w:type="gramStart"/>
-      <w:r>
-        <w:rPr>
-          <w:rFonts w:ascii="Century" w:hAnsi="Century"/>
-          <w:sz w:val="16"/>
-          <w:szCs w:val="16"/>
-        </w:rPr>
-        <w:t xml:space="preserve"> </w:t>
-      </w:r>
-      <w:r>
-        <w:rPr>
-          <w:rFonts w:ascii="Century" w:hAnsi="Century"/>
-          <w:sz w:val="16"/>
-          <w:szCs w:val="16"/>
-        </w:rPr>
-        <w:t>Email</w:t>
-      </w:r>
-      <w:proofErr w:type="gramEnd"/>
-      <w:r>
-        <w:rPr>
-          <w:rFonts w:ascii="Century" w:hAnsi="Century"/>
-          <w:sz w:val="16"/>
-          <w:szCs w:val="16"/>
-        </w:rPr>
-        <w:t xml:space="preserve"> Address: {emailAddress}</w:t>
-      </w:r>
-    </w:p>
-    <w:p>
-      <w:pPr>
-        <w:rPr>
-          <w:rFonts w:ascii="Century" w:hAnsi="Century"/>
-          <w:sz w:val="16"/>
-          <w:szCs w:val="16"/>
-        </w:rPr>
-      </w:pPr>
-      <w:r>
-        <w:rPr>
-          <w:rFonts w:ascii="Century" w:hAnsi="Century"/>
-          <w:sz w:val="16"/>
-          <w:szCs w:val="16"/>
-        </w:rPr>
-        <w:t xml:space="preserve">Hometown Address: {hometownAddress}</w:t>
-      </w:r>
-      <w:r>
-        <w:rPr>
-          <w:rFonts w:ascii="Century" w:hAnsi="Century"/>
-          <w:sz w:val="16"/>
-          <w:szCs w:val="16"/>
-        </w:rPr>
-        <w:tab/>
-        <w:t xml:space="preserve">Mobile No.: {mobileNo}</w:t>
+        <w:t>Person to be contacted in case of emergency: {</w:t>
+      </w:r>
+      <w:proofErr w:type="spellStart"/>
+      <w:r>
+        <w:rPr>
+          <w:rFonts w:ascii="Century" w:hAnsi="Century"/>
+          <w:sz w:val="16"/>
+          <w:szCs w:val="16"/>
+        </w:rPr>
+        <w:t>emergencyName</w:t>
+      </w:r>
+      <w:proofErr w:type="spellEnd"/>
+      <w:r>
+        <w:rPr>
+          <w:rFonts w:ascii="Century" w:hAnsi="Century"/>
+          <w:sz w:val="16"/>
+          <w:szCs w:val="16"/>
+        </w:rPr>
+        <w:t xml:space="preserve">}      </w:t>
+      </w:r>
+      <w:r>
+        <w:rPr>
+          <w:rFonts w:ascii="Century" w:hAnsi="Century"/>
+          <w:sz w:val="16"/>
+          <w:szCs w:val="16"/>
+        </w:rPr>
+        <w:t xml:space="preserve">                 </w:t>
+      </w:r>
+      <w:r>
+        <w:rPr>
+          <w:rFonts w:ascii="Century" w:hAnsi="Century"/>
+          <w:sz w:val="16"/>
+          <w:szCs w:val="16"/>
+        </w:rPr>
+        <w:t>Contact No. {emergencyContactNo}</w:t>
       </w:r>
     </w:p>
     <w:p>
@@ -948,71 +993,59 @@
           <w:sz w:val="16"/>
           <w:szCs w:val="16"/>
         </w:rPr>
-        <w:t xml:space="preserve">Grade Point Average: {gpa}   Religion: {religion}   Citizenship: {citizenship}   Tribe: {tribe}</w:t>
-      </w:r>
-    </w:p>
-    <w:p>
-      <w:pPr>
-        <w:jc w:val="both"/>
-        <w:rPr>
-          <w:rFonts w:ascii="Century" w:hAnsi="Century"/>
-          <w:sz w:val="16"/>
-          <w:szCs w:val="16"/>
-        </w:rPr>
-      </w:pPr>
-      <w:r>
-        <w:rPr>
-          <w:rFonts w:ascii="Century" w:hAnsi="Century"/>
-          <w:sz w:val="16"/>
-          <w:szCs w:val="16"/>
-        </w:rPr>
-        <w:t xml:space="preserve">If working, please indicate the name and address of employer: {employerNameAddress}</w:t>
-      </w:r>
-    </w:p>
-    <w:p>
-      <w:pPr>
-        <w:jc w:val="both"/>
-        <w:rPr>
-          <w:rFonts w:ascii="Century" w:hAnsi="Century"/>
-          <w:sz w:val="16"/>
-          <w:szCs w:val="16"/>
-        </w:rPr>
-      </w:pPr>
-      <w:r>
-        <w:rPr>
-          <w:rFonts w:ascii="Century" w:hAnsi="Century"/>
-          <w:sz w:val="16"/>
-          <w:szCs w:val="16"/>
-        </w:rPr>
-        <w:t xml:space="preserve">Person to be contacted in case of emergency: {emergencyName}      Contact No. {emergencyContactNo}</w:t>
-      </w:r>
-    </w:p>
-    <w:p>
-      <w:pPr>
-        <w:jc w:val="both"/>
-        <w:rPr>
-          <w:rFonts w:ascii="Century" w:hAnsi="Century"/>
-          <w:sz w:val="16"/>
-          <w:szCs w:val="16"/>
-        </w:rPr>
-      </w:pPr>
-      <w:proofErr w:type="gramStart"/>
-      <w:r>
-        <w:rPr>
-          <w:rFonts w:ascii="Century" w:hAnsi="Century"/>
-          <w:sz w:val="16"/>
-          <w:szCs w:val="16"/>
-        </w:rPr>
-        <w:t xml:space="preserve">Address: </w:t>
-      </w:r>
-      <w:proofErr w:type="gramEnd"/>
-      <w:r>
-        <w:rPr>
-          <w:rFonts w:ascii="Century" w:hAnsi="Century"/>
-          <w:sz w:val="16"/>
-          <w:szCs w:val="16"/>
-        </w:rPr>
-        <w:t xml:space="preserve">{emergencyAddress}     Relationship: {emergencyRelationship}</w:t>
+        <w:t>Address: {</w:t>
+      </w:r>
+      <w:proofErr w:type="spellStart"/>
+      <w:r>
+        <w:rPr>
+          <w:rFonts w:ascii="Century" w:hAnsi="Century"/>
+          <w:sz w:val="16"/>
+          <w:szCs w:val="16"/>
+        </w:rPr>
+        <w:t>emergencyAddress</w:t>
+      </w:r>
+      <w:proofErr w:type="spellEnd"/>
+      <w:r>
+        <w:rPr>
+          <w:rFonts w:ascii="Century" w:hAnsi="Century"/>
+          <w:sz w:val="16"/>
+          <w:szCs w:val="16"/>
+        </w:rPr>
+        <w:t xml:space="preserve">}     </w:t>
+      </w:r>
+      <w:r>
+        <w:rPr>
+          <w:rFonts w:ascii="Century" w:hAnsi="Century"/>
+          <w:sz w:val="16"/>
+          <w:szCs w:val="16"/>
+        </w:rPr>
+        <w:t xml:space="preserve">                                       </w:t>
+      </w:r>
+      <w:r>
+        <w:rPr>
+          <w:rFonts w:ascii="Century" w:hAnsi="Century"/>
+          <w:sz w:val="16"/>
+          <w:szCs w:val="16"/>
+        </w:rPr>
+        <w:t>Relationship: {</w:t>
+      </w:r>
+      <w:proofErr w:type="spellStart"/>
+      <w:r>
+        <w:rPr>
+          <w:rFonts w:ascii="Century" w:hAnsi="Century"/>
+          <w:sz w:val="16"/>
+          <w:szCs w:val="16"/>
+        </w:rPr>
+        <w:t>emergencyRelationship</w:t>
+      </w:r>
+      <w:proofErr w:type="spellEnd"/>
+      <w:r>
+        <w:rPr>
+          <w:rFonts w:ascii="Century" w:hAnsi="Century"/>
+          <w:sz w:val="16"/>
+          <w:szCs w:val="16"/>
+        </w:rPr>
+        <w:t>}</w:t>
       </w:r>
     </w:p>
     <w:p>
@@ -1058,6 +1091,7 @@
       <w:tblPr>
         <w:tblStyle w:val="TableGrid"/>
         <w:tblW w:w="10833" w:type="dxa"/>
+        <w:tblLayout w:type="fixed"/>
         <w:tblLook w:val="04A0" w:firstRow="1" w:lastRow="0" w:firstColumn="1" w:lastColumn="0" w:noHBand="0" w:noVBand="1"/>
       </w:tblPr>
       <w:tblGrid>
@@ -1303,7 +1337,7 @@
                 <w:sz w:val="16"/>
                 <w:szCs w:val="16"/>
               </w:rPr>
-              <w:t xml:space="preserve">{edu0School}</w:t>
+              <w:t>{edu0School}</w:t>
             </w:r>
           </w:p>
         </w:tc>
@@ -1326,7 +1360,7 @@
                 <w:sz w:val="16"/>
                 <w:szCs w:val="16"/>
               </w:rPr>
-              <w:t xml:space="preserve">{edu0Address}</w:t>
+              <w:t>{edu0Address}</w:t>
             </w:r>
           </w:p>
         </w:tc>
@@ -1349,7 +1383,7 @@
                 <w:sz w:val="16"/>
                 <w:szCs w:val="16"/>
               </w:rPr>
-              <w:t xml:space="preserve">{edu0PublicPrivate}</w:t>
+              <w:t>{edu0PublicPrivate}</w:t>
             </w:r>
           </w:p>
         </w:tc>
@@ -1372,7 +1406,7 @@
                 <w:sz w:val="16"/>
                 <w:szCs w:val="16"/>
               </w:rPr>
-              <w:t xml:space="preserve">{edu0YearGraduated}</w:t>
+              <w:t>{edu0YearGraduated}</w:t>
             </w:r>
           </w:p>
         </w:tc>
@@ -1395,7 +1429,7 @@
                 <w:sz w:val="16"/>
                 <w:szCs w:val="16"/>
               </w:rPr>
-              <w:t xml:space="preserve">{edu0Honors}</w:t>
+              <w:t>{edu0Honors}</w:t>
             </w:r>
           </w:p>
         </w:tc>
@@ -1446,7 +1480,7 @@
                 <w:sz w:val="16"/>
                 <w:szCs w:val="16"/>
               </w:rPr>
-              <w:t xml:space="preserve">{edu1School}</w:t>
+              <w:t>{edu1School}</w:t>
             </w:r>
           </w:p>
         </w:tc>
@@ -1469,7 +1503,7 @@
                 <w:sz w:val="16"/>
                 <w:szCs w:val="16"/>
               </w:rPr>
-              <w:t xml:space="preserve">{edu1Address}</w:t>
+              <w:t>{edu1Address}</w:t>
             </w:r>
           </w:p>
         </w:tc>
@@ -1492,7 +1526,7 @@
                 <w:sz w:val="16"/>
                 <w:szCs w:val="16"/>
               </w:rPr>
-              <w:t xml:space="preserve">{edu1PublicPrivate}</w:t>
+              <w:t>{edu1PublicPrivate}</w:t>
             </w:r>
           </w:p>
         </w:tc>
@@ -1515,7 +1549,7 @@
                 <w:sz w:val="16"/>
                 <w:szCs w:val="16"/>
               </w:rPr>
-              <w:t xml:space="preserve">{edu1YearGraduated}</w:t>
+              <w:t>{edu1YearGraduated}</w:t>
             </w:r>
           </w:p>
         </w:tc>
@@ -1538,7 +1572,7 @@
                 <w:sz w:val="16"/>
                 <w:szCs w:val="16"/>
               </w:rPr>
-              <w:t xml:space="preserve">{edu1Honors}</w:t>
+              <w:t>{edu1Honors}</w:t>
             </w:r>
           </w:p>
         </w:tc>
@@ -1589,7 +1623,7 @@
                 <w:sz w:val="16"/>
                 <w:szCs w:val="16"/>
               </w:rPr>
-              <w:t xml:space="preserve">{edu2School}</w:t>
+              <w:t>{edu2School}</w:t>
             </w:r>
           </w:p>
         </w:tc>
@@ -1612,7 +1646,7 @@
                 <w:sz w:val="16"/>
                 <w:szCs w:val="16"/>
               </w:rPr>
-              <w:t xml:space="preserve">{edu2Address}</w:t>
+              <w:t>{edu2Address}</w:t>
             </w:r>
           </w:p>
         </w:tc>
@@ -1635,7 +1669,7 @@
                 <w:sz w:val="16"/>
                 <w:szCs w:val="16"/>
               </w:rPr>
-              <w:t xml:space="preserve">{edu2PublicPrivate}</w:t>
+              <w:t>{edu2PublicPrivate}</w:t>
             </w:r>
           </w:p>
         </w:tc>
@@ -1658,7 +1692,7 @@
                 <w:sz w:val="16"/>
                 <w:szCs w:val="16"/>
               </w:rPr>
-              <w:t xml:space="preserve">{edu2YearGraduated}</w:t>
+              <w:t>{edu2YearGraduated}</w:t>
             </w:r>
           </w:p>
         </w:tc>
@@ -1681,7 +1715,7 @@
                 <w:sz w:val="16"/>
                 <w:szCs w:val="16"/>
               </w:rPr>
-              <w:t xml:space="preserve">{edu2Honors}</w:t>
+              <w:t>{edu2Honors}</w:t>
             </w:r>
           </w:p>
         </w:tc>
@@ -1732,7 +1766,7 @@
                 <w:sz w:val="16"/>
                 <w:szCs w:val="16"/>
               </w:rPr>
-              <w:t xml:space="preserve">{edu3School}</w:t>
+              <w:t>{edu3School}</w:t>
             </w:r>
           </w:p>
         </w:tc>
@@ -1755,7 +1789,7 @@
                 <w:sz w:val="16"/>
                 <w:szCs w:val="16"/>
               </w:rPr>
-              <w:t xml:space="preserve">{edu3Address}</w:t>
+              <w:t>{edu3Address}</w:t>
             </w:r>
           </w:p>
         </w:tc>
@@ -1778,7 +1812,7 @@
                 <w:sz w:val="16"/>
                 <w:szCs w:val="16"/>
               </w:rPr>
-              <w:t xml:space="preserve">{edu3PublicPrivate}</w:t>
+              <w:t>{edu3PublicPrivate}</w:t>
             </w:r>
           </w:p>
         </w:tc>
@@ -1801,7 +1835,7 @@
                 <w:sz w:val="16"/>
                 <w:szCs w:val="16"/>
               </w:rPr>
-              <w:t xml:space="preserve">{edu3YearGraduated}</w:t>
+              <w:t>{edu3YearGraduated}</w:t>
             </w:r>
           </w:p>
         </w:tc>
@@ -1824,7 +1858,7 @@
                 <w:sz w:val="16"/>
                 <w:szCs w:val="16"/>
               </w:rPr>
-              <w:t xml:space="preserve">{edu3Honors}</w:t>
+              <w:t>{edu3Honors}</w:t>
             </w:r>
           </w:p>
         </w:tc>
@@ -1875,7 +1909,7 @@
                 <w:sz w:val="16"/>
                 <w:szCs w:val="16"/>
               </w:rPr>
-              <w:t xml:space="preserve">{edu4School}</w:t>
+              <w:t>{edu4School}</w:t>
             </w:r>
           </w:p>
         </w:tc>
@@ -1898,7 +1932,7 @@
                 <w:sz w:val="16"/>
                 <w:szCs w:val="16"/>
               </w:rPr>
-              <w:t xml:space="preserve">{edu4Address}</w:t>
+              <w:t>{edu4Address}</w:t>
             </w:r>
           </w:p>
         </w:tc>
@@ -1921,7 +1955,7 @@
                 <w:sz w:val="16"/>
                 <w:szCs w:val="16"/>
               </w:rPr>
-              <w:t xml:space="preserve">{edu4PublicPrivate}</w:t>
+              <w:t>{edu4PublicPrivate}</w:t>
             </w:r>
           </w:p>
         </w:tc>
@@ -1944,7 +1978,7 @@
                 <w:sz w:val="16"/>
                 <w:szCs w:val="16"/>
               </w:rPr>
-              <w:t xml:space="preserve">{edu4YearGraduated}</w:t>
+              <w:t>{edu4YearGraduated}</w:t>
             </w:r>
           </w:p>
         </w:tc>
@@ -1967,7 +2001,7 @@
                 <w:sz w:val="16"/>
                 <w:szCs w:val="16"/>
               </w:rPr>
-              <w:t xml:space="preserve">{edu4Honors}</w:t>
+              <w:t>{edu4Honors}</w:t>
             </w:r>
           </w:p>
         </w:tc>
@@ -1989,78 +2023,24 @@
           <w:szCs w:val="16"/>
         </w:rPr>
         <w:tab/>
-        <w:t xml:space="preserve">Nature of Schooling:  </w:t>
-      </w:r>
-      <w:proofErr w:type="gramStart"/>
-      <w:r>
-        <w:rPr>
-          <w:rFonts w:ascii="Century" w:hAnsi="Century"/>
-          <w:sz w:val="16"/>
-          <w:szCs w:val="16"/>
-        </w:rPr>
-        <w:t xml:space="preserve">   </w:t>
-      </w:r>
-      <w:proofErr w:type="gramEnd"/>
-      <w:r>
-        <w:rPr>
-          <w:rFonts w:ascii="Century" w:hAnsi="Century"/>
-          <w:sz w:val="16"/>
-          <w:szCs w:val="16"/>
-        </w:rPr>
-        <w:t xml:space="preserve">{natContinuous}</w:t>
-      </w:r>
-      <w:proofErr w:type="gramStart"/>
-      <w:r>
-        <w:rPr>
-          <w:rFonts w:ascii="Century" w:hAnsi="Century"/>
-          <w:sz w:val="16"/>
-          <w:szCs w:val="16"/>
-        </w:rPr>
-        <w:t xml:space="preserve"/>
-      </w:r>
-      <w:proofErr w:type="gramEnd"/>
-      <w:r>
-        <w:rPr>
-          <w:rFonts w:ascii="Century" w:hAnsi="Century"/>
-          <w:sz w:val="16"/>
-          <w:szCs w:val="16"/>
-        </w:rPr>
-        <w:t xml:space="preserve"> Continuous</w:t>
-      </w:r>
-      <w:r>
-        <w:rPr>
-          <w:rFonts w:ascii="Century" w:hAnsi="Century"/>
-          <w:sz w:val="16"/>
-          <w:szCs w:val="16"/>
-        </w:rPr>
-        <w:tab/>
-      </w:r>
-      <w:r>
-        <w:rPr>
-          <w:rFonts w:ascii="Century" w:hAnsi="Century"/>
-          <w:sz w:val="16"/>
-          <w:szCs w:val="16"/>
-        </w:rPr>
-        <w:tab/>
-        <w:t xml:space="preserve"/>
-      </w:r>
-      <w:proofErr w:type="gramStart"/>
-      <w:r>
-        <w:rPr>
-          <w:rFonts w:ascii="Century" w:hAnsi="Century"/>
-          <w:sz w:val="16"/>
-          <w:szCs w:val="16"/>
-        </w:rPr>
-        <w:t xml:space="preserve">{natInterrupted}</w:t>
-      </w:r>
-      <w:proofErr w:type="gramEnd"/>
-      <w:r>
-        <w:rPr>
-          <w:rFonts w:ascii="Century" w:hAnsi="Century"/>
-          <w:sz w:val="16"/>
-          <w:szCs w:val="16"/>
-        </w:rPr>
-        <w:t xml:space="preserve"> Interrupted, why? {interruptedReason}  </w:t>
+        <w:t>Nature of Schooling:     {natContinuous} Continuous</w:t>
+      </w:r>
+      <w:r>
+        <w:rPr>
+          <w:rFonts w:ascii="Century" w:hAnsi="Century"/>
+          <w:sz w:val="16"/>
+          <w:szCs w:val="16"/>
+        </w:rPr>
+        <w:tab/>
+      </w:r>
+      <w:r>
+        <w:rPr>
+          <w:rFonts w:ascii="Century" w:hAnsi="Century"/>
+          <w:sz w:val="16"/>
+          <w:szCs w:val="16"/>
+        </w:rPr>
+        <w:tab/>
+        <w:t xml:space="preserve">{natInterrupted} Interrupted, why? {interruptedReason}  </w:t>
       </w:r>
     </w:p>
     <w:p>
@@ -2105,43 +2085,7 @@
           <w:sz w:val="16"/>
           <w:szCs w:val="16"/>
         </w:rPr>
-        <w:t xml:space="preserve">Name of Father: {fatherName}     Age: {fatherAge} </w:t>
-      </w:r>
-      <w:proofErr w:type="gramStart"/>
-      <w:r>
-        <w:rPr>
-          <w:rFonts w:ascii="Century" w:hAnsi="Century"/>
-          <w:sz w:val="16"/>
-          <w:szCs w:val="16"/>
-        </w:rPr>
-        <w:t xml:space="preserve">{fatherLiving}</w:t>
-      </w:r>
-      <w:proofErr w:type="gramEnd"/>
-      <w:r>
-        <w:rPr>
-          <w:rFonts w:ascii="Century" w:hAnsi="Century"/>
-          <w:sz w:val="16"/>
-          <w:szCs w:val="16"/>
-        </w:rPr>
-        <w:t xml:space="preserve"> </w:t>
-      </w:r>
-      <w:proofErr w:type="gramStart"/>
-      <w:r>
-        <w:rPr>
-          <w:rFonts w:ascii="Century" w:hAnsi="Century"/>
-          <w:sz w:val="16"/>
-          <w:szCs w:val="16"/>
-        </w:rPr>
-        <w:t xml:space="preserve">Living  {fatherDeceased}</w:t>
-      </w:r>
-      <w:proofErr w:type="gramEnd"/>
-      <w:r>
-        <w:rPr>
-          <w:rFonts w:ascii="Century" w:hAnsi="Century"/>
-          <w:sz w:val="16"/>
-          <w:szCs w:val="16"/>
-        </w:rPr>
-        <w:t xml:space="preserve">  Deceased</w:t>
+        <w:t>Name of Father: {fatherName}     Age: {fatherAge} {fatherLiving} Living  {fatherDeceased}  Deceased</w:t>
       </w:r>
     </w:p>
     <w:p>
@@ -2159,7 +2103,7 @@
           <w:sz w:val="16"/>
           <w:szCs w:val="16"/>
         </w:rPr>
-        <w:t xml:space="preserve">Educational Attainment: {fatherEduc}     Occupation: {fatherOccupation}</w:t>
+        <w:t>Educational Attainment: {fatherEduc}     Occupation: {fatherOccupation}</w:t>
       </w:r>
     </w:p>
     <w:p>
@@ -2177,43 +2121,7 @@
           <w:sz w:val="16"/>
           <w:szCs w:val="16"/>
         </w:rPr>
-        <w:t xml:space="preserve">Name of Mother: {motherName}     Age: {motherAge} </w:t>
-      </w:r>
-      <w:proofErr w:type="gramStart"/>
-      <w:r>
-        <w:rPr>
-          <w:rFonts w:ascii="Century" w:hAnsi="Century"/>
-          <w:sz w:val="16"/>
-          <w:szCs w:val="16"/>
-        </w:rPr>
-        <w:t xml:space="preserve">{motherLiving}</w:t>
-      </w:r>
-      <w:proofErr w:type="gramEnd"/>
-      <w:r>
-        <w:rPr>
-          <w:rFonts w:ascii="Century" w:hAnsi="Century"/>
-          <w:sz w:val="16"/>
-          <w:szCs w:val="16"/>
-        </w:rPr>
-        <w:t xml:space="preserve"> </w:t>
-      </w:r>
-      <w:proofErr w:type="gramStart"/>
-      <w:r>
-        <w:rPr>
-          <w:rFonts w:ascii="Century" w:hAnsi="Century"/>
-          <w:sz w:val="16"/>
-          <w:szCs w:val="16"/>
-        </w:rPr>
-        <w:t xml:space="preserve">Living  {motherDeceased}</w:t>
-      </w:r>
-      <w:proofErr w:type="gramEnd"/>
-      <w:r>
-        <w:rPr>
-          <w:rFonts w:ascii="Century" w:hAnsi="Century"/>
-          <w:sz w:val="16"/>
-          <w:szCs w:val="16"/>
-        </w:rPr>
-        <w:t xml:space="preserve">  Deceased</w:t>
+        <w:t>Name of Mother: {motherName}     Age: {motherAge} {motherLiving} Living  {motherDeceased}  Deceased</w:t>
       </w:r>
     </w:p>
     <w:p>
@@ -2231,7 +2139,7 @@
           <w:sz w:val="16"/>
           <w:szCs w:val="16"/>
         </w:rPr>
-        <w:t xml:space="preserve">Educational Attainment: {motherEduc}     Occupation: {motherOccupation}</w:t>
+        <w:t>Educational Attainment: {motherEduc}     Occupation: {motherOccupation}</w:t>
       </w:r>
     </w:p>
     <w:p>
@@ -2267,7 +2175,7 @@
           <w:sz w:val="16"/>
           <w:szCs w:val="16"/>
         </w:rPr>
-        <w:t xml:space="preserve">Educational Attainment: {guardianEduc}     Occupation: {guardianOccupation}</w:t>
+        <w:t>Educational Attainment: {guardianEduc}     Occupation: {guardianOccupation}</w:t>
       </w:r>
     </w:p>
     <w:p>
@@ -2320,24 +2228,7 @@
           <w:szCs w:val="16"/>
         </w:rPr>
         <w:tab/>
-      </w:r>
-      <w:proofErr w:type="gramStart"/>
-      <w:r>
-        <w:rPr>
-          <w:rFonts w:ascii="Century" w:hAnsi="Century"/>
-          <w:sz w:val="16"/>
-          <w:szCs w:val="16"/>
-        </w:rPr>
-        <w:t xml:space="preserve">{pmSingleParent}</w:t>
-      </w:r>
-      <w:proofErr w:type="gramEnd"/>
-      <w:r>
-        <w:rPr>
-          <w:rFonts w:ascii="Century" w:hAnsi="Century"/>
-          <w:sz w:val="16"/>
-          <w:szCs w:val="16"/>
-        </w:rPr>
-        <w:t xml:space="preserve"> Single Parent</w:t>
+        <w:t>{pmSingleParent} Single Parent</w:t>
       </w:r>
     </w:p>
     <w:p>
@@ -2356,66 +2247,32 @@
           <w:szCs w:val="16"/>
         </w:rPr>
         <w:tab/>
-      </w:r>
-      <w:proofErr w:type="gramStart"/>
-      <w:r>
-        <w:rPr>
-          <w:rFonts w:ascii="Century" w:hAnsi="Century"/>
-          <w:sz w:val="16"/>
-          <w:szCs w:val="16"/>
-        </w:rPr>
-        <w:t xml:space="preserve">{pmMarriedTogether}</w:t>
-      </w:r>
-      <w:proofErr w:type="gramEnd"/>
-      <w:r>
-        <w:rPr>
-          <w:rFonts w:ascii="Century" w:hAnsi="Century"/>
-          <w:sz w:val="16"/>
-          <w:szCs w:val="16"/>
-        </w:rPr>
-        <w:t xml:space="preserve"> Married and staying together</w:t>
-      </w:r>
-      <w:r>
-        <w:rPr>
-          <w:rFonts w:ascii="Century" w:hAnsi="Century"/>
-          <w:sz w:val="16"/>
-          <w:szCs w:val="16"/>
-        </w:rPr>
-        <w:tab/>
-      </w:r>
-      <w:r>
-        <w:rPr>
-          <w:rFonts w:ascii="Century" w:hAnsi="Century"/>
-          <w:sz w:val="16"/>
-          <w:szCs w:val="16"/>
-        </w:rPr>
-        <w:tab/>
-      </w:r>
-      <w:r>
-        <w:rPr>
-          <w:rFonts w:ascii="Century" w:hAnsi="Century"/>
-          <w:sz w:val="16"/>
-          <w:szCs w:val="16"/>
-        </w:rPr>
-        <w:tab/>
-      </w:r>
-      <w:proofErr w:type="gramStart"/>
-      <w:r>
-        <w:rPr>
-          <w:rFonts w:ascii="Century" w:hAnsi="Century"/>
-          <w:sz w:val="16"/>
-          <w:szCs w:val="16"/>
-        </w:rPr>
-        <w:t xml:space="preserve">{pmMarriedSeparated}</w:t>
-      </w:r>
-      <w:proofErr w:type="gramEnd"/>
-      <w:r>
-        <w:rPr>
-          <w:rFonts w:ascii="Century" w:hAnsi="Century"/>
-          <w:sz w:val="16"/>
-          <w:szCs w:val="16"/>
-        </w:rPr>
-        <w:t xml:space="preserve"> Married but Separated</w:t>
+        <w:t>{pmMarriedTogether} Married and staying together</w:t>
+      </w:r>
+      <w:r>
+        <w:rPr>
+          <w:rFonts w:ascii="Century" w:hAnsi="Century"/>
+          <w:sz w:val="16"/>
+          <w:szCs w:val="16"/>
+        </w:rPr>
+        <w:tab/>
+      </w:r>
+      <w:r>
+        <w:rPr>
+          <w:rFonts w:ascii="Century" w:hAnsi="Century"/>
+          <w:sz w:val="16"/>
+          <w:szCs w:val="16"/>
+        </w:rPr>
+        <w:tab/>
+      </w:r>
+      <w:r>
+        <w:rPr>
+          <w:rFonts w:ascii="Century" w:hAnsi="Century"/>
+          <w:sz w:val="16"/>
+          <w:szCs w:val="16"/>
+        </w:rPr>
+        <w:tab/>
+        <w:t>{pmMarriedSeparated} Married but Separated</w:t>
       </w:r>
     </w:p>
     <w:p>
@@ -2434,66 +2291,32 @@
           <w:szCs w:val="16"/>
         </w:rPr>
         <w:tab/>
-      </w:r>
-      <w:proofErr w:type="gramStart"/>
-      <w:r>
-        <w:rPr>
-          <w:rFonts w:ascii="Century" w:hAnsi="Century"/>
-          <w:sz w:val="16"/>
-          <w:szCs w:val="16"/>
-        </w:rPr>
-        <w:t xml:space="preserve">{pmNotMarriedLiving}</w:t>
-      </w:r>
-      <w:proofErr w:type="gramEnd"/>
-      <w:r>
-        <w:rPr>
-          <w:rFonts w:ascii="Century" w:hAnsi="Century"/>
-          <w:sz w:val="16"/>
-          <w:szCs w:val="16"/>
-        </w:rPr>
-        <w:t xml:space="preserve"> Not married but living together</w:t>
-      </w:r>
-      <w:r>
-        <w:rPr>
-          <w:rFonts w:ascii="Century" w:hAnsi="Century"/>
-          <w:sz w:val="16"/>
-          <w:szCs w:val="16"/>
-        </w:rPr>
-        <w:tab/>
-      </w:r>
-      <w:r>
-        <w:rPr>
-          <w:rFonts w:ascii="Century" w:hAnsi="Century"/>
-          <w:sz w:val="16"/>
-          <w:szCs w:val="16"/>
-        </w:rPr>
-        <w:tab/>
-      </w:r>
-      <w:r>
-        <w:rPr>
-          <w:rFonts w:ascii="Century" w:hAnsi="Century"/>
-          <w:sz w:val="16"/>
-          <w:szCs w:val="16"/>
-        </w:rPr>
-        <w:tab/>
-      </w:r>
-      <w:proofErr w:type="gramStart"/>
-      <w:r>
-        <w:rPr>
-          <w:rFonts w:ascii="Century" w:hAnsi="Century"/>
-          <w:sz w:val="16"/>
-          <w:szCs w:val="16"/>
-        </w:rPr>
-        <w:t xml:space="preserve">{pmOther}</w:t>
-      </w:r>
-      <w:proofErr w:type="gramEnd"/>
-      <w:r>
-        <w:rPr>
-          <w:rFonts w:ascii="Century" w:hAnsi="Century"/>
-          <w:sz w:val="16"/>
-          <w:szCs w:val="16"/>
-        </w:rPr>
-        <w:t xml:space="preserve"> Other's (Please Specify) {parentsMaritalOther}</w:t>
+        <w:t>{pmNotMarriedLiving} Not married but living together</w:t>
+      </w:r>
+      <w:r>
+        <w:rPr>
+          <w:rFonts w:ascii="Century" w:hAnsi="Century"/>
+          <w:sz w:val="16"/>
+          <w:szCs w:val="16"/>
+        </w:rPr>
+        <w:tab/>
+      </w:r>
+      <w:r>
+        <w:rPr>
+          <w:rFonts w:ascii="Century" w:hAnsi="Century"/>
+          <w:sz w:val="16"/>
+          <w:szCs w:val="16"/>
+        </w:rPr>
+        <w:tab/>
+      </w:r>
+      <w:r>
+        <w:rPr>
+          <w:rFonts w:ascii="Century" w:hAnsi="Century"/>
+          <w:sz w:val="16"/>
+          <w:szCs w:val="16"/>
+        </w:rPr>
+        <w:tab/>
+        <w:t>{pmOther} Other's (Please Specify) {parentsMaritalOther}</w:t>
       </w:r>
     </w:p>
     <w:p>
@@ -2511,7 +2334,7 @@
           <w:sz w:val="16"/>
           <w:szCs w:val="16"/>
         </w:rPr>
-        <w:t xml:space="preserve">Number of children in the family including yourself: {siblingsTotal}   Number of Brothers: {brothersCount}   Number of Sisters: {sistersCount}</w:t>
+        <w:t>Number of children in the family including yourself: {siblingsTotal}   Number of Brothers: {brothersCount}   Number of Sisters: {sistersCount}</w:t>
       </w:r>
     </w:p>
     <w:p>
@@ -2538,92 +2361,41 @@
           <w:szCs w:val="16"/>
         </w:rPr>
         <w:tab/>
-      </w:r>
-      <w:proofErr w:type="gramStart"/>
-      <w:r>
-        <w:rPr>
-          <w:rFonts w:ascii="Century" w:hAnsi="Century"/>
-          <w:sz w:val="16"/>
-          <w:szCs w:val="16"/>
-        </w:rPr>
-        <w:t xml:space="preserve">{finParents}</w:t>
-      </w:r>
-      <w:proofErr w:type="gramEnd"/>
-      <w:r>
-        <w:rPr>
-          <w:rFonts w:ascii="Century" w:hAnsi="Century"/>
-          <w:sz w:val="16"/>
-          <w:szCs w:val="16"/>
-        </w:rPr>
-        <w:t xml:space="preserve"> Parents</w:t>
-      </w:r>
-      <w:r>
-        <w:rPr>
-          <w:rFonts w:ascii="Century" w:hAnsi="Century"/>
-          <w:sz w:val="16"/>
-          <w:szCs w:val="16"/>
-        </w:rPr>
-        <w:tab/>
-      </w:r>
-      <w:r>
-        <w:rPr>
-          <w:rFonts w:ascii="Century" w:hAnsi="Century"/>
-          <w:sz w:val="16"/>
-          <w:szCs w:val="16"/>
-        </w:rPr>
-        <w:tab/>
-      </w:r>
-      <w:proofErr w:type="gramStart"/>
-      <w:r>
-        <w:rPr>
-          <w:rFonts w:ascii="Century" w:hAnsi="Century"/>
-          <w:sz w:val="16"/>
-          <w:szCs w:val="16"/>
-        </w:rPr>
-        <w:t xml:space="preserve">{finSpouse}</w:t>
-      </w:r>
-      <w:proofErr w:type="gramEnd"/>
-      <w:r>
-        <w:rPr>
-          <w:rFonts w:ascii="Century" w:hAnsi="Century"/>
-          <w:sz w:val="16"/>
-          <w:szCs w:val="16"/>
-        </w:rPr>
-        <w:t xml:space="preserve"> Spouse</w:t>
-      </w:r>
-      <w:r>
-        <w:rPr>
-          <w:rFonts w:ascii="Century" w:hAnsi="Century"/>
-          <w:sz w:val="16"/>
-          <w:szCs w:val="16"/>
-        </w:rPr>
-        <w:tab/>
-      </w:r>
-      <w:r>
-        <w:rPr>
-          <w:rFonts w:ascii="Century" w:hAnsi="Century"/>
-          <w:sz w:val="16"/>
-          <w:szCs w:val="16"/>
-        </w:rPr>
-        <w:tab/>
-      </w:r>
-      <w:proofErr w:type="gramStart"/>
-      <w:r>
-        <w:rPr>
-          <w:rFonts w:ascii="Century" w:hAnsi="Century"/>
-          <w:sz w:val="16"/>
-          <w:szCs w:val="16"/>
-        </w:rPr>
-        <w:t xml:space="preserve">{finRelatives}</w:t>
-      </w:r>
-      <w:proofErr w:type="gramEnd"/>
-      <w:r>
-        <w:rPr>
-          <w:rFonts w:ascii="Century" w:hAnsi="Century"/>
-          <w:sz w:val="16"/>
-          <w:szCs w:val="16"/>
-        </w:rPr>
-        <w:t xml:space="preserve"> Relatives</w:t>
+        <w:t>{finParents} Parents</w:t>
+      </w:r>
+      <w:r>
+        <w:rPr>
+          <w:rFonts w:ascii="Century" w:hAnsi="Century"/>
+          <w:sz w:val="16"/>
+          <w:szCs w:val="16"/>
+        </w:rPr>
+        <w:tab/>
+      </w:r>
+      <w:r>
+        <w:rPr>
+          <w:rFonts w:ascii="Century" w:hAnsi="Century"/>
+          <w:sz w:val="16"/>
+          <w:szCs w:val="16"/>
+        </w:rPr>
+        <w:tab/>
+        <w:t>{finSpouse} Spouse</w:t>
+      </w:r>
+      <w:r>
+        <w:rPr>
+          <w:rFonts w:ascii="Century" w:hAnsi="Century"/>
+          <w:sz w:val="16"/>
+          <w:szCs w:val="16"/>
+        </w:rPr>
+        <w:tab/>
+      </w:r>
+      <w:r>
+        <w:rPr>
+          <w:rFonts w:ascii="Century" w:hAnsi="Century"/>
+          <w:sz w:val="16"/>
+          <w:szCs w:val="16"/>
+        </w:rPr>
+        <w:tab/>
+        <w:t>{finRelatives} Relatives</w:t>
       </w:r>
     </w:p>
     <w:p>
@@ -2666,84 +2438,33 @@
           <w:szCs w:val="16"/>
         </w:rPr>
         <w:tab/>
-      </w:r>
-      <w:proofErr w:type="gramStart"/>
-      <w:r>
-        <w:rPr>
-          <w:rFonts w:ascii="Century" w:hAnsi="Century"/>
-          <w:sz w:val="16"/>
-          <w:szCs w:val="16"/>
-        </w:rPr>
-        <w:t xml:space="preserve">{finBrotherSister}</w:t>
-      </w:r>
-      <w:proofErr w:type="gramEnd"/>
-      <w:r>
-        <w:rPr>
-          <w:rFonts w:ascii="Century" w:hAnsi="Century"/>
-          <w:sz w:val="16"/>
-          <w:szCs w:val="16"/>
-        </w:rPr>
-        <w:t xml:space="preserve"> Brother/Sister</w:t>
-      </w:r>
-      <w:r>
-        <w:rPr>
-          <w:rFonts w:ascii="Century" w:hAnsi="Century"/>
-          <w:sz w:val="16"/>
-          <w:szCs w:val="16"/>
-        </w:rPr>
-        <w:tab/>
-      </w:r>
-      <w:proofErr w:type="gramStart"/>
-      <w:r>
-        <w:rPr>
-          <w:rFonts w:ascii="Century" w:hAnsi="Century"/>
-          <w:sz w:val="16"/>
-          <w:szCs w:val="16"/>
-        </w:rPr>
-        <w:t xml:space="preserve">{finScholarship}</w:t>
-      </w:r>
-      <w:proofErr w:type="gramEnd"/>
-      <w:r>
-        <w:rPr>
-          <w:rFonts w:ascii="Century" w:hAnsi="Century"/>
-          <w:sz w:val="16"/>
-          <w:szCs w:val="16"/>
-        </w:rPr>
-        <w:t xml:space="preserve"> Scholarship</w:t>
-      </w:r>
-      <w:r>
-        <w:rPr>
-          <w:rFonts w:ascii="Century" w:hAnsi="Century"/>
-          <w:sz w:val="16"/>
-          <w:szCs w:val="16"/>
-        </w:rPr>
-        <w:tab/>
-      </w:r>
-      <w:r>
-        <w:rPr>
-          <w:rFonts w:ascii="Century" w:hAnsi="Century"/>
-          <w:sz w:val="16"/>
-          <w:szCs w:val="16"/>
-        </w:rPr>
-        <w:tab/>
-      </w:r>
-      <w:proofErr w:type="gramStart"/>
-      <w:r>
-        <w:rPr>
-          <w:rFonts w:ascii="Century" w:hAnsi="Century"/>
-          <w:sz w:val="16"/>
-          <w:szCs w:val="16"/>
-        </w:rPr>
-        <w:t xml:space="preserve">{finSelfSupporting}</w:t>
-      </w:r>
-      <w:proofErr w:type="gramEnd"/>
-      <w:r>
-        <w:rPr>
-          <w:rFonts w:ascii="Century" w:hAnsi="Century"/>
-          <w:sz w:val="16"/>
-          <w:szCs w:val="16"/>
-        </w:rPr>
-        <w:t xml:space="preserve"> Self-supporting/working </w:t>
+        <w:t>{finBrotherSister} Brother/Sister</w:t>
+      </w:r>
+      <w:r>
+        <w:rPr>
+          <w:rFonts w:ascii="Century" w:hAnsi="Century"/>
+          <w:sz w:val="16"/>
+          <w:szCs w:val="16"/>
+        </w:rPr>
+        <w:tab/>
+        <w:t>{finScholarship} Scholarship</w:t>
+      </w:r>
+      <w:r>
+        <w:rPr>
+          <w:rFonts w:ascii="Century" w:hAnsi="Century"/>
+          <w:sz w:val="16"/>
+          <w:szCs w:val="16"/>
+        </w:rPr>
+        <w:tab/>
+      </w:r>
+      <w:r>
+        <w:rPr>
+          <w:rFonts w:ascii="Century" w:hAnsi="Century"/>
+          <w:sz w:val="16"/>
+          <w:szCs w:val="16"/>
+        </w:rPr>
+        <w:tab/>
+        <w:t xml:space="preserve">{finSelfSupporting} Self-supporting/working </w:t>
       </w:r>
     </w:p>
     <w:p>
@@ -2786,24 +2507,7 @@
           <w:szCs w:val="16"/>
         </w:rPr>
         <w:tab/>
-      </w:r>
-      <w:proofErr w:type="gramStart"/>
-      <w:r>
-        <w:rPr>
-          <w:rFonts w:ascii="Century" w:hAnsi="Century"/>
-          <w:sz w:val="16"/>
-          <w:szCs w:val="16"/>
-        </w:rPr>
-        <w:t xml:space="preserve">{finOther}</w:t>
-      </w:r>
-      <w:proofErr w:type="gramEnd"/>
-      <w:r>
-        <w:rPr>
-          <w:rFonts w:ascii="Century" w:hAnsi="Century"/>
-          <w:sz w:val="16"/>
-          <w:szCs w:val="16"/>
-        </w:rPr>
-        <w:t xml:space="preserve"> Others, please specify: {financingOther}</w:t>
+        <w:t>{finOther} Others, please specify: {financingOther}</w:t>
       </w:r>
     </w:p>
     <w:p>
@@ -2876,7 +2580,6 @@
           <w:szCs w:val="14"/>
         </w:rPr>
       </w:pPr>
-      <w:proofErr w:type="gramStart"/>
       <w:r>
         <w:rPr>
           <w:rFonts w:ascii="Century" w:hAnsi="Century"/>
@@ -2885,9 +2588,8 @@
           <w:sz w:val="14"/>
           <w:szCs w:val="14"/>
         </w:rPr>
-        <w:t xml:space="preserve">{hVision}</w:t>
-      </w:r>
-      <w:proofErr w:type="gramEnd"/>
+        <w:t>{hVision} Vision</w:t>
+      </w:r>
       <w:r>
         <w:rPr>
           <w:rFonts w:ascii="Century" w:hAnsi="Century"/>
@@ -2896,7 +2598,7 @@
           <w:sz w:val="14"/>
           <w:szCs w:val="14"/>
         </w:rPr>
-        <w:t xml:space="preserve"> Vision</w:t>
+        <w:tab/>
       </w:r>
       <w:r>
         <w:rPr>
@@ -2907,6 +2609,7 @@
           <w:szCs w:val="14"/>
         </w:rPr>
         <w:tab/>
+        <w:t>{hSpeech} Speech</w:t>
       </w:r>
       <w:r>
         <w:rPr>
@@ -2918,7 +2621,6 @@
         </w:rPr>
         <w:tab/>
       </w:r>
-      <w:proofErr w:type="gramStart"/>
       <w:r>
         <w:rPr>
           <w:rFonts w:ascii="Century" w:hAnsi="Century"/>
@@ -2927,9 +2629,9 @@
           <w:sz w:val="14"/>
           <w:szCs w:val="14"/>
         </w:rPr>
-        <w:t xml:space="preserve">{hSpeech}</w:t>
-      </w:r>
-      <w:proofErr w:type="gramEnd"/>
+        <w:tab/>
+        <w:t>{hHearing} Hearing</w:t>
+      </w:r>
       <w:r>
         <w:rPr>
           <w:rFonts w:ascii="Century" w:hAnsi="Century"/>
@@ -2938,7 +2640,7 @@
           <w:sz w:val="14"/>
           <w:szCs w:val="14"/>
         </w:rPr>
-        <w:t xml:space="preserve"> Speech</w:t>
+        <w:tab/>
       </w:r>
       <w:r>
         <w:rPr>
@@ -2949,102 +2651,7 @@
           <w:szCs w:val="14"/>
         </w:rPr>
         <w:tab/>
-      </w:r>
-      <w:r>
-        <w:rPr>
-          <w:rFonts w:ascii="Century" w:hAnsi="Century"/>
-          <w:b/>
-          <w:bCs/>
-          <w:sz w:val="14"/>
-          <w:szCs w:val="14"/>
-        </w:rPr>
-        <w:tab/>
-      </w:r>
-      <w:proofErr w:type="gramStart"/>
-      <w:r>
-        <w:rPr>
-          <w:rFonts w:ascii="Century" w:hAnsi="Century"/>
-          <w:b/>
-          <w:bCs/>
-          <w:sz w:val="14"/>
-          <w:szCs w:val="14"/>
-        </w:rPr>
-        <w:t xml:space="preserve">{hHearing}</w:t>
-      </w:r>
-      <w:proofErr w:type="gramEnd"/>
-      <w:r>
-        <w:rPr>
-          <w:rFonts w:ascii="Century" w:hAnsi="Century"/>
-          <w:b/>
-          <w:bCs/>
-          <w:sz w:val="14"/>
-          <w:szCs w:val="14"/>
-        </w:rPr>
-        <w:t xml:space="preserve"> Hearing</w:t>
-      </w:r>
-      <w:r>
-        <w:rPr>
-          <w:rFonts w:ascii="Century" w:hAnsi="Century"/>
-          <w:b/>
-          <w:bCs/>
-          <w:sz w:val="14"/>
-          <w:szCs w:val="14"/>
-        </w:rPr>
-        <w:tab/>
-      </w:r>
-      <w:r>
-        <w:rPr>
-          <w:rFonts w:ascii="Century" w:hAnsi="Century"/>
-          <w:b/>
-          <w:bCs/>
-          <w:sz w:val="14"/>
-          <w:szCs w:val="14"/>
-        </w:rPr>
-        <w:tab/>
-      </w:r>
-      <w:proofErr w:type="gramStart"/>
-      <w:r>
-        <w:rPr>
-          <w:rFonts w:ascii="Century" w:hAnsi="Century"/>
-          <w:b/>
-          <w:bCs/>
-          <w:sz w:val="14"/>
-          <w:szCs w:val="14"/>
-        </w:rPr>
-        <w:t xml:space="preserve">{hGeneralHealth}</w:t>
-      </w:r>
-      <w:proofErr w:type="gramEnd"/>
-      <w:r>
-        <w:rPr>
-          <w:rFonts w:ascii="Century" w:hAnsi="Century"/>
-          <w:b/>
-          <w:bCs/>
-          <w:sz w:val="14"/>
-          <w:szCs w:val="14"/>
-        </w:rPr>
-        <w:t xml:space="preserve"> General Health       </w:t>
-      </w:r>
-      <w:proofErr w:type="gramStart"/>
-      <w:r>
-        <w:rPr>
-          <w:rFonts w:ascii="Century" w:hAnsi="Century"/>
-          <w:b/>
-          <w:bCs/>
-          <w:sz w:val="14"/>
-          <w:szCs w:val="14"/>
-        </w:rPr>
-        <w:t xml:space="preserve">   {hPhysical}</w:t>
-      </w:r>
-      <w:proofErr w:type="gramEnd"/>
-      <w:r>
-        <w:rPr>
-          <w:rFonts w:ascii="Century" w:hAnsi="Century"/>
-          <w:b/>
-          <w:bCs/>
-          <w:sz w:val="14"/>
-          <w:szCs w:val="14"/>
-        </w:rPr>
-        <w:t xml:space="preserve"> Physical Disability</w:t>
+        <w:t>{hGeneralHealth} General Health          {hPhysical} Physical Disability</w:t>
       </w:r>
     </w:p>
     <w:p>
@@ -3105,7 +2712,7 @@
           <w:sz w:val="12"/>
           <w:szCs w:val="12"/>
         </w:rPr>
-        <w:t xml:space="preserve">{visionDetail}     {speechDetail}     {hearingDetail}     {generalHealthDetail}</w:t>
+        <w:t>{visionDetail}     {speechDetail}     {hearingDetail}     {generalHealthDetail}</w:t>
       </w:r>
     </w:p>
     <w:p>
@@ -3175,26 +2782,17 @@
           <w:sz w:val="16"/>
           <w:szCs w:val="16"/>
         </w:rPr>
-        <w:t xml:space="preserve">Have you taken any psychological tests before?  {psychYes} </w:t>
-      </w:r>
-      <w:proofErr w:type="gramStart"/>
-      <w:r>
-        <w:rPr>
-          <w:rFonts w:ascii="Century" w:hAnsi="Century"/>
-          <w:sz w:val="16"/>
-          <w:szCs w:val="16"/>
-        </w:rPr>
-        <w:t>Yes</w:t>
-      </w:r>
-      <w:proofErr w:type="gramEnd"/>
-      <w:r>
-        <w:rPr>
-          <w:rFonts w:ascii="Century" w:hAnsi="Century"/>
-          <w:sz w:val="16"/>
-          <w:szCs w:val="16"/>
-        </w:rPr>
-        <w:tab/>
-        <w:t xml:space="preserve">{psychNo} No</w:t>
+        <w:lastRenderedPageBreak/>
+        <w:t>Have you taken any psychological tests before?  {psychYes} Yes</w:t>
+      </w:r>
+      <w:r>
+        <w:rPr>
+          <w:rFonts w:ascii="Century" w:hAnsi="Century"/>
+          <w:sz w:val="16"/>
+          <w:szCs w:val="16"/>
+        </w:rPr>
+        <w:tab/>
+        <w:t>{psychNo} No</w:t>
       </w:r>
     </w:p>
     <w:p>
@@ -3394,194 +2992,194 @@
           <w:sz w:val="16"/>
           <w:szCs w:val="16"/>
         </w:rPr>
-        <w:t xml:space="preserve">{tr0Date}</w:t>
-      </w:r>
-      <w:r>
-        <w:rPr>
-          <w:rFonts w:ascii="Century" w:hAnsi="Century"/>
-          <w:sz w:val="16"/>
-          <w:szCs w:val="16"/>
-        </w:rPr>
-        <w:tab/>
-      </w:r>
-      <w:r>
-        <w:rPr>
-          <w:rFonts w:ascii="Century" w:hAnsi="Century"/>
-          <w:sz w:val="16"/>
-          <w:szCs w:val="16"/>
-        </w:rPr>
-        <w:tab/>
-        <w:t xml:space="preserve">{tr0Kind}</w:t>
-      </w:r>
-      <w:r>
-        <w:rPr>
-          <w:rFonts w:ascii="Century" w:hAnsi="Century"/>
-          <w:sz w:val="16"/>
-          <w:szCs w:val="16"/>
-        </w:rPr>
-        <w:tab/>
-      </w:r>
-      <w:r>
-        <w:rPr>
-          <w:rFonts w:ascii="Century" w:hAnsi="Century"/>
-          <w:sz w:val="16"/>
-          <w:szCs w:val="16"/>
-        </w:rPr>
-        <w:tab/>
-        <w:t xml:space="preserve">{tr0Score}</w:t>
-      </w:r>
-      <w:r>
-        <w:rPr>
-          <w:rFonts w:ascii="Century" w:hAnsi="Century"/>
-          <w:sz w:val="16"/>
-          <w:szCs w:val="16"/>
-        </w:rPr>
-        <w:tab/>
-      </w:r>
-      <w:r>
-        <w:rPr>
-          <w:rFonts w:ascii="Century" w:hAnsi="Century"/>
-          <w:sz w:val="16"/>
-          <w:szCs w:val="16"/>
-        </w:rPr>
-        <w:tab/>
-        <w:t xml:space="preserve">{tr0Rank}</w:t>
-      </w:r>
-    </w:p>
-    <w:p>
-      <w:pPr>
-        <w:rPr>
-          <w:rFonts w:ascii="Century" w:hAnsi="Century"/>
-          <w:sz w:val="16"/>
-          <w:szCs w:val="16"/>
-        </w:rPr>
-      </w:pPr>
-      <w:r>
-        <w:rPr>
-          <w:rFonts w:ascii="Century" w:hAnsi="Century"/>
-          <w:sz w:val="16"/>
-          <w:szCs w:val="16"/>
-        </w:rPr>
-        <w:t xml:space="preserve">{tr1Date}</w:t>
-      </w:r>
-      <w:r>
-        <w:rPr>
-          <w:rFonts w:ascii="Century" w:hAnsi="Century"/>
-          <w:sz w:val="16"/>
-          <w:szCs w:val="16"/>
-        </w:rPr>
-        <w:tab/>
-      </w:r>
-      <w:r>
-        <w:rPr>
-          <w:rFonts w:ascii="Century" w:hAnsi="Century"/>
-          <w:sz w:val="16"/>
-          <w:szCs w:val="16"/>
-        </w:rPr>
-        <w:tab/>
-        <w:t xml:space="preserve">{tr1Kind}</w:t>
-      </w:r>
-      <w:r>
-        <w:rPr>
-          <w:rFonts w:ascii="Century" w:hAnsi="Century"/>
-          <w:sz w:val="16"/>
-          <w:szCs w:val="16"/>
-        </w:rPr>
-        <w:tab/>
-      </w:r>
-      <w:r>
-        <w:rPr>
-          <w:rFonts w:ascii="Century" w:hAnsi="Century"/>
-          <w:sz w:val="16"/>
-          <w:szCs w:val="16"/>
-        </w:rPr>
-        <w:tab/>
-        <w:t xml:space="preserve">{tr1Score}</w:t>
-      </w:r>
-      <w:r>
-        <w:rPr>
-          <w:rFonts w:ascii="Century" w:hAnsi="Century"/>
-          <w:sz w:val="16"/>
-          <w:szCs w:val="16"/>
-        </w:rPr>
-        <w:tab/>
-      </w:r>
-      <w:r>
-        <w:rPr>
-          <w:rFonts w:ascii="Century" w:hAnsi="Century"/>
-          <w:sz w:val="16"/>
-          <w:szCs w:val="16"/>
-        </w:rPr>
-        <w:tab/>
-        <w:t xml:space="preserve">{tr1Rank}</w:t>
-      </w:r>
-    </w:p>
-    <w:p>
-      <w:pPr>
-        <w:rPr>
-          <w:rFonts w:ascii="Century" w:hAnsi="Century"/>
-          <w:sz w:val="16"/>
-          <w:szCs w:val="16"/>
-        </w:rPr>
-      </w:pPr>
-      <w:r>
-        <w:rPr>
-          <w:rFonts w:ascii="Century" w:hAnsi="Century"/>
-          <w:sz w:val="16"/>
-          <w:szCs w:val="16"/>
-        </w:rPr>
-        <w:t xml:space="preserve">{tr2Date}</w:t>
-      </w:r>
-      <w:r>
-        <w:rPr>
-          <w:rFonts w:ascii="Century" w:hAnsi="Century"/>
-          <w:sz w:val="16"/>
-          <w:szCs w:val="16"/>
-        </w:rPr>
-        <w:tab/>
-      </w:r>
-      <w:r>
-        <w:rPr>
-          <w:rFonts w:ascii="Century" w:hAnsi="Century"/>
-          <w:sz w:val="16"/>
-          <w:szCs w:val="16"/>
-        </w:rPr>
-        <w:tab/>
-        <w:t xml:space="preserve">{tr2Kind}</w:t>
-      </w:r>
-      <w:r>
-        <w:rPr>
-          <w:rFonts w:ascii="Century" w:hAnsi="Century"/>
-          <w:sz w:val="16"/>
-          <w:szCs w:val="16"/>
-        </w:rPr>
-        <w:tab/>
-      </w:r>
-      <w:r>
-        <w:rPr>
-          <w:rFonts w:ascii="Century" w:hAnsi="Century"/>
-          <w:sz w:val="16"/>
-          <w:szCs w:val="16"/>
-        </w:rPr>
-        <w:tab/>
-        <w:t xml:space="preserve">{tr2Score}</w:t>
-      </w:r>
-      <w:r>
-        <w:rPr>
-          <w:rFonts w:ascii="Century" w:hAnsi="Century"/>
-          <w:sz w:val="16"/>
-          <w:szCs w:val="16"/>
-        </w:rPr>
-        <w:tab/>
-      </w:r>
-      <w:r>
-        <w:rPr>
-          <w:rFonts w:ascii="Century" w:hAnsi="Century"/>
-          <w:sz w:val="16"/>
-          <w:szCs w:val="16"/>
-        </w:rPr>
-        <w:tab/>
-        <w:t xml:space="preserve">{tr2Rank}</w:t>
+        <w:t>{tr0Date}</w:t>
+      </w:r>
+      <w:r>
+        <w:rPr>
+          <w:rFonts w:ascii="Century" w:hAnsi="Century"/>
+          <w:sz w:val="16"/>
+          <w:szCs w:val="16"/>
+        </w:rPr>
+        <w:tab/>
+      </w:r>
+      <w:r>
+        <w:rPr>
+          <w:rFonts w:ascii="Century" w:hAnsi="Century"/>
+          <w:sz w:val="16"/>
+          <w:szCs w:val="16"/>
+        </w:rPr>
+        <w:tab/>
+        <w:t>{tr0Kind}</w:t>
+      </w:r>
+      <w:r>
+        <w:rPr>
+          <w:rFonts w:ascii="Century" w:hAnsi="Century"/>
+          <w:sz w:val="16"/>
+          <w:szCs w:val="16"/>
+        </w:rPr>
+        <w:tab/>
+      </w:r>
+      <w:r>
+        <w:rPr>
+          <w:rFonts w:ascii="Century" w:hAnsi="Century"/>
+          <w:sz w:val="16"/>
+          <w:szCs w:val="16"/>
+        </w:rPr>
+        <w:tab/>
+        <w:t>{tr0Score}</w:t>
+      </w:r>
+      <w:r>
+        <w:rPr>
+          <w:rFonts w:ascii="Century" w:hAnsi="Century"/>
+          <w:sz w:val="16"/>
+          <w:szCs w:val="16"/>
+        </w:rPr>
+        <w:tab/>
+      </w:r>
+      <w:r>
+        <w:rPr>
+          <w:rFonts w:ascii="Century" w:hAnsi="Century"/>
+          <w:sz w:val="16"/>
+          <w:szCs w:val="16"/>
+        </w:rPr>
+        <w:tab/>
+        <w:t>{tr0Rank}</w:t>
+      </w:r>
+    </w:p>
+    <w:p>
+      <w:pPr>
+        <w:rPr>
+          <w:rFonts w:ascii="Century" w:hAnsi="Century"/>
+          <w:sz w:val="16"/>
+          <w:szCs w:val="16"/>
+        </w:rPr>
+      </w:pPr>
+      <w:r>
+        <w:rPr>
+          <w:rFonts w:ascii="Century" w:hAnsi="Century"/>
+          <w:sz w:val="16"/>
+          <w:szCs w:val="16"/>
+        </w:rPr>
+        <w:t>{tr1Date}</w:t>
+      </w:r>
+      <w:r>
+        <w:rPr>
+          <w:rFonts w:ascii="Century" w:hAnsi="Century"/>
+          <w:sz w:val="16"/>
+          <w:szCs w:val="16"/>
+        </w:rPr>
+        <w:tab/>
+      </w:r>
+      <w:r>
+        <w:rPr>
+          <w:rFonts w:ascii="Century" w:hAnsi="Century"/>
+          <w:sz w:val="16"/>
+          <w:szCs w:val="16"/>
+        </w:rPr>
+        <w:tab/>
+        <w:t>{tr1Kind}</w:t>
+      </w:r>
+      <w:r>
+        <w:rPr>
+          <w:rFonts w:ascii="Century" w:hAnsi="Century"/>
+          <w:sz w:val="16"/>
+          <w:szCs w:val="16"/>
+        </w:rPr>
+        <w:tab/>
+      </w:r>
+      <w:r>
+        <w:rPr>
+          <w:rFonts w:ascii="Century" w:hAnsi="Century"/>
+          <w:sz w:val="16"/>
+          <w:szCs w:val="16"/>
+        </w:rPr>
+        <w:tab/>
+        <w:t>{tr1Score}</w:t>
+      </w:r>
+      <w:r>
+        <w:rPr>
+          <w:rFonts w:ascii="Century" w:hAnsi="Century"/>
+          <w:sz w:val="16"/>
+          <w:szCs w:val="16"/>
+        </w:rPr>
+        <w:tab/>
+      </w:r>
+      <w:r>
+        <w:rPr>
+          <w:rFonts w:ascii="Century" w:hAnsi="Century"/>
+          <w:sz w:val="16"/>
+          <w:szCs w:val="16"/>
+        </w:rPr>
+        <w:tab/>
+        <w:t>{tr1Rank}</w:t>
+      </w:r>
+    </w:p>
+    <w:p>
+      <w:pPr>
+        <w:rPr>
+          <w:rFonts w:ascii="Century" w:hAnsi="Century"/>
+          <w:sz w:val="16"/>
+          <w:szCs w:val="16"/>
+        </w:rPr>
+      </w:pPr>
+      <w:r>
+        <w:rPr>
+          <w:rFonts w:ascii="Century" w:hAnsi="Century"/>
+          <w:sz w:val="16"/>
+          <w:szCs w:val="16"/>
+        </w:rPr>
+        <w:t>{tr2Date}</w:t>
+      </w:r>
+      <w:r>
+        <w:rPr>
+          <w:rFonts w:ascii="Century" w:hAnsi="Century"/>
+          <w:sz w:val="16"/>
+          <w:szCs w:val="16"/>
+        </w:rPr>
+        <w:tab/>
+      </w:r>
+      <w:r>
+        <w:rPr>
+          <w:rFonts w:ascii="Century" w:hAnsi="Century"/>
+          <w:sz w:val="16"/>
+          <w:szCs w:val="16"/>
+        </w:rPr>
+        <w:tab/>
+        <w:t>{tr2Kind}</w:t>
+      </w:r>
+      <w:r>
+        <w:rPr>
+          <w:rFonts w:ascii="Century" w:hAnsi="Century"/>
+          <w:sz w:val="16"/>
+          <w:szCs w:val="16"/>
+        </w:rPr>
+        <w:tab/>
+      </w:r>
+      <w:r>
+        <w:rPr>
+          <w:rFonts w:ascii="Century" w:hAnsi="Century"/>
+          <w:sz w:val="16"/>
+          <w:szCs w:val="16"/>
+        </w:rPr>
+        <w:tab/>
+        <w:t>{tr2Score}</w:t>
+      </w:r>
+      <w:r>
+        <w:rPr>
+          <w:rFonts w:ascii="Century" w:hAnsi="Century"/>
+          <w:sz w:val="16"/>
+          <w:szCs w:val="16"/>
+        </w:rPr>
+        <w:tab/>
+      </w:r>
+      <w:r>
+        <w:rPr>
+          <w:rFonts w:ascii="Century" w:hAnsi="Century"/>
+          <w:sz w:val="16"/>
+          <w:szCs w:val="16"/>
+        </w:rPr>
+        <w:tab/>
+        <w:t>{tr2Rank}</w:t>
       </w:r>
     </w:p>
     <w:p>
@@ -3646,117 +3244,117 @@
           <w:sz w:val="16"/>
           <w:szCs w:val="16"/>
         </w:rPr>
-        <w:t xml:space="preserve">{igSports} Sports</w:t>
-      </w:r>
-      <w:r>
-        <w:rPr>
-          <w:rFonts w:ascii="Century" w:hAnsi="Century"/>
-          <w:sz w:val="16"/>
-          <w:szCs w:val="16"/>
-        </w:rPr>
-        <w:tab/>
-      </w:r>
-      <w:r>
-        <w:rPr>
-          <w:rFonts w:ascii="Century" w:hAnsi="Century"/>
-          <w:sz w:val="16"/>
-          <w:szCs w:val="16"/>
-        </w:rPr>
-        <w:tab/>
-      </w:r>
-      <w:r>
-        <w:rPr>
-          <w:rFonts w:ascii="Century" w:hAnsi="Century"/>
-          <w:sz w:val="16"/>
-          <w:szCs w:val="16"/>
-        </w:rPr>
-        <w:tab/>
-        <w:t xml:space="preserve">{igScience} Science</w:t>
-      </w:r>
-      <w:r>
-        <w:rPr>
-          <w:rFonts w:ascii="Century" w:hAnsi="Century"/>
-          <w:sz w:val="16"/>
-          <w:szCs w:val="16"/>
-        </w:rPr>
-        <w:tab/>
-      </w:r>
-      <w:r>
-        <w:rPr>
-          <w:rFonts w:ascii="Century" w:hAnsi="Century"/>
-          <w:sz w:val="16"/>
-          <w:szCs w:val="16"/>
-        </w:rPr>
-        <w:tab/>
-        <w:t xml:space="preserve">{igCivic} Civic Awareness/Service</w:t>
-      </w:r>
-    </w:p>
-    <w:p>
-      <w:pPr>
-        <w:rPr>
-          <w:rFonts w:ascii="Century" w:hAnsi="Century"/>
-          <w:sz w:val="16"/>
-          <w:szCs w:val="16"/>
-        </w:rPr>
-      </w:pPr>
-      <w:r>
-        <w:rPr>
-          <w:rFonts w:ascii="Century" w:hAnsi="Century"/>
-          <w:sz w:val="16"/>
-          <w:szCs w:val="16"/>
-        </w:rPr>
-        <w:t xml:space="preserve">{igArts} Arts</w:t>
-      </w:r>
-      <w:r>
-        <w:rPr>
-          <w:rFonts w:ascii="Century" w:hAnsi="Century"/>
-          <w:sz w:val="16"/>
-          <w:szCs w:val="16"/>
-        </w:rPr>
-        <w:tab/>
-      </w:r>
-      <w:r>
-        <w:rPr>
-          <w:rFonts w:ascii="Century" w:hAnsi="Century"/>
-          <w:sz w:val="16"/>
-          <w:szCs w:val="16"/>
-        </w:rPr>
-        <w:tab/>
-      </w:r>
-      <w:r>
-        <w:rPr>
-          <w:rFonts w:ascii="Century" w:hAnsi="Century"/>
-          <w:sz w:val="16"/>
-          <w:szCs w:val="16"/>
-        </w:rPr>
-        <w:tab/>
-        <w:t xml:space="preserve">{igSocial} Social Studies</w:t>
-      </w:r>
-      <w:r>
-        <w:rPr>
-          <w:rFonts w:ascii="Century" w:hAnsi="Century"/>
-          <w:sz w:val="16"/>
-          <w:szCs w:val="16"/>
-        </w:rPr>
-        <w:tab/>
-        <w:t xml:space="preserve">{igOther} Others</w:t>
-      </w:r>
-    </w:p>
-    <w:p>
-      <w:pPr>
-        <w:rPr>
-          <w:rFonts w:ascii="Century" w:hAnsi="Century"/>
-          <w:sz w:val="16"/>
-          <w:szCs w:val="16"/>
-        </w:rPr>
-      </w:pPr>
-      <w:r>
-        <w:rPr>
-          <w:rFonts w:ascii="Century" w:hAnsi="Century"/>
-          <w:sz w:val="16"/>
-          <w:szCs w:val="16"/>
-        </w:rPr>
-        <w:t xml:space="preserve">{igReligious} Religious</w:t>
+        <w:t>{igSports} Sports</w:t>
+      </w:r>
+      <w:r>
+        <w:rPr>
+          <w:rFonts w:ascii="Century" w:hAnsi="Century"/>
+          <w:sz w:val="16"/>
+          <w:szCs w:val="16"/>
+        </w:rPr>
+        <w:tab/>
+      </w:r>
+      <w:r>
+        <w:rPr>
+          <w:rFonts w:ascii="Century" w:hAnsi="Century"/>
+          <w:sz w:val="16"/>
+          <w:szCs w:val="16"/>
+        </w:rPr>
+        <w:tab/>
+      </w:r>
+      <w:r>
+        <w:rPr>
+          <w:rFonts w:ascii="Century" w:hAnsi="Century"/>
+          <w:sz w:val="16"/>
+          <w:szCs w:val="16"/>
+        </w:rPr>
+        <w:tab/>
+        <w:t>{igScience} Science</w:t>
+      </w:r>
+      <w:r>
+        <w:rPr>
+          <w:rFonts w:ascii="Century" w:hAnsi="Century"/>
+          <w:sz w:val="16"/>
+          <w:szCs w:val="16"/>
+        </w:rPr>
+        <w:tab/>
+      </w:r>
+      <w:r>
+        <w:rPr>
+          <w:rFonts w:ascii="Century" w:hAnsi="Century"/>
+          <w:sz w:val="16"/>
+          <w:szCs w:val="16"/>
+        </w:rPr>
+        <w:tab/>
+        <w:t>{igCivic} Civic Awareness/Service</w:t>
+      </w:r>
+    </w:p>
+    <w:p>
+      <w:pPr>
+        <w:rPr>
+          <w:rFonts w:ascii="Century" w:hAnsi="Century"/>
+          <w:sz w:val="16"/>
+          <w:szCs w:val="16"/>
+        </w:rPr>
+      </w:pPr>
+      <w:r>
+        <w:rPr>
+          <w:rFonts w:ascii="Century" w:hAnsi="Century"/>
+          <w:sz w:val="16"/>
+          <w:szCs w:val="16"/>
+        </w:rPr>
+        <w:t>{igArts} Arts</w:t>
+      </w:r>
+      <w:r>
+        <w:rPr>
+          <w:rFonts w:ascii="Century" w:hAnsi="Century"/>
+          <w:sz w:val="16"/>
+          <w:szCs w:val="16"/>
+        </w:rPr>
+        <w:tab/>
+      </w:r>
+      <w:r>
+        <w:rPr>
+          <w:rFonts w:ascii="Century" w:hAnsi="Century"/>
+          <w:sz w:val="16"/>
+          <w:szCs w:val="16"/>
+        </w:rPr>
+        <w:tab/>
+      </w:r>
+      <w:r>
+        <w:rPr>
+          <w:rFonts w:ascii="Century" w:hAnsi="Century"/>
+          <w:sz w:val="16"/>
+          <w:szCs w:val="16"/>
+        </w:rPr>
+        <w:tab/>
+        <w:t>{igSocial} Social Studies</w:t>
+      </w:r>
+      <w:r>
+        <w:rPr>
+          <w:rFonts w:ascii="Century" w:hAnsi="Century"/>
+          <w:sz w:val="16"/>
+          <w:szCs w:val="16"/>
+        </w:rPr>
+        <w:tab/>
+        <w:t>{igOther} Others</w:t>
+      </w:r>
+    </w:p>
+    <w:p>
+      <w:pPr>
+        <w:rPr>
+          <w:rFonts w:ascii="Century" w:hAnsi="Century"/>
+          <w:sz w:val="16"/>
+          <w:szCs w:val="16"/>
+        </w:rPr>
+      </w:pPr>
+      <w:r>
+        <w:rPr>
+          <w:rFonts w:ascii="Century" w:hAnsi="Century"/>
+          <w:sz w:val="16"/>
+          <w:szCs w:val="16"/>
+        </w:rPr>
+        <w:t>{igReligious} Religious</w:t>
       </w:r>
       <w:r>
         <w:rPr>
@@ -3802,26 +3400,16 @@
           <w:sz w:val="16"/>
           <w:szCs w:val="16"/>
         </w:rPr>
-        <w:t xml:space="preserve">Have you consulted/been sent to see the Guidance Counselor before?  {consultedYes} </w:t>
-      </w:r>
-      <w:proofErr w:type="gramStart"/>
-      <w:r>
-        <w:rPr>
-          <w:rFonts w:ascii="Century" w:hAnsi="Century"/>
-          <w:sz w:val="16"/>
-          <w:szCs w:val="16"/>
-        </w:rPr>
-        <w:t>Yes</w:t>
-      </w:r>
-      <w:proofErr w:type="gramEnd"/>
-      <w:r>
-        <w:rPr>
-          <w:rFonts w:ascii="Century" w:hAnsi="Century"/>
-          <w:sz w:val="16"/>
-          <w:szCs w:val="16"/>
-        </w:rPr>
-        <w:tab/>
-        <w:t xml:space="preserve">{consultedNo} No</w:t>
+        <w:t>Have you consulted/been sent to see the Guidance Counselor before?  {consultedYes} Yes</w:t>
+      </w:r>
+      <w:r>
+        <w:rPr>
+          <w:rFonts w:ascii="Century" w:hAnsi="Century"/>
+          <w:sz w:val="16"/>
+          <w:szCs w:val="16"/>
+        </w:rPr>
+        <w:tab/>
+        <w:t>{consultedNo} No</w:t>
       </w:r>
     </w:p>
     <w:p>
@@ -3856,7 +3444,7 @@
           <w:sz w:val="16"/>
           <w:szCs w:val="16"/>
         </w:rPr>
-        <w:t xml:space="preserve">{consultedReason}</w:t>
+        <w:t>{consultedReason}</w:t>
       </w:r>
     </w:p>
     <w:p>
@@ -3908,7 +3496,7 @@
           <w:sz w:val="16"/>
           <w:szCs w:val="16"/>
         </w:rPr>
-        <w:t xml:space="preserve">{hnFamily} Family matters</w:t>
+        <w:t>{hnFamily} Family matters</w:t>
       </w:r>
       <w:r>
         <w:rPr>
@@ -3960,108 +3548,108 @@
           <w:sz w:val="16"/>
           <w:szCs w:val="16"/>
         </w:rPr>
-        <w:t xml:space="preserve">{hnRelationship} Relationship problems</w:t>
-      </w:r>
-      <w:r>
-        <w:rPr>
-          <w:rFonts w:ascii="Century" w:hAnsi="Century"/>
-          <w:sz w:val="16"/>
-          <w:szCs w:val="16"/>
-        </w:rPr>
-        <w:tab/>
-        <w:t xml:space="preserve">{hnSelf} Self</w:t>
-      </w:r>
-      <w:r>
-        <w:rPr>
-          <w:rFonts w:ascii="Century" w:hAnsi="Century"/>
-          <w:sz w:val="16"/>
-          <w:szCs w:val="16"/>
-        </w:rPr>
-        <w:tab/>
-      </w:r>
-      <w:r>
-        <w:rPr>
-          <w:rFonts w:ascii="Century" w:hAnsi="Century"/>
-          <w:sz w:val="16"/>
-          <w:szCs w:val="16"/>
-        </w:rPr>
-        <w:tab/>
-      </w:r>
-      <w:r>
-        <w:rPr>
-          <w:rFonts w:ascii="Century" w:hAnsi="Century"/>
-          <w:sz w:val="16"/>
-          <w:szCs w:val="16"/>
-        </w:rPr>
-        <w:tab/>
-      </w:r>
-      <w:r>
-        <w:rPr>
-          <w:rFonts w:ascii="Century" w:hAnsi="Century"/>
-          <w:sz w:val="16"/>
-          <w:szCs w:val="16"/>
-        </w:rPr>
-        <w:tab/>
-      </w:r>
-    </w:p>
-    <w:p>
-      <w:pPr>
-        <w:rPr>
-          <w:rFonts w:ascii="Century" w:hAnsi="Century"/>
-          <w:sz w:val="16"/>
-          <w:szCs w:val="16"/>
-        </w:rPr>
-      </w:pPr>
-      <w:r>
-        <w:rPr>
-          <w:rFonts w:ascii="Century" w:hAnsi="Century"/>
-          <w:sz w:val="16"/>
-          <w:szCs w:val="16"/>
-        </w:rPr>
-        <w:t xml:space="preserve">{hnTeachers} Concerns with teachers</w:t>
-      </w:r>
-      <w:r>
-        <w:rPr>
-          <w:rFonts w:ascii="Century" w:hAnsi="Century"/>
-          <w:sz w:val="16"/>
-          <w:szCs w:val="16"/>
-        </w:rPr>
-        <w:tab/>
-        <w:t xml:space="preserve">{hnFinancial} Financial matters</w:t>
-      </w:r>
-    </w:p>
-    <w:p>
-      <w:pPr>
-        <w:rPr>
-          <w:rFonts w:ascii="Century" w:hAnsi="Century"/>
-          <w:sz w:val="16"/>
-          <w:szCs w:val="16"/>
-        </w:rPr>
-      </w:pPr>
-      <w:r>
-        <w:rPr>
-          <w:rFonts w:ascii="Century" w:hAnsi="Century"/>
-          <w:sz w:val="16"/>
-          <w:szCs w:val="16"/>
-        </w:rPr>
-        <w:t xml:space="preserve">{hnAcademic} Academic concerns</w:t>
-      </w:r>
-      <w:r>
-        <w:rPr>
-          <w:rFonts w:ascii="Century" w:hAnsi="Century"/>
-          <w:sz w:val="16"/>
-          <w:szCs w:val="16"/>
-        </w:rPr>
-        <w:tab/>
-      </w:r>
-      <w:r>
-        <w:rPr>
-          <w:rFonts w:ascii="Century" w:hAnsi="Century"/>
-          <w:sz w:val="16"/>
-          <w:szCs w:val="16"/>
-        </w:rPr>
-        <w:tab/>
-        <w:t xml:space="preserve">{hnHealth} Health concerns</w:t>
+        <w:t>{hnRelationship} Relationship problems</w:t>
+      </w:r>
+      <w:r>
+        <w:rPr>
+          <w:rFonts w:ascii="Century" w:hAnsi="Century"/>
+          <w:sz w:val="16"/>
+          <w:szCs w:val="16"/>
+        </w:rPr>
+        <w:tab/>
+        <w:t>{hnSelf} Self</w:t>
+      </w:r>
+      <w:r>
+        <w:rPr>
+          <w:rFonts w:ascii="Century" w:hAnsi="Century"/>
+          <w:sz w:val="16"/>
+          <w:szCs w:val="16"/>
+        </w:rPr>
+        <w:tab/>
+      </w:r>
+      <w:r>
+        <w:rPr>
+          <w:rFonts w:ascii="Century" w:hAnsi="Century"/>
+          <w:sz w:val="16"/>
+          <w:szCs w:val="16"/>
+        </w:rPr>
+        <w:tab/>
+      </w:r>
+      <w:r>
+        <w:rPr>
+          <w:rFonts w:ascii="Century" w:hAnsi="Century"/>
+          <w:sz w:val="16"/>
+          <w:szCs w:val="16"/>
+        </w:rPr>
+        <w:tab/>
+      </w:r>
+      <w:r>
+        <w:rPr>
+          <w:rFonts w:ascii="Century" w:hAnsi="Century"/>
+          <w:sz w:val="16"/>
+          <w:szCs w:val="16"/>
+        </w:rPr>
+        <w:tab/>
+      </w:r>
+    </w:p>
+    <w:p>
+      <w:pPr>
+        <w:rPr>
+          <w:rFonts w:ascii="Century" w:hAnsi="Century"/>
+          <w:sz w:val="16"/>
+          <w:szCs w:val="16"/>
+        </w:rPr>
+      </w:pPr>
+      <w:r>
+        <w:rPr>
+          <w:rFonts w:ascii="Century" w:hAnsi="Century"/>
+          <w:sz w:val="16"/>
+          <w:szCs w:val="16"/>
+        </w:rPr>
+        <w:t>{hnTeachers} Concerns with teachers</w:t>
+      </w:r>
+      <w:r>
+        <w:rPr>
+          <w:rFonts w:ascii="Century" w:hAnsi="Century"/>
+          <w:sz w:val="16"/>
+          <w:szCs w:val="16"/>
+        </w:rPr>
+        <w:tab/>
+        <w:t>{hnFinancial} Financial matters</w:t>
+      </w:r>
+    </w:p>
+    <w:p>
+      <w:pPr>
+        <w:rPr>
+          <w:rFonts w:ascii="Century" w:hAnsi="Century"/>
+          <w:sz w:val="16"/>
+          <w:szCs w:val="16"/>
+        </w:rPr>
+      </w:pPr>
+      <w:r>
+        <w:rPr>
+          <w:rFonts w:ascii="Century" w:hAnsi="Century"/>
+          <w:sz w:val="16"/>
+          <w:szCs w:val="16"/>
+        </w:rPr>
+        <w:t>{hnAcademic} Academic concerns</w:t>
+      </w:r>
+      <w:r>
+        <w:rPr>
+          <w:rFonts w:ascii="Century" w:hAnsi="Century"/>
+          <w:sz w:val="16"/>
+          <w:szCs w:val="16"/>
+        </w:rPr>
+        <w:tab/>
+      </w:r>
+      <w:r>
+        <w:rPr>
+          <w:rFonts w:ascii="Century" w:hAnsi="Century"/>
+          <w:sz w:val="16"/>
+          <w:szCs w:val="16"/>
+        </w:rPr>
+        <w:tab/>
+        <w:t>{hnHealth} Health concerns</w:t>
       </w:r>
       <w:r>
         <w:rPr>
@@ -4144,24 +3732,98 @@
           <w:sz w:val="16"/>
           <w:szCs w:val="16"/>
         </w:rPr>
-        <w:t xml:space="preserve">{studentPrintedName}                                        ________________________________</w:t>
-      </w:r>
-    </w:p>
-    <w:p>
-      <w:pPr>
-        <w:rPr>
-          <w:rFonts w:ascii="Century" w:hAnsi="Century"/>
-          <w:sz w:val="16"/>
-          <w:szCs w:val="16"/>
-        </w:rPr>
-      </w:pPr>
-      <w:r>
-        <w:rPr>
-          <w:rFonts w:ascii="Century" w:hAnsi="Century"/>
-          <w:sz w:val="16"/>
-          <w:szCs w:val="16"/>
-        </w:rPr>
-        <w:t xml:space="preserve">                        Student’s Printed Name                                                          Student’s Signature</w:t>
+        <w:t xml:space="preserve">         </w:t>
+      </w:r>
+      <w:r>
+        <w:rPr>
+          <w:rFonts w:ascii="Century" w:hAnsi="Century"/>
+          <w:sz w:val="16"/>
+          <w:szCs w:val="16"/>
+        </w:rPr>
+        <w:t>{</w:t>
+      </w:r>
+      <w:proofErr w:type="spellStart"/>
+      <w:r>
+        <w:rPr>
+          <w:rFonts w:ascii="Century" w:hAnsi="Century"/>
+          <w:sz w:val="16"/>
+          <w:szCs w:val="16"/>
+        </w:rPr>
+        <w:t>studentPrintedName</w:t>
+      </w:r>
+      <w:proofErr w:type="spellEnd"/>
+      <w:r>
+        <w:rPr>
+          <w:rFonts w:ascii="Century" w:hAnsi="Century"/>
+          <w:sz w:val="16"/>
+          <w:szCs w:val="16"/>
+        </w:rPr>
+        <w:t xml:space="preserve">}                                      </w:t>
+      </w:r>
+      <w:r>
+        <w:rPr>
+          <w:rFonts w:ascii="Century" w:hAnsi="Century"/>
+          <w:sz w:val="16"/>
+          <w:szCs w:val="16"/>
+        </w:rPr>
+        <w:t xml:space="preserve">      </w:t>
+      </w:r>
+      <w:r>
+        <w:rPr>
+          <w:rFonts w:ascii="Century" w:hAnsi="Century"/>
+          <w:sz w:val="16"/>
+          <w:szCs w:val="16"/>
+        </w:rPr>
+        <w:t xml:space="preserve"> </w:t>
+      </w:r>
+      <w:r>
+        <w:rPr>
+          <w:rFonts w:ascii="Century" w:hAnsi="Century"/>
+          <w:sz w:val="16"/>
+          <w:szCs w:val="16"/>
+        </w:rPr>
+        <w:t xml:space="preserve">                         </w:t>
+      </w:r>
+      <w:r>
+        <w:rPr>
+          <w:rFonts w:ascii="Century" w:hAnsi="Century"/>
+          <w:sz w:val="16"/>
+          <w:szCs w:val="16"/>
+        </w:rPr>
+        <w:t xml:space="preserve"> ________________________________</w:t>
+      </w:r>
+    </w:p>
+    <w:p>
+      <w:pPr>
+        <w:rPr>
+          <w:rFonts w:ascii="Century" w:hAnsi="Century"/>
+          <w:sz w:val="16"/>
+          <w:szCs w:val="16"/>
+        </w:rPr>
+      </w:pPr>
+      <w:r>
+        <w:rPr>
+          <w:rFonts w:ascii="Century" w:hAnsi="Century"/>
+          <w:sz w:val="16"/>
+          <w:szCs w:val="16"/>
+        </w:rPr>
+        <w:t xml:space="preserve">                        Student’s Printed Name                                                         </w:t>
+      </w:r>
+      <w:r>
+        <w:rPr>
+          <w:rFonts w:ascii="Century" w:hAnsi="Century"/>
+          <w:sz w:val="16"/>
+          <w:szCs w:val="16"/>
+        </w:rPr>
+        <w:t xml:space="preserve">                        </w:t>
+      </w:r>
+      <w:r>
+        <w:rPr>
+          <w:rFonts w:ascii="Century" w:hAnsi="Century"/>
+          <w:sz w:val="16"/>
+          <w:szCs w:val="16"/>
+        </w:rPr>
+        <w:t xml:space="preserve"> Student’s Signature</w:t>
       </w:r>
     </w:p>
     <w:p>
@@ -4237,7 +3899,7 @@
           </mc:Choice>
           <mc:Fallback>
             <w:pict>
-              <v:line w14:anchorId="3F418ECE" id="Straight Connector 1" o:spid="_x0000_s1026" style="position:absolute;z-index:251664384;visibility:visible;mso-wrap-style:square;mso-wrap-distance-left:9pt;mso-wrap-distance-top:0;mso-wrap-distance-right:9pt;mso-wrap-distance-bottom:0;mso-position-horizontal:absolute;mso-position-horizontal-relative:text;mso-position-vertical:absolute;mso-position-vertical-relative:text" from="5.9pt,8.05pt" to="547.6pt,8.05pt" o:gfxdata="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" strokecolor="black [3213]" strokeweight=".5pt">
+              <v:line w14:anchorId="15EDA377" id="Straight Connector 1" o:spid="_x0000_s1026" style="position:absolute;z-index:251664384;visibility:visible;mso-wrap-style:square;mso-wrap-distance-left:9pt;mso-wrap-distance-top:0;mso-wrap-distance-right:9pt;mso-wrap-distance-bottom:0;mso-position-horizontal:absolute;mso-position-horizontal-relative:text;mso-position-vertical:absolute;mso-position-vertical-relative:text" from="5.9pt,8.05pt" to="547.6pt,8.05pt" o:gfxdata="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" strokecolor="black [3213]" strokeweight=".5pt">
                 <v:stroke dashstyle="dash" joinstyle="miter"/>
               </v:line>
             </w:pict>
@@ -4693,6 +4355,7 @@
         <w:tblStyle w:val="TableGrid"/>
         <w:tblW w:w="0" w:type="auto"/>
         <w:tblInd w:w="360" w:type="dxa"/>
+        <w:tblLayout w:type="fixed"/>
         <w:tblLook w:val="04A0" w:firstRow="1" w:lastRow="0" w:firstColumn="1" w:lastColumn="0" w:noHBand="0" w:noVBand="1"/>
       </w:tblPr>
       <w:tblGrid>
@@ -4726,7 +4389,65 @@
                 <w:sz w:val="14"/>
                 <w:szCs w:val="14"/>
               </w:rPr>
-              <w:t xml:space="preserve">{studentPrintedName}                                        ________________________________</w:t>
+              <w:t xml:space="preserve">                         </w:t>
+            </w:r>
+            <w:r>
+              <w:rPr>
+                <w:rFonts w:ascii="Century" w:hAnsi="Century"/>
+                <w:sz w:val="14"/>
+                <w:szCs w:val="14"/>
+              </w:rPr>
+              <w:t>{</w:t>
+            </w:r>
+            <w:proofErr w:type="spellStart"/>
+            <w:r>
+              <w:rPr>
+                <w:rFonts w:ascii="Century" w:hAnsi="Century"/>
+                <w:sz w:val="14"/>
+                <w:szCs w:val="14"/>
+              </w:rPr>
+              <w:t>studentPrintedName</w:t>
+            </w:r>
+            <w:proofErr w:type="spellEnd"/>
+            <w:r>
+              <w:rPr>
+                <w:rFonts w:ascii="Century" w:hAnsi="Century"/>
+                <w:sz w:val="14"/>
+                <w:szCs w:val="14"/>
+              </w:rPr>
+              <w:t xml:space="preserve">}                                     </w:t>
+            </w:r>
+            <w:r>
+              <w:rPr>
+                <w:rFonts w:ascii="Century" w:hAnsi="Century"/>
+                <w:sz w:val="14"/>
+                <w:szCs w:val="14"/>
+              </w:rPr>
+              <w:t xml:space="preserve">      </w:t>
+            </w:r>
+            <w:r>
+              <w:rPr>
+                <w:rFonts w:ascii="Century" w:hAnsi="Century"/>
+                <w:sz w:val="14"/>
+                <w:szCs w:val="14"/>
+              </w:rPr>
+              <w:t xml:space="preserve">   </w:t>
+            </w:r>
+            <w:r>
+              <w:rPr>
+                <w:rFonts w:ascii="Century" w:hAnsi="Century"/>
+                <w:sz w:val="14"/>
+                <w:szCs w:val="14"/>
+              </w:rPr>
+              <w:t xml:space="preserve">                                             </w:t>
+            </w:r>
+            <w:r>
+              <w:rPr>
+                <w:rFonts w:ascii="Century" w:hAnsi="Century"/>
+                <w:sz w:val="14"/>
+                <w:szCs w:val="14"/>
+              </w:rPr>
+              <w:t>________________________________</w:t>
             </w:r>
           </w:p>
           <w:p>
@@ -4743,7 +4464,23 @@
                 <w:sz w:val="14"/>
                 <w:szCs w:val="14"/>
               </w:rPr>
-              <w:t xml:space="preserve">                        Student’s Printed Name                                                          Student’s Signature</w:t>
+              <w:t xml:space="preserve">                        Student’s Printed Name                                                          </w:t>
+            </w:r>
+            <w:r>
+              <w:rPr>
+                <w:rFonts w:ascii="Century" w:hAnsi="Century"/>
+                <w:sz w:val="14"/>
+                <w:szCs w:val="14"/>
+              </w:rPr>
+              <w:t xml:space="preserve">                                          </w:t>
+            </w:r>
+            <w:r>
+              <w:rPr>
+                <w:rFonts w:ascii="Century" w:hAnsi="Century"/>
+                <w:sz w:val="14"/>
+                <w:szCs w:val="14"/>
+              </w:rPr>
+              <w:t>Student’s Signature</w:t>
             </w:r>
           </w:p>
           <w:p>
@@ -4770,7 +4507,33 @@
                 <w:sz w:val="14"/>
                 <w:szCs w:val="14"/>
               </w:rPr>
-              <w:t xml:space="preserve">Date Signed: {dateAcknowledged}</w:t>
+              <w:t xml:space="preserve">                                                                                                           </w:t>
+            </w:r>
+            <w:r>
+              <w:rPr>
+                <w:rFonts w:ascii="Century" w:hAnsi="Century"/>
+                <w:sz w:val="14"/>
+                <w:szCs w:val="14"/>
+              </w:rPr>
+              <w:t>Date Signed: {</w:t>
+            </w:r>
+            <w:proofErr w:type="spellStart"/>
+            <w:r>
+              <w:rPr>
+                <w:rFonts w:ascii="Century" w:hAnsi="Century"/>
+                <w:sz w:val="14"/>
+                <w:szCs w:val="14"/>
+              </w:rPr>
+              <w:t>dateAcknowledged</w:t>
+            </w:r>
+            <w:proofErr w:type="spellEnd"/>
+            <w:r>
+              <w:rPr>
+                <w:rFonts w:ascii="Century" w:hAnsi="Century"/>
+                <w:sz w:val="14"/>
+                <w:szCs w:val="14"/>
+              </w:rPr>
+              <w:t>}</w:t>
             </w:r>
           </w:p>
           <w:p>
@@ -5201,21 +4964,8 @@
               <w:szCs w:val="28"/>
               <w:lang w:val="en-US"/>
             </w:rPr>
-            <w:t xml:space="preserve">GUIDANCE AND </w:t>
+            <w:t>GUIDANCE AND COUNSELING  SECTION</w:t>
           </w:r>
-          <w:proofErr w:type="gramStart"/>
-          <w:r>
-            <w:rPr>
-              <w:rFonts w:ascii="Century" w:hAnsi="Century" w:cs="Century"/>
-              <w:b/>
-              <w:bCs/>
-              <w:sz w:val="20"/>
-              <w:szCs w:val="28"/>
-              <w:lang w:val="en-US"/>
-            </w:rPr>
-            <w:t>COUNSELING  SECTION</w:t>
-          </w:r>
-          <w:proofErr w:type="gramEnd"/>
         </w:p>
       </w:tc>
       <w:tc>

</xml_diff>

<commit_message>
Add: feature signature embbeded in generated all docx
</commit_message>
<xml_diff>
--- a/backend/templates/individual-inventory-template.docx
+++ b/backend/templates/individual-inventory-template.docx
@@ -505,45 +505,28 @@
           <w:sz w:val="16"/>
           <w:szCs w:val="16"/>
         </w:rPr>
-        <w:t>Name: {</w:t>
-      </w:r>
-      <w:proofErr w:type="spellStart"/>
-      <w:r>
-        <w:rPr>
-          <w:rFonts w:ascii="Century" w:hAnsi="Century"/>
-          <w:sz w:val="16"/>
-          <w:szCs w:val="16"/>
-        </w:rPr>
-        <w:t>fullName</w:t>
-      </w:r>
-      <w:proofErr w:type="spellEnd"/>
-      <w:r>
-        <w:rPr>
-          <w:rFonts w:ascii="Century" w:hAnsi="Century"/>
-          <w:sz w:val="16"/>
-          <w:szCs w:val="16"/>
-        </w:rPr>
-        <w:t xml:space="preserve">}         </w:t>
-      </w:r>
-      <w:r>
-        <w:rPr>
-          <w:rFonts w:ascii="Century" w:hAnsi="Century"/>
-          <w:sz w:val="16"/>
-          <w:szCs w:val="16"/>
-        </w:rPr>
-        <w:t xml:space="preserve">                                                                                                               </w:t>
-      </w:r>
-      <w:r>
-        <w:rPr>
-          <w:rFonts w:ascii="Century" w:hAnsi="Century"/>
-          <w:sz w:val="16"/>
-          <w:szCs w:val="16"/>
-        </w:rPr>
-        <w:t>Sex: {sex}   Age: {age}</w:t>
-      </w:r>
-    </w:p>
-    <w:p>
-      <w:pPr>
+        <w:t xml:space="preserve">Name: {fullName}         </w:t>
+      </w:r>
+      <w:r>
+        <w:rPr>
+          <w:rFonts w:ascii="Century" w:hAnsi="Century"/>
+          <w:sz w:val="16"/>
+          <w:szCs w:val="16"/>
+        </w:rPr>
+        <w:t xml:space="preserve">                                                                                                        </w:t>
+      </w:r>
+      <w:r>
+        <w:rPr>
+          <w:rFonts w:ascii="Century" w:hAnsi="Century"/>
+          <w:sz w:val="16"/>
+          <w:szCs w:val="16"/>
+        </w:rPr>
+        <w:t xml:space="preserve"> Sex: {sex}   Age: {age}</w:t>
+      </w:r>
+    </w:p>
+    <w:p>
+      <w:pPr>
+        <w:ind w:left="720" w:firstLine="720"/>
         <w:jc w:val="both"/>
         <w:rPr>
           <w:rFonts w:ascii="Century" w:hAnsi="Century"/>
@@ -619,67 +602,16 @@
           <w:sz w:val="16"/>
           <w:szCs w:val="16"/>
         </w:rPr>
-        <w:t>Course: {course}     Year Level: {</w:t>
-      </w:r>
-      <w:proofErr w:type="spellStart"/>
-      <w:r>
-        <w:rPr>
-          <w:rFonts w:ascii="Century" w:hAnsi="Century"/>
-          <w:sz w:val="16"/>
-          <w:szCs w:val="16"/>
-        </w:rPr>
-        <w:t>yearLevel</w:t>
-      </w:r>
-      <w:proofErr w:type="spellEnd"/>
-      <w:r>
-        <w:rPr>
-          <w:rFonts w:ascii="Century" w:hAnsi="Century"/>
-          <w:sz w:val="16"/>
-          <w:szCs w:val="16"/>
-        </w:rPr>
-        <w:t>}</w:t>
-      </w:r>
-      <w:r>
-        <w:rPr>
-          <w:rFonts w:ascii="Century" w:hAnsi="Century"/>
-          <w:sz w:val="16"/>
-          <w:szCs w:val="16"/>
-        </w:rPr>
-        <w:tab/>
-      </w:r>
-      <w:r>
-        <w:rPr>
-          <w:rFonts w:ascii="Century" w:hAnsi="Century"/>
-          <w:sz w:val="16"/>
-          <w:szCs w:val="16"/>
-        </w:rPr>
-        <w:t xml:space="preserve">                                                     </w:t>
-      </w:r>
-      <w:r>
-        <w:rPr>
-          <w:rFonts w:ascii="Century" w:hAnsi="Century"/>
-          <w:sz w:val="16"/>
-          <w:szCs w:val="16"/>
-        </w:rPr>
-        <w:t>A.Y. {</w:t>
-      </w:r>
-      <w:proofErr w:type="spellStart"/>
-      <w:r>
-        <w:rPr>
-          <w:rFonts w:ascii="Century" w:hAnsi="Century"/>
-          <w:sz w:val="16"/>
-          <w:szCs w:val="16"/>
-        </w:rPr>
-        <w:t>academicYear</w:t>
-      </w:r>
-      <w:proofErr w:type="spellEnd"/>
-      <w:r>
-        <w:rPr>
-          <w:rFonts w:ascii="Century" w:hAnsi="Century"/>
-          <w:sz w:val="16"/>
-          <w:szCs w:val="16"/>
-        </w:rPr>
-        <w:t>}     Date of Birth: {dateOfBirth}</w:t>
+        <w:t>Course: {course}     Year Level: {yearLevel}</w:t>
+      </w:r>
+      <w:r>
+        <w:rPr>
+          <w:rFonts w:ascii="Century" w:hAnsi="Century"/>
+          <w:sz w:val="16"/>
+          <w:szCs w:val="16"/>
+        </w:rPr>
+        <w:tab/>
+        <w:t>A.Y. {academicYear}     Date of Birth: {dateOfBirth}</w:t>
       </w:r>
     </w:p>
     <w:p>
@@ -722,39 +654,7 @@
           <w:sz w:val="16"/>
           <w:szCs w:val="16"/>
         </w:rPr>
-        <w:t>(Residential/BoardingHouse/Dormitory): {presentAddress}</w:t>
-      </w:r>
-      <w:r>
-        <w:rPr>
-          <w:rFonts w:ascii="Century" w:hAnsi="Century"/>
-          <w:sz w:val="16"/>
-          <w:szCs w:val="16"/>
-        </w:rPr>
-        <w:t xml:space="preserve">                         </w:t>
-      </w:r>
-      <w:r>
-        <w:rPr>
-          <w:rFonts w:ascii="Century" w:hAnsi="Century"/>
-          <w:sz w:val="16"/>
-          <w:szCs w:val="16"/>
-        </w:rPr>
-        <w:t xml:space="preserve">          </w:t>
-      </w:r>
-      <w:r>
-        <w:rPr>
-          <w:rFonts w:ascii="Century" w:hAnsi="Century"/>
-          <w:sz w:val="16"/>
-          <w:szCs w:val="16"/>
-        </w:rPr>
-        <w:t xml:space="preserve">  </w:t>
-      </w:r>
-      <w:r>
-        <w:rPr>
-          <w:rFonts w:ascii="Century" w:hAnsi="Century"/>
-          <w:sz w:val="16"/>
-          <w:szCs w:val="16"/>
-        </w:rPr>
-        <w:t xml:space="preserve"> </w:t>
+        <w:t xml:space="preserve">(Residential/BoardingHouse/Dormitory): {presentAddress} </w:t>
       </w:r>
       <w:r>
         <w:rPr>
@@ -779,48 +679,15 @@
           <w:sz w:val="16"/>
           <w:szCs w:val="16"/>
         </w:rPr>
-        <w:t>Hometown Address: {</w:t>
-      </w:r>
-      <w:proofErr w:type="spellStart"/>
-      <w:r>
-        <w:rPr>
-          <w:rFonts w:ascii="Century" w:hAnsi="Century"/>
-          <w:sz w:val="16"/>
-          <w:szCs w:val="16"/>
-        </w:rPr>
-        <w:t>hometownAddress</w:t>
-      </w:r>
-      <w:proofErr w:type="spellEnd"/>
-      <w:r>
-        <w:rPr>
-          <w:rFonts w:ascii="Century" w:hAnsi="Century"/>
-          <w:sz w:val="16"/>
-          <w:szCs w:val="16"/>
-        </w:rPr>
-        <w:t>}</w:t>
-      </w:r>
-      <w:r>
-        <w:rPr>
-          <w:rFonts w:ascii="Century" w:hAnsi="Century"/>
-          <w:sz w:val="16"/>
-          <w:szCs w:val="16"/>
-        </w:rPr>
-        <w:tab/>
-      </w:r>
-      <w:r>
-        <w:rPr>
-          <w:rFonts w:ascii="Century" w:hAnsi="Century"/>
-          <w:sz w:val="16"/>
-          <w:szCs w:val="16"/>
-        </w:rPr>
-        <w:t xml:space="preserve">                                                      </w:t>
-      </w:r>
-      <w:r>
-        <w:rPr>
-          <w:rFonts w:ascii="Century" w:hAnsi="Century"/>
-          <w:sz w:val="16"/>
-          <w:szCs w:val="16"/>
-        </w:rPr>
+        <w:t>Hometown Address: {hometownAddress}</w:t>
+      </w:r>
+      <w:r>
+        <w:rPr>
+          <w:rFonts w:ascii="Century" w:hAnsi="Century"/>
+          <w:sz w:val="16"/>
+          <w:szCs w:val="16"/>
+        </w:rPr>
+        <w:tab/>
         <w:t>Mobile No.: {mobileNo}</w:t>
       </w:r>
     </w:p>
@@ -839,73 +706,7 @@
           <w:sz w:val="16"/>
           <w:szCs w:val="16"/>
         </w:rPr>
-        <w:t>Grade Point Average: {</w:t>
-      </w:r>
-      <w:proofErr w:type="spellStart"/>
-      <w:r>
-        <w:rPr>
-          <w:rFonts w:ascii="Century" w:hAnsi="Century"/>
-          <w:sz w:val="16"/>
-          <w:szCs w:val="16"/>
-        </w:rPr>
-        <w:t>gpa</w:t>
-      </w:r>
-      <w:proofErr w:type="spellEnd"/>
-      <w:r>
-        <w:rPr>
-          <w:rFonts w:ascii="Century" w:hAnsi="Century"/>
-          <w:sz w:val="16"/>
-          <w:szCs w:val="16"/>
-        </w:rPr>
-        <w:t xml:space="preserve">}   </w:t>
-      </w:r>
-      <w:r>
-        <w:rPr>
-          <w:rFonts w:ascii="Century" w:hAnsi="Century"/>
-          <w:sz w:val="16"/>
-          <w:szCs w:val="16"/>
-        </w:rPr>
-        <w:t xml:space="preserve">   </w:t>
-      </w:r>
-      <w:r>
-        <w:rPr>
-          <w:rFonts w:ascii="Century" w:hAnsi="Century"/>
-          <w:sz w:val="16"/>
-          <w:szCs w:val="16"/>
-        </w:rPr>
-        <w:t>Religion: {religion}</w:t>
-      </w:r>
-      <w:r>
-        <w:rPr>
-          <w:rFonts w:ascii="Century" w:hAnsi="Century"/>
-          <w:sz w:val="16"/>
-          <w:szCs w:val="16"/>
-        </w:rPr>
-        <w:t xml:space="preserve">                   </w:t>
-      </w:r>
-      <w:r>
-        <w:rPr>
-          <w:rFonts w:ascii="Century" w:hAnsi="Century"/>
-          <w:sz w:val="16"/>
-          <w:szCs w:val="16"/>
-        </w:rPr>
-        <w:t xml:space="preserve"> Citizenship: {citizenship}   </w:t>
-      </w:r>
-      <w:r>
-        <w:rPr>
-          <w:rFonts w:ascii="Century" w:hAnsi="Century"/>
-          <w:sz w:val="16"/>
-          <w:szCs w:val="16"/>
-        </w:rPr>
-        <w:t xml:space="preserve">                </w:t>
-      </w:r>
-      <w:r>
-        <w:rPr>
-          <w:rFonts w:ascii="Century" w:hAnsi="Century"/>
-          <w:sz w:val="16"/>
-          <w:szCs w:val="16"/>
-        </w:rPr>
-        <w:t>Tribe: {tribe}</w:t>
+        <w:t>Grade Point Average: {gpa}   Religion: {religion}   Citizenship: {citizenship}   Tribe: {tribe}</w:t>
       </w:r>
     </w:p>
     <w:p>
@@ -941,41 +742,7 @@
           <w:sz w:val="16"/>
           <w:szCs w:val="16"/>
         </w:rPr>
-        <w:t>Person to be contacted in case of emergency: {</w:t>
-      </w:r>
-      <w:proofErr w:type="spellStart"/>
-      <w:r>
-        <w:rPr>
-          <w:rFonts w:ascii="Century" w:hAnsi="Century"/>
-          <w:sz w:val="16"/>
-          <w:szCs w:val="16"/>
-        </w:rPr>
-        <w:t>emergencyName</w:t>
-      </w:r>
-      <w:proofErr w:type="spellEnd"/>
-      <w:r>
-        <w:rPr>
-          <w:rFonts w:ascii="Century" w:hAnsi="Century"/>
-          <w:sz w:val="16"/>
-          <w:szCs w:val="16"/>
-        </w:rPr>
-        <w:t xml:space="preserve">}      </w:t>
-      </w:r>
-      <w:r>
-        <w:rPr>
-          <w:rFonts w:ascii="Century" w:hAnsi="Century"/>
-          <w:sz w:val="16"/>
-          <w:szCs w:val="16"/>
-        </w:rPr>
-        <w:t xml:space="preserve">                 </w:t>
-      </w:r>
-      <w:r>
-        <w:rPr>
-          <w:rFonts w:ascii="Century" w:hAnsi="Century"/>
-          <w:sz w:val="16"/>
-          <w:szCs w:val="16"/>
-        </w:rPr>
-        <w:t>Contact No. {emergencyContactNo}</w:t>
+        <w:t>Person to be contacted in case of emergency: {emergencyName}      Contact No. {emergencyContactNo}</w:t>
       </w:r>
     </w:p>
     <w:p>
@@ -993,59 +760,7 @@
           <w:sz w:val="16"/>
           <w:szCs w:val="16"/>
         </w:rPr>
-        <w:t>Address: {</w:t>
-      </w:r>
-      <w:proofErr w:type="spellStart"/>
-      <w:r>
-        <w:rPr>
-          <w:rFonts w:ascii="Century" w:hAnsi="Century"/>
-          <w:sz w:val="16"/>
-          <w:szCs w:val="16"/>
-        </w:rPr>
-        <w:t>emergencyAddress</w:t>
-      </w:r>
-      <w:proofErr w:type="spellEnd"/>
-      <w:r>
-        <w:rPr>
-          <w:rFonts w:ascii="Century" w:hAnsi="Century"/>
-          <w:sz w:val="16"/>
-          <w:szCs w:val="16"/>
-        </w:rPr>
-        <w:t xml:space="preserve">}     </w:t>
-      </w:r>
-      <w:r>
-        <w:rPr>
-          <w:rFonts w:ascii="Century" w:hAnsi="Century"/>
-          <w:sz w:val="16"/>
-          <w:szCs w:val="16"/>
-        </w:rPr>
-        <w:t xml:space="preserve">                                       </w:t>
-      </w:r>
-      <w:r>
-        <w:rPr>
-          <w:rFonts w:ascii="Century" w:hAnsi="Century"/>
-          <w:sz w:val="16"/>
-          <w:szCs w:val="16"/>
-        </w:rPr>
-        <w:t>Relationship: {</w:t>
-      </w:r>
-      <w:proofErr w:type="spellStart"/>
-      <w:r>
-        <w:rPr>
-          <w:rFonts w:ascii="Century" w:hAnsi="Century"/>
-          <w:sz w:val="16"/>
-          <w:szCs w:val="16"/>
-        </w:rPr>
-        <w:t>emergencyRelationship</w:t>
-      </w:r>
-      <w:proofErr w:type="spellEnd"/>
-      <w:r>
-        <w:rPr>
-          <w:rFonts w:ascii="Century" w:hAnsi="Century"/>
-          <w:sz w:val="16"/>
-          <w:szCs w:val="16"/>
-        </w:rPr>
-        <w:t>}</w:t>
+        <w:t>Address: {emergencyAddress}     Relationship: {emergencyRelationship}</w:t>
       </w:r>
     </w:p>
     <w:p>
@@ -3718,6 +3433,32 @@
       </w:pPr>
     </w:p>
     <w:p>
+      <w:r>
+        <w:rPr>
+          <w:rFonts w:ascii="Century" w:hAnsi="Century"/>
+          <w:sz w:val="16"/>
+          <w:szCs w:val="16"/>
+        </w:rPr>
+        <w:t xml:space="preserve">                                                                                         </w:t>
+      </w:r>
+      <w:r>
+        <w:rPr>
+          <w:rFonts w:ascii="Century" w:hAnsi="Century"/>
+          <w:sz w:val="16"/>
+          <w:szCs w:val="16"/>
+        </w:rPr>
+        <w:t xml:space="preserve">                                                                       </w:t>
+      </w:r>
+      <w:r>
+        <w:rPr>
+          <w:rFonts w:ascii="Century" w:hAnsi="Century"/>
+          <w:sz w:val="16"/>
+          <w:szCs w:val="16"/>
+        </w:rPr>
+        <w:t xml:space="preserve"> {%studentSignature}</w:t>
+      </w:r>
+    </w:p>
+    <w:p>
       <w:pPr>
         <w:ind w:firstLine="720"/>
         <w:rPr>
@@ -3758,72 +3499,56 @@
           <w:sz w:val="16"/>
           <w:szCs w:val="16"/>
         </w:rPr>
-        <w:t xml:space="preserve">}                                      </w:t>
-      </w:r>
-      <w:r>
-        <w:rPr>
-          <w:rFonts w:ascii="Century" w:hAnsi="Century"/>
-          <w:sz w:val="16"/>
-          <w:szCs w:val="16"/>
-        </w:rPr>
-        <w:t xml:space="preserve">      </w:t>
-      </w:r>
-      <w:r>
-        <w:rPr>
-          <w:rFonts w:ascii="Century" w:hAnsi="Century"/>
-          <w:sz w:val="16"/>
-          <w:szCs w:val="16"/>
-        </w:rPr>
-        <w:t xml:space="preserve"> </w:t>
-      </w:r>
-      <w:r>
-        <w:rPr>
-          <w:rFonts w:ascii="Century" w:hAnsi="Century"/>
-          <w:sz w:val="16"/>
-          <w:szCs w:val="16"/>
-        </w:rPr>
-        <w:t xml:space="preserve">                         </w:t>
-      </w:r>
-      <w:r>
-        <w:rPr>
-          <w:rFonts w:ascii="Century" w:hAnsi="Century"/>
-          <w:sz w:val="16"/>
-          <w:szCs w:val="16"/>
-        </w:rPr>
-        <w:t xml:space="preserve"> ________________________________</w:t>
-      </w:r>
-    </w:p>
-    <w:p>
-      <w:pPr>
-        <w:rPr>
-          <w:rFonts w:ascii="Century" w:hAnsi="Century"/>
-          <w:sz w:val="16"/>
-          <w:szCs w:val="16"/>
-        </w:rPr>
-      </w:pPr>
-      <w:r>
-        <w:rPr>
-          <w:rFonts w:ascii="Century" w:hAnsi="Century"/>
-          <w:sz w:val="16"/>
-          <w:szCs w:val="16"/>
-        </w:rPr>
-        <w:t xml:space="preserve">                        Student’s Printed Name                                                         </w:t>
-      </w:r>
-      <w:r>
-        <w:rPr>
-          <w:rFonts w:ascii="Century" w:hAnsi="Century"/>
-          <w:sz w:val="16"/>
-          <w:szCs w:val="16"/>
-        </w:rPr>
-        <w:t xml:space="preserve">                        </w:t>
-      </w:r>
-      <w:r>
-        <w:rPr>
-          <w:rFonts w:ascii="Century" w:hAnsi="Century"/>
-          <w:sz w:val="16"/>
-          <w:szCs w:val="16"/>
-        </w:rPr>
-        <w:t xml:space="preserve"> Student’s Signature</w:t>
+        <w:t xml:space="preserve">}                                     </w:t>
+      </w:r>
+      <w:r>
+        <w:rPr>
+          <w:rFonts w:ascii="Century" w:hAnsi="Century"/>
+          <w:sz w:val="16"/>
+          <w:szCs w:val="16"/>
+        </w:rPr>
+        <w:t xml:space="preserve">                                              </w:t>
+      </w:r>
+      <w:r>
+        <w:rPr>
+          <w:rFonts w:ascii="Century" w:hAnsi="Century"/>
+          <w:sz w:val="16"/>
+          <w:szCs w:val="16"/>
+        </w:rPr>
+        <w:t xml:space="preserve">   ________________________________</w:t>
+      </w:r>
+    </w:p>
+    <w:p>
+      <w:pPr>
+        <w:rPr>
+          <w:rFonts w:ascii="Century" w:hAnsi="Century"/>
+          <w:sz w:val="16"/>
+          <w:szCs w:val="16"/>
+        </w:rPr>
+      </w:pPr>
+      <w:r>
+        <w:rPr>
+          <w:rFonts w:ascii="Century" w:hAnsi="Century"/>
+          <w:sz w:val="16"/>
+          <w:szCs w:val="16"/>
+        </w:rPr>
+        <w:t xml:space="preserve">                        Student’s Printed Name                                    </w:t>
+      </w:r>
+      <w:r>
+        <w:rPr>
+          <w:rFonts w:ascii="Century" w:hAnsi="Century"/>
+          <w:sz w:val="16"/>
+          <w:szCs w:val="16"/>
+        </w:rPr>
+        <w:t xml:space="preserve">                                        </w:t>
+      </w:r>
+      <w:r>
+        <w:rPr>
+          <w:rFonts w:ascii="Century" w:hAnsi="Century"/>
+          <w:sz w:val="16"/>
+          <w:szCs w:val="16"/>
+        </w:rPr>
+        <w:t xml:space="preserve">                      Student’s Signature</w:t>
       </w:r>
     </w:p>
     <w:p>
@@ -3899,7 +3624,7 @@
           </mc:Choice>
           <mc:Fallback>
             <w:pict>
-              <v:line w14:anchorId="15EDA377" id="Straight Connector 1" o:spid="_x0000_s1026" style="position:absolute;z-index:251664384;visibility:visible;mso-wrap-style:square;mso-wrap-distance-left:9pt;mso-wrap-distance-top:0;mso-wrap-distance-right:9pt;mso-wrap-distance-bottom:0;mso-position-horizontal:absolute;mso-position-horizontal-relative:text;mso-position-vertical:absolute;mso-position-vertical-relative:text" from="5.9pt,8.05pt" to="547.6pt,8.05pt" o:gfxdata="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" strokecolor="black [3213]" strokeweight=".5pt">
+              <v:line w14:anchorId="66EEC521" id="Straight Connector 1" o:spid="_x0000_s1026" style="position:absolute;z-index:251664384;visibility:visible;mso-wrap-style:square;mso-wrap-distance-left:9pt;mso-wrap-distance-top:0;mso-wrap-distance-right:9pt;mso-wrap-distance-bottom:0;mso-position-horizontal:absolute;mso-position-horizontal-relative:text;mso-position-vertical:absolute;mso-position-vertical-relative:text" from="5.9pt,8.05pt" to="547.6pt,8.05pt" o:gfxdata="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" strokecolor="black [3213]" strokeweight=".5pt">
                 <v:stroke dashstyle="dash" joinstyle="miter"/>
               </v:line>
             </w:pict>
@@ -4376,78 +4101,13 @@
             </w:pPr>
           </w:p>
           <w:p>
-            <w:pPr>
-              <w:rPr>
-                <w:rFonts w:ascii="Century" w:hAnsi="Century"/>
-                <w:sz w:val="14"/>
-                <w:szCs w:val="14"/>
-              </w:rPr>
-            </w:pPr>
             <w:r>
               <w:rPr>
                 <w:rFonts w:ascii="Century" w:hAnsi="Century"/>
-                <w:sz w:val="14"/>
-                <w:szCs w:val="14"/>
-              </w:rPr>
-              <w:t xml:space="preserve">                         </w:t>
-            </w:r>
-            <w:r>
-              <w:rPr>
-                <w:rFonts w:ascii="Century" w:hAnsi="Century"/>
-                <w:sz w:val="14"/>
-                <w:szCs w:val="14"/>
-              </w:rPr>
-              <w:t>{</w:t>
-            </w:r>
-            <w:proofErr w:type="spellStart"/>
-            <w:r>
-              <w:rPr>
-                <w:rFonts w:ascii="Century" w:hAnsi="Century"/>
-                <w:sz w:val="14"/>
-                <w:szCs w:val="14"/>
-              </w:rPr>
-              <w:t>studentPrintedName</w:t>
-            </w:r>
-            <w:proofErr w:type="spellEnd"/>
-            <w:r>
-              <w:rPr>
-                <w:rFonts w:ascii="Century" w:hAnsi="Century"/>
-                <w:sz w:val="14"/>
-                <w:szCs w:val="14"/>
-              </w:rPr>
-              <w:t xml:space="preserve">}                                     </w:t>
-            </w:r>
-            <w:r>
-              <w:rPr>
-                <w:rFonts w:ascii="Century" w:hAnsi="Century"/>
-                <w:sz w:val="14"/>
-                <w:szCs w:val="14"/>
-              </w:rPr>
-              <w:t xml:space="preserve">      </w:t>
-            </w:r>
-            <w:r>
-              <w:rPr>
-                <w:rFonts w:ascii="Century" w:hAnsi="Century"/>
-                <w:sz w:val="14"/>
-                <w:szCs w:val="14"/>
-              </w:rPr>
-              <w:t xml:space="preserve">   </w:t>
-            </w:r>
-            <w:r>
-              <w:rPr>
-                <w:rFonts w:ascii="Century" w:hAnsi="Century"/>
-                <w:sz w:val="14"/>
-                <w:szCs w:val="14"/>
-              </w:rPr>
-              <w:t xml:space="preserve">                                             </w:t>
-            </w:r>
-            <w:r>
-              <w:rPr>
-                <w:rFonts w:ascii="Century" w:hAnsi="Century"/>
-                <w:sz w:val="14"/>
-                <w:szCs w:val="14"/>
-              </w:rPr>
-              <w:t>________________________________</w:t>
+                <w:sz w:val="16"/>
+                <w:szCs w:val="16"/>
+              </w:rPr>
+              <w:t xml:space="preserve">                                                                                          {%studentSignature}</w:t>
             </w:r>
           </w:p>
           <w:p>
@@ -4464,23 +4124,24 @@
                 <w:sz w:val="14"/>
                 <w:szCs w:val="14"/>
               </w:rPr>
-              <w:t xml:space="preserve">                        Student’s Printed Name                                                          </w:t>
+              <w:t>{studentPrintedName}                                        ________________________________</w:t>
             </w:r>
-            <w:r>
+          </w:p>
+          <w:p>
+            <w:pPr>
               <w:rPr>
                 <w:rFonts w:ascii="Century" w:hAnsi="Century"/>
                 <w:sz w:val="14"/>
                 <w:szCs w:val="14"/>
               </w:rPr>
-              <w:t xml:space="preserve">                                          </w:t>
-            </w:r>
+            </w:pPr>
             <w:r>
               <w:rPr>
                 <w:rFonts w:ascii="Century" w:hAnsi="Century"/>
                 <w:sz w:val="14"/>
                 <w:szCs w:val="14"/>
               </w:rPr>
-              <w:t>Student’s Signature</w:t>
+              <w:t xml:space="preserve">                        Student’s Printed Name                                                          Student’s Signature</w:t>
             </w:r>
           </w:p>
           <w:p>
@@ -4507,33 +4168,58 @@
                 <w:sz w:val="14"/>
                 <w:szCs w:val="14"/>
               </w:rPr>
-              <w:t xml:space="preserve">                                                                                                           </w:t>
+              <w:t>Date Signed: {dateAcknowledged}</w:t>
             </w:r>
+          </w:p>
+          <w:p/>
+          <w:p>
             <w:r>
               <w:rPr>
                 <w:rFonts w:ascii="Century" w:hAnsi="Century"/>
-                <w:sz w:val="14"/>
-                <w:szCs w:val="14"/>
-              </w:rPr>
-              <w:t>Date Signed: {</w:t>
+                <w:sz w:val="16"/>
+                <w:szCs w:val="16"/>
+              </w:rPr>
+              <w:t>Attested by:</w:t>
             </w:r>
-            <w:proofErr w:type="spellStart"/>
+          </w:p>
+          <w:p>
             <w:r>
               <w:rPr>
                 <w:rFonts w:ascii="Century" w:hAnsi="Century"/>
-                <w:sz w:val="14"/>
-                <w:szCs w:val="14"/>
-              </w:rPr>
-              <w:t>dateAcknowledged</w:t>
+                <w:sz w:val="16"/>
+                <w:szCs w:val="16"/>
+              </w:rPr>
+              <w:t>{%counselorSignature}</w:t>
             </w:r>
-            <w:proofErr w:type="spellEnd"/>
+          </w:p>
+          <w:p>
             <w:r>
               <w:rPr>
                 <w:rFonts w:ascii="Century" w:hAnsi="Century"/>
-                <w:sz w:val="14"/>
-                <w:szCs w:val="14"/>
-              </w:rPr>
-              <w:t>}</w:t>
+                <w:sz w:val="16"/>
+                <w:szCs w:val="16"/>
+              </w:rPr>
+              <w:t>____________________________________________________</w:t>
+            </w:r>
+          </w:p>
+          <w:p>
+            <w:r>
+              <w:rPr>
+                <w:rFonts w:ascii="Century" w:hAnsi="Century"/>
+                <w:sz w:val="16"/>
+                <w:szCs w:val="16"/>
+              </w:rPr>
+              <w:t>{counselorPrintedName}</w:t>
+            </w:r>
+          </w:p>
+          <w:p>
+            <w:r>
+              <w:rPr>
+                <w:rFonts w:ascii="Century" w:hAnsi="Century"/>
+                <w:sz w:val="16"/>
+                <w:szCs w:val="16"/>
+              </w:rPr>
+              <w:t>Guidance Counselor's Signature over Printed Name</w:t>
             </w:r>
           </w:p>
           <w:p>

</xml_diff>

<commit_message>
fix: improve formatting and layout in individual inventory template
</commit_message>
<xml_diff>
--- a/backend/templates/individual-inventory-template.docx
+++ b/backend/templates/individual-inventory-template.docx
@@ -505,45 +505,28 @@
           <w:sz w:val="16"/>
           <w:szCs w:val="16"/>
         </w:rPr>
-        <w:t>Name: {</w:t>
-      </w:r>
-      <w:proofErr w:type="spellStart"/>
-      <w:r>
-        <w:rPr>
-          <w:rFonts w:ascii="Century" w:hAnsi="Century"/>
-          <w:sz w:val="16"/>
-          <w:szCs w:val="16"/>
-        </w:rPr>
-        <w:t>fullName</w:t>
-      </w:r>
-      <w:proofErr w:type="spellEnd"/>
-      <w:r>
-        <w:rPr>
-          <w:rFonts w:ascii="Century" w:hAnsi="Century"/>
-          <w:sz w:val="16"/>
-          <w:szCs w:val="16"/>
-        </w:rPr>
-        <w:t xml:space="preserve">}         </w:t>
-      </w:r>
-      <w:r>
-        <w:rPr>
-          <w:rFonts w:ascii="Century" w:hAnsi="Century"/>
-          <w:sz w:val="16"/>
-          <w:szCs w:val="16"/>
-        </w:rPr>
-        <w:t xml:space="preserve">                                                                                                               </w:t>
-      </w:r>
-      <w:r>
-        <w:rPr>
-          <w:rFonts w:ascii="Century" w:hAnsi="Century"/>
-          <w:sz w:val="16"/>
-          <w:szCs w:val="16"/>
-        </w:rPr>
-        <w:t>Sex: {sex}   Age: {age}</w:t>
-      </w:r>
-    </w:p>
-    <w:p>
-      <w:pPr>
+        <w:t xml:space="preserve">Name: {fullName}         </w:t>
+      </w:r>
+      <w:r>
+        <w:rPr>
+          <w:rFonts w:ascii="Century" w:hAnsi="Century"/>
+          <w:sz w:val="16"/>
+          <w:szCs w:val="16"/>
+        </w:rPr>
+        <w:t xml:space="preserve">                                                                                                        </w:t>
+      </w:r>
+      <w:r>
+        <w:rPr>
+          <w:rFonts w:ascii="Century" w:hAnsi="Century"/>
+          <w:sz w:val="16"/>
+          <w:szCs w:val="16"/>
+        </w:rPr>
+        <w:t xml:space="preserve"> Sex: {sex}   Age: {age}</w:t>
+      </w:r>
+    </w:p>
+    <w:p>
+      <w:pPr>
+        <w:ind w:left="720" w:firstLine="720"/>
         <w:jc w:val="both"/>
         <w:rPr>
           <w:rFonts w:ascii="Century" w:hAnsi="Century"/>
@@ -619,67 +602,16 @@
           <w:sz w:val="16"/>
           <w:szCs w:val="16"/>
         </w:rPr>
-        <w:t>Course: {course}     Year Level: {</w:t>
-      </w:r>
-      <w:proofErr w:type="spellStart"/>
-      <w:r>
-        <w:rPr>
-          <w:rFonts w:ascii="Century" w:hAnsi="Century"/>
-          <w:sz w:val="16"/>
-          <w:szCs w:val="16"/>
-        </w:rPr>
-        <w:t>yearLevel</w:t>
-      </w:r>
-      <w:proofErr w:type="spellEnd"/>
-      <w:r>
-        <w:rPr>
-          <w:rFonts w:ascii="Century" w:hAnsi="Century"/>
-          <w:sz w:val="16"/>
-          <w:szCs w:val="16"/>
-        </w:rPr>
-        <w:t>}</w:t>
-      </w:r>
-      <w:r>
-        <w:rPr>
-          <w:rFonts w:ascii="Century" w:hAnsi="Century"/>
-          <w:sz w:val="16"/>
-          <w:szCs w:val="16"/>
-        </w:rPr>
-        <w:tab/>
-      </w:r>
-      <w:r>
-        <w:rPr>
-          <w:rFonts w:ascii="Century" w:hAnsi="Century"/>
-          <w:sz w:val="16"/>
-          <w:szCs w:val="16"/>
-        </w:rPr>
-        <w:t xml:space="preserve">                                                     </w:t>
-      </w:r>
-      <w:r>
-        <w:rPr>
-          <w:rFonts w:ascii="Century" w:hAnsi="Century"/>
-          <w:sz w:val="16"/>
-          <w:szCs w:val="16"/>
-        </w:rPr>
-        <w:t>A.Y. {</w:t>
-      </w:r>
-      <w:proofErr w:type="spellStart"/>
-      <w:r>
-        <w:rPr>
-          <w:rFonts w:ascii="Century" w:hAnsi="Century"/>
-          <w:sz w:val="16"/>
-          <w:szCs w:val="16"/>
-        </w:rPr>
-        <w:t>academicYear</w:t>
-      </w:r>
-      <w:proofErr w:type="spellEnd"/>
-      <w:r>
-        <w:rPr>
-          <w:rFonts w:ascii="Century" w:hAnsi="Century"/>
-          <w:sz w:val="16"/>
-          <w:szCs w:val="16"/>
-        </w:rPr>
-        <w:t>}     Date of Birth: {dateOfBirth}</w:t>
+        <w:t>Course: {course}     Year Level: {yearLevel}</w:t>
+      </w:r>
+      <w:r>
+        <w:rPr>
+          <w:rFonts w:ascii="Century" w:hAnsi="Century"/>
+          <w:sz w:val="16"/>
+          <w:szCs w:val="16"/>
+        </w:rPr>
+        <w:tab/>
+        <w:t>A.Y. {academicYear}     Date of Birth: {dateOfBirth}</w:t>
       </w:r>
     </w:p>
     <w:p>
@@ -722,39 +654,7 @@
           <w:sz w:val="16"/>
           <w:szCs w:val="16"/>
         </w:rPr>
-        <w:t>(Residential/BoardingHouse/Dormitory): {presentAddress}</w:t>
-      </w:r>
-      <w:r>
-        <w:rPr>
-          <w:rFonts w:ascii="Century" w:hAnsi="Century"/>
-          <w:sz w:val="16"/>
-          <w:szCs w:val="16"/>
-        </w:rPr>
-        <w:t xml:space="preserve">                         </w:t>
-      </w:r>
-      <w:r>
-        <w:rPr>
-          <w:rFonts w:ascii="Century" w:hAnsi="Century"/>
-          <w:sz w:val="16"/>
-          <w:szCs w:val="16"/>
-        </w:rPr>
-        <w:t xml:space="preserve">          </w:t>
-      </w:r>
-      <w:r>
-        <w:rPr>
-          <w:rFonts w:ascii="Century" w:hAnsi="Century"/>
-          <w:sz w:val="16"/>
-          <w:szCs w:val="16"/>
-        </w:rPr>
-        <w:t xml:space="preserve">  </w:t>
-      </w:r>
-      <w:r>
-        <w:rPr>
-          <w:rFonts w:ascii="Century" w:hAnsi="Century"/>
-          <w:sz w:val="16"/>
-          <w:szCs w:val="16"/>
-        </w:rPr>
-        <w:t xml:space="preserve"> </w:t>
+        <w:t xml:space="preserve">(Residential/BoardingHouse/Dormitory): {presentAddress} </w:t>
       </w:r>
       <w:r>
         <w:rPr>
@@ -779,48 +679,15 @@
           <w:sz w:val="16"/>
           <w:szCs w:val="16"/>
         </w:rPr>
-        <w:t>Hometown Address: {</w:t>
-      </w:r>
-      <w:proofErr w:type="spellStart"/>
-      <w:r>
-        <w:rPr>
-          <w:rFonts w:ascii="Century" w:hAnsi="Century"/>
-          <w:sz w:val="16"/>
-          <w:szCs w:val="16"/>
-        </w:rPr>
-        <w:t>hometownAddress</w:t>
-      </w:r>
-      <w:proofErr w:type="spellEnd"/>
-      <w:r>
-        <w:rPr>
-          <w:rFonts w:ascii="Century" w:hAnsi="Century"/>
-          <w:sz w:val="16"/>
-          <w:szCs w:val="16"/>
-        </w:rPr>
-        <w:t>}</w:t>
-      </w:r>
-      <w:r>
-        <w:rPr>
-          <w:rFonts w:ascii="Century" w:hAnsi="Century"/>
-          <w:sz w:val="16"/>
-          <w:szCs w:val="16"/>
-        </w:rPr>
-        <w:tab/>
-      </w:r>
-      <w:r>
-        <w:rPr>
-          <w:rFonts w:ascii="Century" w:hAnsi="Century"/>
-          <w:sz w:val="16"/>
-          <w:szCs w:val="16"/>
-        </w:rPr>
-        <w:t xml:space="preserve">                                                      </w:t>
-      </w:r>
-      <w:r>
-        <w:rPr>
-          <w:rFonts w:ascii="Century" w:hAnsi="Century"/>
-          <w:sz w:val="16"/>
-          <w:szCs w:val="16"/>
-        </w:rPr>
+        <w:t>Hometown Address: {hometownAddress}</w:t>
+      </w:r>
+      <w:r>
+        <w:rPr>
+          <w:rFonts w:ascii="Century" w:hAnsi="Century"/>
+          <w:sz w:val="16"/>
+          <w:szCs w:val="16"/>
+        </w:rPr>
+        <w:tab/>
         <w:t>Mobile No.: {mobileNo}</w:t>
       </w:r>
     </w:p>
@@ -839,73 +706,7 @@
           <w:sz w:val="16"/>
           <w:szCs w:val="16"/>
         </w:rPr>
-        <w:t>Grade Point Average: {</w:t>
-      </w:r>
-      <w:proofErr w:type="spellStart"/>
-      <w:r>
-        <w:rPr>
-          <w:rFonts w:ascii="Century" w:hAnsi="Century"/>
-          <w:sz w:val="16"/>
-          <w:szCs w:val="16"/>
-        </w:rPr>
-        <w:t>gpa</w:t>
-      </w:r>
-      <w:proofErr w:type="spellEnd"/>
-      <w:r>
-        <w:rPr>
-          <w:rFonts w:ascii="Century" w:hAnsi="Century"/>
-          <w:sz w:val="16"/>
-          <w:szCs w:val="16"/>
-        </w:rPr>
-        <w:t xml:space="preserve">}   </w:t>
-      </w:r>
-      <w:r>
-        <w:rPr>
-          <w:rFonts w:ascii="Century" w:hAnsi="Century"/>
-          <w:sz w:val="16"/>
-          <w:szCs w:val="16"/>
-        </w:rPr>
-        <w:t xml:space="preserve">   </w:t>
-      </w:r>
-      <w:r>
-        <w:rPr>
-          <w:rFonts w:ascii="Century" w:hAnsi="Century"/>
-          <w:sz w:val="16"/>
-          <w:szCs w:val="16"/>
-        </w:rPr>
-        <w:t>Religion: {religion}</w:t>
-      </w:r>
-      <w:r>
-        <w:rPr>
-          <w:rFonts w:ascii="Century" w:hAnsi="Century"/>
-          <w:sz w:val="16"/>
-          <w:szCs w:val="16"/>
-        </w:rPr>
-        <w:t xml:space="preserve">                   </w:t>
-      </w:r>
-      <w:r>
-        <w:rPr>
-          <w:rFonts w:ascii="Century" w:hAnsi="Century"/>
-          <w:sz w:val="16"/>
-          <w:szCs w:val="16"/>
-        </w:rPr>
-        <w:t xml:space="preserve"> Citizenship: {citizenship}   </w:t>
-      </w:r>
-      <w:r>
-        <w:rPr>
-          <w:rFonts w:ascii="Century" w:hAnsi="Century"/>
-          <w:sz w:val="16"/>
-          <w:szCs w:val="16"/>
-        </w:rPr>
-        <w:t xml:space="preserve">                </w:t>
-      </w:r>
-      <w:r>
-        <w:rPr>
-          <w:rFonts w:ascii="Century" w:hAnsi="Century"/>
-          <w:sz w:val="16"/>
-          <w:szCs w:val="16"/>
-        </w:rPr>
-        <w:t>Tribe: {tribe}</w:t>
+        <w:t>Grade Point Average: {gpa}   Religion: {religion}   Citizenship: {citizenship}   Tribe: {tribe}</w:t>
       </w:r>
     </w:p>
     <w:p>
@@ -941,41 +742,7 @@
           <w:sz w:val="16"/>
           <w:szCs w:val="16"/>
         </w:rPr>
-        <w:t>Person to be contacted in case of emergency: {</w:t>
-      </w:r>
-      <w:proofErr w:type="spellStart"/>
-      <w:r>
-        <w:rPr>
-          <w:rFonts w:ascii="Century" w:hAnsi="Century"/>
-          <w:sz w:val="16"/>
-          <w:szCs w:val="16"/>
-        </w:rPr>
-        <w:t>emergencyName</w:t>
-      </w:r>
-      <w:proofErr w:type="spellEnd"/>
-      <w:r>
-        <w:rPr>
-          <w:rFonts w:ascii="Century" w:hAnsi="Century"/>
-          <w:sz w:val="16"/>
-          <w:szCs w:val="16"/>
-        </w:rPr>
-        <w:t xml:space="preserve">}      </w:t>
-      </w:r>
-      <w:r>
-        <w:rPr>
-          <w:rFonts w:ascii="Century" w:hAnsi="Century"/>
-          <w:sz w:val="16"/>
-          <w:szCs w:val="16"/>
-        </w:rPr>
-        <w:t xml:space="preserve">                 </w:t>
-      </w:r>
-      <w:r>
-        <w:rPr>
-          <w:rFonts w:ascii="Century" w:hAnsi="Century"/>
-          <w:sz w:val="16"/>
-          <w:szCs w:val="16"/>
-        </w:rPr>
-        <w:t>Contact No. {emergencyContactNo}</w:t>
+        <w:t>Person to be contacted in case of emergency: {emergencyName}      Contact No. {emergencyContactNo}</w:t>
       </w:r>
     </w:p>
     <w:p>
@@ -993,59 +760,7 @@
           <w:sz w:val="16"/>
           <w:szCs w:val="16"/>
         </w:rPr>
-        <w:t>Address: {</w:t>
-      </w:r>
-      <w:proofErr w:type="spellStart"/>
-      <w:r>
-        <w:rPr>
-          <w:rFonts w:ascii="Century" w:hAnsi="Century"/>
-          <w:sz w:val="16"/>
-          <w:szCs w:val="16"/>
-        </w:rPr>
-        <w:t>emergencyAddress</w:t>
-      </w:r>
-      <w:proofErr w:type="spellEnd"/>
-      <w:r>
-        <w:rPr>
-          <w:rFonts w:ascii="Century" w:hAnsi="Century"/>
-          <w:sz w:val="16"/>
-          <w:szCs w:val="16"/>
-        </w:rPr>
-        <w:t xml:space="preserve">}     </w:t>
-      </w:r>
-      <w:r>
-        <w:rPr>
-          <w:rFonts w:ascii="Century" w:hAnsi="Century"/>
-          <w:sz w:val="16"/>
-          <w:szCs w:val="16"/>
-        </w:rPr>
-        <w:t xml:space="preserve">                                       </w:t>
-      </w:r>
-      <w:r>
-        <w:rPr>
-          <w:rFonts w:ascii="Century" w:hAnsi="Century"/>
-          <w:sz w:val="16"/>
-          <w:szCs w:val="16"/>
-        </w:rPr>
-        <w:t>Relationship: {</w:t>
-      </w:r>
-      <w:proofErr w:type="spellStart"/>
-      <w:r>
-        <w:rPr>
-          <w:rFonts w:ascii="Century" w:hAnsi="Century"/>
-          <w:sz w:val="16"/>
-          <w:szCs w:val="16"/>
-        </w:rPr>
-        <w:t>emergencyRelationship</w:t>
-      </w:r>
-      <w:proofErr w:type="spellEnd"/>
-      <w:r>
-        <w:rPr>
-          <w:rFonts w:ascii="Century" w:hAnsi="Century"/>
-          <w:sz w:val="16"/>
-          <w:szCs w:val="16"/>
-        </w:rPr>
-        <w:t>}</w:t>
+        <w:t>Address: {emergencyAddress}     Relationship: {emergencyRelationship}</w:t>
       </w:r>
     </w:p>
     <w:p>
@@ -3718,6 +3433,32 @@
       </w:pPr>
     </w:p>
     <w:p>
+      <w:r>
+        <w:rPr>
+          <w:rFonts w:ascii="Century" w:hAnsi="Century"/>
+          <w:sz w:val="16"/>
+          <w:szCs w:val="16"/>
+        </w:rPr>
+        <w:t xml:space="preserve">                                                                                         </w:t>
+      </w:r>
+      <w:r>
+        <w:rPr>
+          <w:rFonts w:ascii="Century" w:hAnsi="Century"/>
+          <w:sz w:val="16"/>
+          <w:szCs w:val="16"/>
+        </w:rPr>
+        <w:t xml:space="preserve">                                                                       </w:t>
+      </w:r>
+      <w:r>
+        <w:rPr>
+          <w:rFonts w:ascii="Century" w:hAnsi="Century"/>
+          <w:sz w:val="16"/>
+          <w:szCs w:val="16"/>
+        </w:rPr>
+        <w:t xml:space="preserve"> {%studentSignature}</w:t>
+      </w:r>
+    </w:p>
+    <w:p>
       <w:pPr>
         <w:ind w:firstLine="720"/>
         <w:rPr>
@@ -3758,72 +3499,56 @@
           <w:sz w:val="16"/>
           <w:szCs w:val="16"/>
         </w:rPr>
-        <w:t xml:space="preserve">}                                      </w:t>
-      </w:r>
-      <w:r>
-        <w:rPr>
-          <w:rFonts w:ascii="Century" w:hAnsi="Century"/>
-          <w:sz w:val="16"/>
-          <w:szCs w:val="16"/>
-        </w:rPr>
-        <w:t xml:space="preserve">      </w:t>
-      </w:r>
-      <w:r>
-        <w:rPr>
-          <w:rFonts w:ascii="Century" w:hAnsi="Century"/>
-          <w:sz w:val="16"/>
-          <w:szCs w:val="16"/>
-        </w:rPr>
-        <w:t xml:space="preserve"> </w:t>
-      </w:r>
-      <w:r>
-        <w:rPr>
-          <w:rFonts w:ascii="Century" w:hAnsi="Century"/>
-          <w:sz w:val="16"/>
-          <w:szCs w:val="16"/>
-        </w:rPr>
-        <w:t xml:space="preserve">                         </w:t>
-      </w:r>
-      <w:r>
-        <w:rPr>
-          <w:rFonts w:ascii="Century" w:hAnsi="Century"/>
-          <w:sz w:val="16"/>
-          <w:szCs w:val="16"/>
-        </w:rPr>
-        <w:t xml:space="preserve"> ________________________________</w:t>
-      </w:r>
-    </w:p>
-    <w:p>
-      <w:pPr>
-        <w:rPr>
-          <w:rFonts w:ascii="Century" w:hAnsi="Century"/>
-          <w:sz w:val="16"/>
-          <w:szCs w:val="16"/>
-        </w:rPr>
-      </w:pPr>
-      <w:r>
-        <w:rPr>
-          <w:rFonts w:ascii="Century" w:hAnsi="Century"/>
-          <w:sz w:val="16"/>
-          <w:szCs w:val="16"/>
-        </w:rPr>
-        <w:t xml:space="preserve">                        Student’s Printed Name                                                         </w:t>
-      </w:r>
-      <w:r>
-        <w:rPr>
-          <w:rFonts w:ascii="Century" w:hAnsi="Century"/>
-          <w:sz w:val="16"/>
-          <w:szCs w:val="16"/>
-        </w:rPr>
-        <w:t xml:space="preserve">                        </w:t>
-      </w:r>
-      <w:r>
-        <w:rPr>
-          <w:rFonts w:ascii="Century" w:hAnsi="Century"/>
-          <w:sz w:val="16"/>
-          <w:szCs w:val="16"/>
-        </w:rPr>
-        <w:t xml:space="preserve"> Student’s Signature</w:t>
+        <w:t xml:space="preserve">}                                     </w:t>
+      </w:r>
+      <w:r>
+        <w:rPr>
+          <w:rFonts w:ascii="Century" w:hAnsi="Century"/>
+          <w:sz w:val="16"/>
+          <w:szCs w:val="16"/>
+        </w:rPr>
+        <w:t xml:space="preserve">                                              </w:t>
+      </w:r>
+      <w:r>
+        <w:rPr>
+          <w:rFonts w:ascii="Century" w:hAnsi="Century"/>
+          <w:sz w:val="16"/>
+          <w:szCs w:val="16"/>
+        </w:rPr>
+        <w:t xml:space="preserve">   ________________________________</w:t>
+      </w:r>
+    </w:p>
+    <w:p>
+      <w:pPr>
+        <w:rPr>
+          <w:rFonts w:ascii="Century" w:hAnsi="Century"/>
+          <w:sz w:val="16"/>
+          <w:szCs w:val="16"/>
+        </w:rPr>
+      </w:pPr>
+      <w:r>
+        <w:rPr>
+          <w:rFonts w:ascii="Century" w:hAnsi="Century"/>
+          <w:sz w:val="16"/>
+          <w:szCs w:val="16"/>
+        </w:rPr>
+        <w:t xml:space="preserve">                        Student’s Printed Name                                    </w:t>
+      </w:r>
+      <w:r>
+        <w:rPr>
+          <w:rFonts w:ascii="Century" w:hAnsi="Century"/>
+          <w:sz w:val="16"/>
+          <w:szCs w:val="16"/>
+        </w:rPr>
+        <w:t xml:space="preserve">                                        </w:t>
+      </w:r>
+      <w:r>
+        <w:rPr>
+          <w:rFonts w:ascii="Century" w:hAnsi="Century"/>
+          <w:sz w:val="16"/>
+          <w:szCs w:val="16"/>
+        </w:rPr>
+        <w:t xml:space="preserve">                      Student’s Signature</w:t>
       </w:r>
     </w:p>
     <w:p>
@@ -3899,7 +3624,7 @@
           </mc:Choice>
           <mc:Fallback>
             <w:pict>
-              <v:line w14:anchorId="15EDA377" id="Straight Connector 1" o:spid="_x0000_s1026" style="position:absolute;z-index:251664384;visibility:visible;mso-wrap-style:square;mso-wrap-distance-left:9pt;mso-wrap-distance-top:0;mso-wrap-distance-right:9pt;mso-wrap-distance-bottom:0;mso-position-horizontal:absolute;mso-position-horizontal-relative:text;mso-position-vertical:absolute;mso-position-vertical-relative:text" from="5.9pt,8.05pt" to="547.6pt,8.05pt" o:gfxdata="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" strokecolor="black [3213]" strokeweight=".5pt">
+              <v:line w14:anchorId="66EEC521" id="Straight Connector 1" o:spid="_x0000_s1026" style="position:absolute;z-index:251664384;visibility:visible;mso-wrap-style:square;mso-wrap-distance-left:9pt;mso-wrap-distance-top:0;mso-wrap-distance-right:9pt;mso-wrap-distance-bottom:0;mso-position-horizontal:absolute;mso-position-horizontal-relative:text;mso-position-vertical:absolute;mso-position-vertical-relative:text" from="5.9pt,8.05pt" to="547.6pt,8.05pt" o:gfxdata="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" strokecolor="black [3213]" strokeweight=".5pt">
                 <v:stroke dashstyle="dash" joinstyle="miter"/>
               </v:line>
             </w:pict>
@@ -4376,78 +4101,13 @@
             </w:pPr>
           </w:p>
           <w:p>
-            <w:pPr>
-              <w:rPr>
-                <w:rFonts w:ascii="Century" w:hAnsi="Century"/>
-                <w:sz w:val="14"/>
-                <w:szCs w:val="14"/>
-              </w:rPr>
-            </w:pPr>
             <w:r>
               <w:rPr>
                 <w:rFonts w:ascii="Century" w:hAnsi="Century"/>
-                <w:sz w:val="14"/>
-                <w:szCs w:val="14"/>
-              </w:rPr>
-              <w:t xml:space="preserve">                         </w:t>
-            </w:r>
-            <w:r>
-              <w:rPr>
-                <w:rFonts w:ascii="Century" w:hAnsi="Century"/>
-                <w:sz w:val="14"/>
-                <w:szCs w:val="14"/>
-              </w:rPr>
-              <w:t>{</w:t>
-            </w:r>
-            <w:proofErr w:type="spellStart"/>
-            <w:r>
-              <w:rPr>
-                <w:rFonts w:ascii="Century" w:hAnsi="Century"/>
-                <w:sz w:val="14"/>
-                <w:szCs w:val="14"/>
-              </w:rPr>
-              <w:t>studentPrintedName</w:t>
-            </w:r>
-            <w:proofErr w:type="spellEnd"/>
-            <w:r>
-              <w:rPr>
-                <w:rFonts w:ascii="Century" w:hAnsi="Century"/>
-                <w:sz w:val="14"/>
-                <w:szCs w:val="14"/>
-              </w:rPr>
-              <w:t xml:space="preserve">}                                     </w:t>
-            </w:r>
-            <w:r>
-              <w:rPr>
-                <w:rFonts w:ascii="Century" w:hAnsi="Century"/>
-                <w:sz w:val="14"/>
-                <w:szCs w:val="14"/>
-              </w:rPr>
-              <w:t xml:space="preserve">      </w:t>
-            </w:r>
-            <w:r>
-              <w:rPr>
-                <w:rFonts w:ascii="Century" w:hAnsi="Century"/>
-                <w:sz w:val="14"/>
-                <w:szCs w:val="14"/>
-              </w:rPr>
-              <w:t xml:space="preserve">   </w:t>
-            </w:r>
-            <w:r>
-              <w:rPr>
-                <w:rFonts w:ascii="Century" w:hAnsi="Century"/>
-                <w:sz w:val="14"/>
-                <w:szCs w:val="14"/>
-              </w:rPr>
-              <w:t xml:space="preserve">                                             </w:t>
-            </w:r>
-            <w:r>
-              <w:rPr>
-                <w:rFonts w:ascii="Century" w:hAnsi="Century"/>
-                <w:sz w:val="14"/>
-                <w:szCs w:val="14"/>
-              </w:rPr>
-              <w:t>________________________________</w:t>
+                <w:sz w:val="16"/>
+                <w:szCs w:val="16"/>
+              </w:rPr>
+              <w:t xml:space="preserve">                                                                                          {%studentSignature}</w:t>
             </w:r>
           </w:p>
           <w:p>
@@ -4464,23 +4124,24 @@
                 <w:sz w:val="14"/>
                 <w:szCs w:val="14"/>
               </w:rPr>
-              <w:t xml:space="preserve">                        Student’s Printed Name                                                          </w:t>
+              <w:t>{studentPrintedName}                                        ________________________________</w:t>
             </w:r>
-            <w:r>
+          </w:p>
+          <w:p>
+            <w:pPr>
               <w:rPr>
                 <w:rFonts w:ascii="Century" w:hAnsi="Century"/>
                 <w:sz w:val="14"/>
                 <w:szCs w:val="14"/>
               </w:rPr>
-              <w:t xml:space="preserve">                                          </w:t>
-            </w:r>
+            </w:pPr>
             <w:r>
               <w:rPr>
                 <w:rFonts w:ascii="Century" w:hAnsi="Century"/>
                 <w:sz w:val="14"/>
                 <w:szCs w:val="14"/>
               </w:rPr>
-              <w:t>Student’s Signature</w:t>
+              <w:t xml:space="preserve">                        Student’s Printed Name                                                          Student’s Signature</w:t>
             </w:r>
           </w:p>
           <w:p>
@@ -4507,33 +4168,58 @@
                 <w:sz w:val="14"/>
                 <w:szCs w:val="14"/>
               </w:rPr>
-              <w:t xml:space="preserve">                                                                                                           </w:t>
+              <w:t>Date Signed: {dateAcknowledged}</w:t>
             </w:r>
+          </w:p>
+          <w:p/>
+          <w:p>
             <w:r>
               <w:rPr>
                 <w:rFonts w:ascii="Century" w:hAnsi="Century"/>
-                <w:sz w:val="14"/>
-                <w:szCs w:val="14"/>
-              </w:rPr>
-              <w:t>Date Signed: {</w:t>
+                <w:sz w:val="16"/>
+                <w:szCs w:val="16"/>
+              </w:rPr>
+              <w:t>Attested by:</w:t>
             </w:r>
-            <w:proofErr w:type="spellStart"/>
+          </w:p>
+          <w:p>
             <w:r>
               <w:rPr>
                 <w:rFonts w:ascii="Century" w:hAnsi="Century"/>
-                <w:sz w:val="14"/>
-                <w:szCs w:val="14"/>
-              </w:rPr>
-              <w:t>dateAcknowledged</w:t>
+                <w:sz w:val="16"/>
+                <w:szCs w:val="16"/>
+              </w:rPr>
+              <w:t>{%counselorSignature}</w:t>
             </w:r>
-            <w:proofErr w:type="spellEnd"/>
+          </w:p>
+          <w:p>
             <w:r>
               <w:rPr>
                 <w:rFonts w:ascii="Century" w:hAnsi="Century"/>
-                <w:sz w:val="14"/>
-                <w:szCs w:val="14"/>
-              </w:rPr>
-              <w:t>}</w:t>
+                <w:sz w:val="16"/>
+                <w:szCs w:val="16"/>
+              </w:rPr>
+              <w:t>____________________________________________________</w:t>
+            </w:r>
+          </w:p>
+          <w:p>
+            <w:r>
+              <w:rPr>
+                <w:rFonts w:ascii="Century" w:hAnsi="Century"/>
+                <w:sz w:val="16"/>
+                <w:szCs w:val="16"/>
+              </w:rPr>
+              <w:t>{counselorPrintedName}</w:t>
+            </w:r>
+          </w:p>
+          <w:p>
+            <w:r>
+              <w:rPr>
+                <w:rFonts w:ascii="Century" w:hAnsi="Century"/>
+                <w:sz w:val="16"/>
+                <w:szCs w:val="16"/>
+              </w:rPr>
+              <w:t>Guidance Counselor's Signature over Printed Name</w:t>
             </w:r>
           </w:p>
           <w:p>

</xml_diff>

<commit_message>
feat: implement student authentication system, landing page components, and user registration workflow
</commit_message>
<xml_diff>
--- a/backend/templates/individual-inventory-template.docx
+++ b/backend/templates/individual-inventory-template.docx
@@ -493,35 +493,20 @@
     </w:p>
     <w:p>
       <w:pPr>
-        <w:rPr>
-          <w:rFonts w:ascii="Century" w:hAnsi="Century"/>
-          <w:sz w:val="16"/>
-          <w:szCs w:val="16"/>
-        </w:rPr>
-      </w:pPr>
-      <w:r>
-        <w:rPr>
-          <w:rFonts w:ascii="Century" w:hAnsi="Century"/>
-          <w:sz w:val="16"/>
-          <w:szCs w:val="16"/>
-        </w:rPr>
-        <w:t xml:space="preserve">Name: {fullName}         </w:t>
-      </w:r>
-      <w:r>
-        <w:rPr>
-          <w:rFonts w:ascii="Century" w:hAnsi="Century"/>
-          <w:sz w:val="16"/>
-          <w:szCs w:val="16"/>
-        </w:rPr>
-        <w:t xml:space="preserve">                                                                                                        </w:t>
-      </w:r>
-      <w:r>
-        <w:rPr>
-          <w:rFonts w:ascii="Century" w:hAnsi="Century"/>
-          <w:sz w:val="16"/>
-          <w:szCs w:val="16"/>
-        </w:rPr>
-        <w:t xml:space="preserve"> Sex: {sex}   Age: {age}</w:t>
+        <w:jc w:val="right"/>
+        <w:rPr>
+          <w:rFonts w:ascii="Century" w:hAnsi="Century"/>
+          <w:sz w:val="16"/>
+          <w:szCs w:val="16"/>
+        </w:rPr>
+      </w:pPr>
+      <w:r>
+        <w:rPr>
+          <w:rFonts w:ascii="Century" w:hAnsi="Century"/>
+          <w:sz w:val="16"/>
+          <w:szCs w:val="16"/>
+        </w:rPr>
+        <w:t xml:space="preserve">Name: {fullName}          Sex: {sex}   Age: {age}</w:t>
       </w:r>
     </w:p>
     <w:p>
@@ -557,7 +542,61 @@
           <w:szCs w:val="16"/>
         </w:rPr>
         <w:tab/>
-        <w:t xml:space="preserve">     (First Name)                (Middle Name)</w:t>
+        <w:t xml:space="preserve">  </w:t>
+      </w:r>
+      <w:proofErr w:type="gramStart"/>
+      <w:r>
+        <w:rPr>
+          <w:rFonts w:ascii="Century" w:hAnsi="Century"/>
+          <w:sz w:val="16"/>
+          <w:szCs w:val="16"/>
+        </w:rPr>
+        <w:t xml:space="preserve">   (</w:t>
+      </w:r>
+      <w:proofErr w:type="gramEnd"/>
+      <w:r>
+        <w:rPr>
+          <w:rFonts w:ascii="Century" w:hAnsi="Century"/>
+          <w:sz w:val="16"/>
+          <w:szCs w:val="16"/>
+        </w:rPr>
+        <w:t xml:space="preserve">First </w:t>
+      </w:r>
+      <w:proofErr w:type="gramStart"/>
+      <w:r>
+        <w:rPr>
+          <w:rFonts w:ascii="Century" w:hAnsi="Century"/>
+          <w:sz w:val="16"/>
+          <w:szCs w:val="16"/>
+        </w:rPr>
+        <w:t xml:space="preserve">Name)   </w:t>
+      </w:r>
+      <w:proofErr w:type="gramEnd"/>
+      <w:r>
+        <w:rPr>
+          <w:rFonts w:ascii="Century" w:hAnsi="Century"/>
+          <w:sz w:val="16"/>
+          <w:szCs w:val="16"/>
+        </w:rPr>
+        <w:t xml:space="preserve">          </w:t>
+      </w:r>
+      <w:proofErr w:type="gramStart"/>
+      <w:r>
+        <w:rPr>
+          <w:rFonts w:ascii="Century" w:hAnsi="Century"/>
+          <w:sz w:val="16"/>
+          <w:szCs w:val="16"/>
+        </w:rPr>
+        <w:t xml:space="preserve">   (</w:t>
+      </w:r>
+      <w:proofErr w:type="gramEnd"/>
+      <w:r>
+        <w:rPr>
+          <w:rFonts w:ascii="Century" w:hAnsi="Century"/>
+          <w:sz w:val="16"/>
+          <w:szCs w:val="16"/>
+        </w:rPr>
+        <w:t>Middle Name)</w:t>
       </w:r>
       <w:r>
         <w:rPr>
@@ -584,7 +623,122 @@
           <w:sz w:val="16"/>
           <w:szCs w:val="16"/>
         </w:rPr>
-        <w:t>Civil Status: {csSingle} Single {csMarried}Married {csSeparated}Separated {csWidow}Widow {csSoloParent}Solo Parent</w:t>
+        <w:t xml:space="preserve">Civil Status: </w:t>
+      </w:r>
+      <w:r>
+        <w:rPr>
+          <w:rFonts w:ascii="Century" w:hAnsi="Century"/>
+          <w:sz w:val="16"/>
+          <w:szCs w:val="16"/>
+        </w:rPr>
+        <w:r>
+          <w:rPr>
+            <w:rFonts w:ascii="Century" w:hAnsi="Century"/>
+            <w:sz w:val="16"/>
+            <w:szCs w:val="16"/>
+          </w:rPr>
+          <w:t xml:space="preserve">{csSingle}</w:t>
+        </w:r>
+      </w:r>
+      <w:r>
+        <w:rPr>
+          <w:rFonts w:ascii="Century" w:hAnsi="Century"/>
+          <w:sz w:val="16"/>
+          <w:szCs w:val="16"/>
+        </w:rPr>
+        <w:t xml:space="preserve"> Single </w:t>
+      </w:r>
+      <w:r>
+        <w:rPr>
+          <w:rFonts w:ascii="Century" w:hAnsi="Century"/>
+          <w:sz w:val="16"/>
+          <w:szCs w:val="16"/>
+        </w:rPr>
+        <w:r>
+          <w:rPr>
+            <w:rFonts w:ascii="Century" w:hAnsi="Century"/>
+            <w:sz w:val="16"/>
+            <w:szCs w:val="16"/>
+          </w:rPr>
+          <w:t xml:space="preserve">{csMarried}</w:t>
+        </w:r>
+      </w:r>
+      <w:r>
+        <w:rPr>
+          <w:rFonts w:ascii="Century" w:hAnsi="Century"/>
+          <w:sz w:val="16"/>
+          <w:szCs w:val="16"/>
+        </w:rPr>
+        <w:t xml:space="preserve">Married </w:t>
+      </w:r>
+      <w:r>
+        <w:rPr>
+          <w:rFonts w:ascii="Century" w:hAnsi="Century"/>
+          <w:sz w:val="16"/>
+          <w:szCs w:val="16"/>
+        </w:rPr>
+        <w:r>
+          <w:rPr>
+            <w:rFonts w:ascii="Century" w:hAnsi="Century"/>
+            <w:sz w:val="16"/>
+            <w:szCs w:val="16"/>
+          </w:rPr>
+          <w:t xml:space="preserve">{csSeparated}</w:t>
+        </w:r>
+      </w:r>
+      <w:r>
+        <w:rPr>
+          <w:rFonts w:ascii="Century" w:hAnsi="Century"/>
+          <w:sz w:val="16"/>
+          <w:szCs w:val="16"/>
+        </w:rPr>
+        <w:t xml:space="preserve">Separated </w:t>
+      </w:r>
+      <w:r>
+        <w:rPr>
+          <w:rFonts w:ascii="Century" w:hAnsi="Century"/>
+          <w:sz w:val="16"/>
+          <w:szCs w:val="16"/>
+        </w:rPr>
+        <w:r>
+          <w:rPr>
+            <w:rFonts w:ascii="Century" w:hAnsi="Century"/>
+            <w:sz w:val="16"/>
+            <w:szCs w:val="16"/>
+          </w:rPr>
+          <w:t xml:space="preserve">{csWidow}</w:t>
+        </w:r>
+      </w:r>
+      <w:r>
+        <w:rPr>
+          <w:rFonts w:ascii="Century" w:hAnsi="Century"/>
+          <w:sz w:val="16"/>
+          <w:szCs w:val="16"/>
+        </w:rPr>
+        <w:t xml:space="preserve">Widow </w:t>
+      </w:r>
+      <w:r>
+        <w:rPr>
+          <w:rFonts w:ascii="Century" w:hAnsi="Century"/>
+          <w:sz w:val="16"/>
+          <w:szCs w:val="16"/>
+        </w:rPr>
+        <w:r>
+          <w:rPr>
+            <w:rFonts w:ascii="Century" w:hAnsi="Century"/>
+            <w:sz w:val="16"/>
+            <w:szCs w:val="16"/>
+          </w:rPr>
+          <w:t xml:space="preserve">{csSoloParent}</w:t>
+        </w:r>
+      </w:r>
+      <w:r>
+        <w:rPr>
+          <w:rFonts w:ascii="Century" w:hAnsi="Century"/>
+          <w:sz w:val="16"/>
+          <w:szCs w:val="16"/>
+        </w:rPr>
+        <w:t>Solo Parent</w:t>
       </w:r>
     </w:p>
     <w:p>
@@ -602,16 +756,16 @@
           <w:sz w:val="16"/>
           <w:szCs w:val="16"/>
         </w:rPr>
-        <w:t>Course: {course}     Year Level: {yearLevel}</w:t>
-      </w:r>
-      <w:r>
-        <w:rPr>
-          <w:rFonts w:ascii="Century" w:hAnsi="Century"/>
-          <w:sz w:val="16"/>
-          <w:szCs w:val="16"/>
-        </w:rPr>
-        <w:tab/>
-        <w:t>A.Y. {academicYear}     Date of Birth: {dateOfBirth}</w:t>
+        <w:t xml:space="preserve">Course: {course}     Year Level: {yearLevel}</w:t>
+      </w:r>
+      <w:r>
+        <w:rPr>
+          <w:rFonts w:ascii="Century" w:hAnsi="Century"/>
+          <w:sz w:val="16"/>
+          <w:szCs w:val="16"/>
+        </w:rPr>
+        <w:tab/>
+        <w:t xml:space="preserve">A.Y. {academicYear}     Date of Birth: {dateOfBirth}</w:t>
       </w:r>
     </w:p>
     <w:p>
@@ -629,66 +783,154 @@
           <w:sz w:val="16"/>
           <w:szCs w:val="16"/>
         </w:rPr>
-        <w:t>Height (m): {heightM}     Weight: {weightKg}     Place of Birth: {placeOfBirth}</w:t>
-      </w:r>
-    </w:p>
-    <w:p>
-      <w:pPr>
-        <w:rPr>
-          <w:rFonts w:ascii="Century" w:hAnsi="Century"/>
-          <w:sz w:val="16"/>
-          <w:szCs w:val="16"/>
-        </w:rPr>
-      </w:pPr>
-      <w:r>
-        <w:rPr>
-          <w:rFonts w:ascii="Century" w:hAnsi="Century"/>
-          <w:sz w:val="16"/>
-          <w:szCs w:val="16"/>
-        </w:rPr>
-        <w:t>Present Address</w:t>
-      </w:r>
-      <w:r>
-        <w:rPr>
-          <w:rFonts w:ascii="Century" w:hAnsi="Century"/>
-          <w:sz w:val="16"/>
-          <w:szCs w:val="16"/>
-        </w:rPr>
-        <w:t xml:space="preserve">(Residential/BoardingHouse/Dormitory): {presentAddress} </w:t>
-      </w:r>
-      <w:r>
-        <w:rPr>
-          <w:rFonts w:ascii="Century" w:hAnsi="Century"/>
-          <w:sz w:val="16"/>
-          <w:szCs w:val="16"/>
-        </w:rPr>
-        <w:t>Email Address: {emailAddress}</w:t>
-      </w:r>
-    </w:p>
-    <w:p>
-      <w:pPr>
-        <w:rPr>
-          <w:rFonts w:ascii="Century" w:hAnsi="Century"/>
-          <w:sz w:val="16"/>
-          <w:szCs w:val="16"/>
-        </w:rPr>
-      </w:pPr>
-      <w:r>
-        <w:rPr>
-          <w:rFonts w:ascii="Century" w:hAnsi="Century"/>
-          <w:sz w:val="16"/>
-          <w:szCs w:val="16"/>
-        </w:rPr>
-        <w:t>Hometown Address: {hometownAddress}</w:t>
-      </w:r>
-      <w:r>
-        <w:rPr>
-          <w:rFonts w:ascii="Century" w:hAnsi="Century"/>
-          <w:sz w:val="16"/>
-          <w:szCs w:val="16"/>
-        </w:rPr>
-        <w:tab/>
-        <w:t>Mobile No.: {mobileNo}</w:t>
+        <w:t>Height (m</w:t>
+      </w:r>
+      <w:proofErr w:type="gramStart"/>
+      <w:r>
+        <w:rPr>
+          <w:rFonts w:ascii="Century" w:hAnsi="Century"/>
+          <w:sz w:val="16"/>
+          <w:szCs w:val="16"/>
+        </w:rPr>
+        <w:t xml:space="preserve">): </w:t>
+      </w:r>
+      <w:proofErr w:type="gramEnd"/>
+      <w:r>
+        <w:rPr>
+          <w:rFonts w:ascii="Century" w:hAnsi="Century"/>
+          <w:sz w:val="16"/>
+          <w:szCs w:val="16"/>
+        </w:rPr>
+        <w:t xml:space="preserve">{heightM}     Weight: {weightKg}     Place of Birth: {placeOfBirth}</w:t>
+      </w:r>
+    </w:p>
+    <w:p>
+      <w:pPr>
+        <w:rPr>
+          <w:rFonts w:ascii="Century" w:hAnsi="Century"/>
+          <w:sz w:val="16"/>
+          <w:szCs w:val="16"/>
+        </w:rPr>
+      </w:pPr>
+      <w:r>
+        <w:rPr>
+          <w:rFonts w:ascii="Century" w:hAnsi="Century"/>
+          <w:sz w:val="16"/>
+          <w:szCs w:val="16"/>
+        </w:rPr>
+        <w:t xml:space="preserve">Present </w:t>
+      </w:r>
+      <w:proofErr w:type="gramStart"/>
+      <w:r>
+        <w:rPr>
+          <w:rFonts w:ascii="Century" w:hAnsi="Century"/>
+          <w:sz w:val="16"/>
+          <w:szCs w:val="16"/>
+        </w:rPr>
+        <w:t>Address</w:t>
+      </w:r>
+      <w:r>
+        <w:rPr>
+          <w:rFonts w:ascii="Century" w:hAnsi="Century"/>
+          <w:sz w:val="16"/>
+          <w:szCs w:val="16"/>
+        </w:rPr>
+        <w:t>(</w:t>
+      </w:r>
+      <w:proofErr w:type="gramEnd"/>
+      <w:r>
+        <w:rPr>
+          <w:rFonts w:ascii="Century" w:hAnsi="Century"/>
+          <w:sz w:val="16"/>
+          <w:szCs w:val="16"/>
+        </w:rPr>
+        <w:t>Residential/BoardingHouse/Dormitory</w:t>
+      </w:r>
+      <w:proofErr w:type="gramStart"/>
+      <w:r>
+        <w:rPr>
+          <w:rFonts w:ascii="Century" w:hAnsi="Century"/>
+          <w:sz w:val="16"/>
+          <w:szCs w:val="16"/>
+        </w:rPr>
+        <w:t>):</w:t>
+      </w:r>
+      <w:r>
+        <w:rPr>
+          <w:rFonts w:ascii="Century" w:hAnsi="Century"/>
+          <w:sz w:val="16"/>
+          <w:szCs w:val="16"/>
+        </w:rPr>
+        <w:t xml:space="preserve"/>
+      </w:r>
+      <w:proofErr w:type="gramEnd"/>
+      <w:r>
+        <w:rPr>
+          <w:rFonts w:ascii="Century" w:hAnsi="Century"/>
+          <w:sz w:val="16"/>
+          <w:szCs w:val="16"/>
+        </w:rPr>
+        <w:t xml:space="preserve"/>
+      </w:r>
+      <w:r>
+        <w:rPr>
+          <w:rFonts w:ascii="Century" w:hAnsi="Century"/>
+          <w:sz w:val="16"/>
+          <w:szCs w:val="16"/>
+        </w:rPr>
+        <w:t xml:space="preserve"> {presentAddress}</w:t>
+      </w:r>
+      <w:proofErr w:type="gramStart"/>
+      <w:r>
+        <w:rPr>
+          <w:rFonts w:ascii="Century" w:hAnsi="Century"/>
+          <w:sz w:val="16"/>
+          <w:szCs w:val="16"/>
+        </w:rPr>
+        <w:t xml:space="preserve"> </w:t>
+      </w:r>
+      <w:r>
+        <w:rPr>
+          <w:rFonts w:ascii="Century" w:hAnsi="Century"/>
+          <w:sz w:val="16"/>
+          <w:szCs w:val="16"/>
+        </w:rPr>
+        <w:t>Email</w:t>
+      </w:r>
+      <w:proofErr w:type="gramEnd"/>
+      <w:r>
+        <w:rPr>
+          <w:rFonts w:ascii="Century" w:hAnsi="Century"/>
+          <w:sz w:val="16"/>
+          <w:szCs w:val="16"/>
+        </w:rPr>
+        <w:t xml:space="preserve"> Address: {emailAddress}</w:t>
+      </w:r>
+    </w:p>
+    <w:p>
+      <w:pPr>
+        <w:rPr>
+          <w:rFonts w:ascii="Century" w:hAnsi="Century"/>
+          <w:sz w:val="16"/>
+          <w:szCs w:val="16"/>
+        </w:rPr>
+      </w:pPr>
+      <w:r>
+        <w:rPr>
+          <w:rFonts w:ascii="Century" w:hAnsi="Century"/>
+          <w:sz w:val="16"/>
+          <w:szCs w:val="16"/>
+        </w:rPr>
+        <w:t xml:space="preserve">Hometown Address: {hometownAddress}</w:t>
+      </w:r>
+      <w:r>
+        <w:rPr>
+          <w:rFonts w:ascii="Century" w:hAnsi="Century"/>
+          <w:sz w:val="16"/>
+          <w:szCs w:val="16"/>
+        </w:rPr>
+        <w:tab/>
+        <w:t xml:space="preserve">Mobile No.: {mobileNo}</w:t>
       </w:r>
     </w:p>
     <w:p>
@@ -706,7 +948,7 @@
           <w:sz w:val="16"/>
           <w:szCs w:val="16"/>
         </w:rPr>
-        <w:t>Grade Point Average: {gpa}   Religion: {religion}   Citizenship: {citizenship}   Tribe: {tribe}</w:t>
+        <w:t xml:space="preserve">Grade Point Average: {gpa}   Religion: {religion}   Citizenship: {citizenship}   Tribe: {tribe}</w:t>
       </w:r>
     </w:p>
     <w:p>
@@ -724,7 +966,7 @@
           <w:sz w:val="16"/>
           <w:szCs w:val="16"/>
         </w:rPr>
-        <w:t>If working, please indicate the name and address of employer: {employerNameAddress}</w:t>
+        <w:t xml:space="preserve">If working, please indicate the name and address of employer: {employerNameAddress}</w:t>
       </w:r>
     </w:p>
     <w:p>
@@ -742,7 +984,7 @@
           <w:sz w:val="16"/>
           <w:szCs w:val="16"/>
         </w:rPr>
-        <w:t>Person to be contacted in case of emergency: {emergencyName}      Contact No. {emergencyContactNo}</w:t>
+        <w:t xml:space="preserve">Person to be contacted in case of emergency: {emergencyName}      Contact No. {emergencyContactNo}</w:t>
       </w:r>
     </w:p>
     <w:p>
@@ -754,13 +996,23 @@
           <w:szCs w:val="16"/>
         </w:rPr>
       </w:pPr>
-      <w:r>
-        <w:rPr>
-          <w:rFonts w:ascii="Century" w:hAnsi="Century"/>
-          <w:sz w:val="16"/>
-          <w:szCs w:val="16"/>
-        </w:rPr>
-        <w:t>Address: {emergencyAddress}     Relationship: {emergencyRelationship}</w:t>
+      <w:proofErr w:type="gramStart"/>
+      <w:r>
+        <w:rPr>
+          <w:rFonts w:ascii="Century" w:hAnsi="Century"/>
+          <w:sz w:val="16"/>
+          <w:szCs w:val="16"/>
+        </w:rPr>
+        <w:t xml:space="preserve">Address: </w:t>
+      </w:r>
+      <w:proofErr w:type="gramEnd"/>
+      <w:r>
+        <w:rPr>
+          <w:rFonts w:ascii="Century" w:hAnsi="Century"/>
+          <w:sz w:val="16"/>
+          <w:szCs w:val="16"/>
+        </w:rPr>
+        <w:t xml:space="preserve">{emergencyAddress}     Relationship: {emergencyRelationship}</w:t>
       </w:r>
     </w:p>
     <w:p>
@@ -1052,7 +1304,7 @@
                 <w:sz w:val="16"/>
                 <w:szCs w:val="16"/>
               </w:rPr>
-              <w:t>{edu0School}</w:t>
+              <w:t xml:space="preserve">{edu0School}</w:t>
             </w:r>
           </w:p>
         </w:tc>
@@ -1075,7 +1327,7 @@
                 <w:sz w:val="16"/>
                 <w:szCs w:val="16"/>
               </w:rPr>
-              <w:t>{edu0Address}</w:t>
+              <w:t xml:space="preserve">{edu0Address}</w:t>
             </w:r>
           </w:p>
         </w:tc>
@@ -1098,7 +1350,7 @@
                 <w:sz w:val="16"/>
                 <w:szCs w:val="16"/>
               </w:rPr>
-              <w:t>{edu0PublicPrivate}</w:t>
+              <w:t xml:space="preserve">{edu0PublicPrivate}</w:t>
             </w:r>
           </w:p>
         </w:tc>
@@ -1121,7 +1373,7 @@
                 <w:sz w:val="16"/>
                 <w:szCs w:val="16"/>
               </w:rPr>
-              <w:t>{edu0YearGraduated}</w:t>
+              <w:t xml:space="preserve">{edu0YearGraduated}</w:t>
             </w:r>
           </w:p>
         </w:tc>
@@ -1144,7 +1396,7 @@
                 <w:sz w:val="16"/>
                 <w:szCs w:val="16"/>
               </w:rPr>
-              <w:t>{edu0Honors}</w:t>
+              <w:t xml:space="preserve">{edu0Honors}</w:t>
             </w:r>
           </w:p>
         </w:tc>
@@ -1195,7 +1447,7 @@
                 <w:sz w:val="16"/>
                 <w:szCs w:val="16"/>
               </w:rPr>
-              <w:t>{edu1School}</w:t>
+              <w:t xml:space="preserve">{edu1School}</w:t>
             </w:r>
           </w:p>
         </w:tc>
@@ -1218,7 +1470,7 @@
                 <w:sz w:val="16"/>
                 <w:szCs w:val="16"/>
               </w:rPr>
-              <w:t>{edu1Address}</w:t>
+              <w:t xml:space="preserve">{edu1Address}</w:t>
             </w:r>
           </w:p>
         </w:tc>
@@ -1241,7 +1493,7 @@
                 <w:sz w:val="16"/>
                 <w:szCs w:val="16"/>
               </w:rPr>
-              <w:t>{edu1PublicPrivate}</w:t>
+              <w:t xml:space="preserve">{edu1PublicPrivate}</w:t>
             </w:r>
           </w:p>
         </w:tc>
@@ -1264,7 +1516,7 @@
                 <w:sz w:val="16"/>
                 <w:szCs w:val="16"/>
               </w:rPr>
-              <w:t>{edu1YearGraduated}</w:t>
+              <w:t xml:space="preserve">{edu1YearGraduated}</w:t>
             </w:r>
           </w:p>
         </w:tc>
@@ -1287,7 +1539,7 @@
                 <w:sz w:val="16"/>
                 <w:szCs w:val="16"/>
               </w:rPr>
-              <w:t>{edu1Honors}</w:t>
+              <w:t xml:space="preserve">{edu1Honors}</w:t>
             </w:r>
           </w:p>
         </w:tc>
@@ -1338,7 +1590,7 @@
                 <w:sz w:val="16"/>
                 <w:szCs w:val="16"/>
               </w:rPr>
-              <w:t>{edu2School}</w:t>
+              <w:t xml:space="preserve">{edu2School}</w:t>
             </w:r>
           </w:p>
         </w:tc>
@@ -1361,7 +1613,7 @@
                 <w:sz w:val="16"/>
                 <w:szCs w:val="16"/>
               </w:rPr>
-              <w:t>{edu2Address}</w:t>
+              <w:t xml:space="preserve">{edu2Address}</w:t>
             </w:r>
           </w:p>
         </w:tc>
@@ -1384,7 +1636,7 @@
                 <w:sz w:val="16"/>
                 <w:szCs w:val="16"/>
               </w:rPr>
-              <w:t>{edu2PublicPrivate}</w:t>
+              <w:t xml:space="preserve">{edu2PublicPrivate}</w:t>
             </w:r>
           </w:p>
         </w:tc>
@@ -1407,7 +1659,7 @@
                 <w:sz w:val="16"/>
                 <w:szCs w:val="16"/>
               </w:rPr>
-              <w:t>{edu2YearGraduated}</w:t>
+              <w:t xml:space="preserve">{edu2YearGraduated}</w:t>
             </w:r>
           </w:p>
         </w:tc>
@@ -1430,7 +1682,7 @@
                 <w:sz w:val="16"/>
                 <w:szCs w:val="16"/>
               </w:rPr>
-              <w:t>{edu2Honors}</w:t>
+              <w:t xml:space="preserve">{edu2Honors}</w:t>
             </w:r>
           </w:p>
         </w:tc>
@@ -1481,7 +1733,7 @@
                 <w:sz w:val="16"/>
                 <w:szCs w:val="16"/>
               </w:rPr>
-              <w:t>{edu3School}</w:t>
+              <w:t xml:space="preserve">{edu3School}</w:t>
             </w:r>
           </w:p>
         </w:tc>
@@ -1504,7 +1756,7 @@
                 <w:sz w:val="16"/>
                 <w:szCs w:val="16"/>
               </w:rPr>
-              <w:t>{edu3Address}</w:t>
+              <w:t xml:space="preserve">{edu3Address}</w:t>
             </w:r>
           </w:p>
         </w:tc>
@@ -1527,7 +1779,7 @@
                 <w:sz w:val="16"/>
                 <w:szCs w:val="16"/>
               </w:rPr>
-              <w:t>{edu3PublicPrivate}</w:t>
+              <w:t xml:space="preserve">{edu3PublicPrivate}</w:t>
             </w:r>
           </w:p>
         </w:tc>
@@ -1550,7 +1802,7 @@
                 <w:sz w:val="16"/>
                 <w:szCs w:val="16"/>
               </w:rPr>
-              <w:t>{edu3YearGraduated}</w:t>
+              <w:t xml:space="preserve">{edu3YearGraduated}</w:t>
             </w:r>
           </w:p>
         </w:tc>
@@ -1573,7 +1825,7 @@
                 <w:sz w:val="16"/>
                 <w:szCs w:val="16"/>
               </w:rPr>
-              <w:t>{edu3Honors}</w:t>
+              <w:t xml:space="preserve">{edu3Honors}</w:t>
             </w:r>
           </w:p>
         </w:tc>
@@ -1624,7 +1876,7 @@
                 <w:sz w:val="16"/>
                 <w:szCs w:val="16"/>
               </w:rPr>
-              <w:t>{edu4School}</w:t>
+              <w:t xml:space="preserve">{edu4School}</w:t>
             </w:r>
           </w:p>
         </w:tc>
@@ -1647,7 +1899,7 @@
                 <w:sz w:val="16"/>
                 <w:szCs w:val="16"/>
               </w:rPr>
-              <w:t>{edu4Address}</w:t>
+              <w:t xml:space="preserve">{edu4Address}</w:t>
             </w:r>
           </w:p>
         </w:tc>
@@ -1670,7 +1922,7 @@
                 <w:sz w:val="16"/>
                 <w:szCs w:val="16"/>
               </w:rPr>
-              <w:t>{edu4PublicPrivate}</w:t>
+              <w:t xml:space="preserve">{edu4PublicPrivate}</w:t>
             </w:r>
           </w:p>
         </w:tc>
@@ -1693,7 +1945,7 @@
                 <w:sz w:val="16"/>
                 <w:szCs w:val="16"/>
               </w:rPr>
-              <w:t>{edu4YearGraduated}</w:t>
+              <w:t xml:space="preserve">{edu4YearGraduated}</w:t>
             </w:r>
           </w:p>
         </w:tc>
@@ -1716,7 +1968,7 @@
                 <w:sz w:val="16"/>
                 <w:szCs w:val="16"/>
               </w:rPr>
-              <w:t>{edu4Honors}</w:t>
+              <w:t xml:space="preserve">{edu4Honors}</w:t>
             </w:r>
           </w:p>
         </w:tc>
@@ -1738,24 +1990,78 @@
           <w:szCs w:val="16"/>
         </w:rPr>
         <w:tab/>
-        <w:t>Nature of Schooling:     {natContinuous} Continuous</w:t>
-      </w:r>
-      <w:r>
-        <w:rPr>
-          <w:rFonts w:ascii="Century" w:hAnsi="Century"/>
-          <w:sz w:val="16"/>
-          <w:szCs w:val="16"/>
-        </w:rPr>
-        <w:tab/>
-      </w:r>
-      <w:r>
-        <w:rPr>
-          <w:rFonts w:ascii="Century" w:hAnsi="Century"/>
-          <w:sz w:val="16"/>
-          <w:szCs w:val="16"/>
-        </w:rPr>
-        <w:tab/>
-        <w:t xml:space="preserve">{natInterrupted} Interrupted, why? {interruptedReason}  </w:t>
+        <w:t xml:space="preserve">Nature of Schooling:  </w:t>
+      </w:r>
+      <w:proofErr w:type="gramStart"/>
+      <w:r>
+        <w:rPr>
+          <w:rFonts w:ascii="Century" w:hAnsi="Century"/>
+          <w:sz w:val="16"/>
+          <w:szCs w:val="16"/>
+        </w:rPr>
+        <w:t xml:space="preserve">   </w:t>
+      </w:r>
+      <w:proofErr w:type="gramEnd"/>
+      <w:r>
+        <w:rPr>
+          <w:rFonts w:ascii="Century" w:hAnsi="Century"/>
+          <w:sz w:val="16"/>
+          <w:szCs w:val="16"/>
+        </w:rPr>
+        <w:t xml:space="preserve">{natContinuous}</w:t>
+      </w:r>
+      <w:proofErr w:type="gramStart"/>
+      <w:r>
+        <w:rPr>
+          <w:rFonts w:ascii="Century" w:hAnsi="Century"/>
+          <w:sz w:val="16"/>
+          <w:szCs w:val="16"/>
+        </w:rPr>
+        <w:t xml:space="preserve"/>
+      </w:r>
+      <w:proofErr w:type="gramEnd"/>
+      <w:r>
+        <w:rPr>
+          <w:rFonts w:ascii="Century" w:hAnsi="Century"/>
+          <w:sz w:val="16"/>
+          <w:szCs w:val="16"/>
+        </w:rPr>
+        <w:t xml:space="preserve"> Continuous</w:t>
+      </w:r>
+      <w:r>
+        <w:rPr>
+          <w:rFonts w:ascii="Century" w:hAnsi="Century"/>
+          <w:sz w:val="16"/>
+          <w:szCs w:val="16"/>
+        </w:rPr>
+        <w:tab/>
+      </w:r>
+      <w:r>
+        <w:rPr>
+          <w:rFonts w:ascii="Century" w:hAnsi="Century"/>
+          <w:sz w:val="16"/>
+          <w:szCs w:val="16"/>
+        </w:rPr>
+        <w:tab/>
+        <w:t xml:space="preserve"/>
+      </w:r>
+      <w:proofErr w:type="gramStart"/>
+      <w:r>
+        <w:rPr>
+          <w:rFonts w:ascii="Century" w:hAnsi="Century"/>
+          <w:sz w:val="16"/>
+          <w:szCs w:val="16"/>
+        </w:rPr>
+        <w:t xml:space="preserve">{natInterrupted}</w:t>
+      </w:r>
+      <w:proofErr w:type="gramEnd"/>
+      <w:r>
+        <w:rPr>
+          <w:rFonts w:ascii="Century" w:hAnsi="Century"/>
+          <w:sz w:val="16"/>
+          <w:szCs w:val="16"/>
+        </w:rPr>
+        <w:t xml:space="preserve"> Interrupted, why? {interruptedReason}  </w:t>
       </w:r>
     </w:p>
     <w:p>
@@ -1800,7 +2106,43 @@
           <w:sz w:val="16"/>
           <w:szCs w:val="16"/>
         </w:rPr>
-        <w:t>Name of Father: {fatherName}     Age: {fatherAge} {fatherLiving} Living  {fatherDeceased}  Deceased</w:t>
+        <w:t xml:space="preserve">Name of Father: {fatherName}     Age: {fatherAge} </w:t>
+      </w:r>
+      <w:proofErr w:type="gramStart"/>
+      <w:r>
+        <w:rPr>
+          <w:rFonts w:ascii="Century" w:hAnsi="Century"/>
+          <w:sz w:val="16"/>
+          <w:szCs w:val="16"/>
+        </w:rPr>
+        <w:t xml:space="preserve">{fatherLiving}</w:t>
+      </w:r>
+      <w:proofErr w:type="gramEnd"/>
+      <w:r>
+        <w:rPr>
+          <w:rFonts w:ascii="Century" w:hAnsi="Century"/>
+          <w:sz w:val="16"/>
+          <w:szCs w:val="16"/>
+        </w:rPr>
+        <w:t xml:space="preserve"> </w:t>
+      </w:r>
+      <w:proofErr w:type="gramStart"/>
+      <w:r>
+        <w:rPr>
+          <w:rFonts w:ascii="Century" w:hAnsi="Century"/>
+          <w:sz w:val="16"/>
+          <w:szCs w:val="16"/>
+        </w:rPr>
+        <w:t xml:space="preserve">Living  {fatherDeceased}</w:t>
+      </w:r>
+      <w:proofErr w:type="gramEnd"/>
+      <w:r>
+        <w:rPr>
+          <w:rFonts w:ascii="Century" w:hAnsi="Century"/>
+          <w:sz w:val="16"/>
+          <w:szCs w:val="16"/>
+        </w:rPr>
+        <w:t xml:space="preserve">  Deceased</w:t>
       </w:r>
     </w:p>
     <w:p>
@@ -1818,7 +2160,7 @@
           <w:sz w:val="16"/>
           <w:szCs w:val="16"/>
         </w:rPr>
-        <w:t>Educational Attainment: {fatherEduc}     Occupation: {fatherOccupation}</w:t>
+        <w:t xml:space="preserve">Educational Attainment: {fatherEduc}     Occupation: {fatherOccupation}</w:t>
       </w:r>
     </w:p>
     <w:p>
@@ -1836,7 +2178,43 @@
           <w:sz w:val="16"/>
           <w:szCs w:val="16"/>
         </w:rPr>
-        <w:t>Name of Mother: {motherName}     Age: {motherAge} {motherLiving} Living  {motherDeceased}  Deceased</w:t>
+        <w:t xml:space="preserve">Name of Mother: {motherName}     Age: {motherAge} </w:t>
+      </w:r>
+      <w:proofErr w:type="gramStart"/>
+      <w:r>
+        <w:rPr>
+          <w:rFonts w:ascii="Century" w:hAnsi="Century"/>
+          <w:sz w:val="16"/>
+          <w:szCs w:val="16"/>
+        </w:rPr>
+        <w:t xml:space="preserve">{motherLiving}</w:t>
+      </w:r>
+      <w:proofErr w:type="gramEnd"/>
+      <w:r>
+        <w:rPr>
+          <w:rFonts w:ascii="Century" w:hAnsi="Century"/>
+          <w:sz w:val="16"/>
+          <w:szCs w:val="16"/>
+        </w:rPr>
+        <w:t xml:space="preserve"> </w:t>
+      </w:r>
+      <w:proofErr w:type="gramStart"/>
+      <w:r>
+        <w:rPr>
+          <w:rFonts w:ascii="Century" w:hAnsi="Century"/>
+          <w:sz w:val="16"/>
+          <w:szCs w:val="16"/>
+        </w:rPr>
+        <w:t xml:space="preserve">Living  {motherDeceased}</w:t>
+      </w:r>
+      <w:proofErr w:type="gramEnd"/>
+      <w:r>
+        <w:rPr>
+          <w:rFonts w:ascii="Century" w:hAnsi="Century"/>
+          <w:sz w:val="16"/>
+          <w:szCs w:val="16"/>
+        </w:rPr>
+        <w:t xml:space="preserve">  Deceased</w:t>
       </w:r>
     </w:p>
     <w:p>
@@ -1854,7 +2232,7 @@
           <w:sz w:val="16"/>
           <w:szCs w:val="16"/>
         </w:rPr>
-        <w:t>Educational Attainment: {motherEduc}     Occupation: {motherOccupation}</w:t>
+        <w:t xml:space="preserve">Educational Attainment: {motherEduc}     Occupation: {motherOccupation}</w:t>
       </w:r>
     </w:p>
     <w:p>
@@ -1890,7 +2268,7 @@
           <w:sz w:val="16"/>
           <w:szCs w:val="16"/>
         </w:rPr>
-        <w:t>Educational Attainment: {guardianEduc}     Occupation: {guardianOccupation}</w:t>
+        <w:t xml:space="preserve">Educational Attainment: {guardianEduc}     Occupation: {guardianOccupation}</w:t>
       </w:r>
     </w:p>
     <w:p>
@@ -1943,7 +2321,24 @@
           <w:szCs w:val="16"/>
         </w:rPr>
         <w:tab/>
-        <w:t>{pmSingleParent} Single Parent</w:t>
+      </w:r>
+      <w:proofErr w:type="gramStart"/>
+      <w:r>
+        <w:rPr>
+          <w:rFonts w:ascii="Century" w:hAnsi="Century"/>
+          <w:sz w:val="16"/>
+          <w:szCs w:val="16"/>
+        </w:rPr>
+        <w:t xml:space="preserve">{pmSingleParent}</w:t>
+      </w:r>
+      <w:proofErr w:type="gramEnd"/>
+      <w:r>
+        <w:rPr>
+          <w:rFonts w:ascii="Century" w:hAnsi="Century"/>
+          <w:sz w:val="16"/>
+          <w:szCs w:val="16"/>
+        </w:rPr>
+        <w:t xml:space="preserve"> Single Parent</w:t>
       </w:r>
     </w:p>
     <w:p>
@@ -1962,32 +2357,66 @@
           <w:szCs w:val="16"/>
         </w:rPr>
         <w:tab/>
-        <w:t>{pmMarriedTogether} Married and staying together</w:t>
-      </w:r>
-      <w:r>
-        <w:rPr>
-          <w:rFonts w:ascii="Century" w:hAnsi="Century"/>
-          <w:sz w:val="16"/>
-          <w:szCs w:val="16"/>
-        </w:rPr>
-        <w:tab/>
-      </w:r>
-      <w:r>
-        <w:rPr>
-          <w:rFonts w:ascii="Century" w:hAnsi="Century"/>
-          <w:sz w:val="16"/>
-          <w:szCs w:val="16"/>
-        </w:rPr>
-        <w:tab/>
-      </w:r>
-      <w:r>
-        <w:rPr>
-          <w:rFonts w:ascii="Century" w:hAnsi="Century"/>
-          <w:sz w:val="16"/>
-          <w:szCs w:val="16"/>
-        </w:rPr>
-        <w:tab/>
-        <w:t>{pmMarriedSeparated} Married but Separated</w:t>
+      </w:r>
+      <w:proofErr w:type="gramStart"/>
+      <w:r>
+        <w:rPr>
+          <w:rFonts w:ascii="Century" w:hAnsi="Century"/>
+          <w:sz w:val="16"/>
+          <w:szCs w:val="16"/>
+        </w:rPr>
+        <w:t xml:space="preserve">{pmMarriedTogether}</w:t>
+      </w:r>
+      <w:proofErr w:type="gramEnd"/>
+      <w:r>
+        <w:rPr>
+          <w:rFonts w:ascii="Century" w:hAnsi="Century"/>
+          <w:sz w:val="16"/>
+          <w:szCs w:val="16"/>
+        </w:rPr>
+        <w:t xml:space="preserve"> Married and staying together</w:t>
+      </w:r>
+      <w:r>
+        <w:rPr>
+          <w:rFonts w:ascii="Century" w:hAnsi="Century"/>
+          <w:sz w:val="16"/>
+          <w:szCs w:val="16"/>
+        </w:rPr>
+        <w:tab/>
+      </w:r>
+      <w:r>
+        <w:rPr>
+          <w:rFonts w:ascii="Century" w:hAnsi="Century"/>
+          <w:sz w:val="16"/>
+          <w:szCs w:val="16"/>
+        </w:rPr>
+        <w:tab/>
+      </w:r>
+      <w:r>
+        <w:rPr>
+          <w:rFonts w:ascii="Century" w:hAnsi="Century"/>
+          <w:sz w:val="16"/>
+          <w:szCs w:val="16"/>
+        </w:rPr>
+        <w:tab/>
+      </w:r>
+      <w:proofErr w:type="gramStart"/>
+      <w:r>
+        <w:rPr>
+          <w:rFonts w:ascii="Century" w:hAnsi="Century"/>
+          <w:sz w:val="16"/>
+          <w:szCs w:val="16"/>
+        </w:rPr>
+        <w:t xml:space="preserve">{pmMarriedSeparated}</w:t>
+      </w:r>
+      <w:proofErr w:type="gramEnd"/>
+      <w:r>
+        <w:rPr>
+          <w:rFonts w:ascii="Century" w:hAnsi="Century"/>
+          <w:sz w:val="16"/>
+          <w:szCs w:val="16"/>
+        </w:rPr>
+        <w:t xml:space="preserve"> Married but Separated</w:t>
       </w:r>
     </w:p>
     <w:p>
@@ -2006,32 +2435,66 @@
           <w:szCs w:val="16"/>
         </w:rPr>
         <w:tab/>
-        <w:t>{pmNotMarriedLiving} Not married but living together</w:t>
-      </w:r>
-      <w:r>
-        <w:rPr>
-          <w:rFonts w:ascii="Century" w:hAnsi="Century"/>
-          <w:sz w:val="16"/>
-          <w:szCs w:val="16"/>
-        </w:rPr>
-        <w:tab/>
-      </w:r>
-      <w:r>
-        <w:rPr>
-          <w:rFonts w:ascii="Century" w:hAnsi="Century"/>
-          <w:sz w:val="16"/>
-          <w:szCs w:val="16"/>
-        </w:rPr>
-        <w:tab/>
-      </w:r>
-      <w:r>
-        <w:rPr>
-          <w:rFonts w:ascii="Century" w:hAnsi="Century"/>
-          <w:sz w:val="16"/>
-          <w:szCs w:val="16"/>
-        </w:rPr>
-        <w:tab/>
-        <w:t>{pmOther} Other's (Please Specify) {parentsMaritalOther}</w:t>
+      </w:r>
+      <w:proofErr w:type="gramStart"/>
+      <w:r>
+        <w:rPr>
+          <w:rFonts w:ascii="Century" w:hAnsi="Century"/>
+          <w:sz w:val="16"/>
+          <w:szCs w:val="16"/>
+        </w:rPr>
+        <w:t xml:space="preserve">{pmNotMarriedLiving}</w:t>
+      </w:r>
+      <w:proofErr w:type="gramEnd"/>
+      <w:r>
+        <w:rPr>
+          <w:rFonts w:ascii="Century" w:hAnsi="Century"/>
+          <w:sz w:val="16"/>
+          <w:szCs w:val="16"/>
+        </w:rPr>
+        <w:t xml:space="preserve"> Not married but living together</w:t>
+      </w:r>
+      <w:r>
+        <w:rPr>
+          <w:rFonts w:ascii="Century" w:hAnsi="Century"/>
+          <w:sz w:val="16"/>
+          <w:szCs w:val="16"/>
+        </w:rPr>
+        <w:tab/>
+      </w:r>
+      <w:r>
+        <w:rPr>
+          <w:rFonts w:ascii="Century" w:hAnsi="Century"/>
+          <w:sz w:val="16"/>
+          <w:szCs w:val="16"/>
+        </w:rPr>
+        <w:tab/>
+      </w:r>
+      <w:r>
+        <w:rPr>
+          <w:rFonts w:ascii="Century" w:hAnsi="Century"/>
+          <w:sz w:val="16"/>
+          <w:szCs w:val="16"/>
+        </w:rPr>
+        <w:tab/>
+      </w:r>
+      <w:proofErr w:type="gramStart"/>
+      <w:r>
+        <w:rPr>
+          <w:rFonts w:ascii="Century" w:hAnsi="Century"/>
+          <w:sz w:val="16"/>
+          <w:szCs w:val="16"/>
+        </w:rPr>
+        <w:t xml:space="preserve">{pmOther}</w:t>
+      </w:r>
+      <w:proofErr w:type="gramEnd"/>
+      <w:r>
+        <w:rPr>
+          <w:rFonts w:ascii="Century" w:hAnsi="Century"/>
+          <w:sz w:val="16"/>
+          <w:szCs w:val="16"/>
+        </w:rPr>
+        <w:t xml:space="preserve"> Other's (Please Specify) {parentsMaritalOther}</w:t>
       </w:r>
     </w:p>
     <w:p>
@@ -2049,7 +2512,7 @@
           <w:sz w:val="16"/>
           <w:szCs w:val="16"/>
         </w:rPr>
-        <w:t>Number of children in the family including yourself: {siblingsTotal}   Number of Brothers: {brothersCount}   Number of Sisters: {sistersCount}</w:t>
+        <w:t xml:space="preserve">Number of children in the family including yourself: {siblingsTotal}   Number of Brothers: {brothersCount}   Number of Sisters: {sistersCount}</w:t>
       </w:r>
     </w:p>
     <w:p>
@@ -2076,41 +2539,92 @@
           <w:szCs w:val="16"/>
         </w:rPr>
         <w:tab/>
-        <w:t>{finParents} Parents</w:t>
-      </w:r>
-      <w:r>
-        <w:rPr>
-          <w:rFonts w:ascii="Century" w:hAnsi="Century"/>
-          <w:sz w:val="16"/>
-          <w:szCs w:val="16"/>
-        </w:rPr>
-        <w:tab/>
-      </w:r>
-      <w:r>
-        <w:rPr>
-          <w:rFonts w:ascii="Century" w:hAnsi="Century"/>
-          <w:sz w:val="16"/>
-          <w:szCs w:val="16"/>
-        </w:rPr>
-        <w:tab/>
-        <w:t>{finSpouse} Spouse</w:t>
-      </w:r>
-      <w:r>
-        <w:rPr>
-          <w:rFonts w:ascii="Century" w:hAnsi="Century"/>
-          <w:sz w:val="16"/>
-          <w:szCs w:val="16"/>
-        </w:rPr>
-        <w:tab/>
-      </w:r>
-      <w:r>
-        <w:rPr>
-          <w:rFonts w:ascii="Century" w:hAnsi="Century"/>
-          <w:sz w:val="16"/>
-          <w:szCs w:val="16"/>
-        </w:rPr>
-        <w:tab/>
-        <w:t>{finRelatives} Relatives</w:t>
+      </w:r>
+      <w:proofErr w:type="gramStart"/>
+      <w:r>
+        <w:rPr>
+          <w:rFonts w:ascii="Century" w:hAnsi="Century"/>
+          <w:sz w:val="16"/>
+          <w:szCs w:val="16"/>
+        </w:rPr>
+        <w:t xml:space="preserve">{finParents}</w:t>
+      </w:r>
+      <w:proofErr w:type="gramEnd"/>
+      <w:r>
+        <w:rPr>
+          <w:rFonts w:ascii="Century" w:hAnsi="Century"/>
+          <w:sz w:val="16"/>
+          <w:szCs w:val="16"/>
+        </w:rPr>
+        <w:t xml:space="preserve"> Parents</w:t>
+      </w:r>
+      <w:r>
+        <w:rPr>
+          <w:rFonts w:ascii="Century" w:hAnsi="Century"/>
+          <w:sz w:val="16"/>
+          <w:szCs w:val="16"/>
+        </w:rPr>
+        <w:tab/>
+      </w:r>
+      <w:r>
+        <w:rPr>
+          <w:rFonts w:ascii="Century" w:hAnsi="Century"/>
+          <w:sz w:val="16"/>
+          <w:szCs w:val="16"/>
+        </w:rPr>
+        <w:tab/>
+      </w:r>
+      <w:proofErr w:type="gramStart"/>
+      <w:r>
+        <w:rPr>
+          <w:rFonts w:ascii="Century" w:hAnsi="Century"/>
+          <w:sz w:val="16"/>
+          <w:szCs w:val="16"/>
+        </w:rPr>
+        <w:t xml:space="preserve">{finSpouse}</w:t>
+      </w:r>
+      <w:proofErr w:type="gramEnd"/>
+      <w:r>
+        <w:rPr>
+          <w:rFonts w:ascii="Century" w:hAnsi="Century"/>
+          <w:sz w:val="16"/>
+          <w:szCs w:val="16"/>
+        </w:rPr>
+        <w:t xml:space="preserve"> Spouse</w:t>
+      </w:r>
+      <w:r>
+        <w:rPr>
+          <w:rFonts w:ascii="Century" w:hAnsi="Century"/>
+          <w:sz w:val="16"/>
+          <w:szCs w:val="16"/>
+        </w:rPr>
+        <w:tab/>
+      </w:r>
+      <w:r>
+        <w:rPr>
+          <w:rFonts w:ascii="Century" w:hAnsi="Century"/>
+          <w:sz w:val="16"/>
+          <w:szCs w:val="16"/>
+        </w:rPr>
+        <w:tab/>
+      </w:r>
+      <w:proofErr w:type="gramStart"/>
+      <w:r>
+        <w:rPr>
+          <w:rFonts w:ascii="Century" w:hAnsi="Century"/>
+          <w:sz w:val="16"/>
+          <w:szCs w:val="16"/>
+        </w:rPr>
+        <w:t xml:space="preserve">{finRelatives}</w:t>
+      </w:r>
+      <w:proofErr w:type="gramEnd"/>
+      <w:r>
+        <w:rPr>
+          <w:rFonts w:ascii="Century" w:hAnsi="Century"/>
+          <w:sz w:val="16"/>
+          <w:szCs w:val="16"/>
+        </w:rPr>
+        <w:t xml:space="preserve"> Relatives</w:t>
       </w:r>
     </w:p>
     <w:p>
@@ -2153,33 +2667,84 @@
           <w:szCs w:val="16"/>
         </w:rPr>
         <w:tab/>
-        <w:t>{finBrotherSister} Brother/Sister</w:t>
-      </w:r>
-      <w:r>
-        <w:rPr>
-          <w:rFonts w:ascii="Century" w:hAnsi="Century"/>
-          <w:sz w:val="16"/>
-          <w:szCs w:val="16"/>
-        </w:rPr>
-        <w:tab/>
-        <w:t>{finScholarship} Scholarship</w:t>
-      </w:r>
-      <w:r>
-        <w:rPr>
-          <w:rFonts w:ascii="Century" w:hAnsi="Century"/>
-          <w:sz w:val="16"/>
-          <w:szCs w:val="16"/>
-        </w:rPr>
-        <w:tab/>
-      </w:r>
-      <w:r>
-        <w:rPr>
-          <w:rFonts w:ascii="Century" w:hAnsi="Century"/>
-          <w:sz w:val="16"/>
-          <w:szCs w:val="16"/>
-        </w:rPr>
-        <w:tab/>
-        <w:t xml:space="preserve">{finSelfSupporting} Self-supporting/working </w:t>
+      </w:r>
+      <w:proofErr w:type="gramStart"/>
+      <w:r>
+        <w:rPr>
+          <w:rFonts w:ascii="Century" w:hAnsi="Century"/>
+          <w:sz w:val="16"/>
+          <w:szCs w:val="16"/>
+        </w:rPr>
+        <w:t xml:space="preserve">{finBrotherSister}</w:t>
+      </w:r>
+      <w:proofErr w:type="gramEnd"/>
+      <w:r>
+        <w:rPr>
+          <w:rFonts w:ascii="Century" w:hAnsi="Century"/>
+          <w:sz w:val="16"/>
+          <w:szCs w:val="16"/>
+        </w:rPr>
+        <w:t xml:space="preserve"> Brother/Sister</w:t>
+      </w:r>
+      <w:r>
+        <w:rPr>
+          <w:rFonts w:ascii="Century" w:hAnsi="Century"/>
+          <w:sz w:val="16"/>
+          <w:szCs w:val="16"/>
+        </w:rPr>
+        <w:tab/>
+      </w:r>
+      <w:proofErr w:type="gramStart"/>
+      <w:r>
+        <w:rPr>
+          <w:rFonts w:ascii="Century" w:hAnsi="Century"/>
+          <w:sz w:val="16"/>
+          <w:szCs w:val="16"/>
+        </w:rPr>
+        <w:t xml:space="preserve">{finScholarship}</w:t>
+      </w:r>
+      <w:proofErr w:type="gramEnd"/>
+      <w:r>
+        <w:rPr>
+          <w:rFonts w:ascii="Century" w:hAnsi="Century"/>
+          <w:sz w:val="16"/>
+          <w:szCs w:val="16"/>
+        </w:rPr>
+        <w:t xml:space="preserve"> Scholarship</w:t>
+      </w:r>
+      <w:r>
+        <w:rPr>
+          <w:rFonts w:ascii="Century" w:hAnsi="Century"/>
+          <w:sz w:val="16"/>
+          <w:szCs w:val="16"/>
+        </w:rPr>
+        <w:tab/>
+      </w:r>
+      <w:r>
+        <w:rPr>
+          <w:rFonts w:ascii="Century" w:hAnsi="Century"/>
+          <w:sz w:val="16"/>
+          <w:szCs w:val="16"/>
+        </w:rPr>
+        <w:tab/>
+      </w:r>
+      <w:proofErr w:type="gramStart"/>
+      <w:r>
+        <w:rPr>
+          <w:rFonts w:ascii="Century" w:hAnsi="Century"/>
+          <w:sz w:val="16"/>
+          <w:szCs w:val="16"/>
+        </w:rPr>
+        <w:t xml:space="preserve">{finSelfSupporting}</w:t>
+      </w:r>
+      <w:proofErr w:type="gramEnd"/>
+      <w:r>
+        <w:rPr>
+          <w:rFonts w:ascii="Century" w:hAnsi="Century"/>
+          <w:sz w:val="16"/>
+          <w:szCs w:val="16"/>
+        </w:rPr>
+        <w:t xml:space="preserve"> Self-supporting/working </w:t>
       </w:r>
     </w:p>
     <w:p>
@@ -2222,7 +2787,24 @@
           <w:szCs w:val="16"/>
         </w:rPr>
         <w:tab/>
-        <w:t>{finOther} Others, please specify: {financingOther}</w:t>
+      </w:r>
+      <w:proofErr w:type="gramStart"/>
+      <w:r>
+        <w:rPr>
+          <w:rFonts w:ascii="Century" w:hAnsi="Century"/>
+          <w:sz w:val="16"/>
+          <w:szCs w:val="16"/>
+        </w:rPr>
+        <w:t xml:space="preserve">{finOther}</w:t>
+      </w:r>
+      <w:proofErr w:type="gramEnd"/>
+      <w:r>
+        <w:rPr>
+          <w:rFonts w:ascii="Century" w:hAnsi="Century"/>
+          <w:sz w:val="16"/>
+          <w:szCs w:val="16"/>
+        </w:rPr>
+        <w:t xml:space="preserve"> Others, please specify: {financingOther}</w:t>
       </w:r>
     </w:p>
     <w:p>
@@ -2295,6 +2877,7 @@
           <w:szCs w:val="14"/>
         </w:rPr>
       </w:pPr>
+      <w:proofErr w:type="gramStart"/>
       <w:r>
         <w:rPr>
           <w:rFonts w:ascii="Century" w:hAnsi="Century"/>
@@ -2303,8 +2886,9 @@
           <w:sz w:val="14"/>
           <w:szCs w:val="14"/>
         </w:rPr>
-        <w:t>{hVision} Vision</w:t>
-      </w:r>
+        <w:t xml:space="preserve">{hVision}</w:t>
+      </w:r>
+      <w:proofErr w:type="gramEnd"/>
       <w:r>
         <w:rPr>
           <w:rFonts w:ascii="Century" w:hAnsi="Century"/>
@@ -2313,7 +2897,7 @@
           <w:sz w:val="14"/>
           <w:szCs w:val="14"/>
         </w:rPr>
-        <w:tab/>
+        <w:t xml:space="preserve"> Vision</w:t>
       </w:r>
       <w:r>
         <w:rPr>
@@ -2324,7 +2908,6 @@
           <w:szCs w:val="14"/>
         </w:rPr>
         <w:tab/>
-        <w:t>{hSpeech} Speech</w:t>
       </w:r>
       <w:r>
         <w:rPr>
@@ -2336,6 +2919,7 @@
         </w:rPr>
         <w:tab/>
       </w:r>
+      <w:proofErr w:type="gramStart"/>
       <w:r>
         <w:rPr>
           <w:rFonts w:ascii="Century" w:hAnsi="Century"/>
@@ -2344,9 +2928,9 @@
           <w:sz w:val="14"/>
           <w:szCs w:val="14"/>
         </w:rPr>
-        <w:tab/>
-        <w:t>{hHearing} Hearing</w:t>
-      </w:r>
+        <w:t xml:space="preserve">{hSpeech}</w:t>
+      </w:r>
+      <w:proofErr w:type="gramEnd"/>
       <w:r>
         <w:rPr>
           <w:rFonts w:ascii="Century" w:hAnsi="Century"/>
@@ -2355,7 +2939,7 @@
           <w:sz w:val="14"/>
           <w:szCs w:val="14"/>
         </w:rPr>
-        <w:tab/>
+        <w:t xml:space="preserve"> Speech</w:t>
       </w:r>
       <w:r>
         <w:rPr>
@@ -2366,7 +2950,102 @@
           <w:szCs w:val="14"/>
         </w:rPr>
         <w:tab/>
-        <w:t>{hGeneralHealth} General Health          {hPhysical} Physical Disability</w:t>
+      </w:r>
+      <w:r>
+        <w:rPr>
+          <w:rFonts w:ascii="Century" w:hAnsi="Century"/>
+          <w:b/>
+          <w:bCs/>
+          <w:sz w:val="14"/>
+          <w:szCs w:val="14"/>
+        </w:rPr>
+        <w:tab/>
+      </w:r>
+      <w:proofErr w:type="gramStart"/>
+      <w:r>
+        <w:rPr>
+          <w:rFonts w:ascii="Century" w:hAnsi="Century"/>
+          <w:b/>
+          <w:bCs/>
+          <w:sz w:val="14"/>
+          <w:szCs w:val="14"/>
+        </w:rPr>
+        <w:t xml:space="preserve">{hHearing}</w:t>
+      </w:r>
+      <w:proofErr w:type="gramEnd"/>
+      <w:r>
+        <w:rPr>
+          <w:rFonts w:ascii="Century" w:hAnsi="Century"/>
+          <w:b/>
+          <w:bCs/>
+          <w:sz w:val="14"/>
+          <w:szCs w:val="14"/>
+        </w:rPr>
+        <w:t xml:space="preserve"> Hearing</w:t>
+      </w:r>
+      <w:r>
+        <w:rPr>
+          <w:rFonts w:ascii="Century" w:hAnsi="Century"/>
+          <w:b/>
+          <w:bCs/>
+          <w:sz w:val="14"/>
+          <w:szCs w:val="14"/>
+        </w:rPr>
+        <w:tab/>
+      </w:r>
+      <w:r>
+        <w:rPr>
+          <w:rFonts w:ascii="Century" w:hAnsi="Century"/>
+          <w:b/>
+          <w:bCs/>
+          <w:sz w:val="14"/>
+          <w:szCs w:val="14"/>
+        </w:rPr>
+        <w:tab/>
+      </w:r>
+      <w:proofErr w:type="gramStart"/>
+      <w:r>
+        <w:rPr>
+          <w:rFonts w:ascii="Century" w:hAnsi="Century"/>
+          <w:b/>
+          <w:bCs/>
+          <w:sz w:val="14"/>
+          <w:szCs w:val="14"/>
+        </w:rPr>
+        <w:t xml:space="preserve">{hGeneralHealth}</w:t>
+      </w:r>
+      <w:proofErr w:type="gramEnd"/>
+      <w:r>
+        <w:rPr>
+          <w:rFonts w:ascii="Century" w:hAnsi="Century"/>
+          <w:b/>
+          <w:bCs/>
+          <w:sz w:val="14"/>
+          <w:szCs w:val="14"/>
+        </w:rPr>
+        <w:t xml:space="preserve"> General Health       </w:t>
+      </w:r>
+      <w:proofErr w:type="gramStart"/>
+      <w:r>
+        <w:rPr>
+          <w:rFonts w:ascii="Century" w:hAnsi="Century"/>
+          <w:b/>
+          <w:bCs/>
+          <w:sz w:val="14"/>
+          <w:szCs w:val="14"/>
+        </w:rPr>
+        <w:t xml:space="preserve">   {hPhysical}</w:t>
+      </w:r>
+      <w:proofErr w:type="gramEnd"/>
+      <w:r>
+        <w:rPr>
+          <w:rFonts w:ascii="Century" w:hAnsi="Century"/>
+          <w:b/>
+          <w:bCs/>
+          <w:sz w:val="14"/>
+          <w:szCs w:val="14"/>
+        </w:rPr>
+        <w:t xml:space="preserve"> Physical Disability</w:t>
       </w:r>
     </w:p>
     <w:p>
@@ -2427,7 +3106,7 @@
           <w:sz w:val="12"/>
           <w:szCs w:val="12"/>
         </w:rPr>
-        <w:t>{visionDetail}     {speechDetail}     {hearingDetail}     {generalHealthDetail}</w:t>
+        <w:t xml:space="preserve">{visionDetail}     {speechDetail}     {hearingDetail}     {generalHealthDetail}</w:t>
       </w:r>
     </w:p>
     <w:p>
@@ -2497,39 +3176,49 @@
           <w:sz w:val="16"/>
           <w:szCs w:val="16"/>
         </w:rPr>
-        <w:lastRenderedPageBreak/>
-        <w:t>Have you taken any psychological tests before?  {psychYes} Yes</w:t>
-      </w:r>
-      <w:r>
-        <w:rPr>
-          <w:rFonts w:ascii="Century" w:hAnsi="Century"/>
-          <w:sz w:val="16"/>
-          <w:szCs w:val="16"/>
-        </w:rPr>
-        <w:tab/>
-        <w:t>{psychNo} No</w:t>
-      </w:r>
-    </w:p>
-    <w:p>
-      <w:pPr>
-        <w:rPr>
-          <w:rFonts w:ascii="Century" w:hAnsi="Century"/>
-          <w:sz w:val="16"/>
-          <w:szCs w:val="16"/>
-        </w:rPr>
-      </w:pPr>
-    </w:p>
-    <w:p>
-      <w:pPr>
-        <w:rPr>
-          <w:rFonts w:ascii="Century" w:hAnsi="Century"/>
-          <w:sz w:val="16"/>
-          <w:szCs w:val="16"/>
-        </w:rPr>
-      </w:pPr>
-    </w:p>
-    <w:p>
-      <w:pPr>
+        <w:t xml:space="preserve">Have you taken any psychological tests before?  {psychYes} </w:t>
+      </w:r>
+      <w:proofErr w:type="gramStart"/>
+      <w:r>
+        <w:rPr>
+          <w:rFonts w:ascii="Century" w:hAnsi="Century"/>
+          <w:sz w:val="16"/>
+          <w:szCs w:val="16"/>
+        </w:rPr>
+        <w:t>Yes</w:t>
+      </w:r>
+      <w:proofErr w:type="gramEnd"/>
+      <w:r>
+        <w:rPr>
+          <w:rFonts w:ascii="Century" w:hAnsi="Century"/>
+          <w:sz w:val="16"/>
+          <w:szCs w:val="16"/>
+        </w:rPr>
+        <w:tab/>
+        <w:t xml:space="preserve">{psychNo} No</w:t>
+      </w:r>
+    </w:p>
+    <w:p>
+      <w:pPr>
+        <w:rPr>
+          <w:rFonts w:ascii="Century" w:hAnsi="Century"/>
+          <w:sz w:val="16"/>
+          <w:szCs w:val="16"/>
+        </w:rPr>
+      </w:pPr>
+    </w:p>
+    <w:p>
+      <w:pPr>
+        <w:rPr>
+          <w:rFonts w:ascii="Century" w:hAnsi="Century"/>
+          <w:sz w:val="16"/>
+          <w:szCs w:val="16"/>
+        </w:rPr>
+      </w:pPr>
+    </w:p>
+    <w:p>
+      <w:pPr>
+        <w:pageBreakBefore/>
         <w:jc w:val="center"/>
         <w:rPr>
           <w:rFonts w:ascii="Century" w:hAnsi="Century"/>
@@ -2707,194 +3396,194 @@
           <w:sz w:val="16"/>
           <w:szCs w:val="16"/>
         </w:rPr>
-        <w:t>{tr0Date}</w:t>
-      </w:r>
-      <w:r>
-        <w:rPr>
-          <w:rFonts w:ascii="Century" w:hAnsi="Century"/>
-          <w:sz w:val="16"/>
-          <w:szCs w:val="16"/>
-        </w:rPr>
-        <w:tab/>
-      </w:r>
-      <w:r>
-        <w:rPr>
-          <w:rFonts w:ascii="Century" w:hAnsi="Century"/>
-          <w:sz w:val="16"/>
-          <w:szCs w:val="16"/>
-        </w:rPr>
-        <w:tab/>
-        <w:t>{tr0Kind}</w:t>
-      </w:r>
-      <w:r>
-        <w:rPr>
-          <w:rFonts w:ascii="Century" w:hAnsi="Century"/>
-          <w:sz w:val="16"/>
-          <w:szCs w:val="16"/>
-        </w:rPr>
-        <w:tab/>
-      </w:r>
-      <w:r>
-        <w:rPr>
-          <w:rFonts w:ascii="Century" w:hAnsi="Century"/>
-          <w:sz w:val="16"/>
-          <w:szCs w:val="16"/>
-        </w:rPr>
-        <w:tab/>
-        <w:t>{tr0Score}</w:t>
-      </w:r>
-      <w:r>
-        <w:rPr>
-          <w:rFonts w:ascii="Century" w:hAnsi="Century"/>
-          <w:sz w:val="16"/>
-          <w:szCs w:val="16"/>
-        </w:rPr>
-        <w:tab/>
-      </w:r>
-      <w:r>
-        <w:rPr>
-          <w:rFonts w:ascii="Century" w:hAnsi="Century"/>
-          <w:sz w:val="16"/>
-          <w:szCs w:val="16"/>
-        </w:rPr>
-        <w:tab/>
-        <w:t>{tr0Rank}</w:t>
-      </w:r>
-    </w:p>
-    <w:p>
-      <w:pPr>
-        <w:rPr>
-          <w:rFonts w:ascii="Century" w:hAnsi="Century"/>
-          <w:sz w:val="16"/>
-          <w:szCs w:val="16"/>
-        </w:rPr>
-      </w:pPr>
-      <w:r>
-        <w:rPr>
-          <w:rFonts w:ascii="Century" w:hAnsi="Century"/>
-          <w:sz w:val="16"/>
-          <w:szCs w:val="16"/>
-        </w:rPr>
-        <w:t>{tr1Date}</w:t>
-      </w:r>
-      <w:r>
-        <w:rPr>
-          <w:rFonts w:ascii="Century" w:hAnsi="Century"/>
-          <w:sz w:val="16"/>
-          <w:szCs w:val="16"/>
-        </w:rPr>
-        <w:tab/>
-      </w:r>
-      <w:r>
-        <w:rPr>
-          <w:rFonts w:ascii="Century" w:hAnsi="Century"/>
-          <w:sz w:val="16"/>
-          <w:szCs w:val="16"/>
-        </w:rPr>
-        <w:tab/>
-        <w:t>{tr1Kind}</w:t>
-      </w:r>
-      <w:r>
-        <w:rPr>
-          <w:rFonts w:ascii="Century" w:hAnsi="Century"/>
-          <w:sz w:val="16"/>
-          <w:szCs w:val="16"/>
-        </w:rPr>
-        <w:tab/>
-      </w:r>
-      <w:r>
-        <w:rPr>
-          <w:rFonts w:ascii="Century" w:hAnsi="Century"/>
-          <w:sz w:val="16"/>
-          <w:szCs w:val="16"/>
-        </w:rPr>
-        <w:tab/>
-        <w:t>{tr1Score}</w:t>
-      </w:r>
-      <w:r>
-        <w:rPr>
-          <w:rFonts w:ascii="Century" w:hAnsi="Century"/>
-          <w:sz w:val="16"/>
-          <w:szCs w:val="16"/>
-        </w:rPr>
-        <w:tab/>
-      </w:r>
-      <w:r>
-        <w:rPr>
-          <w:rFonts w:ascii="Century" w:hAnsi="Century"/>
-          <w:sz w:val="16"/>
-          <w:szCs w:val="16"/>
-        </w:rPr>
-        <w:tab/>
-        <w:t>{tr1Rank}</w:t>
-      </w:r>
-    </w:p>
-    <w:p>
-      <w:pPr>
-        <w:rPr>
-          <w:rFonts w:ascii="Century" w:hAnsi="Century"/>
-          <w:sz w:val="16"/>
-          <w:szCs w:val="16"/>
-        </w:rPr>
-      </w:pPr>
-      <w:r>
-        <w:rPr>
-          <w:rFonts w:ascii="Century" w:hAnsi="Century"/>
-          <w:sz w:val="16"/>
-          <w:szCs w:val="16"/>
-        </w:rPr>
-        <w:t>{tr2Date}</w:t>
-      </w:r>
-      <w:r>
-        <w:rPr>
-          <w:rFonts w:ascii="Century" w:hAnsi="Century"/>
-          <w:sz w:val="16"/>
-          <w:szCs w:val="16"/>
-        </w:rPr>
-        <w:tab/>
-      </w:r>
-      <w:r>
-        <w:rPr>
-          <w:rFonts w:ascii="Century" w:hAnsi="Century"/>
-          <w:sz w:val="16"/>
-          <w:szCs w:val="16"/>
-        </w:rPr>
-        <w:tab/>
-        <w:t>{tr2Kind}</w:t>
-      </w:r>
-      <w:r>
-        <w:rPr>
-          <w:rFonts w:ascii="Century" w:hAnsi="Century"/>
-          <w:sz w:val="16"/>
-          <w:szCs w:val="16"/>
-        </w:rPr>
-        <w:tab/>
-      </w:r>
-      <w:r>
-        <w:rPr>
-          <w:rFonts w:ascii="Century" w:hAnsi="Century"/>
-          <w:sz w:val="16"/>
-          <w:szCs w:val="16"/>
-        </w:rPr>
-        <w:tab/>
-        <w:t>{tr2Score}</w:t>
-      </w:r>
-      <w:r>
-        <w:rPr>
-          <w:rFonts w:ascii="Century" w:hAnsi="Century"/>
-          <w:sz w:val="16"/>
-          <w:szCs w:val="16"/>
-        </w:rPr>
-        <w:tab/>
-      </w:r>
-      <w:r>
-        <w:rPr>
-          <w:rFonts w:ascii="Century" w:hAnsi="Century"/>
-          <w:sz w:val="16"/>
-          <w:szCs w:val="16"/>
-        </w:rPr>
-        <w:tab/>
-        <w:t>{tr2Rank}</w:t>
+        <w:t xml:space="preserve">{tr0Date}</w:t>
+      </w:r>
+      <w:r>
+        <w:rPr>
+          <w:rFonts w:ascii="Century" w:hAnsi="Century"/>
+          <w:sz w:val="16"/>
+          <w:szCs w:val="16"/>
+        </w:rPr>
+        <w:tab/>
+      </w:r>
+      <w:r>
+        <w:rPr>
+          <w:rFonts w:ascii="Century" w:hAnsi="Century"/>
+          <w:sz w:val="16"/>
+          <w:szCs w:val="16"/>
+        </w:rPr>
+        <w:tab/>
+        <w:t xml:space="preserve">{tr0Kind}</w:t>
+      </w:r>
+      <w:r>
+        <w:rPr>
+          <w:rFonts w:ascii="Century" w:hAnsi="Century"/>
+          <w:sz w:val="16"/>
+          <w:szCs w:val="16"/>
+        </w:rPr>
+        <w:tab/>
+      </w:r>
+      <w:r>
+        <w:rPr>
+          <w:rFonts w:ascii="Century" w:hAnsi="Century"/>
+          <w:sz w:val="16"/>
+          <w:szCs w:val="16"/>
+        </w:rPr>
+        <w:tab/>
+        <w:t xml:space="preserve">{tr0Score}</w:t>
+      </w:r>
+      <w:r>
+        <w:rPr>
+          <w:rFonts w:ascii="Century" w:hAnsi="Century"/>
+          <w:sz w:val="16"/>
+          <w:szCs w:val="16"/>
+        </w:rPr>
+        <w:tab/>
+      </w:r>
+      <w:r>
+        <w:rPr>
+          <w:rFonts w:ascii="Century" w:hAnsi="Century"/>
+          <w:sz w:val="16"/>
+          <w:szCs w:val="16"/>
+        </w:rPr>
+        <w:tab/>
+        <w:t xml:space="preserve">{tr0Rank}</w:t>
+      </w:r>
+    </w:p>
+    <w:p>
+      <w:pPr>
+        <w:rPr>
+          <w:rFonts w:ascii="Century" w:hAnsi="Century"/>
+          <w:sz w:val="16"/>
+          <w:szCs w:val="16"/>
+        </w:rPr>
+      </w:pPr>
+      <w:r>
+        <w:rPr>
+          <w:rFonts w:ascii="Century" w:hAnsi="Century"/>
+          <w:sz w:val="16"/>
+          <w:szCs w:val="16"/>
+        </w:rPr>
+        <w:t xml:space="preserve">{tr1Date}</w:t>
+      </w:r>
+      <w:r>
+        <w:rPr>
+          <w:rFonts w:ascii="Century" w:hAnsi="Century"/>
+          <w:sz w:val="16"/>
+          <w:szCs w:val="16"/>
+        </w:rPr>
+        <w:tab/>
+      </w:r>
+      <w:r>
+        <w:rPr>
+          <w:rFonts w:ascii="Century" w:hAnsi="Century"/>
+          <w:sz w:val="16"/>
+          <w:szCs w:val="16"/>
+        </w:rPr>
+        <w:tab/>
+        <w:t xml:space="preserve">{tr1Kind}</w:t>
+      </w:r>
+      <w:r>
+        <w:rPr>
+          <w:rFonts w:ascii="Century" w:hAnsi="Century"/>
+          <w:sz w:val="16"/>
+          <w:szCs w:val="16"/>
+        </w:rPr>
+        <w:tab/>
+      </w:r>
+      <w:r>
+        <w:rPr>
+          <w:rFonts w:ascii="Century" w:hAnsi="Century"/>
+          <w:sz w:val="16"/>
+          <w:szCs w:val="16"/>
+        </w:rPr>
+        <w:tab/>
+        <w:t xml:space="preserve">{tr1Score}</w:t>
+      </w:r>
+      <w:r>
+        <w:rPr>
+          <w:rFonts w:ascii="Century" w:hAnsi="Century"/>
+          <w:sz w:val="16"/>
+          <w:szCs w:val="16"/>
+        </w:rPr>
+        <w:tab/>
+      </w:r>
+      <w:r>
+        <w:rPr>
+          <w:rFonts w:ascii="Century" w:hAnsi="Century"/>
+          <w:sz w:val="16"/>
+          <w:szCs w:val="16"/>
+        </w:rPr>
+        <w:tab/>
+        <w:t xml:space="preserve">{tr1Rank}</w:t>
+      </w:r>
+    </w:p>
+    <w:p>
+      <w:pPr>
+        <w:rPr>
+          <w:rFonts w:ascii="Century" w:hAnsi="Century"/>
+          <w:sz w:val="16"/>
+          <w:szCs w:val="16"/>
+        </w:rPr>
+      </w:pPr>
+      <w:r>
+        <w:rPr>
+          <w:rFonts w:ascii="Century" w:hAnsi="Century"/>
+          <w:sz w:val="16"/>
+          <w:szCs w:val="16"/>
+        </w:rPr>
+        <w:t xml:space="preserve">{tr2Date}</w:t>
+      </w:r>
+      <w:r>
+        <w:rPr>
+          <w:rFonts w:ascii="Century" w:hAnsi="Century"/>
+          <w:sz w:val="16"/>
+          <w:szCs w:val="16"/>
+        </w:rPr>
+        <w:tab/>
+      </w:r>
+      <w:r>
+        <w:rPr>
+          <w:rFonts w:ascii="Century" w:hAnsi="Century"/>
+          <w:sz w:val="16"/>
+          <w:szCs w:val="16"/>
+        </w:rPr>
+        <w:tab/>
+        <w:t xml:space="preserve">{tr2Kind}</w:t>
+      </w:r>
+      <w:r>
+        <w:rPr>
+          <w:rFonts w:ascii="Century" w:hAnsi="Century"/>
+          <w:sz w:val="16"/>
+          <w:szCs w:val="16"/>
+        </w:rPr>
+        <w:tab/>
+      </w:r>
+      <w:r>
+        <w:rPr>
+          <w:rFonts w:ascii="Century" w:hAnsi="Century"/>
+          <w:sz w:val="16"/>
+          <w:szCs w:val="16"/>
+        </w:rPr>
+        <w:tab/>
+        <w:t xml:space="preserve">{tr2Score}</w:t>
+      </w:r>
+      <w:r>
+        <w:rPr>
+          <w:rFonts w:ascii="Century" w:hAnsi="Century"/>
+          <w:sz w:val="16"/>
+          <w:szCs w:val="16"/>
+        </w:rPr>
+        <w:tab/>
+      </w:r>
+      <w:r>
+        <w:rPr>
+          <w:rFonts w:ascii="Century" w:hAnsi="Century"/>
+          <w:sz w:val="16"/>
+          <w:szCs w:val="16"/>
+        </w:rPr>
+        <w:tab/>
+        <w:t xml:space="preserve">{tr2Rank}</w:t>
       </w:r>
     </w:p>
     <w:p>
@@ -2959,117 +3648,117 @@
           <w:sz w:val="16"/>
           <w:szCs w:val="16"/>
         </w:rPr>
-        <w:t>{igSports} Sports</w:t>
-      </w:r>
-      <w:r>
-        <w:rPr>
-          <w:rFonts w:ascii="Century" w:hAnsi="Century"/>
-          <w:sz w:val="16"/>
-          <w:szCs w:val="16"/>
-        </w:rPr>
-        <w:tab/>
-      </w:r>
-      <w:r>
-        <w:rPr>
-          <w:rFonts w:ascii="Century" w:hAnsi="Century"/>
-          <w:sz w:val="16"/>
-          <w:szCs w:val="16"/>
-        </w:rPr>
-        <w:tab/>
-      </w:r>
-      <w:r>
-        <w:rPr>
-          <w:rFonts w:ascii="Century" w:hAnsi="Century"/>
-          <w:sz w:val="16"/>
-          <w:szCs w:val="16"/>
-        </w:rPr>
-        <w:tab/>
-        <w:t>{igScience} Science</w:t>
-      </w:r>
-      <w:r>
-        <w:rPr>
-          <w:rFonts w:ascii="Century" w:hAnsi="Century"/>
-          <w:sz w:val="16"/>
-          <w:szCs w:val="16"/>
-        </w:rPr>
-        <w:tab/>
-      </w:r>
-      <w:r>
-        <w:rPr>
-          <w:rFonts w:ascii="Century" w:hAnsi="Century"/>
-          <w:sz w:val="16"/>
-          <w:szCs w:val="16"/>
-        </w:rPr>
-        <w:tab/>
-        <w:t>{igCivic} Civic Awareness/Service</w:t>
-      </w:r>
-    </w:p>
-    <w:p>
-      <w:pPr>
-        <w:rPr>
-          <w:rFonts w:ascii="Century" w:hAnsi="Century"/>
-          <w:sz w:val="16"/>
-          <w:szCs w:val="16"/>
-        </w:rPr>
-      </w:pPr>
-      <w:r>
-        <w:rPr>
-          <w:rFonts w:ascii="Century" w:hAnsi="Century"/>
-          <w:sz w:val="16"/>
-          <w:szCs w:val="16"/>
-        </w:rPr>
-        <w:t>{igArts} Arts</w:t>
-      </w:r>
-      <w:r>
-        <w:rPr>
-          <w:rFonts w:ascii="Century" w:hAnsi="Century"/>
-          <w:sz w:val="16"/>
-          <w:szCs w:val="16"/>
-        </w:rPr>
-        <w:tab/>
-      </w:r>
-      <w:r>
-        <w:rPr>
-          <w:rFonts w:ascii="Century" w:hAnsi="Century"/>
-          <w:sz w:val="16"/>
-          <w:szCs w:val="16"/>
-        </w:rPr>
-        <w:tab/>
-      </w:r>
-      <w:r>
-        <w:rPr>
-          <w:rFonts w:ascii="Century" w:hAnsi="Century"/>
-          <w:sz w:val="16"/>
-          <w:szCs w:val="16"/>
-        </w:rPr>
-        <w:tab/>
-        <w:t>{igSocial} Social Studies</w:t>
-      </w:r>
-      <w:r>
-        <w:rPr>
-          <w:rFonts w:ascii="Century" w:hAnsi="Century"/>
-          <w:sz w:val="16"/>
-          <w:szCs w:val="16"/>
-        </w:rPr>
-        <w:tab/>
-        <w:t>{igOther} Others</w:t>
-      </w:r>
-    </w:p>
-    <w:p>
-      <w:pPr>
-        <w:rPr>
-          <w:rFonts w:ascii="Century" w:hAnsi="Century"/>
-          <w:sz w:val="16"/>
-          <w:szCs w:val="16"/>
-        </w:rPr>
-      </w:pPr>
-      <w:r>
-        <w:rPr>
-          <w:rFonts w:ascii="Century" w:hAnsi="Century"/>
-          <w:sz w:val="16"/>
-          <w:szCs w:val="16"/>
-        </w:rPr>
-        <w:t>{igReligious} Religious</w:t>
+        <w:t xml:space="preserve">{igSports} Sports</w:t>
+      </w:r>
+      <w:r>
+        <w:rPr>
+          <w:rFonts w:ascii="Century" w:hAnsi="Century"/>
+          <w:sz w:val="16"/>
+          <w:szCs w:val="16"/>
+        </w:rPr>
+        <w:tab/>
+      </w:r>
+      <w:r>
+        <w:rPr>
+          <w:rFonts w:ascii="Century" w:hAnsi="Century"/>
+          <w:sz w:val="16"/>
+          <w:szCs w:val="16"/>
+        </w:rPr>
+        <w:tab/>
+      </w:r>
+      <w:r>
+        <w:rPr>
+          <w:rFonts w:ascii="Century" w:hAnsi="Century"/>
+          <w:sz w:val="16"/>
+          <w:szCs w:val="16"/>
+        </w:rPr>
+        <w:tab/>
+        <w:t xml:space="preserve">{igScience} Science</w:t>
+      </w:r>
+      <w:r>
+        <w:rPr>
+          <w:rFonts w:ascii="Century" w:hAnsi="Century"/>
+          <w:sz w:val="16"/>
+          <w:szCs w:val="16"/>
+        </w:rPr>
+        <w:tab/>
+      </w:r>
+      <w:r>
+        <w:rPr>
+          <w:rFonts w:ascii="Century" w:hAnsi="Century"/>
+          <w:sz w:val="16"/>
+          <w:szCs w:val="16"/>
+        </w:rPr>
+        <w:tab/>
+        <w:t xml:space="preserve">{igCivic} Civic Awareness/Service</w:t>
+      </w:r>
+    </w:p>
+    <w:p>
+      <w:pPr>
+        <w:rPr>
+          <w:rFonts w:ascii="Century" w:hAnsi="Century"/>
+          <w:sz w:val="16"/>
+          <w:szCs w:val="16"/>
+        </w:rPr>
+      </w:pPr>
+      <w:r>
+        <w:rPr>
+          <w:rFonts w:ascii="Century" w:hAnsi="Century"/>
+          <w:sz w:val="16"/>
+          <w:szCs w:val="16"/>
+        </w:rPr>
+        <w:t xml:space="preserve">{igArts} Arts</w:t>
+      </w:r>
+      <w:r>
+        <w:rPr>
+          <w:rFonts w:ascii="Century" w:hAnsi="Century"/>
+          <w:sz w:val="16"/>
+          <w:szCs w:val="16"/>
+        </w:rPr>
+        <w:tab/>
+      </w:r>
+      <w:r>
+        <w:rPr>
+          <w:rFonts w:ascii="Century" w:hAnsi="Century"/>
+          <w:sz w:val="16"/>
+          <w:szCs w:val="16"/>
+        </w:rPr>
+        <w:tab/>
+      </w:r>
+      <w:r>
+        <w:rPr>
+          <w:rFonts w:ascii="Century" w:hAnsi="Century"/>
+          <w:sz w:val="16"/>
+          <w:szCs w:val="16"/>
+        </w:rPr>
+        <w:tab/>
+        <w:t xml:space="preserve">{igSocial} Social Studies</w:t>
+      </w:r>
+      <w:r>
+        <w:rPr>
+          <w:rFonts w:ascii="Century" w:hAnsi="Century"/>
+          <w:sz w:val="16"/>
+          <w:szCs w:val="16"/>
+        </w:rPr>
+        <w:tab/>
+        <w:t xml:space="preserve">{igOther} Others</w:t>
+      </w:r>
+    </w:p>
+    <w:p>
+      <w:pPr>
+        <w:rPr>
+          <w:rFonts w:ascii="Century" w:hAnsi="Century"/>
+          <w:sz w:val="16"/>
+          <w:szCs w:val="16"/>
+        </w:rPr>
+      </w:pPr>
+      <w:r>
+        <w:rPr>
+          <w:rFonts w:ascii="Century" w:hAnsi="Century"/>
+          <w:sz w:val="16"/>
+          <w:szCs w:val="16"/>
+        </w:rPr>
+        <w:t xml:space="preserve">{igReligious} Religious</w:t>
       </w:r>
       <w:r>
         <w:rPr>
@@ -3115,16 +3804,26 @@
           <w:sz w:val="16"/>
           <w:szCs w:val="16"/>
         </w:rPr>
-        <w:t>Have you consulted/been sent to see the Guidance Counselor before?  {consultedYes} Yes</w:t>
-      </w:r>
-      <w:r>
-        <w:rPr>
-          <w:rFonts w:ascii="Century" w:hAnsi="Century"/>
-          <w:sz w:val="16"/>
-          <w:szCs w:val="16"/>
-        </w:rPr>
-        <w:tab/>
-        <w:t>{consultedNo} No</w:t>
+        <w:t xml:space="preserve">Have you consulted/been sent to see the Guidance Counselor before?  {consultedYes} </w:t>
+      </w:r>
+      <w:proofErr w:type="gramStart"/>
+      <w:r>
+        <w:rPr>
+          <w:rFonts w:ascii="Century" w:hAnsi="Century"/>
+          <w:sz w:val="16"/>
+          <w:szCs w:val="16"/>
+        </w:rPr>
+        <w:t>Yes</w:t>
+      </w:r>
+      <w:proofErr w:type="gramEnd"/>
+      <w:r>
+        <w:rPr>
+          <w:rFonts w:ascii="Century" w:hAnsi="Century"/>
+          <w:sz w:val="16"/>
+          <w:szCs w:val="16"/>
+        </w:rPr>
+        <w:tab/>
+        <w:t xml:space="preserve">{consultedNo} No</w:t>
       </w:r>
     </w:p>
     <w:p>
@@ -3159,7 +3858,7 @@
           <w:sz w:val="16"/>
           <w:szCs w:val="16"/>
         </w:rPr>
-        <w:t>{consultedReason}</w:t>
+        <w:t xml:space="preserve">{consultedReason}</w:t>
       </w:r>
     </w:p>
     <w:p>
@@ -3211,7 +3910,7 @@
           <w:sz w:val="16"/>
           <w:szCs w:val="16"/>
         </w:rPr>
-        <w:t>{hnFamily} Family matters</w:t>
+        <w:t xml:space="preserve">{hnFamily} Family matters</w:t>
       </w:r>
       <w:r>
         <w:rPr>
@@ -3263,108 +3962,108 @@
           <w:sz w:val="16"/>
           <w:szCs w:val="16"/>
         </w:rPr>
-        <w:t>{hnRelationship} Relationship problems</w:t>
-      </w:r>
-      <w:r>
-        <w:rPr>
-          <w:rFonts w:ascii="Century" w:hAnsi="Century"/>
-          <w:sz w:val="16"/>
-          <w:szCs w:val="16"/>
-        </w:rPr>
-        <w:tab/>
-        <w:t>{hnSelf} Self</w:t>
-      </w:r>
-      <w:r>
-        <w:rPr>
-          <w:rFonts w:ascii="Century" w:hAnsi="Century"/>
-          <w:sz w:val="16"/>
-          <w:szCs w:val="16"/>
-        </w:rPr>
-        <w:tab/>
-      </w:r>
-      <w:r>
-        <w:rPr>
-          <w:rFonts w:ascii="Century" w:hAnsi="Century"/>
-          <w:sz w:val="16"/>
-          <w:szCs w:val="16"/>
-        </w:rPr>
-        <w:tab/>
-      </w:r>
-      <w:r>
-        <w:rPr>
-          <w:rFonts w:ascii="Century" w:hAnsi="Century"/>
-          <w:sz w:val="16"/>
-          <w:szCs w:val="16"/>
-        </w:rPr>
-        <w:tab/>
-      </w:r>
-      <w:r>
-        <w:rPr>
-          <w:rFonts w:ascii="Century" w:hAnsi="Century"/>
-          <w:sz w:val="16"/>
-          <w:szCs w:val="16"/>
-        </w:rPr>
-        <w:tab/>
-      </w:r>
-    </w:p>
-    <w:p>
-      <w:pPr>
-        <w:rPr>
-          <w:rFonts w:ascii="Century" w:hAnsi="Century"/>
-          <w:sz w:val="16"/>
-          <w:szCs w:val="16"/>
-        </w:rPr>
-      </w:pPr>
-      <w:r>
-        <w:rPr>
-          <w:rFonts w:ascii="Century" w:hAnsi="Century"/>
-          <w:sz w:val="16"/>
-          <w:szCs w:val="16"/>
-        </w:rPr>
-        <w:t>{hnTeachers} Concerns with teachers</w:t>
-      </w:r>
-      <w:r>
-        <w:rPr>
-          <w:rFonts w:ascii="Century" w:hAnsi="Century"/>
-          <w:sz w:val="16"/>
-          <w:szCs w:val="16"/>
-        </w:rPr>
-        <w:tab/>
-        <w:t>{hnFinancial} Financial matters</w:t>
-      </w:r>
-    </w:p>
-    <w:p>
-      <w:pPr>
-        <w:rPr>
-          <w:rFonts w:ascii="Century" w:hAnsi="Century"/>
-          <w:sz w:val="16"/>
-          <w:szCs w:val="16"/>
-        </w:rPr>
-      </w:pPr>
-      <w:r>
-        <w:rPr>
-          <w:rFonts w:ascii="Century" w:hAnsi="Century"/>
-          <w:sz w:val="16"/>
-          <w:szCs w:val="16"/>
-        </w:rPr>
-        <w:t>{hnAcademic} Academic concerns</w:t>
-      </w:r>
-      <w:r>
-        <w:rPr>
-          <w:rFonts w:ascii="Century" w:hAnsi="Century"/>
-          <w:sz w:val="16"/>
-          <w:szCs w:val="16"/>
-        </w:rPr>
-        <w:tab/>
-      </w:r>
-      <w:r>
-        <w:rPr>
-          <w:rFonts w:ascii="Century" w:hAnsi="Century"/>
-          <w:sz w:val="16"/>
-          <w:szCs w:val="16"/>
-        </w:rPr>
-        <w:tab/>
-        <w:t>{hnHealth} Health concerns</w:t>
+        <w:t xml:space="preserve">{hnRelationship} Relationship problems</w:t>
+      </w:r>
+      <w:r>
+        <w:rPr>
+          <w:rFonts w:ascii="Century" w:hAnsi="Century"/>
+          <w:sz w:val="16"/>
+          <w:szCs w:val="16"/>
+        </w:rPr>
+        <w:tab/>
+        <w:t xml:space="preserve">{hnSelf} Self</w:t>
+      </w:r>
+      <w:r>
+        <w:rPr>
+          <w:rFonts w:ascii="Century" w:hAnsi="Century"/>
+          <w:sz w:val="16"/>
+          <w:szCs w:val="16"/>
+        </w:rPr>
+        <w:tab/>
+      </w:r>
+      <w:r>
+        <w:rPr>
+          <w:rFonts w:ascii="Century" w:hAnsi="Century"/>
+          <w:sz w:val="16"/>
+          <w:szCs w:val="16"/>
+        </w:rPr>
+        <w:tab/>
+      </w:r>
+      <w:r>
+        <w:rPr>
+          <w:rFonts w:ascii="Century" w:hAnsi="Century"/>
+          <w:sz w:val="16"/>
+          <w:szCs w:val="16"/>
+        </w:rPr>
+        <w:tab/>
+      </w:r>
+      <w:r>
+        <w:rPr>
+          <w:rFonts w:ascii="Century" w:hAnsi="Century"/>
+          <w:sz w:val="16"/>
+          <w:szCs w:val="16"/>
+        </w:rPr>
+        <w:tab/>
+      </w:r>
+    </w:p>
+    <w:p>
+      <w:pPr>
+        <w:rPr>
+          <w:rFonts w:ascii="Century" w:hAnsi="Century"/>
+          <w:sz w:val="16"/>
+          <w:szCs w:val="16"/>
+        </w:rPr>
+      </w:pPr>
+      <w:r>
+        <w:rPr>
+          <w:rFonts w:ascii="Century" w:hAnsi="Century"/>
+          <w:sz w:val="16"/>
+          <w:szCs w:val="16"/>
+        </w:rPr>
+        <w:t xml:space="preserve">{hnTeachers} Concerns with teachers</w:t>
+      </w:r>
+      <w:r>
+        <w:rPr>
+          <w:rFonts w:ascii="Century" w:hAnsi="Century"/>
+          <w:sz w:val="16"/>
+          <w:szCs w:val="16"/>
+        </w:rPr>
+        <w:tab/>
+        <w:t xml:space="preserve">{hnFinancial} Financial matters</w:t>
+      </w:r>
+    </w:p>
+    <w:p>
+      <w:pPr>
+        <w:rPr>
+          <w:rFonts w:ascii="Century" w:hAnsi="Century"/>
+          <w:sz w:val="16"/>
+          <w:szCs w:val="16"/>
+        </w:rPr>
+      </w:pPr>
+      <w:r>
+        <w:rPr>
+          <w:rFonts w:ascii="Century" w:hAnsi="Century"/>
+          <w:sz w:val="16"/>
+          <w:szCs w:val="16"/>
+        </w:rPr>
+        <w:t xml:space="preserve">{hnAcademic} Academic concerns</w:t>
+      </w:r>
+      <w:r>
+        <w:rPr>
+          <w:rFonts w:ascii="Century" w:hAnsi="Century"/>
+          <w:sz w:val="16"/>
+          <w:szCs w:val="16"/>
+        </w:rPr>
+        <w:tab/>
+      </w:r>
+      <w:r>
+        <w:rPr>
+          <w:rFonts w:ascii="Century" w:hAnsi="Century"/>
+          <w:sz w:val="16"/>
+          <w:szCs w:val="16"/>
+        </w:rPr>
+        <w:tab/>
+        <w:t xml:space="preserve">{hnHealth} Health concerns</w:t>
       </w:r>
       <w:r>
         <w:rPr>
@@ -3439,23 +4138,15 @@
           <w:sz w:val="16"/>
           <w:szCs w:val="16"/>
         </w:rPr>
-        <w:t xml:space="preserve">                                                                                         </w:t>
-      </w:r>
-      <w:r>
-        <w:rPr>
-          <w:rFonts w:ascii="Century" w:hAnsi="Century"/>
-          <w:sz w:val="16"/>
-          <w:szCs w:val="16"/>
-        </w:rPr>
-        <w:t xml:space="preserve">                                                                       </w:t>
-      </w:r>
-      <w:r>
-        <w:rPr>
-          <w:rFonts w:ascii="Century" w:hAnsi="Century"/>
-          <w:sz w:val="16"/>
-          <w:szCs w:val="16"/>
-        </w:rPr>
-        <w:t xml:space="preserve"> {%studentSignature}</w:t>
+        <w:t xml:space="preserve">                                                                                          </w:t>
+      </w:r>
+      <w:r>
+        <w:rPr>
+          <w:rFonts w:ascii="Century" w:hAnsi="Century"/>
+          <w:sz w:val="16"/>
+          <w:szCs w:val="16"/>
+        </w:rPr>
+        <w:t xml:space="preserve">{%studentSignature}</w:t>
       </w:r>
     </w:p>
     <w:p>
@@ -3473,82 +4164,24 @@
           <w:sz w:val="16"/>
           <w:szCs w:val="16"/>
         </w:rPr>
-        <w:t xml:space="preserve">         </w:t>
-      </w:r>
-      <w:r>
-        <w:rPr>
-          <w:rFonts w:ascii="Century" w:hAnsi="Century"/>
-          <w:sz w:val="16"/>
-          <w:szCs w:val="16"/>
-        </w:rPr>
-        <w:t>{</w:t>
-      </w:r>
-      <w:proofErr w:type="spellStart"/>
-      <w:r>
-        <w:rPr>
-          <w:rFonts w:ascii="Century" w:hAnsi="Century"/>
-          <w:sz w:val="16"/>
-          <w:szCs w:val="16"/>
-        </w:rPr>
-        <w:t>studentPrintedName</w:t>
-      </w:r>
-      <w:proofErr w:type="spellEnd"/>
-      <w:r>
-        <w:rPr>
-          <w:rFonts w:ascii="Century" w:hAnsi="Century"/>
-          <w:sz w:val="16"/>
-          <w:szCs w:val="16"/>
-        </w:rPr>
-        <w:t xml:space="preserve">}                                     </w:t>
-      </w:r>
-      <w:r>
-        <w:rPr>
-          <w:rFonts w:ascii="Century" w:hAnsi="Century"/>
-          <w:sz w:val="16"/>
-          <w:szCs w:val="16"/>
-        </w:rPr>
-        <w:t xml:space="preserve">                                              </w:t>
-      </w:r>
-      <w:r>
-        <w:rPr>
-          <w:rFonts w:ascii="Century" w:hAnsi="Century"/>
-          <w:sz w:val="16"/>
-          <w:szCs w:val="16"/>
-        </w:rPr>
-        <w:t xml:space="preserve">   ________________________________</w:t>
-      </w:r>
-    </w:p>
-    <w:p>
-      <w:pPr>
-        <w:rPr>
-          <w:rFonts w:ascii="Century" w:hAnsi="Century"/>
-          <w:sz w:val="16"/>
-          <w:szCs w:val="16"/>
-        </w:rPr>
-      </w:pPr>
-      <w:r>
-        <w:rPr>
-          <w:rFonts w:ascii="Century" w:hAnsi="Century"/>
-          <w:sz w:val="16"/>
-          <w:szCs w:val="16"/>
-        </w:rPr>
-        <w:t xml:space="preserve">                        Student’s Printed Name                                    </w:t>
-      </w:r>
-      <w:r>
-        <w:rPr>
-          <w:rFonts w:ascii="Century" w:hAnsi="Century"/>
-          <w:sz w:val="16"/>
-          <w:szCs w:val="16"/>
-        </w:rPr>
-        <w:t xml:space="preserve">                                        </w:t>
-      </w:r>
-      <w:r>
-        <w:rPr>
-          <w:rFonts w:ascii="Century" w:hAnsi="Century"/>
-          <w:sz w:val="16"/>
-          <w:szCs w:val="16"/>
-        </w:rPr>
-        <w:t xml:space="preserve">                      Student’s Signature</w:t>
+        <w:t xml:space="preserve">{studentPrintedName}                                        ________________________________</w:t>
+      </w:r>
+    </w:p>
+    <w:p>
+      <w:pPr>
+        <w:rPr>
+          <w:rFonts w:ascii="Century" w:hAnsi="Century"/>
+          <w:sz w:val="16"/>
+          <w:szCs w:val="16"/>
+        </w:rPr>
+      </w:pPr>
+      <w:r>
+        <w:rPr>
+          <w:rFonts w:ascii="Century" w:hAnsi="Century"/>
+          <w:sz w:val="16"/>
+          <w:szCs w:val="16"/>
+        </w:rPr>
+        <w:t xml:space="preserve">                        Student’s Printed Name                                                          Student’s Signature</w:t>
       </w:r>
     </w:p>
     <w:p>
@@ -3624,7 +4257,7 @@
           </mc:Choice>
           <mc:Fallback>
             <w:pict>
-              <v:line w14:anchorId="66EEC521" id="Straight Connector 1" o:spid="_x0000_s1026" style="position:absolute;z-index:251664384;visibility:visible;mso-wrap-style:square;mso-wrap-distance-left:9pt;mso-wrap-distance-top:0;mso-wrap-distance-right:9pt;mso-wrap-distance-bottom:0;mso-position-horizontal:absolute;mso-position-horizontal-relative:text;mso-position-vertical:absolute;mso-position-vertical-relative:text" from="5.9pt,8.05pt" to="547.6pt,8.05pt" o:gfxdata="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" strokecolor="black [3213]" strokeweight=".5pt">
+              <v:line w14:anchorId="3F418ECE" id="Straight Connector 1" o:spid="_x0000_s1026" style="position:absolute;z-index:251664384;visibility:visible;mso-wrap-style:square;mso-wrap-distance-left:9pt;mso-wrap-distance-top:0;mso-wrap-distance-right:9pt;mso-wrap-distance-bottom:0;mso-position-horizontal:absolute;mso-position-horizontal-relative:text;mso-position-vertical:absolute;mso-position-vertical-relative:text" from="5.9pt,8.05pt" to="547.6pt,8.05pt" o:gfxdata="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" strokecolor="black [3213]" strokeweight=".5pt">
                 <v:stroke dashstyle="dash" joinstyle="miter"/>
               </v:line>
             </w:pict>
@@ -4079,8 +4712,8 @@
       <w:tblPr>
         <w:tblStyle w:val="TableGrid"/>
         <w:tblW w:w="0" w:type="auto"/>
+        <w:tblLayout w:type="fixed"/>
         <w:tblInd w:w="360" w:type="dxa"/>
-        <w:tblLayout w:type="fixed"/>
         <w:tblLook w:val="04A0" w:firstRow="1" w:lastRow="0" w:firstColumn="1" w:lastColumn="0" w:noHBand="0" w:noVBand="1"/>
       </w:tblPr>
       <w:tblGrid>
@@ -4107,7 +4740,15 @@
                 <w:sz w:val="16"/>
                 <w:szCs w:val="16"/>
               </w:rPr>
-              <w:t xml:space="preserve">                                                                                          {%studentSignature}</w:t>
+              <w:t xml:space="preserve">                                                                                          </w:t>
+            </w:r>
+            <w:r>
+              <w:rPr>
+                <w:rFonts w:ascii="Century" w:hAnsi="Century"/>
+                <w:sz w:val="16"/>
+                <w:szCs w:val="16"/>
+              </w:rPr>
+              <w:t xml:space="preserve">{%studentSignature}</w:t>
             </w:r>
           </w:p>
           <w:p>
@@ -4124,7 +4765,7 @@
                 <w:sz w:val="14"/>
                 <w:szCs w:val="14"/>
               </w:rPr>
-              <w:t>{studentPrintedName}                                        ________________________________</w:t>
+              <w:t xml:space="preserve">{studentPrintedName}                                        ________________________________</w:t>
             </w:r>
           </w:p>
           <w:p>
@@ -4168,18 +4809,7 @@
                 <w:sz w:val="14"/>
                 <w:szCs w:val="14"/>
               </w:rPr>
-              <w:t>Date Signed: {dateAcknowledged}</w:t>
-            </w:r>
-          </w:p>
-          <w:p/>
-          <w:p>
-            <w:r>
-              <w:rPr>
-                <w:rFonts w:ascii="Century" w:hAnsi="Century"/>
-                <w:sz w:val="16"/>
-                <w:szCs w:val="16"/>
-              </w:rPr>
-              <w:t>Attested by:</w:t>
+              <w:t xml:space="preserve">Date Signed: {dateAcknowledged}</w:t>
             </w:r>
           </w:p>
           <w:p>
@@ -4189,7 +4819,7 @@
                 <w:sz w:val="16"/>
                 <w:szCs w:val="16"/>
               </w:rPr>
-              <w:t>{%counselorSignature}</w:t>
+              <w:t xml:space="preserve"/>
             </w:r>
           </w:p>
           <w:p>
@@ -4199,7 +4829,7 @@
                 <w:sz w:val="16"/>
                 <w:szCs w:val="16"/>
               </w:rPr>
-              <w:t>____________________________________________________</w:t>
+              <w:t xml:space="preserve">Attested by:</w:t>
             </w:r>
           </w:p>
           <w:p>
@@ -4209,7 +4839,7 @@
                 <w:sz w:val="16"/>
                 <w:szCs w:val="16"/>
               </w:rPr>
-              <w:t>{counselorPrintedName}</w:t>
+              <w:t xml:space="preserve">{%counselorSignature}</w:t>
             </w:r>
           </w:p>
           <w:p>
@@ -4219,7 +4849,27 @@
                 <w:sz w:val="16"/>
                 <w:szCs w:val="16"/>
               </w:rPr>
-              <w:t>Guidance Counselor's Signature over Printed Name</w:t>
+              <w:t xml:space="preserve">____________________________________________________</w:t>
+            </w:r>
+          </w:p>
+          <w:p>
+            <w:r>
+              <w:rPr>
+                <w:rFonts w:ascii="Century" w:hAnsi="Century"/>
+                <w:sz w:val="16"/>
+                <w:szCs w:val="16"/>
+              </w:rPr>
+              <w:t xml:space="preserve">{counselorPrintedName}</w:t>
+            </w:r>
+          </w:p>
+          <w:p>
+            <w:r>
+              <w:rPr>
+                <w:rFonts w:ascii="Century" w:hAnsi="Century"/>
+                <w:sz w:val="16"/>
+                <w:szCs w:val="16"/>
+              </w:rPr>
+              <w:t xml:space="preserve">Guidance Counselor's Signature over Printed Name</w:t>
             </w:r>
           </w:p>
           <w:p>
@@ -4650,8 +5300,21 @@
               <w:szCs w:val="28"/>
               <w:lang w:val="en-US"/>
             </w:rPr>
-            <w:t>GUIDANCE AND COUNSELING  SECTION</w:t>
+            <w:t xml:space="preserve">GUIDANCE AND </w:t>
           </w:r>
+          <w:proofErr w:type="gramStart"/>
+          <w:r>
+            <w:rPr>
+              <w:rFonts w:ascii="Century" w:hAnsi="Century" w:cs="Century"/>
+              <w:b/>
+              <w:bCs/>
+              <w:sz w:val="20"/>
+              <w:szCs w:val="28"/>
+              <w:lang w:val="en-US"/>
+            </w:rPr>
+            <w:t>COUNSELING  SECTION</w:t>
+          </w:r>
+          <w:proofErr w:type="gramEnd"/>
         </w:p>
       </w:tc>
       <w:tc>

</xml_diff>

<commit_message>
feat: implement system evaluation survey functionality and add responsive sidebar component
</commit_message>
<xml_diff>
--- a/backend/templates/individual-inventory-template.docx
+++ b/backend/templates/individual-inventory-template.docx
@@ -467,7 +467,16 @@
           <w:sz w:val="16"/>
           <w:szCs w:val="16"/>
         </w:rPr>
-        <w:t xml:space="preserve"> {idNumber}</w:t>
+        <w:t xml:space="preserve"> </w:t>
+      </w:r>
+      <w:r>
+        <w:rPr>
+          <w:rFonts w:ascii="Century" w:hAnsi="Century"/>
+          <w:sz w:val="16"/>
+          <w:szCs w:val="16"/>
+          <w:u w:val="single"/>
+        </w:rPr>
+        <w:t xml:space="preserve">{idNumber}</w:t>
       </w:r>
     </w:p>
     <w:p>
@@ -493,35 +502,81 @@
     </w:p>
     <w:p>
       <w:pPr>
-        <w:rPr>
-          <w:rFonts w:ascii="Century" w:hAnsi="Century"/>
-          <w:sz w:val="16"/>
-          <w:szCs w:val="16"/>
-        </w:rPr>
-      </w:pPr>
-      <w:r>
-        <w:rPr>
-          <w:rFonts w:ascii="Century" w:hAnsi="Century"/>
-          <w:sz w:val="16"/>
-          <w:szCs w:val="16"/>
-        </w:rPr>
-        <w:t xml:space="preserve">Name: {fullName}         </w:t>
-      </w:r>
-      <w:r>
-        <w:rPr>
-          <w:rFonts w:ascii="Century" w:hAnsi="Century"/>
-          <w:sz w:val="16"/>
-          <w:szCs w:val="16"/>
-        </w:rPr>
-        <w:t xml:space="preserve">                                                                                                        </w:t>
-      </w:r>
-      <w:r>
-        <w:rPr>
-          <w:rFonts w:ascii="Century" w:hAnsi="Century"/>
-          <w:sz w:val="16"/>
-          <w:szCs w:val="16"/>
-        </w:rPr>
-        <w:t xml:space="preserve"> Sex: {sex}   Age: {age}</w:t>
+        <w:jc w:val="right"/>
+        <w:rPr>
+          <w:rFonts w:ascii="Century" w:hAnsi="Century"/>
+          <w:sz w:val="16"/>
+          <w:szCs w:val="16"/>
+        </w:rPr>
+      </w:pPr>
+      <w:r>
+        <w:rPr>
+          <w:rFonts w:ascii="Century" w:hAnsi="Century"/>
+          <w:sz w:val="16"/>
+          <w:szCs w:val="16"/>
+        </w:rPr>
+        <w:t xml:space="preserve">Name: </w:t>
+      </w:r>
+      <w:r>
+        <w:rPr>
+          <w:rFonts w:ascii="Century" w:hAnsi="Century"/>
+          <w:sz w:val="16"/>
+          <w:szCs w:val="16"/>
+          <w:u w:val="single"/>
+        </w:rPr>
+        <w:t xml:space="preserve">{nameSurname}</w:t>
+      </w:r>
+      <w:r>
+        <w:rPr>
+          <w:rFonts w:ascii="Century" w:hAnsi="Century"/>
+          <w:sz w:val="16"/>
+          <w:szCs w:val="16"/>
+          <w:u w:val="single"/>
+        </w:rPr>
+        <w:t xml:space="preserve">{nameFirst}</w:t>
+      </w:r>
+      <w:r>
+        <w:rPr>
+          <w:rFonts w:ascii="Century" w:hAnsi="Century"/>
+          <w:sz w:val="16"/>
+          <w:szCs w:val="16"/>
+          <w:u w:val="single"/>
+        </w:rPr>
+        <w:t xml:space="preserve">{nameMiddle}</w:t>
+      </w:r>
+      <w:r>
+        <w:rPr>
+          <w:rFonts w:ascii="Century" w:hAnsi="Century"/>
+          <w:sz w:val="16"/>
+          <w:szCs w:val="16"/>
+        </w:rPr>
+        <w:t xml:space="preserve">Sex: </w:t>
+      </w:r>
+      <w:r>
+        <w:rPr>
+          <w:rFonts w:ascii="Century" w:hAnsi="Century"/>
+          <w:sz w:val="16"/>
+          <w:szCs w:val="16"/>
+          <w:u w:val="single"/>
+        </w:rPr>
+        <w:t xml:space="preserve">{sex}</w:t>
+      </w:r>
+      <w:r>
+        <w:rPr>
+          <w:rFonts w:ascii="Century" w:hAnsi="Century"/>
+          <w:sz w:val="16"/>
+          <w:szCs w:val="16"/>
+        </w:rPr>
+        <w:t xml:space="preserve"> Age: </w:t>
+      </w:r>
+      <w:r>
+        <w:rPr>
+          <w:rFonts w:ascii="Century" w:hAnsi="Century"/>
+          <w:sz w:val="16"/>
+          <w:szCs w:val="16"/>
+          <w:u w:val="single"/>
+        </w:rPr>
+        <w:t xml:space="preserve">{age}</w:t>
       </w:r>
     </w:p>
     <w:p>
@@ -557,7 +612,61 @@
           <w:szCs w:val="16"/>
         </w:rPr>
         <w:tab/>
-        <w:t xml:space="preserve">     (First Name)                (Middle Name)</w:t>
+        <w:t xml:space="preserve">  </w:t>
+      </w:r>
+      <w:proofErr w:type="gramStart"/>
+      <w:r>
+        <w:rPr>
+          <w:rFonts w:ascii="Century" w:hAnsi="Century"/>
+          <w:sz w:val="16"/>
+          <w:szCs w:val="16"/>
+        </w:rPr>
+        <w:t xml:space="preserve">   (</w:t>
+      </w:r>
+      <w:proofErr w:type="gramEnd"/>
+      <w:r>
+        <w:rPr>
+          <w:rFonts w:ascii="Century" w:hAnsi="Century"/>
+          <w:sz w:val="16"/>
+          <w:szCs w:val="16"/>
+        </w:rPr>
+        <w:t xml:space="preserve">First </w:t>
+      </w:r>
+      <w:proofErr w:type="gramStart"/>
+      <w:r>
+        <w:rPr>
+          <w:rFonts w:ascii="Century" w:hAnsi="Century"/>
+          <w:sz w:val="16"/>
+          <w:szCs w:val="16"/>
+        </w:rPr>
+        <w:t xml:space="preserve">Name)   </w:t>
+      </w:r>
+      <w:proofErr w:type="gramEnd"/>
+      <w:r>
+        <w:rPr>
+          <w:rFonts w:ascii="Century" w:hAnsi="Century"/>
+          <w:sz w:val="16"/>
+          <w:szCs w:val="16"/>
+        </w:rPr>
+        <w:t xml:space="preserve">          </w:t>
+      </w:r>
+      <w:proofErr w:type="gramStart"/>
+      <w:r>
+        <w:rPr>
+          <w:rFonts w:ascii="Century" w:hAnsi="Century"/>
+          <w:sz w:val="16"/>
+          <w:szCs w:val="16"/>
+        </w:rPr>
+        <w:t xml:space="preserve">   (</w:t>
+      </w:r>
+      <w:proofErr w:type="gramEnd"/>
+      <w:r>
+        <w:rPr>
+          <w:rFonts w:ascii="Century" w:hAnsi="Century"/>
+          <w:sz w:val="16"/>
+          <w:szCs w:val="16"/>
+        </w:rPr>
+        <w:t>Middle Name)</w:t>
       </w:r>
       <w:r>
         <w:rPr>
@@ -584,7 +693,122 @@
           <w:sz w:val="16"/>
           <w:szCs w:val="16"/>
         </w:rPr>
-        <w:t>Civil Status: {csSingle} Single {csMarried}Married {csSeparated}Separated {csWidow}Widow {csSoloParent}Solo Parent</w:t>
+        <w:t xml:space="preserve">Civil Status: </w:t>
+      </w:r>
+      <w:r>
+        <w:rPr>
+          <w:rFonts w:ascii="Century" w:hAnsi="Century"/>
+          <w:sz w:val="16"/>
+          <w:szCs w:val="16"/>
+        </w:rPr>
+        <w:r>
+          <w:rPr>
+            <w:rFonts w:ascii="Century" w:hAnsi="Century"/>
+            <w:sz w:val="16"/>
+            <w:szCs w:val="16"/>
+          </w:rPr>
+          <w:t xml:space="preserve">{csSingle}</w:t>
+        </w:r>
+      </w:r>
+      <w:r>
+        <w:rPr>
+          <w:rFonts w:ascii="Century" w:hAnsi="Century"/>
+          <w:sz w:val="16"/>
+          <w:szCs w:val="16"/>
+        </w:rPr>
+        <w:t xml:space="preserve"> Single </w:t>
+      </w:r>
+      <w:r>
+        <w:rPr>
+          <w:rFonts w:ascii="Century" w:hAnsi="Century"/>
+          <w:sz w:val="16"/>
+          <w:szCs w:val="16"/>
+        </w:rPr>
+        <w:r>
+          <w:rPr>
+            <w:rFonts w:ascii="Century" w:hAnsi="Century"/>
+            <w:sz w:val="16"/>
+            <w:szCs w:val="16"/>
+          </w:rPr>
+          <w:t xml:space="preserve">{csMarried}</w:t>
+        </w:r>
+      </w:r>
+      <w:r>
+        <w:rPr>
+          <w:rFonts w:ascii="Century" w:hAnsi="Century"/>
+          <w:sz w:val="16"/>
+          <w:szCs w:val="16"/>
+        </w:rPr>
+        <w:t xml:space="preserve">Married </w:t>
+      </w:r>
+      <w:r>
+        <w:rPr>
+          <w:rFonts w:ascii="Century" w:hAnsi="Century"/>
+          <w:sz w:val="16"/>
+          <w:szCs w:val="16"/>
+        </w:rPr>
+        <w:r>
+          <w:rPr>
+            <w:rFonts w:ascii="Century" w:hAnsi="Century"/>
+            <w:sz w:val="16"/>
+            <w:szCs w:val="16"/>
+          </w:rPr>
+          <w:t xml:space="preserve">{csSeparated}</w:t>
+        </w:r>
+      </w:r>
+      <w:r>
+        <w:rPr>
+          <w:rFonts w:ascii="Century" w:hAnsi="Century"/>
+          <w:sz w:val="16"/>
+          <w:szCs w:val="16"/>
+        </w:rPr>
+        <w:t xml:space="preserve">Separated </w:t>
+      </w:r>
+      <w:r>
+        <w:rPr>
+          <w:rFonts w:ascii="Century" w:hAnsi="Century"/>
+          <w:sz w:val="16"/>
+          <w:szCs w:val="16"/>
+        </w:rPr>
+        <w:r>
+          <w:rPr>
+            <w:rFonts w:ascii="Century" w:hAnsi="Century"/>
+            <w:sz w:val="16"/>
+            <w:szCs w:val="16"/>
+          </w:rPr>
+          <w:t xml:space="preserve">{csWidow}</w:t>
+        </w:r>
+      </w:r>
+      <w:r>
+        <w:rPr>
+          <w:rFonts w:ascii="Century" w:hAnsi="Century"/>
+          <w:sz w:val="16"/>
+          <w:szCs w:val="16"/>
+        </w:rPr>
+        <w:t xml:space="preserve">Widow </w:t>
+      </w:r>
+      <w:r>
+        <w:rPr>
+          <w:rFonts w:ascii="Century" w:hAnsi="Century"/>
+          <w:sz w:val="16"/>
+          <w:szCs w:val="16"/>
+        </w:rPr>
+        <w:r>
+          <w:rPr>
+            <w:rFonts w:ascii="Century" w:hAnsi="Century"/>
+            <w:sz w:val="16"/>
+            <w:szCs w:val="16"/>
+          </w:rPr>
+          <w:t xml:space="preserve">{csSoloParent}</w:t>
+        </w:r>
+      </w:r>
+      <w:r>
+        <w:rPr>
+          <w:rFonts w:ascii="Century" w:hAnsi="Century"/>
+          <w:sz w:val="16"/>
+          <w:szCs w:val="16"/>
+        </w:rPr>
+        <w:t>Solo Parent</w:t>
       </w:r>
     </w:p>
     <w:p>
@@ -602,16 +826,75 @@
           <w:sz w:val="16"/>
           <w:szCs w:val="16"/>
         </w:rPr>
-        <w:t>Course: {course}     Year Level: {yearLevel}</w:t>
-      </w:r>
-      <w:r>
-        <w:rPr>
-          <w:rFonts w:ascii="Century" w:hAnsi="Century"/>
-          <w:sz w:val="16"/>
-          <w:szCs w:val="16"/>
-        </w:rPr>
-        <w:tab/>
-        <w:t>A.Y. {academicYear}     Date of Birth: {dateOfBirth}</w:t>
+        <w:t xml:space="preserve">Course: </w:t>
+      </w:r>
+      <w:r>
+        <w:rPr>
+          <w:rFonts w:ascii="Century" w:hAnsi="Century"/>
+          <w:sz w:val="16"/>
+          <w:szCs w:val="16"/>
+          <w:u w:val="single"/>
+        </w:rPr>
+        <w:t xml:space="preserve">{course}</w:t>
+      </w:r>
+      <w:r>
+        <w:rPr>
+          <w:rFonts w:ascii="Century" w:hAnsi="Century"/>
+          <w:sz w:val="16"/>
+          <w:szCs w:val="16"/>
+        </w:rPr>
+        <w:t xml:space="preserve"> Year Level: </w:t>
+      </w:r>
+      <w:r>
+        <w:rPr>
+          <w:rFonts w:ascii="Century" w:hAnsi="Century"/>
+          <w:sz w:val="16"/>
+          <w:szCs w:val="16"/>
+          <w:u w:val="single"/>
+        </w:rPr>
+        <w:t xml:space="preserve">{yearLevel}</w:t>
+      </w:r>
+      <w:r>
+        <w:rPr>
+          <w:rFonts w:ascii="Century" w:hAnsi="Century"/>
+          <w:sz w:val="16"/>
+          <w:szCs w:val="16"/>
+        </w:rPr>
+        <w:tab/>
+      </w:r>
+      <w:r>
+        <w:rPr>
+          <w:rFonts w:ascii="Century" w:hAnsi="Century"/>
+          <w:sz w:val="16"/>
+          <w:szCs w:val="16"/>
+        </w:rPr>
+        <w:t xml:space="preserve">A.Y. </w:t>
+      </w:r>
+      <w:r>
+        <w:rPr>
+          <w:rFonts w:ascii="Century" w:hAnsi="Century"/>
+          <w:sz w:val="16"/>
+          <w:szCs w:val="16"/>
+          <w:u w:val="single"/>
+        </w:rPr>
+        <w:t xml:space="preserve">{academicYear}</w:t>
+      </w:r>
+      <w:r>
+        <w:rPr>
+          <w:rFonts w:ascii="Century" w:hAnsi="Century"/>
+          <w:sz w:val="16"/>
+          <w:szCs w:val="16"/>
+        </w:rPr>
+        <w:t xml:space="preserve">Date of Birth: </w:t>
+      </w:r>
+      <w:r>
+        <w:rPr>
+          <w:rFonts w:ascii="Century" w:hAnsi="Century"/>
+          <w:sz w:val="16"/>
+          <w:szCs w:val="16"/>
+          <w:u w:val="single"/>
+        </w:rPr>
+        <w:t xml:space="preserve">{dateOfBirth}</w:t>
       </w:r>
     </w:p>
     <w:p>
@@ -629,66 +912,216 @@
           <w:sz w:val="16"/>
           <w:szCs w:val="16"/>
         </w:rPr>
-        <w:t>Height (m): {heightM}     Weight: {weightKg}     Place of Birth: {placeOfBirth}</w:t>
-      </w:r>
-    </w:p>
-    <w:p>
-      <w:pPr>
-        <w:rPr>
-          <w:rFonts w:ascii="Century" w:hAnsi="Century"/>
-          <w:sz w:val="16"/>
-          <w:szCs w:val="16"/>
-        </w:rPr>
-      </w:pPr>
-      <w:r>
-        <w:rPr>
-          <w:rFonts w:ascii="Century" w:hAnsi="Century"/>
-          <w:sz w:val="16"/>
-          <w:szCs w:val="16"/>
-        </w:rPr>
-        <w:t>Present Address</w:t>
-      </w:r>
-      <w:r>
-        <w:rPr>
-          <w:rFonts w:ascii="Century" w:hAnsi="Century"/>
-          <w:sz w:val="16"/>
-          <w:szCs w:val="16"/>
-        </w:rPr>
-        <w:t xml:space="preserve">(Residential/BoardingHouse/Dormitory): {presentAddress} </w:t>
-      </w:r>
-      <w:r>
-        <w:rPr>
-          <w:rFonts w:ascii="Century" w:hAnsi="Century"/>
-          <w:sz w:val="16"/>
-          <w:szCs w:val="16"/>
-        </w:rPr>
-        <w:t>Email Address: {emailAddress}</w:t>
-      </w:r>
-    </w:p>
-    <w:p>
-      <w:pPr>
-        <w:rPr>
-          <w:rFonts w:ascii="Century" w:hAnsi="Century"/>
-          <w:sz w:val="16"/>
-          <w:szCs w:val="16"/>
-        </w:rPr>
-      </w:pPr>
-      <w:r>
-        <w:rPr>
-          <w:rFonts w:ascii="Century" w:hAnsi="Century"/>
-          <w:sz w:val="16"/>
-          <w:szCs w:val="16"/>
-        </w:rPr>
-        <w:t>Hometown Address: {hometownAddress}</w:t>
-      </w:r>
-      <w:r>
-        <w:rPr>
-          <w:rFonts w:ascii="Century" w:hAnsi="Century"/>
-          <w:sz w:val="16"/>
-          <w:szCs w:val="16"/>
-        </w:rPr>
-        <w:tab/>
-        <w:t>Mobile No.: {mobileNo}</w:t>
+        <w:t>Height (m</w:t>
+      </w:r>
+      <w:proofErr w:type="gramStart"/>
+      <w:r>
+        <w:rPr>
+          <w:rFonts w:ascii="Century" w:hAnsi="Century"/>
+          <w:sz w:val="16"/>
+          <w:szCs w:val="16"/>
+        </w:rPr>
+        <w:t xml:space="preserve">): </w:t>
+      </w:r>
+      <w:proofErr w:type="gramEnd"/>
+      <w:r>
+        <w:rPr>
+          <w:rFonts w:ascii="Century" w:hAnsi="Century"/>
+          <w:sz w:val="16"/>
+          <w:szCs w:val="16"/>
+          <w:u w:val="single"/>
+        </w:rPr>
+        <w:t xml:space="preserve">{heightM}</w:t>
+      </w:r>
+      <w:r>
+        <w:rPr>
+          <w:rFonts w:ascii="Century" w:hAnsi="Century"/>
+          <w:sz w:val="16"/>
+          <w:szCs w:val="16"/>
+        </w:rPr>
+        <w:t xml:space="preserve"> Weight: </w:t>
+      </w:r>
+      <w:r>
+        <w:rPr>
+          <w:rFonts w:ascii="Century" w:hAnsi="Century"/>
+          <w:sz w:val="16"/>
+          <w:szCs w:val="16"/>
+          <w:u w:val="single"/>
+        </w:rPr>
+        <w:t xml:space="preserve">{weightKg}</w:t>
+      </w:r>
+      <w:r>
+        <w:rPr>
+          <w:rFonts w:ascii="Century" w:hAnsi="Century"/>
+          <w:sz w:val="16"/>
+          <w:szCs w:val="16"/>
+        </w:rPr>
+        <w:t xml:space="preserve"> Place of Birth: </w:t>
+      </w:r>
+      <w:r>
+        <w:rPr>
+          <w:rFonts w:ascii="Century" w:hAnsi="Century"/>
+          <w:sz w:val="16"/>
+          <w:szCs w:val="16"/>
+          <w:u w:val="single"/>
+        </w:rPr>
+        <w:t xml:space="preserve">{placeOfBirth}</w:t>
+      </w:r>
+    </w:p>
+    <w:p>
+      <w:pPr>
+        <w:rPr>
+          <w:rFonts w:ascii="Century" w:hAnsi="Century"/>
+          <w:sz w:val="16"/>
+          <w:szCs w:val="16"/>
+        </w:rPr>
+      </w:pPr>
+      <w:r>
+        <w:rPr>
+          <w:rFonts w:ascii="Century" w:hAnsi="Century"/>
+          <w:sz w:val="16"/>
+          <w:szCs w:val="16"/>
+        </w:rPr>
+        <w:t xml:space="preserve">Present </w:t>
+      </w:r>
+      <w:proofErr w:type="gramStart"/>
+      <w:r>
+        <w:rPr>
+          <w:rFonts w:ascii="Century" w:hAnsi="Century"/>
+          <w:sz w:val="16"/>
+          <w:szCs w:val="16"/>
+        </w:rPr>
+        <w:t>Address</w:t>
+      </w:r>
+      <w:r>
+        <w:rPr>
+          <w:rFonts w:ascii="Century" w:hAnsi="Century"/>
+          <w:sz w:val="16"/>
+          <w:szCs w:val="16"/>
+        </w:rPr>
+        <w:t>(</w:t>
+      </w:r>
+      <w:proofErr w:type="gramEnd"/>
+      <w:r>
+        <w:rPr>
+          <w:rFonts w:ascii="Century" w:hAnsi="Century"/>
+          <w:sz w:val="16"/>
+          <w:szCs w:val="16"/>
+        </w:rPr>
+        <w:t>Residential/BoardingHouse/Dormitory</w:t>
+      </w:r>
+      <w:proofErr w:type="gramStart"/>
+      <w:r>
+        <w:rPr>
+          <w:rFonts w:ascii="Century" w:hAnsi="Century"/>
+          <w:sz w:val="16"/>
+          <w:szCs w:val="16"/>
+        </w:rPr>
+        <w:t>):</w:t>
+      </w:r>
+      <w:r>
+        <w:rPr>
+          <w:rFonts w:ascii="Century" w:hAnsi="Century"/>
+          <w:sz w:val="16"/>
+          <w:szCs w:val="16"/>
+        </w:rPr>
+        <w:t xml:space="preserve"/>
+      </w:r>
+      <w:proofErr w:type="gramEnd"/>
+      <w:r>
+        <w:rPr>
+          <w:rFonts w:ascii="Century" w:hAnsi="Century"/>
+          <w:sz w:val="16"/>
+          <w:szCs w:val="16"/>
+        </w:rPr>
+        <w:t xml:space="preserve"/>
+      </w:r>
+      <w:r>
+        <w:rPr>
+          <w:rFonts w:ascii="Century" w:hAnsi="Century"/>
+          <w:sz w:val="16"/>
+          <w:szCs w:val="16"/>
+          <w:u w:val="single"/>
+        </w:rPr>
+        <w:t xml:space="preserve">{presentAddress}</w:t>
+      </w:r>
+      <w:proofErr w:type="gramStart"/>
+      <w:r>
+        <w:rPr>
+          <w:rFonts w:ascii="Century" w:hAnsi="Century"/>
+          <w:sz w:val="16"/>
+          <w:szCs w:val="16"/>
+        </w:rPr>
+        <w:t xml:space="preserve"> </w:t>
+      </w:r>
+      <w:r>
+        <w:rPr>
+          <w:rFonts w:ascii="Century" w:hAnsi="Century"/>
+          <w:sz w:val="16"/>
+          <w:szCs w:val="16"/>
+        </w:rPr>
+        <w:t>Email</w:t>
+      </w:r>
+      <w:proofErr w:type="gramEnd"/>
+      <w:r>
+        <w:rPr>
+          <w:rFonts w:ascii="Century" w:hAnsi="Century"/>
+          <w:sz w:val="16"/>
+          <w:szCs w:val="16"/>
+        </w:rPr>
+        <w:t xml:space="preserve"> Address: </w:t>
+      </w:r>
+      <w:r>
+        <w:rPr>
+          <w:rFonts w:ascii="Century" w:hAnsi="Century"/>
+          <w:sz w:val="16"/>
+          <w:szCs w:val="16"/>
+          <w:u w:val="single"/>
+        </w:rPr>
+        <w:t xml:space="preserve">{emailAddress}</w:t>
+      </w:r>
+    </w:p>
+    <w:p>
+      <w:pPr>
+        <w:rPr>
+          <w:rFonts w:ascii="Century" w:hAnsi="Century"/>
+          <w:sz w:val="16"/>
+          <w:szCs w:val="16"/>
+        </w:rPr>
+      </w:pPr>
+      <w:r>
+        <w:rPr>
+          <w:rFonts w:ascii="Century" w:hAnsi="Century"/>
+          <w:sz w:val="16"/>
+          <w:szCs w:val="16"/>
+        </w:rPr>
+        <w:t xml:space="preserve">Hometown Address: </w:t>
+      </w:r>
+      <w:r>
+        <w:rPr>
+          <w:rFonts w:ascii="Century" w:hAnsi="Century"/>
+          <w:sz w:val="16"/>
+          <w:szCs w:val="16"/>
+          <w:u w:val="single"/>
+        </w:rPr>
+        <w:t xml:space="preserve">{hometownAddress}</w:t>
+      </w:r>
+      <w:r>
+        <w:rPr>
+          <w:rFonts w:ascii="Century" w:hAnsi="Century"/>
+          <w:sz w:val="16"/>
+          <w:szCs w:val="16"/>
+        </w:rPr>
+        <w:t xml:space="preserve">Mobile No.: </w:t>
+      </w:r>
+      <w:r>
+        <w:rPr>
+          <w:rFonts w:ascii="Century" w:hAnsi="Century"/>
+          <w:sz w:val="16"/>
+          <w:szCs w:val="16"/>
+          <w:u w:val="single"/>
+        </w:rPr>
+        <w:t xml:space="preserve">{mobileNo}</w:t>
       </w:r>
     </w:p>
     <w:p>
@@ -706,7 +1139,67 @@
           <w:sz w:val="16"/>
           <w:szCs w:val="16"/>
         </w:rPr>
-        <w:t>Grade Point Average: {gpa}   Religion: {religion}   Citizenship: {citizenship}   Tribe: {tribe}</w:t>
+        <w:t xml:space="preserve">Grade Point Average: </w:t>
+      </w:r>
+      <w:r>
+        <w:rPr>
+          <w:rFonts w:ascii="Century" w:hAnsi="Century"/>
+          <w:sz w:val="16"/>
+          <w:szCs w:val="16"/>
+          <w:u w:val="single"/>
+        </w:rPr>
+        <w:t xml:space="preserve">{gpa}</w:t>
+      </w:r>
+      <w:r>
+        <w:rPr>
+          <w:rFonts w:ascii="Century" w:hAnsi="Century"/>
+          <w:sz w:val="16"/>
+          <w:szCs w:val="16"/>
+        </w:rPr>
+        <w:t xml:space="preserve"> Religion: </w:t>
+      </w:r>
+      <w:r>
+        <w:rPr>
+          <w:rFonts w:ascii="Century" w:hAnsi="Century"/>
+          <w:sz w:val="16"/>
+          <w:szCs w:val="16"/>
+          <w:u w:val="single"/>
+        </w:rPr>
+        <w:t xml:space="preserve">{religion}</w:t>
+      </w:r>
+      <w:r>
+        <w:rPr>
+          <w:rFonts w:ascii="Century" w:hAnsi="Century"/>
+          <w:sz w:val="16"/>
+          <w:szCs w:val="16"/>
+        </w:rPr>
+        <w:t xml:space="preserve"> Citizenship: </w:t>
+      </w:r>
+      <w:r>
+        <w:rPr>
+          <w:rFonts w:ascii="Century" w:hAnsi="Century"/>
+          <w:sz w:val="16"/>
+          <w:szCs w:val="16"/>
+          <w:u w:val="single"/>
+        </w:rPr>
+        <w:t xml:space="preserve">{citizenship}</w:t>
+      </w:r>
+      <w:r>
+        <w:rPr>
+          <w:rFonts w:ascii="Century" w:hAnsi="Century"/>
+          <w:sz w:val="16"/>
+          <w:szCs w:val="16"/>
+        </w:rPr>
+        <w:t xml:space="preserve"> Tribe; </w:t>
+      </w:r>
+      <w:r>
+        <w:rPr>
+          <w:rFonts w:ascii="Century" w:hAnsi="Century"/>
+          <w:sz w:val="16"/>
+          <w:szCs w:val="16"/>
+          <w:u w:val="single"/>
+        </w:rPr>
+        <w:t xml:space="preserve">{tribe}</w:t>
       </w:r>
     </w:p>
     <w:p>
@@ -724,7 +1217,16 @@
           <w:sz w:val="16"/>
           <w:szCs w:val="16"/>
         </w:rPr>
-        <w:t>If working, please indicate the name and address of employer: {employerNameAddress}</w:t>
+        <w:t xml:space="preserve">If working, please indicate the name and address of employer: </w:t>
+      </w:r>
+      <w:r>
+        <w:rPr>
+          <w:rFonts w:ascii="Century" w:hAnsi="Century"/>
+          <w:sz w:val="16"/>
+          <w:szCs w:val="16"/>
+          <w:u w:val="single"/>
+        </w:rPr>
+        <w:t xml:space="preserve">{employerNameAddress}</w:t>
       </w:r>
     </w:p>
     <w:p>
@@ -742,7 +1244,33 @@
           <w:sz w:val="16"/>
           <w:szCs w:val="16"/>
         </w:rPr>
-        <w:t>Person to be contacted in case of emergency: {emergencyName}      Contact No. {emergencyContactNo}</w:t>
+        <w:t xml:space="preserve">Person to be contacted in case of emergency: </w:t>
+      </w:r>
+      <w:r>
+        <w:rPr>
+          <w:rFonts w:ascii="Century" w:hAnsi="Century"/>
+          <w:sz w:val="16"/>
+          <w:szCs w:val="16"/>
+          <w:u w:val="single"/>
+        </w:rPr>
+        <w:t xml:space="preserve">{emergencyName}</w:t>
+      </w:r>
+      <w:r>
+        <w:rPr>
+          <w:rFonts w:ascii="Century" w:hAnsi="Century"/>
+          <w:sz w:val="16"/>
+          <w:szCs w:val="16"/>
+        </w:rPr>
+        <w:t xml:space="preserve"> Contact No. </w:t>
+      </w:r>
+      <w:r>
+        <w:rPr>
+          <w:rFonts w:ascii="Century" w:hAnsi="Century"/>
+          <w:sz w:val="16"/>
+          <w:szCs w:val="16"/>
+          <w:u w:val="single"/>
+        </w:rPr>
+        <w:t xml:space="preserve">{emergencyContactNo}</w:t>
       </w:r>
     </w:p>
     <w:p>
@@ -754,13 +1282,41 @@
           <w:szCs w:val="16"/>
         </w:rPr>
       </w:pPr>
-      <w:r>
-        <w:rPr>
-          <w:rFonts w:ascii="Century" w:hAnsi="Century"/>
-          <w:sz w:val="16"/>
-          <w:szCs w:val="16"/>
-        </w:rPr>
-        <w:t>Address: {emergencyAddress}     Relationship: {emergencyRelationship}</w:t>
+      <w:proofErr w:type="gramStart"/>
+      <w:r>
+        <w:rPr>
+          <w:rFonts w:ascii="Century" w:hAnsi="Century"/>
+          <w:sz w:val="16"/>
+          <w:szCs w:val="16"/>
+        </w:rPr>
+        <w:t xml:space="preserve">Address: </w:t>
+      </w:r>
+      <w:proofErr w:type="gramEnd"/>
+      <w:r>
+        <w:rPr>
+          <w:rFonts w:ascii="Century" w:hAnsi="Century"/>
+          <w:sz w:val="16"/>
+          <w:szCs w:val="16"/>
+          <w:u w:val="single"/>
+        </w:rPr>
+        <w:t xml:space="preserve">{emergencyAddress}</w:t>
+      </w:r>
+      <w:r>
+        <w:rPr>
+          <w:rFonts w:ascii="Century" w:hAnsi="Century"/>
+          <w:sz w:val="16"/>
+          <w:szCs w:val="16"/>
+        </w:rPr>
+        <w:t xml:space="preserve"> Relationship: </w:t>
+      </w:r>
+      <w:r>
+        <w:rPr>
+          <w:rFonts w:ascii="Century" w:hAnsi="Century"/>
+          <w:sz w:val="16"/>
+          <w:szCs w:val="16"/>
+          <w:u w:val="single"/>
+        </w:rPr>
+        <w:t xml:space="preserve">{emergencyRelationship}</w:t>
       </w:r>
     </w:p>
     <w:p>
@@ -1052,7 +1608,7 @@
                 <w:sz w:val="16"/>
                 <w:szCs w:val="16"/>
               </w:rPr>
-              <w:t>{edu0School}</w:t>
+              <w:t xml:space="preserve">{edu0School}</w:t>
             </w:r>
           </w:p>
         </w:tc>
@@ -1075,7 +1631,7 @@
                 <w:sz w:val="16"/>
                 <w:szCs w:val="16"/>
               </w:rPr>
-              <w:t>{edu0Address}</w:t>
+              <w:t xml:space="preserve">{edu0Address}</w:t>
             </w:r>
           </w:p>
         </w:tc>
@@ -1098,7 +1654,7 @@
                 <w:sz w:val="16"/>
                 <w:szCs w:val="16"/>
               </w:rPr>
-              <w:t>{edu0PublicPrivate}</w:t>
+              <w:t xml:space="preserve">{edu0PublicPrivate}</w:t>
             </w:r>
           </w:p>
         </w:tc>
@@ -1121,7 +1677,7 @@
                 <w:sz w:val="16"/>
                 <w:szCs w:val="16"/>
               </w:rPr>
-              <w:t>{edu0YearGraduated}</w:t>
+              <w:t xml:space="preserve">{edu0YearGraduated}</w:t>
             </w:r>
           </w:p>
         </w:tc>
@@ -1144,7 +1700,7 @@
                 <w:sz w:val="16"/>
                 <w:szCs w:val="16"/>
               </w:rPr>
-              <w:t>{edu0Honors}</w:t>
+              <w:t xml:space="preserve">{edu0Honors}</w:t>
             </w:r>
           </w:p>
         </w:tc>
@@ -1195,7 +1751,7 @@
                 <w:sz w:val="16"/>
                 <w:szCs w:val="16"/>
               </w:rPr>
-              <w:t>{edu1School}</w:t>
+              <w:t xml:space="preserve">{edu1School}</w:t>
             </w:r>
           </w:p>
         </w:tc>
@@ -1218,7 +1774,7 @@
                 <w:sz w:val="16"/>
                 <w:szCs w:val="16"/>
               </w:rPr>
-              <w:t>{edu1Address}</w:t>
+              <w:t xml:space="preserve">{edu1Address}</w:t>
             </w:r>
           </w:p>
         </w:tc>
@@ -1241,7 +1797,7 @@
                 <w:sz w:val="16"/>
                 <w:szCs w:val="16"/>
               </w:rPr>
-              <w:t>{edu1PublicPrivate}</w:t>
+              <w:t xml:space="preserve">{edu1PublicPrivate}</w:t>
             </w:r>
           </w:p>
         </w:tc>
@@ -1264,7 +1820,7 @@
                 <w:sz w:val="16"/>
                 <w:szCs w:val="16"/>
               </w:rPr>
-              <w:t>{edu1YearGraduated}</w:t>
+              <w:t xml:space="preserve">{edu1YearGraduated}</w:t>
             </w:r>
           </w:p>
         </w:tc>
@@ -1287,7 +1843,7 @@
                 <w:sz w:val="16"/>
                 <w:szCs w:val="16"/>
               </w:rPr>
-              <w:t>{edu1Honors}</w:t>
+              <w:t xml:space="preserve">{edu1Honors}</w:t>
             </w:r>
           </w:p>
         </w:tc>
@@ -1338,7 +1894,7 @@
                 <w:sz w:val="16"/>
                 <w:szCs w:val="16"/>
               </w:rPr>
-              <w:t>{edu2School}</w:t>
+              <w:t xml:space="preserve">{edu2School}</w:t>
             </w:r>
           </w:p>
         </w:tc>
@@ -1361,7 +1917,7 @@
                 <w:sz w:val="16"/>
                 <w:szCs w:val="16"/>
               </w:rPr>
-              <w:t>{edu2Address}</w:t>
+              <w:t xml:space="preserve">{edu2Address}</w:t>
             </w:r>
           </w:p>
         </w:tc>
@@ -1384,7 +1940,7 @@
                 <w:sz w:val="16"/>
                 <w:szCs w:val="16"/>
               </w:rPr>
-              <w:t>{edu2PublicPrivate}</w:t>
+              <w:t xml:space="preserve">{edu2PublicPrivate}</w:t>
             </w:r>
           </w:p>
         </w:tc>
@@ -1407,7 +1963,7 @@
                 <w:sz w:val="16"/>
                 <w:szCs w:val="16"/>
               </w:rPr>
-              <w:t>{edu2YearGraduated}</w:t>
+              <w:t xml:space="preserve">{edu2YearGraduated}</w:t>
             </w:r>
           </w:p>
         </w:tc>
@@ -1430,7 +1986,7 @@
                 <w:sz w:val="16"/>
                 <w:szCs w:val="16"/>
               </w:rPr>
-              <w:t>{edu2Honors}</w:t>
+              <w:t xml:space="preserve">{edu2Honors}</w:t>
             </w:r>
           </w:p>
         </w:tc>
@@ -1481,7 +2037,7 @@
                 <w:sz w:val="16"/>
                 <w:szCs w:val="16"/>
               </w:rPr>
-              <w:t>{edu3School}</w:t>
+              <w:t xml:space="preserve">{edu3School}</w:t>
             </w:r>
           </w:p>
         </w:tc>
@@ -1504,7 +2060,7 @@
                 <w:sz w:val="16"/>
                 <w:szCs w:val="16"/>
               </w:rPr>
-              <w:t>{edu3Address}</w:t>
+              <w:t xml:space="preserve">{edu3Address}</w:t>
             </w:r>
           </w:p>
         </w:tc>
@@ -1527,7 +2083,7 @@
                 <w:sz w:val="16"/>
                 <w:szCs w:val="16"/>
               </w:rPr>
-              <w:t>{edu3PublicPrivate}</w:t>
+              <w:t xml:space="preserve">{edu3PublicPrivate}</w:t>
             </w:r>
           </w:p>
         </w:tc>
@@ -1550,7 +2106,7 @@
                 <w:sz w:val="16"/>
                 <w:szCs w:val="16"/>
               </w:rPr>
-              <w:t>{edu3YearGraduated}</w:t>
+              <w:t xml:space="preserve">{edu3YearGraduated}</w:t>
             </w:r>
           </w:p>
         </w:tc>
@@ -1573,7 +2129,7 @@
                 <w:sz w:val="16"/>
                 <w:szCs w:val="16"/>
               </w:rPr>
-              <w:t>{edu3Honors}</w:t>
+              <w:t xml:space="preserve">{edu3Honors}</w:t>
             </w:r>
           </w:p>
         </w:tc>
@@ -1624,7 +2180,7 @@
                 <w:sz w:val="16"/>
                 <w:szCs w:val="16"/>
               </w:rPr>
-              <w:t>{edu4School}</w:t>
+              <w:t xml:space="preserve">{edu4School}</w:t>
             </w:r>
           </w:p>
         </w:tc>
@@ -1647,7 +2203,7 @@
                 <w:sz w:val="16"/>
                 <w:szCs w:val="16"/>
               </w:rPr>
-              <w:t>{edu4Address}</w:t>
+              <w:t xml:space="preserve">{edu4Address}</w:t>
             </w:r>
           </w:p>
         </w:tc>
@@ -1670,7 +2226,7 @@
                 <w:sz w:val="16"/>
                 <w:szCs w:val="16"/>
               </w:rPr>
-              <w:t>{edu4PublicPrivate}</w:t>
+              <w:t xml:space="preserve">{edu4PublicPrivate}</w:t>
             </w:r>
           </w:p>
         </w:tc>
@@ -1693,7 +2249,7 @@
                 <w:sz w:val="16"/>
                 <w:szCs w:val="16"/>
               </w:rPr>
-              <w:t>{edu4YearGraduated}</w:t>
+              <w:t xml:space="preserve">{edu4YearGraduated}</w:t>
             </w:r>
           </w:p>
         </w:tc>
@@ -1716,7 +2272,7 @@
                 <w:sz w:val="16"/>
                 <w:szCs w:val="16"/>
               </w:rPr>
-              <w:t>{edu4Honors}</w:t>
+              <w:t xml:space="preserve">{edu4Honors}</w:t>
             </w:r>
           </w:p>
         </w:tc>
@@ -1738,24 +2294,95 @@
           <w:szCs w:val="16"/>
         </w:rPr>
         <w:tab/>
-        <w:t>Nature of Schooling:     {natContinuous} Continuous</w:t>
-      </w:r>
-      <w:r>
-        <w:rPr>
-          <w:rFonts w:ascii="Century" w:hAnsi="Century"/>
-          <w:sz w:val="16"/>
-          <w:szCs w:val="16"/>
-        </w:rPr>
-        <w:tab/>
-      </w:r>
-      <w:r>
-        <w:rPr>
-          <w:rFonts w:ascii="Century" w:hAnsi="Century"/>
-          <w:sz w:val="16"/>
-          <w:szCs w:val="16"/>
-        </w:rPr>
-        <w:tab/>
-        <w:t xml:space="preserve">{natInterrupted} Interrupted, why? {interruptedReason}  </w:t>
+        <w:t xml:space="preserve">Nature of Schooling:  </w:t>
+      </w:r>
+      <w:proofErr w:type="gramStart"/>
+      <w:r>
+        <w:rPr>
+          <w:rFonts w:ascii="Century" w:hAnsi="Century"/>
+          <w:sz w:val="16"/>
+          <w:szCs w:val="16"/>
+        </w:rPr>
+        <w:t xml:space="preserve">   </w:t>
+      </w:r>
+      <w:proofErr w:type="gramEnd"/>
+      <w:r>
+        <w:rPr>
+          <w:rFonts w:ascii="Century" w:hAnsi="Century"/>
+          <w:sz w:val="16"/>
+          <w:szCs w:val="16"/>
+        </w:rPr>
+        <w:t xml:space="preserve">{natContinuous}</w:t>
+      </w:r>
+      <w:proofErr w:type="gramStart"/>
+      <w:r>
+        <w:rPr>
+          <w:rFonts w:ascii="Century" w:hAnsi="Century"/>
+          <w:sz w:val="16"/>
+          <w:szCs w:val="16"/>
+        </w:rPr>
+        <w:t xml:space="preserve"/>
+      </w:r>
+      <w:proofErr w:type="gramEnd"/>
+      <w:r>
+        <w:rPr>
+          <w:rFonts w:ascii="Century" w:hAnsi="Century"/>
+          <w:sz w:val="16"/>
+          <w:szCs w:val="16"/>
+        </w:rPr>
+        <w:t xml:space="preserve"> Continuous</w:t>
+      </w:r>
+      <w:r>
+        <w:rPr>
+          <w:rFonts w:ascii="Century" w:hAnsi="Century"/>
+          <w:sz w:val="16"/>
+          <w:szCs w:val="16"/>
+        </w:rPr>
+        <w:tab/>
+      </w:r>
+      <w:r>
+        <w:rPr>
+          <w:rFonts w:ascii="Century" w:hAnsi="Century"/>
+          <w:sz w:val="16"/>
+          <w:szCs w:val="16"/>
+        </w:rPr>
+        <w:tab/>
+        <w:t xml:space="preserve"/>
+      </w:r>
+      <w:proofErr w:type="gramStart"/>
+      <w:r>
+        <w:rPr>
+          <w:rFonts w:ascii="Century" w:hAnsi="Century"/>
+          <w:sz w:val="16"/>
+          <w:szCs w:val="16"/>
+        </w:rPr>
+        <w:t xml:space="preserve">{natInterrupted}</w:t>
+      </w:r>
+      <w:proofErr w:type="gramEnd"/>
+      <w:r>
+        <w:rPr>
+          <w:rFonts w:ascii="Century" w:hAnsi="Century"/>
+          <w:sz w:val="16"/>
+          <w:szCs w:val="16"/>
+        </w:rPr>
+        <w:t xml:space="preserve"> Interrupted, why? </w:t>
+      </w:r>
+      <w:r>
+        <w:rPr>
+          <w:rFonts w:ascii="Century" w:hAnsi="Century"/>
+          <w:sz w:val="16"/>
+          <w:szCs w:val="16"/>
+          <w:u w:val="single"/>
+        </w:rPr>
+        <w:t xml:space="preserve">{interruptedReason}</w:t>
+      </w:r>
+      <w:r>
+        <w:rPr>
+          <w:rFonts w:ascii="Century" w:hAnsi="Century"/>
+          <w:sz w:val="16"/>
+          <w:szCs w:val="16"/>
+        </w:rPr>
+        <w:t xml:space="preserve">  </w:t>
       </w:r>
     </w:p>
     <w:p>
@@ -1800,7 +2427,77 @@
           <w:sz w:val="16"/>
           <w:szCs w:val="16"/>
         </w:rPr>
-        <w:t>Name of Father: {fatherName}     Age: {fatherAge} {fatherLiving} Living  {fatherDeceased}  Deceased</w:t>
+        <w:t xml:space="preserve">Name of Father: </w:t>
+      </w:r>
+      <w:r>
+        <w:rPr>
+          <w:rFonts w:ascii="Century" w:hAnsi="Century"/>
+          <w:sz w:val="16"/>
+          <w:szCs w:val="16"/>
+          <w:u w:val="single"/>
+        </w:rPr>
+        <w:t xml:space="preserve">{fatherName}</w:t>
+      </w:r>
+      <w:r>
+        <w:rPr>
+          <w:rFonts w:ascii="Century" w:hAnsi="Century"/>
+          <w:sz w:val="16"/>
+          <w:szCs w:val="16"/>
+        </w:rPr>
+        <w:t xml:space="preserve"> Age: </w:t>
+      </w:r>
+      <w:r>
+        <w:rPr>
+          <w:rFonts w:ascii="Century" w:hAnsi="Century"/>
+          <w:sz w:val="16"/>
+          <w:szCs w:val="16"/>
+          <w:u w:val="single"/>
+        </w:rPr>
+        <w:t xml:space="preserve">{fatherAge}</w:t>
+      </w:r>
+      <w:r>
+        <w:rPr>
+          <w:rFonts w:ascii="Century" w:hAnsi="Century"/>
+          <w:sz w:val="16"/>
+          <w:szCs w:val="16"/>
+        </w:rPr>
+        <w:t xml:space="preserve"> </w:t>
+      </w:r>
+      <w:proofErr w:type="gramStart"/>
+      <w:r>
+        <w:rPr>
+          <w:rFonts w:ascii="Century" w:hAnsi="Century"/>
+          <w:sz w:val="16"/>
+          <w:szCs w:val="16"/>
+        </w:rPr>
+        <w:t xml:space="preserve">{fatherLiving}</w:t>
+      </w:r>
+      <w:proofErr w:type="gramEnd"/>
+      <w:r>
+        <w:rPr>
+          <w:rFonts w:ascii="Century" w:hAnsi="Century"/>
+          <w:sz w:val="16"/>
+          <w:szCs w:val="16"/>
+        </w:rPr>
+        <w:t xml:space="preserve"> </w:t>
+      </w:r>
+      <w:proofErr w:type="gramStart"/>
+      <w:r>
+        <w:rPr>
+          <w:rFonts w:ascii="Century" w:hAnsi="Century"/>
+          <w:sz w:val="16"/>
+          <w:szCs w:val="16"/>
+        </w:rPr>
+        <w:t xml:space="preserve">Living  {fatherDeceased}</w:t>
+      </w:r>
+      <w:proofErr w:type="gramEnd"/>
+      <w:r>
+        <w:rPr>
+          <w:rFonts w:ascii="Century" w:hAnsi="Century"/>
+          <w:sz w:val="16"/>
+          <w:szCs w:val="16"/>
+        </w:rPr>
+        <w:t xml:space="preserve">  Deceased</w:t>
       </w:r>
     </w:p>
     <w:p>
@@ -1818,7 +2515,33 @@
           <w:sz w:val="16"/>
           <w:szCs w:val="16"/>
         </w:rPr>
-        <w:t>Educational Attainment: {fatherEduc}     Occupation: {fatherOccupation}</w:t>
+        <w:t xml:space="preserve">Educational Attainment: </w:t>
+      </w:r>
+      <w:r>
+        <w:rPr>
+          <w:rFonts w:ascii="Century" w:hAnsi="Century"/>
+          <w:sz w:val="16"/>
+          <w:szCs w:val="16"/>
+          <w:u w:val="single"/>
+        </w:rPr>
+        <w:t xml:space="preserve">{fatherEduc}</w:t>
+      </w:r>
+      <w:r>
+        <w:rPr>
+          <w:rFonts w:ascii="Century" w:hAnsi="Century"/>
+          <w:sz w:val="16"/>
+          <w:szCs w:val="16"/>
+        </w:rPr>
+        <w:t xml:space="preserve"> Occupation: </w:t>
+      </w:r>
+      <w:r>
+        <w:rPr>
+          <w:rFonts w:ascii="Century" w:hAnsi="Century"/>
+          <w:sz w:val="16"/>
+          <w:szCs w:val="16"/>
+          <w:u w:val="single"/>
+        </w:rPr>
+        <w:t xml:space="preserve">{fatherOccupation}</w:t>
       </w:r>
     </w:p>
     <w:p>
@@ -1836,7 +2559,77 @@
           <w:sz w:val="16"/>
           <w:szCs w:val="16"/>
         </w:rPr>
-        <w:t>Name of Mother: {motherName}     Age: {motherAge} {motherLiving} Living  {motherDeceased}  Deceased</w:t>
+        <w:t xml:space="preserve">Name of Mother: </w:t>
+      </w:r>
+      <w:r>
+        <w:rPr>
+          <w:rFonts w:ascii="Century" w:hAnsi="Century"/>
+          <w:sz w:val="16"/>
+          <w:szCs w:val="16"/>
+          <w:u w:val="single"/>
+        </w:rPr>
+        <w:t xml:space="preserve">{motherName}</w:t>
+      </w:r>
+      <w:r>
+        <w:rPr>
+          <w:rFonts w:ascii="Century" w:hAnsi="Century"/>
+          <w:sz w:val="16"/>
+          <w:szCs w:val="16"/>
+        </w:rPr>
+        <w:t xml:space="preserve"> Age: </w:t>
+      </w:r>
+      <w:r>
+        <w:rPr>
+          <w:rFonts w:ascii="Century" w:hAnsi="Century"/>
+          <w:sz w:val="16"/>
+          <w:szCs w:val="16"/>
+          <w:u w:val="single"/>
+        </w:rPr>
+        <w:t xml:space="preserve">{motherAge}</w:t>
+      </w:r>
+      <w:r>
+        <w:rPr>
+          <w:rFonts w:ascii="Century" w:hAnsi="Century"/>
+          <w:sz w:val="16"/>
+          <w:szCs w:val="16"/>
+        </w:rPr>
+        <w:t xml:space="preserve"> </w:t>
+      </w:r>
+      <w:proofErr w:type="gramStart"/>
+      <w:r>
+        <w:rPr>
+          <w:rFonts w:ascii="Century" w:hAnsi="Century"/>
+          <w:sz w:val="16"/>
+          <w:szCs w:val="16"/>
+        </w:rPr>
+        <w:t xml:space="preserve">{motherLiving}</w:t>
+      </w:r>
+      <w:proofErr w:type="gramEnd"/>
+      <w:r>
+        <w:rPr>
+          <w:rFonts w:ascii="Century" w:hAnsi="Century"/>
+          <w:sz w:val="16"/>
+          <w:szCs w:val="16"/>
+        </w:rPr>
+        <w:t xml:space="preserve"> </w:t>
+      </w:r>
+      <w:proofErr w:type="gramStart"/>
+      <w:r>
+        <w:rPr>
+          <w:rFonts w:ascii="Century" w:hAnsi="Century"/>
+          <w:sz w:val="16"/>
+          <w:szCs w:val="16"/>
+        </w:rPr>
+        <w:t xml:space="preserve">Living  {motherDeceased}</w:t>
+      </w:r>
+      <w:proofErr w:type="gramEnd"/>
+      <w:r>
+        <w:rPr>
+          <w:rFonts w:ascii="Century" w:hAnsi="Century"/>
+          <w:sz w:val="16"/>
+          <w:szCs w:val="16"/>
+        </w:rPr>
+        <w:t xml:space="preserve">  Deceased</w:t>
       </w:r>
     </w:p>
     <w:p>
@@ -1854,7 +2647,33 @@
           <w:sz w:val="16"/>
           <w:szCs w:val="16"/>
         </w:rPr>
-        <w:t>Educational Attainment: {motherEduc}     Occupation: {motherOccupation}</w:t>
+        <w:t xml:space="preserve">Educational Attainment: </w:t>
+      </w:r>
+      <w:r>
+        <w:rPr>
+          <w:rFonts w:ascii="Century" w:hAnsi="Century"/>
+          <w:sz w:val="16"/>
+          <w:szCs w:val="16"/>
+          <w:u w:val="single"/>
+        </w:rPr>
+        <w:t xml:space="preserve">{motherEduc}</w:t>
+      </w:r>
+      <w:r>
+        <w:rPr>
+          <w:rFonts w:ascii="Century" w:hAnsi="Century"/>
+          <w:sz w:val="16"/>
+          <w:szCs w:val="16"/>
+        </w:rPr>
+        <w:t xml:space="preserve"> Occupation: </w:t>
+      </w:r>
+      <w:r>
+        <w:rPr>
+          <w:rFonts w:ascii="Century" w:hAnsi="Century"/>
+          <w:sz w:val="16"/>
+          <w:szCs w:val="16"/>
+          <w:u w:val="single"/>
+        </w:rPr>
+        <w:t xml:space="preserve">{motherOccupation}</w:t>
       </w:r>
     </w:p>
     <w:p>
@@ -1872,7 +2691,41 @@
           <w:sz w:val="16"/>
           <w:szCs w:val="16"/>
         </w:rPr>
-        <w:t xml:space="preserve">Name of Guardian (If any): {guardianName}     Age: {guardianAge} </w:t>
+        <w:t xml:space="preserve">Name of Guardian (If any): </w:t>
+      </w:r>
+      <w:r>
+        <w:rPr>
+          <w:rFonts w:ascii="Century" w:hAnsi="Century"/>
+          <w:sz w:val="16"/>
+          <w:szCs w:val="16"/>
+          <w:u w:val="single"/>
+        </w:rPr>
+        <w:t xml:space="preserve">{guardianName}</w:t>
+      </w:r>
+      <w:r>
+        <w:rPr>
+          <w:rFonts w:ascii="Century" w:hAnsi="Century"/>
+          <w:sz w:val="16"/>
+          <w:szCs w:val="16"/>
+        </w:rPr>
+        <w:t xml:space="preserve"> Age: </w:t>
+      </w:r>
+      <w:r>
+        <w:rPr>
+          <w:rFonts w:ascii="Century" w:hAnsi="Century"/>
+          <w:sz w:val="16"/>
+          <w:szCs w:val="16"/>
+          <w:u w:val="single"/>
+        </w:rPr>
+        <w:t xml:space="preserve">{guardianAge}</w:t>
+      </w:r>
+      <w:r>
+        <w:rPr>
+          <w:rFonts w:ascii="Century" w:hAnsi="Century"/>
+          <w:sz w:val="16"/>
+          <w:szCs w:val="16"/>
+        </w:rPr>
+        <w:t xml:space="preserve"> </w:t>
       </w:r>
     </w:p>
     <w:p>
@@ -1890,7 +2743,33 @@
           <w:sz w:val="16"/>
           <w:szCs w:val="16"/>
         </w:rPr>
-        <w:t>Educational Attainment: {guardianEduc}     Occupation: {guardianOccupation}</w:t>
+        <w:t xml:space="preserve">Educational Attainment: </w:t>
+      </w:r>
+      <w:r>
+        <w:rPr>
+          <w:rFonts w:ascii="Century" w:hAnsi="Century"/>
+          <w:sz w:val="16"/>
+          <w:szCs w:val="16"/>
+          <w:u w:val="single"/>
+        </w:rPr>
+        <w:t xml:space="preserve">{guardianEduc}</w:t>
+      </w:r>
+      <w:r>
+        <w:rPr>
+          <w:rFonts w:ascii="Century" w:hAnsi="Century"/>
+          <w:sz w:val="16"/>
+          <w:szCs w:val="16"/>
+        </w:rPr>
+        <w:t xml:space="preserve"> Occupation: </w:t>
+      </w:r>
+      <w:r>
+        <w:rPr>
+          <w:rFonts w:ascii="Century" w:hAnsi="Century"/>
+          <w:sz w:val="16"/>
+          <w:szCs w:val="16"/>
+          <w:u w:val="single"/>
+        </w:rPr>
+        <w:t xml:space="preserve">{guardianOccupation}</w:t>
       </w:r>
     </w:p>
     <w:p>
@@ -1943,7 +2822,24 @@
           <w:szCs w:val="16"/>
         </w:rPr>
         <w:tab/>
-        <w:t>{pmSingleParent} Single Parent</w:t>
+      </w:r>
+      <w:proofErr w:type="gramStart"/>
+      <w:r>
+        <w:rPr>
+          <w:rFonts w:ascii="Century" w:hAnsi="Century"/>
+          <w:sz w:val="16"/>
+          <w:szCs w:val="16"/>
+        </w:rPr>
+        <w:t xml:space="preserve">{pmSingleParent}</w:t>
+      </w:r>
+      <w:proofErr w:type="gramEnd"/>
+      <w:r>
+        <w:rPr>
+          <w:rFonts w:ascii="Century" w:hAnsi="Century"/>
+          <w:sz w:val="16"/>
+          <w:szCs w:val="16"/>
+        </w:rPr>
+        <w:t xml:space="preserve"> Single Parent</w:t>
       </w:r>
     </w:p>
     <w:p>
@@ -1962,32 +2858,66 @@
           <w:szCs w:val="16"/>
         </w:rPr>
         <w:tab/>
-        <w:t>{pmMarriedTogether} Married and staying together</w:t>
-      </w:r>
-      <w:r>
-        <w:rPr>
-          <w:rFonts w:ascii="Century" w:hAnsi="Century"/>
-          <w:sz w:val="16"/>
-          <w:szCs w:val="16"/>
-        </w:rPr>
-        <w:tab/>
-      </w:r>
-      <w:r>
-        <w:rPr>
-          <w:rFonts w:ascii="Century" w:hAnsi="Century"/>
-          <w:sz w:val="16"/>
-          <w:szCs w:val="16"/>
-        </w:rPr>
-        <w:tab/>
-      </w:r>
-      <w:r>
-        <w:rPr>
-          <w:rFonts w:ascii="Century" w:hAnsi="Century"/>
-          <w:sz w:val="16"/>
-          <w:szCs w:val="16"/>
-        </w:rPr>
-        <w:tab/>
-        <w:t>{pmMarriedSeparated} Married but Separated</w:t>
+      </w:r>
+      <w:proofErr w:type="gramStart"/>
+      <w:r>
+        <w:rPr>
+          <w:rFonts w:ascii="Century" w:hAnsi="Century"/>
+          <w:sz w:val="16"/>
+          <w:szCs w:val="16"/>
+        </w:rPr>
+        <w:t xml:space="preserve">{pmMarriedTogether}</w:t>
+      </w:r>
+      <w:proofErr w:type="gramEnd"/>
+      <w:r>
+        <w:rPr>
+          <w:rFonts w:ascii="Century" w:hAnsi="Century"/>
+          <w:sz w:val="16"/>
+          <w:szCs w:val="16"/>
+        </w:rPr>
+        <w:t xml:space="preserve"> Married and staying together</w:t>
+      </w:r>
+      <w:r>
+        <w:rPr>
+          <w:rFonts w:ascii="Century" w:hAnsi="Century"/>
+          <w:sz w:val="16"/>
+          <w:szCs w:val="16"/>
+        </w:rPr>
+        <w:tab/>
+      </w:r>
+      <w:r>
+        <w:rPr>
+          <w:rFonts w:ascii="Century" w:hAnsi="Century"/>
+          <w:sz w:val="16"/>
+          <w:szCs w:val="16"/>
+        </w:rPr>
+        <w:tab/>
+      </w:r>
+      <w:r>
+        <w:rPr>
+          <w:rFonts w:ascii="Century" w:hAnsi="Century"/>
+          <w:sz w:val="16"/>
+          <w:szCs w:val="16"/>
+        </w:rPr>
+        <w:tab/>
+      </w:r>
+      <w:proofErr w:type="gramStart"/>
+      <w:r>
+        <w:rPr>
+          <w:rFonts w:ascii="Century" w:hAnsi="Century"/>
+          <w:sz w:val="16"/>
+          <w:szCs w:val="16"/>
+        </w:rPr>
+        <w:t xml:space="preserve">{pmMarriedSeparated}</w:t>
+      </w:r>
+      <w:proofErr w:type="gramEnd"/>
+      <w:r>
+        <w:rPr>
+          <w:rFonts w:ascii="Century" w:hAnsi="Century"/>
+          <w:sz w:val="16"/>
+          <w:szCs w:val="16"/>
+        </w:rPr>
+        <w:t xml:space="preserve"> Married but Separated</w:t>
       </w:r>
     </w:p>
     <w:p>
@@ -2006,32 +2936,75 @@
           <w:szCs w:val="16"/>
         </w:rPr>
         <w:tab/>
-        <w:t>{pmNotMarriedLiving} Not married but living together</w:t>
-      </w:r>
-      <w:r>
-        <w:rPr>
-          <w:rFonts w:ascii="Century" w:hAnsi="Century"/>
-          <w:sz w:val="16"/>
-          <w:szCs w:val="16"/>
-        </w:rPr>
-        <w:tab/>
-      </w:r>
-      <w:r>
-        <w:rPr>
-          <w:rFonts w:ascii="Century" w:hAnsi="Century"/>
-          <w:sz w:val="16"/>
-          <w:szCs w:val="16"/>
-        </w:rPr>
-        <w:tab/>
-      </w:r>
-      <w:r>
-        <w:rPr>
-          <w:rFonts w:ascii="Century" w:hAnsi="Century"/>
-          <w:sz w:val="16"/>
-          <w:szCs w:val="16"/>
-        </w:rPr>
-        <w:tab/>
-        <w:t>{pmOther} Other's (Please Specify) {parentsMaritalOther}</w:t>
+      </w:r>
+      <w:proofErr w:type="gramStart"/>
+      <w:r>
+        <w:rPr>
+          <w:rFonts w:ascii="Century" w:hAnsi="Century"/>
+          <w:sz w:val="16"/>
+          <w:szCs w:val="16"/>
+        </w:rPr>
+        <w:t xml:space="preserve">{pmNotMarriedLiving}</w:t>
+      </w:r>
+      <w:proofErr w:type="gramEnd"/>
+      <w:r>
+        <w:rPr>
+          <w:rFonts w:ascii="Century" w:hAnsi="Century"/>
+          <w:sz w:val="16"/>
+          <w:szCs w:val="16"/>
+        </w:rPr>
+        <w:t xml:space="preserve"> Not married but living together</w:t>
+      </w:r>
+      <w:r>
+        <w:rPr>
+          <w:rFonts w:ascii="Century" w:hAnsi="Century"/>
+          <w:sz w:val="16"/>
+          <w:szCs w:val="16"/>
+        </w:rPr>
+        <w:tab/>
+      </w:r>
+      <w:r>
+        <w:rPr>
+          <w:rFonts w:ascii="Century" w:hAnsi="Century"/>
+          <w:sz w:val="16"/>
+          <w:szCs w:val="16"/>
+        </w:rPr>
+        <w:tab/>
+      </w:r>
+      <w:r>
+        <w:rPr>
+          <w:rFonts w:ascii="Century" w:hAnsi="Century"/>
+          <w:sz w:val="16"/>
+          <w:szCs w:val="16"/>
+        </w:rPr>
+        <w:tab/>
+      </w:r>
+      <w:proofErr w:type="gramStart"/>
+      <w:r>
+        <w:rPr>
+          <w:rFonts w:ascii="Century" w:hAnsi="Century"/>
+          <w:sz w:val="16"/>
+          <w:szCs w:val="16"/>
+        </w:rPr>
+        <w:t xml:space="preserve">{pmOther}</w:t>
+      </w:r>
+      <w:proofErr w:type="gramEnd"/>
+      <w:r>
+        <w:rPr>
+          <w:rFonts w:ascii="Century" w:hAnsi="Century"/>
+          <w:sz w:val="16"/>
+          <w:szCs w:val="16"/>
+        </w:rPr>
+        <w:t xml:space="preserve"> Other’s (Please Specify) </w:t>
+      </w:r>
+      <w:r>
+        <w:rPr>
+          <w:rFonts w:ascii="Century" w:hAnsi="Century"/>
+          <w:sz w:val="16"/>
+          <w:szCs w:val="16"/>
+          <w:u w:val="single"/>
+        </w:rPr>
+        <w:t xml:space="preserve">{parentsMaritalOther}</w:t>
       </w:r>
     </w:p>
     <w:p>
@@ -2049,7 +3022,50 @@
           <w:sz w:val="16"/>
           <w:szCs w:val="16"/>
         </w:rPr>
-        <w:t>Number of children in the family including yourself: {siblingsTotal}   Number of Brothers: {brothersCount}   Number of Sisters: {sistersCount}</w:t>
+        <w:t xml:space="preserve">Number of children in the family including yourself: </w:t>
+      </w:r>
+      <w:r>
+        <w:rPr>
+          <w:rFonts w:ascii="Century" w:hAnsi="Century"/>
+          <w:sz w:val="16"/>
+          <w:szCs w:val="16"/>
+          <w:u w:val="single"/>
+        </w:rPr>
+        <w:t xml:space="preserve">{siblingsTotal}</w:t>
+      </w:r>
+      <w:r>
+        <w:rPr>
+          <w:rFonts w:ascii="Century" w:hAnsi="Century"/>
+          <w:sz w:val="16"/>
+          <w:szCs w:val="16"/>
+        </w:rPr>
+        <w:t xml:space="preserve"> Number of Brothers: </w:t>
+      </w:r>
+      <w:r>
+        <w:rPr>
+          <w:rFonts w:ascii="Century" w:hAnsi="Century"/>
+          <w:sz w:val="16"/>
+          <w:szCs w:val="16"/>
+          <w:u w:val="single"/>
+        </w:rPr>
+        <w:t xml:space="preserve">{brothersCount}</w:t>
+      </w:r>
+      <w:r>
+        <w:rPr>
+          <w:rFonts w:ascii="Century" w:hAnsi="Century"/>
+          <w:sz w:val="16"/>
+          <w:szCs w:val="16"/>
+        </w:rPr>
+        <w:t xml:space="preserve"> Number of Sisters: </w:t>
+      </w:r>
+      <w:r>
+        <w:rPr>
+          <w:rFonts w:ascii="Century" w:hAnsi="Century"/>
+          <w:sz w:val="16"/>
+          <w:szCs w:val="16"/>
+          <w:u w:val="single"/>
+        </w:rPr>
+        <w:t xml:space="preserve">{sistersCount}</w:t>
       </w:r>
     </w:p>
     <w:p>
@@ -2076,41 +3092,92 @@
           <w:szCs w:val="16"/>
         </w:rPr>
         <w:tab/>
-        <w:t>{finParents} Parents</w:t>
-      </w:r>
-      <w:r>
-        <w:rPr>
-          <w:rFonts w:ascii="Century" w:hAnsi="Century"/>
-          <w:sz w:val="16"/>
-          <w:szCs w:val="16"/>
-        </w:rPr>
-        <w:tab/>
-      </w:r>
-      <w:r>
-        <w:rPr>
-          <w:rFonts w:ascii="Century" w:hAnsi="Century"/>
-          <w:sz w:val="16"/>
-          <w:szCs w:val="16"/>
-        </w:rPr>
-        <w:tab/>
-        <w:t>{finSpouse} Spouse</w:t>
-      </w:r>
-      <w:r>
-        <w:rPr>
-          <w:rFonts w:ascii="Century" w:hAnsi="Century"/>
-          <w:sz w:val="16"/>
-          <w:szCs w:val="16"/>
-        </w:rPr>
-        <w:tab/>
-      </w:r>
-      <w:r>
-        <w:rPr>
-          <w:rFonts w:ascii="Century" w:hAnsi="Century"/>
-          <w:sz w:val="16"/>
-          <w:szCs w:val="16"/>
-        </w:rPr>
-        <w:tab/>
-        <w:t>{finRelatives} Relatives</w:t>
+      </w:r>
+      <w:proofErr w:type="gramStart"/>
+      <w:r>
+        <w:rPr>
+          <w:rFonts w:ascii="Century" w:hAnsi="Century"/>
+          <w:sz w:val="16"/>
+          <w:szCs w:val="16"/>
+        </w:rPr>
+        <w:t xml:space="preserve">{finParents}</w:t>
+      </w:r>
+      <w:proofErr w:type="gramEnd"/>
+      <w:r>
+        <w:rPr>
+          <w:rFonts w:ascii="Century" w:hAnsi="Century"/>
+          <w:sz w:val="16"/>
+          <w:szCs w:val="16"/>
+        </w:rPr>
+        <w:t xml:space="preserve"> Parents</w:t>
+      </w:r>
+      <w:r>
+        <w:rPr>
+          <w:rFonts w:ascii="Century" w:hAnsi="Century"/>
+          <w:sz w:val="16"/>
+          <w:szCs w:val="16"/>
+        </w:rPr>
+        <w:tab/>
+      </w:r>
+      <w:r>
+        <w:rPr>
+          <w:rFonts w:ascii="Century" w:hAnsi="Century"/>
+          <w:sz w:val="16"/>
+          <w:szCs w:val="16"/>
+        </w:rPr>
+        <w:tab/>
+      </w:r>
+      <w:proofErr w:type="gramStart"/>
+      <w:r>
+        <w:rPr>
+          <w:rFonts w:ascii="Century" w:hAnsi="Century"/>
+          <w:sz w:val="16"/>
+          <w:szCs w:val="16"/>
+        </w:rPr>
+        <w:t xml:space="preserve">{finSpouse}</w:t>
+      </w:r>
+      <w:proofErr w:type="gramEnd"/>
+      <w:r>
+        <w:rPr>
+          <w:rFonts w:ascii="Century" w:hAnsi="Century"/>
+          <w:sz w:val="16"/>
+          <w:szCs w:val="16"/>
+        </w:rPr>
+        <w:t xml:space="preserve"> Spouse</w:t>
+      </w:r>
+      <w:r>
+        <w:rPr>
+          <w:rFonts w:ascii="Century" w:hAnsi="Century"/>
+          <w:sz w:val="16"/>
+          <w:szCs w:val="16"/>
+        </w:rPr>
+        <w:tab/>
+      </w:r>
+      <w:r>
+        <w:rPr>
+          <w:rFonts w:ascii="Century" w:hAnsi="Century"/>
+          <w:sz w:val="16"/>
+          <w:szCs w:val="16"/>
+        </w:rPr>
+        <w:tab/>
+      </w:r>
+      <w:proofErr w:type="gramStart"/>
+      <w:r>
+        <w:rPr>
+          <w:rFonts w:ascii="Century" w:hAnsi="Century"/>
+          <w:sz w:val="16"/>
+          <w:szCs w:val="16"/>
+        </w:rPr>
+        <w:t xml:space="preserve">{finRelatives}</w:t>
+      </w:r>
+      <w:proofErr w:type="gramEnd"/>
+      <w:r>
+        <w:rPr>
+          <w:rFonts w:ascii="Century" w:hAnsi="Century"/>
+          <w:sz w:val="16"/>
+          <w:szCs w:val="16"/>
+        </w:rPr>
+        <w:t xml:space="preserve"> Relatives</w:t>
       </w:r>
     </w:p>
     <w:p>
@@ -2153,33 +3220,84 @@
           <w:szCs w:val="16"/>
         </w:rPr>
         <w:tab/>
-        <w:t>{finBrotherSister} Brother/Sister</w:t>
-      </w:r>
-      <w:r>
-        <w:rPr>
-          <w:rFonts w:ascii="Century" w:hAnsi="Century"/>
-          <w:sz w:val="16"/>
-          <w:szCs w:val="16"/>
-        </w:rPr>
-        <w:tab/>
-        <w:t>{finScholarship} Scholarship</w:t>
-      </w:r>
-      <w:r>
-        <w:rPr>
-          <w:rFonts w:ascii="Century" w:hAnsi="Century"/>
-          <w:sz w:val="16"/>
-          <w:szCs w:val="16"/>
-        </w:rPr>
-        <w:tab/>
-      </w:r>
-      <w:r>
-        <w:rPr>
-          <w:rFonts w:ascii="Century" w:hAnsi="Century"/>
-          <w:sz w:val="16"/>
-          <w:szCs w:val="16"/>
-        </w:rPr>
-        <w:tab/>
-        <w:t xml:space="preserve">{finSelfSupporting} Self-supporting/working </w:t>
+      </w:r>
+      <w:proofErr w:type="gramStart"/>
+      <w:r>
+        <w:rPr>
+          <w:rFonts w:ascii="Century" w:hAnsi="Century"/>
+          <w:sz w:val="16"/>
+          <w:szCs w:val="16"/>
+        </w:rPr>
+        <w:t xml:space="preserve">{finBrotherSister}</w:t>
+      </w:r>
+      <w:proofErr w:type="gramEnd"/>
+      <w:r>
+        <w:rPr>
+          <w:rFonts w:ascii="Century" w:hAnsi="Century"/>
+          <w:sz w:val="16"/>
+          <w:szCs w:val="16"/>
+        </w:rPr>
+        <w:t xml:space="preserve"> Brother/Sister</w:t>
+      </w:r>
+      <w:r>
+        <w:rPr>
+          <w:rFonts w:ascii="Century" w:hAnsi="Century"/>
+          <w:sz w:val="16"/>
+          <w:szCs w:val="16"/>
+        </w:rPr>
+        <w:tab/>
+      </w:r>
+      <w:proofErr w:type="gramStart"/>
+      <w:r>
+        <w:rPr>
+          <w:rFonts w:ascii="Century" w:hAnsi="Century"/>
+          <w:sz w:val="16"/>
+          <w:szCs w:val="16"/>
+        </w:rPr>
+        <w:t xml:space="preserve">{finScholarship}</w:t>
+      </w:r>
+      <w:proofErr w:type="gramEnd"/>
+      <w:r>
+        <w:rPr>
+          <w:rFonts w:ascii="Century" w:hAnsi="Century"/>
+          <w:sz w:val="16"/>
+          <w:szCs w:val="16"/>
+        </w:rPr>
+        <w:t xml:space="preserve"> Scholarship</w:t>
+      </w:r>
+      <w:r>
+        <w:rPr>
+          <w:rFonts w:ascii="Century" w:hAnsi="Century"/>
+          <w:sz w:val="16"/>
+          <w:szCs w:val="16"/>
+        </w:rPr>
+        <w:tab/>
+      </w:r>
+      <w:r>
+        <w:rPr>
+          <w:rFonts w:ascii="Century" w:hAnsi="Century"/>
+          <w:sz w:val="16"/>
+          <w:szCs w:val="16"/>
+        </w:rPr>
+        <w:tab/>
+      </w:r>
+      <w:proofErr w:type="gramStart"/>
+      <w:r>
+        <w:rPr>
+          <w:rFonts w:ascii="Century" w:hAnsi="Century"/>
+          <w:sz w:val="16"/>
+          <w:szCs w:val="16"/>
+        </w:rPr>
+        <w:t xml:space="preserve">{finSelfSupporting}</w:t>
+      </w:r>
+      <w:proofErr w:type="gramEnd"/>
+      <w:r>
+        <w:rPr>
+          <w:rFonts w:ascii="Century" w:hAnsi="Century"/>
+          <w:sz w:val="16"/>
+          <w:szCs w:val="16"/>
+        </w:rPr>
+        <w:t xml:space="preserve"> Self-supporting/working </w:t>
       </w:r>
     </w:p>
     <w:p>
@@ -2222,7 +3340,33 @@
           <w:szCs w:val="16"/>
         </w:rPr>
         <w:tab/>
-        <w:t>{finOther} Others, please specify: {financingOther}</w:t>
+      </w:r>
+      <w:proofErr w:type="gramStart"/>
+      <w:r>
+        <w:rPr>
+          <w:rFonts w:ascii="Century" w:hAnsi="Century"/>
+          <w:sz w:val="16"/>
+          <w:szCs w:val="16"/>
+        </w:rPr>
+        <w:t xml:space="preserve">{finOther}</w:t>
+      </w:r>
+      <w:proofErr w:type="gramEnd"/>
+      <w:r>
+        <w:rPr>
+          <w:rFonts w:ascii="Century" w:hAnsi="Century"/>
+          <w:sz w:val="16"/>
+          <w:szCs w:val="16"/>
+        </w:rPr>
+        <w:t xml:space="preserve"> Others, please specify: </w:t>
+      </w:r>
+      <w:r>
+        <w:rPr>
+          <w:rFonts w:ascii="Century" w:hAnsi="Century"/>
+          <w:sz w:val="16"/>
+          <w:szCs w:val="16"/>
+          <w:u w:val="single"/>
+        </w:rPr>
+        <w:t xml:space="preserve">{financingOther}</w:t>
       </w:r>
     </w:p>
     <w:p>
@@ -2295,6 +3439,7 @@
           <w:szCs w:val="14"/>
         </w:rPr>
       </w:pPr>
+      <w:proofErr w:type="gramStart"/>
       <w:r>
         <w:rPr>
           <w:rFonts w:ascii="Century" w:hAnsi="Century"/>
@@ -2303,8 +3448,9 @@
           <w:sz w:val="14"/>
           <w:szCs w:val="14"/>
         </w:rPr>
-        <w:t>{hVision} Vision</w:t>
-      </w:r>
+        <w:t xml:space="preserve">{hVision}</w:t>
+      </w:r>
+      <w:proofErr w:type="gramEnd"/>
       <w:r>
         <w:rPr>
           <w:rFonts w:ascii="Century" w:hAnsi="Century"/>
@@ -2313,7 +3459,7 @@
           <w:sz w:val="14"/>
           <w:szCs w:val="14"/>
         </w:rPr>
-        <w:tab/>
+        <w:t xml:space="preserve"> Vision</w:t>
       </w:r>
       <w:r>
         <w:rPr>
@@ -2324,7 +3470,6 @@
           <w:szCs w:val="14"/>
         </w:rPr>
         <w:tab/>
-        <w:t>{hSpeech} Speech</w:t>
       </w:r>
       <w:r>
         <w:rPr>
@@ -2336,6 +3481,7 @@
         </w:rPr>
         <w:tab/>
       </w:r>
+      <w:proofErr w:type="gramStart"/>
       <w:r>
         <w:rPr>
           <w:rFonts w:ascii="Century" w:hAnsi="Century"/>
@@ -2344,9 +3490,9 @@
           <w:sz w:val="14"/>
           <w:szCs w:val="14"/>
         </w:rPr>
-        <w:tab/>
-        <w:t>{hHearing} Hearing</w:t>
-      </w:r>
+        <w:t xml:space="preserve">{hSpeech}</w:t>
+      </w:r>
+      <w:proofErr w:type="gramEnd"/>
       <w:r>
         <w:rPr>
           <w:rFonts w:ascii="Century" w:hAnsi="Century"/>
@@ -2355,7 +3501,7 @@
           <w:sz w:val="14"/>
           <w:szCs w:val="14"/>
         </w:rPr>
-        <w:tab/>
+        <w:t xml:space="preserve"> Speech</w:t>
       </w:r>
       <w:r>
         <w:rPr>
@@ -2366,7 +3512,102 @@
           <w:szCs w:val="14"/>
         </w:rPr>
         <w:tab/>
-        <w:t>{hGeneralHealth} General Health          {hPhysical} Physical Disability</w:t>
+      </w:r>
+      <w:r>
+        <w:rPr>
+          <w:rFonts w:ascii="Century" w:hAnsi="Century"/>
+          <w:b/>
+          <w:bCs/>
+          <w:sz w:val="14"/>
+          <w:szCs w:val="14"/>
+        </w:rPr>
+        <w:tab/>
+      </w:r>
+      <w:proofErr w:type="gramStart"/>
+      <w:r>
+        <w:rPr>
+          <w:rFonts w:ascii="Century" w:hAnsi="Century"/>
+          <w:b/>
+          <w:bCs/>
+          <w:sz w:val="14"/>
+          <w:szCs w:val="14"/>
+        </w:rPr>
+        <w:t xml:space="preserve">{hHearing}</w:t>
+      </w:r>
+      <w:proofErr w:type="gramEnd"/>
+      <w:r>
+        <w:rPr>
+          <w:rFonts w:ascii="Century" w:hAnsi="Century"/>
+          <w:b/>
+          <w:bCs/>
+          <w:sz w:val="14"/>
+          <w:szCs w:val="14"/>
+        </w:rPr>
+        <w:t xml:space="preserve"> Hearing</w:t>
+      </w:r>
+      <w:r>
+        <w:rPr>
+          <w:rFonts w:ascii="Century" w:hAnsi="Century"/>
+          <w:b/>
+          <w:bCs/>
+          <w:sz w:val="14"/>
+          <w:szCs w:val="14"/>
+        </w:rPr>
+        <w:tab/>
+      </w:r>
+      <w:r>
+        <w:rPr>
+          <w:rFonts w:ascii="Century" w:hAnsi="Century"/>
+          <w:b/>
+          <w:bCs/>
+          <w:sz w:val="14"/>
+          <w:szCs w:val="14"/>
+        </w:rPr>
+        <w:tab/>
+      </w:r>
+      <w:proofErr w:type="gramStart"/>
+      <w:r>
+        <w:rPr>
+          <w:rFonts w:ascii="Century" w:hAnsi="Century"/>
+          <w:b/>
+          <w:bCs/>
+          <w:sz w:val="14"/>
+          <w:szCs w:val="14"/>
+        </w:rPr>
+        <w:t xml:space="preserve">{hGeneralHealth}</w:t>
+      </w:r>
+      <w:proofErr w:type="gramEnd"/>
+      <w:r>
+        <w:rPr>
+          <w:rFonts w:ascii="Century" w:hAnsi="Century"/>
+          <w:b/>
+          <w:bCs/>
+          <w:sz w:val="14"/>
+          <w:szCs w:val="14"/>
+        </w:rPr>
+        <w:t xml:space="preserve"> General Health       </w:t>
+      </w:r>
+      <w:proofErr w:type="gramStart"/>
+      <w:r>
+        <w:rPr>
+          <w:rFonts w:ascii="Century" w:hAnsi="Century"/>
+          <w:b/>
+          <w:bCs/>
+          <w:sz w:val="14"/>
+          <w:szCs w:val="14"/>
+        </w:rPr>
+        <w:t xml:space="preserve">   {hPhysical}</w:t>
+      </w:r>
+      <w:proofErr w:type="gramEnd"/>
+      <w:r>
+        <w:rPr>
+          <w:rFonts w:ascii="Century" w:hAnsi="Century"/>
+          <w:b/>
+          <w:bCs/>
+          <w:sz w:val="14"/>
+          <w:szCs w:val="14"/>
+        </w:rPr>
+        <w:t xml:space="preserve"> Physical Disability</w:t>
       </w:r>
     </w:p>
     <w:p>
@@ -2426,8 +3667,60 @@
           <w:rFonts w:ascii="Century" w:hAnsi="Century"/>
           <w:sz w:val="12"/>
           <w:szCs w:val="12"/>
-        </w:rPr>
-        <w:t>{visionDetail}     {speechDetail}     {hearingDetail}     {generalHealthDetail}</w:t>
+          <w:u w:val="single"/>
+        </w:rPr>
+        <w:t xml:space="preserve">{visionDetail}</w:t>
+      </w:r>
+      <w:r>
+        <w:rPr>
+          <w:rFonts w:ascii="Century" w:hAnsi="Century"/>
+          <w:sz w:val="12"/>
+          <w:szCs w:val="12"/>
+        </w:rPr>
+        <w:t xml:space="preserve">    </w:t>
+      </w:r>
+      <w:r>
+        <w:rPr>
+          <w:rFonts w:ascii="Century" w:hAnsi="Century"/>
+          <w:sz w:val="12"/>
+          <w:szCs w:val="12"/>
+          <w:u w:val="single"/>
+        </w:rPr>
+        <w:t xml:space="preserve">{speechDetail}</w:t>
+      </w:r>
+      <w:r>
+        <w:rPr>
+          <w:rFonts w:ascii="Century" w:hAnsi="Century"/>
+          <w:sz w:val="12"/>
+          <w:szCs w:val="12"/>
+        </w:rPr>
+        <w:t xml:space="preserve">   </w:t>
+      </w:r>
+      <w:r>
+        <w:rPr>
+          <w:rFonts w:ascii="Century" w:hAnsi="Century"/>
+          <w:sz w:val="12"/>
+          <w:szCs w:val="12"/>
+          <w:u w:val="single"/>
+        </w:rPr>
+        <w:t xml:space="preserve">{hearingDetail}</w:t>
+      </w:r>
+      <w:r>
+        <w:rPr>
+          <w:rFonts w:ascii="Century" w:hAnsi="Century"/>
+          <w:sz w:val="12"/>
+          <w:szCs w:val="12"/>
+        </w:rPr>
+        <w:t xml:space="preserve">  </w:t>
+      </w:r>
+      <w:r>
+        <w:rPr>
+          <w:rFonts w:ascii="Century" w:hAnsi="Century"/>
+          <w:sz w:val="12"/>
+          <w:szCs w:val="12"/>
+          <w:u w:val="single"/>
+        </w:rPr>
+        <w:t xml:space="preserve">{generalHealthDetail}</w:t>
       </w:r>
     </w:p>
     <w:p>
@@ -2475,7 +3768,16 @@
           <w:sz w:val="12"/>
           <w:szCs w:val="12"/>
         </w:rPr>
-        <w:t xml:space="preserve">                {diagnosedIllnessesNote}</w:t>
+        <w:t xml:space="preserve">                </w:t>
+      </w:r>
+      <w:r>
+        <w:rPr>
+          <w:rFonts w:ascii="Century" w:hAnsi="Century"/>
+          <w:sz w:val="12"/>
+          <w:szCs w:val="12"/>
+          <w:u w:val="single"/>
+        </w:rPr>
+        <w:t xml:space="preserve">{diagnosedIllnessesNote}</w:t>
       </w:r>
     </w:p>
     <w:p>
@@ -2497,17 +3799,26 @@
           <w:sz w:val="16"/>
           <w:szCs w:val="16"/>
         </w:rPr>
-        <w:lastRenderedPageBreak/>
-        <w:t>Have you taken any psychological tests before?  {psychYes} Yes</w:t>
-      </w:r>
-      <w:r>
-        <w:rPr>
-          <w:rFonts w:ascii="Century" w:hAnsi="Century"/>
-          <w:sz w:val="16"/>
-          <w:szCs w:val="16"/>
-        </w:rPr>
-        <w:tab/>
-        <w:t>{psychNo} No</w:t>
+        <w:t xml:space="preserve">Have you taken any psychological tests before?  {psychYes} </w:t>
+      </w:r>
+      <w:proofErr w:type="gramStart"/>
+      <w:r>
+        <w:rPr>
+          <w:rFonts w:ascii="Century" w:hAnsi="Century"/>
+          <w:sz w:val="16"/>
+          <w:szCs w:val="16"/>
+        </w:rPr>
+        <w:t>Yes</w:t>
+      </w:r>
+      <w:proofErr w:type="gramEnd"/>
+      <w:r>
+        <w:rPr>
+          <w:rFonts w:ascii="Century" w:hAnsi="Century"/>
+          <w:sz w:val="16"/>
+          <w:szCs w:val="16"/>
+        </w:rPr>
+        <w:tab/>
+        <w:t xml:space="preserve">{psychNo} No</w:t>
       </w:r>
     </w:p>
     <w:p>
@@ -2706,195 +4017,198 @@
           <w:rFonts w:ascii="Century" w:hAnsi="Century"/>
           <w:sz w:val="16"/>
           <w:szCs w:val="16"/>
-        </w:rPr>
-        <w:t>{tr0Date}</w:t>
-      </w:r>
-      <w:r>
-        <w:rPr>
-          <w:rFonts w:ascii="Century" w:hAnsi="Century"/>
-          <w:sz w:val="16"/>
-          <w:szCs w:val="16"/>
-        </w:rPr>
-        <w:tab/>
-      </w:r>
-      <w:r>
-        <w:rPr>
-          <w:rFonts w:ascii="Century" w:hAnsi="Century"/>
-          <w:sz w:val="16"/>
-          <w:szCs w:val="16"/>
-        </w:rPr>
-        <w:tab/>
-        <w:t>{tr0Kind}</w:t>
-      </w:r>
-      <w:r>
-        <w:rPr>
-          <w:rFonts w:ascii="Century" w:hAnsi="Century"/>
-          <w:sz w:val="16"/>
-          <w:szCs w:val="16"/>
-        </w:rPr>
-        <w:tab/>
-      </w:r>
-      <w:r>
-        <w:rPr>
-          <w:rFonts w:ascii="Century" w:hAnsi="Century"/>
-          <w:sz w:val="16"/>
-          <w:szCs w:val="16"/>
-        </w:rPr>
-        <w:tab/>
-        <w:t>{tr0Score}</w:t>
-      </w:r>
-      <w:r>
-        <w:rPr>
-          <w:rFonts w:ascii="Century" w:hAnsi="Century"/>
-          <w:sz w:val="16"/>
-          <w:szCs w:val="16"/>
-        </w:rPr>
-        <w:tab/>
-      </w:r>
-      <w:r>
-        <w:rPr>
-          <w:rFonts w:ascii="Century" w:hAnsi="Century"/>
-          <w:sz w:val="16"/>
-          <w:szCs w:val="16"/>
-        </w:rPr>
-        <w:tab/>
-        <w:t>{tr0Rank}</w:t>
-      </w:r>
-    </w:p>
-    <w:p>
-      <w:pPr>
-        <w:rPr>
-          <w:rFonts w:ascii="Century" w:hAnsi="Century"/>
-          <w:sz w:val="16"/>
-          <w:szCs w:val="16"/>
-        </w:rPr>
-      </w:pPr>
-      <w:r>
-        <w:rPr>
-          <w:rFonts w:ascii="Century" w:hAnsi="Century"/>
-          <w:sz w:val="16"/>
-          <w:szCs w:val="16"/>
-        </w:rPr>
-        <w:t>{tr1Date}</w:t>
-      </w:r>
-      <w:r>
-        <w:rPr>
-          <w:rFonts w:ascii="Century" w:hAnsi="Century"/>
-          <w:sz w:val="16"/>
-          <w:szCs w:val="16"/>
-        </w:rPr>
-        <w:tab/>
-      </w:r>
-      <w:r>
-        <w:rPr>
-          <w:rFonts w:ascii="Century" w:hAnsi="Century"/>
-          <w:sz w:val="16"/>
-          <w:szCs w:val="16"/>
-        </w:rPr>
-        <w:tab/>
-        <w:t>{tr1Kind}</w:t>
-      </w:r>
-      <w:r>
-        <w:rPr>
-          <w:rFonts w:ascii="Century" w:hAnsi="Century"/>
-          <w:sz w:val="16"/>
-          <w:szCs w:val="16"/>
-        </w:rPr>
-        <w:tab/>
-      </w:r>
-      <w:r>
-        <w:rPr>
-          <w:rFonts w:ascii="Century" w:hAnsi="Century"/>
-          <w:sz w:val="16"/>
-          <w:szCs w:val="16"/>
-        </w:rPr>
-        <w:tab/>
-        <w:t>{tr1Score}</w:t>
-      </w:r>
-      <w:r>
-        <w:rPr>
-          <w:rFonts w:ascii="Century" w:hAnsi="Century"/>
-          <w:sz w:val="16"/>
-          <w:szCs w:val="16"/>
-        </w:rPr>
-        <w:tab/>
-      </w:r>
-      <w:r>
-        <w:rPr>
-          <w:rFonts w:ascii="Century" w:hAnsi="Century"/>
-          <w:sz w:val="16"/>
-          <w:szCs w:val="16"/>
-        </w:rPr>
-        <w:tab/>
-        <w:t>{tr1Rank}</w:t>
-      </w:r>
-    </w:p>
-    <w:p>
-      <w:pPr>
-        <w:rPr>
-          <w:rFonts w:ascii="Century" w:hAnsi="Century"/>
-          <w:sz w:val="16"/>
-          <w:szCs w:val="16"/>
-        </w:rPr>
-      </w:pPr>
-      <w:r>
-        <w:rPr>
-          <w:rFonts w:ascii="Century" w:hAnsi="Century"/>
-          <w:sz w:val="16"/>
-          <w:szCs w:val="16"/>
-        </w:rPr>
-        <w:t>{tr2Date}</w:t>
-      </w:r>
-      <w:r>
-        <w:rPr>
-          <w:rFonts w:ascii="Century" w:hAnsi="Century"/>
-          <w:sz w:val="16"/>
-          <w:szCs w:val="16"/>
-        </w:rPr>
-        <w:tab/>
-      </w:r>
-      <w:r>
-        <w:rPr>
-          <w:rFonts w:ascii="Century" w:hAnsi="Century"/>
-          <w:sz w:val="16"/>
-          <w:szCs w:val="16"/>
-        </w:rPr>
-        <w:tab/>
-        <w:t>{tr2Kind}</w:t>
-      </w:r>
-      <w:r>
-        <w:rPr>
-          <w:rFonts w:ascii="Century" w:hAnsi="Century"/>
-          <w:sz w:val="16"/>
-          <w:szCs w:val="16"/>
-        </w:rPr>
-        <w:tab/>
-      </w:r>
-      <w:r>
-        <w:rPr>
-          <w:rFonts w:ascii="Century" w:hAnsi="Century"/>
-          <w:sz w:val="16"/>
-          <w:szCs w:val="16"/>
-        </w:rPr>
-        <w:tab/>
-        <w:t>{tr2Score}</w:t>
-      </w:r>
-      <w:r>
-        <w:rPr>
-          <w:rFonts w:ascii="Century" w:hAnsi="Century"/>
-          <w:sz w:val="16"/>
-          <w:szCs w:val="16"/>
-        </w:rPr>
-        <w:tab/>
-      </w:r>
-      <w:r>
-        <w:rPr>
-          <w:rFonts w:ascii="Century" w:hAnsi="Century"/>
-          <w:sz w:val="16"/>
-          <w:szCs w:val="16"/>
-        </w:rPr>
-        <w:tab/>
-        <w:t>{tr2Rank}</w:t>
+          <w:u w:val="single"/>
+        </w:rPr>
+        <w:t xml:space="preserve">{tr0Date}</w:t>
+      </w:r>
+      <w:r>
+        <w:rPr>
+          <w:rFonts w:ascii="Century" w:hAnsi="Century"/>
+          <w:sz w:val="16"/>
+          <w:szCs w:val="16"/>
+        </w:rPr>
+        <w:tab/>
+      </w:r>
+      <w:r>
+        <w:rPr>
+          <w:rFonts w:ascii="Century" w:hAnsi="Century"/>
+          <w:sz w:val="16"/>
+          <w:szCs w:val="16"/>
+          <w:u w:val="single"/>
+        </w:rPr>
+        <w:t xml:space="preserve">{tr0Kind}</w:t>
+      </w:r>
+      <w:r>
+        <w:rPr>
+          <w:rFonts w:ascii="Century" w:hAnsi="Century"/>
+          <w:sz w:val="16"/>
+          <w:szCs w:val="16"/>
+        </w:rPr>
+        <w:tab/>
+      </w:r>
+      <w:r>
+        <w:rPr>
+          <w:rFonts w:ascii="Century" w:hAnsi="Century"/>
+          <w:sz w:val="16"/>
+          <w:szCs w:val="16"/>
+          <w:u w:val="single"/>
+        </w:rPr>
+        <w:t xml:space="preserve">{tr0Score}</w:t>
+      </w:r>
+      <w:r>
+        <w:rPr>
+          <w:rFonts w:ascii="Century" w:hAnsi="Century"/>
+          <w:sz w:val="16"/>
+          <w:szCs w:val="16"/>
+        </w:rPr>
+        <w:tab/>
+      </w:r>
+      <w:r>
+        <w:rPr>
+          <w:rFonts w:ascii="Century" w:hAnsi="Century"/>
+          <w:sz w:val="16"/>
+          <w:szCs w:val="16"/>
+          <w:u w:val="single"/>
+        </w:rPr>
+        <w:t xml:space="preserve">{tr0Rank}</w:t>
+      </w:r>
+    </w:p>
+    <w:p>
+      <w:pPr>
+        <w:rPr>
+          <w:rFonts w:ascii="Century" w:hAnsi="Century"/>
+          <w:sz w:val="16"/>
+          <w:szCs w:val="16"/>
+        </w:rPr>
+      </w:pPr>
+      <w:r>
+        <w:rPr>
+          <w:rFonts w:ascii="Century" w:hAnsi="Century"/>
+          <w:sz w:val="16"/>
+          <w:szCs w:val="16"/>
+          <w:u w:val="single"/>
+        </w:rPr>
+        <w:t xml:space="preserve">{tr1Date}</w:t>
+      </w:r>
+      <w:r>
+        <w:rPr>
+          <w:rFonts w:ascii="Century" w:hAnsi="Century"/>
+          <w:sz w:val="16"/>
+          <w:szCs w:val="16"/>
+        </w:rPr>
+        <w:tab/>
+      </w:r>
+      <w:r>
+        <w:rPr>
+          <w:rFonts w:ascii="Century" w:hAnsi="Century"/>
+          <w:sz w:val="16"/>
+          <w:szCs w:val="16"/>
+          <w:u w:val="single"/>
+        </w:rPr>
+        <w:t xml:space="preserve">{tr1Kind}</w:t>
+      </w:r>
+      <w:r>
+        <w:rPr>
+          <w:rFonts w:ascii="Century" w:hAnsi="Century"/>
+          <w:sz w:val="16"/>
+          <w:szCs w:val="16"/>
+        </w:rPr>
+        <w:tab/>
+      </w:r>
+      <w:r>
+        <w:rPr>
+          <w:rFonts w:ascii="Century" w:hAnsi="Century"/>
+          <w:sz w:val="16"/>
+          <w:szCs w:val="16"/>
+          <w:u w:val="single"/>
+        </w:rPr>
+        <w:t xml:space="preserve">{tr1Score}</w:t>
+      </w:r>
+      <w:r>
+        <w:rPr>
+          <w:rFonts w:ascii="Century" w:hAnsi="Century"/>
+          <w:sz w:val="16"/>
+          <w:szCs w:val="16"/>
+        </w:rPr>
+        <w:tab/>
+      </w:r>
+      <w:r>
+        <w:rPr>
+          <w:rFonts w:ascii="Century" w:hAnsi="Century"/>
+          <w:sz w:val="16"/>
+          <w:szCs w:val="16"/>
+          <w:u w:val="single"/>
+        </w:rPr>
+        <w:t xml:space="preserve">{tr1Rank}</w:t>
+      </w:r>
+    </w:p>
+    <w:p>
+      <w:pPr>
+        <w:rPr>
+          <w:rFonts w:ascii="Century" w:hAnsi="Century"/>
+          <w:sz w:val="16"/>
+          <w:szCs w:val="16"/>
+        </w:rPr>
+      </w:pPr>
+      <w:r>
+        <w:rPr>
+          <w:rFonts w:ascii="Century" w:hAnsi="Century"/>
+          <w:sz w:val="16"/>
+          <w:szCs w:val="16"/>
+          <w:u w:val="single"/>
+        </w:rPr>
+        <w:t xml:space="preserve">{tr2Date}</w:t>
+      </w:r>
+      <w:r>
+        <w:rPr>
+          <w:rFonts w:ascii="Century" w:hAnsi="Century"/>
+          <w:sz w:val="16"/>
+          <w:szCs w:val="16"/>
+        </w:rPr>
+        <w:tab/>
+      </w:r>
+      <w:r>
+        <w:rPr>
+          <w:rFonts w:ascii="Century" w:hAnsi="Century"/>
+          <w:sz w:val="16"/>
+          <w:szCs w:val="16"/>
+          <w:u w:val="single"/>
+        </w:rPr>
+        <w:t xml:space="preserve">{tr2Kind}</w:t>
+      </w:r>
+      <w:r>
+        <w:rPr>
+          <w:rFonts w:ascii="Century" w:hAnsi="Century"/>
+          <w:sz w:val="16"/>
+          <w:szCs w:val="16"/>
+        </w:rPr>
+        <w:tab/>
+      </w:r>
+      <w:r>
+        <w:rPr>
+          <w:rFonts w:ascii="Century" w:hAnsi="Century"/>
+          <w:sz w:val="16"/>
+          <w:szCs w:val="16"/>
+          <w:u w:val="single"/>
+        </w:rPr>
+        <w:t xml:space="preserve">{tr2Score}</w:t>
+      </w:r>
+      <w:r>
+        <w:rPr>
+          <w:rFonts w:ascii="Century" w:hAnsi="Century"/>
+          <w:sz w:val="16"/>
+          <w:szCs w:val="16"/>
+        </w:rPr>
+        <w:tab/>
+      </w:r>
+      <w:r>
+        <w:rPr>
+          <w:rFonts w:ascii="Century" w:hAnsi="Century"/>
+          <w:sz w:val="16"/>
+          <w:szCs w:val="16"/>
+          <w:u w:val="single"/>
+        </w:rPr>
+        <w:t xml:space="preserve">{tr2Rank}</w:t>
       </w:r>
     </w:p>
     <w:p>
@@ -2959,117 +4273,117 @@
           <w:sz w:val="16"/>
           <w:szCs w:val="16"/>
         </w:rPr>
-        <w:t>{igSports} Sports</w:t>
-      </w:r>
-      <w:r>
-        <w:rPr>
-          <w:rFonts w:ascii="Century" w:hAnsi="Century"/>
-          <w:sz w:val="16"/>
-          <w:szCs w:val="16"/>
-        </w:rPr>
-        <w:tab/>
-      </w:r>
-      <w:r>
-        <w:rPr>
-          <w:rFonts w:ascii="Century" w:hAnsi="Century"/>
-          <w:sz w:val="16"/>
-          <w:szCs w:val="16"/>
-        </w:rPr>
-        <w:tab/>
-      </w:r>
-      <w:r>
-        <w:rPr>
-          <w:rFonts w:ascii="Century" w:hAnsi="Century"/>
-          <w:sz w:val="16"/>
-          <w:szCs w:val="16"/>
-        </w:rPr>
-        <w:tab/>
-        <w:t>{igScience} Science</w:t>
-      </w:r>
-      <w:r>
-        <w:rPr>
-          <w:rFonts w:ascii="Century" w:hAnsi="Century"/>
-          <w:sz w:val="16"/>
-          <w:szCs w:val="16"/>
-        </w:rPr>
-        <w:tab/>
-      </w:r>
-      <w:r>
-        <w:rPr>
-          <w:rFonts w:ascii="Century" w:hAnsi="Century"/>
-          <w:sz w:val="16"/>
-          <w:szCs w:val="16"/>
-        </w:rPr>
-        <w:tab/>
-        <w:t>{igCivic} Civic Awareness/Service</w:t>
-      </w:r>
-    </w:p>
-    <w:p>
-      <w:pPr>
-        <w:rPr>
-          <w:rFonts w:ascii="Century" w:hAnsi="Century"/>
-          <w:sz w:val="16"/>
-          <w:szCs w:val="16"/>
-        </w:rPr>
-      </w:pPr>
-      <w:r>
-        <w:rPr>
-          <w:rFonts w:ascii="Century" w:hAnsi="Century"/>
-          <w:sz w:val="16"/>
-          <w:szCs w:val="16"/>
-        </w:rPr>
-        <w:t>{igArts} Arts</w:t>
-      </w:r>
-      <w:r>
-        <w:rPr>
-          <w:rFonts w:ascii="Century" w:hAnsi="Century"/>
-          <w:sz w:val="16"/>
-          <w:szCs w:val="16"/>
-        </w:rPr>
-        <w:tab/>
-      </w:r>
-      <w:r>
-        <w:rPr>
-          <w:rFonts w:ascii="Century" w:hAnsi="Century"/>
-          <w:sz w:val="16"/>
-          <w:szCs w:val="16"/>
-        </w:rPr>
-        <w:tab/>
-      </w:r>
-      <w:r>
-        <w:rPr>
-          <w:rFonts w:ascii="Century" w:hAnsi="Century"/>
-          <w:sz w:val="16"/>
-          <w:szCs w:val="16"/>
-        </w:rPr>
-        <w:tab/>
-        <w:t>{igSocial} Social Studies</w:t>
-      </w:r>
-      <w:r>
-        <w:rPr>
-          <w:rFonts w:ascii="Century" w:hAnsi="Century"/>
-          <w:sz w:val="16"/>
-          <w:szCs w:val="16"/>
-        </w:rPr>
-        <w:tab/>
-        <w:t>{igOther} Others</w:t>
-      </w:r>
-    </w:p>
-    <w:p>
-      <w:pPr>
-        <w:rPr>
-          <w:rFonts w:ascii="Century" w:hAnsi="Century"/>
-          <w:sz w:val="16"/>
-          <w:szCs w:val="16"/>
-        </w:rPr>
-      </w:pPr>
-      <w:r>
-        <w:rPr>
-          <w:rFonts w:ascii="Century" w:hAnsi="Century"/>
-          <w:sz w:val="16"/>
-          <w:szCs w:val="16"/>
-        </w:rPr>
-        <w:t>{igReligious} Religious</w:t>
+        <w:t xml:space="preserve">{igSports} Sports</w:t>
+      </w:r>
+      <w:r>
+        <w:rPr>
+          <w:rFonts w:ascii="Century" w:hAnsi="Century"/>
+          <w:sz w:val="16"/>
+          <w:szCs w:val="16"/>
+        </w:rPr>
+        <w:tab/>
+      </w:r>
+      <w:r>
+        <w:rPr>
+          <w:rFonts w:ascii="Century" w:hAnsi="Century"/>
+          <w:sz w:val="16"/>
+          <w:szCs w:val="16"/>
+        </w:rPr>
+        <w:tab/>
+      </w:r>
+      <w:r>
+        <w:rPr>
+          <w:rFonts w:ascii="Century" w:hAnsi="Century"/>
+          <w:sz w:val="16"/>
+          <w:szCs w:val="16"/>
+        </w:rPr>
+        <w:tab/>
+        <w:t xml:space="preserve">{igScience} Science</w:t>
+      </w:r>
+      <w:r>
+        <w:rPr>
+          <w:rFonts w:ascii="Century" w:hAnsi="Century"/>
+          <w:sz w:val="16"/>
+          <w:szCs w:val="16"/>
+        </w:rPr>
+        <w:tab/>
+      </w:r>
+      <w:r>
+        <w:rPr>
+          <w:rFonts w:ascii="Century" w:hAnsi="Century"/>
+          <w:sz w:val="16"/>
+          <w:szCs w:val="16"/>
+        </w:rPr>
+        <w:tab/>
+        <w:t xml:space="preserve">{igCivic} Civic Awareness/Service</w:t>
+      </w:r>
+    </w:p>
+    <w:p>
+      <w:pPr>
+        <w:rPr>
+          <w:rFonts w:ascii="Century" w:hAnsi="Century"/>
+          <w:sz w:val="16"/>
+          <w:szCs w:val="16"/>
+        </w:rPr>
+      </w:pPr>
+      <w:r>
+        <w:rPr>
+          <w:rFonts w:ascii="Century" w:hAnsi="Century"/>
+          <w:sz w:val="16"/>
+          <w:szCs w:val="16"/>
+        </w:rPr>
+        <w:t xml:space="preserve">{igArts} Arts</w:t>
+      </w:r>
+      <w:r>
+        <w:rPr>
+          <w:rFonts w:ascii="Century" w:hAnsi="Century"/>
+          <w:sz w:val="16"/>
+          <w:szCs w:val="16"/>
+        </w:rPr>
+        <w:tab/>
+      </w:r>
+      <w:r>
+        <w:rPr>
+          <w:rFonts w:ascii="Century" w:hAnsi="Century"/>
+          <w:sz w:val="16"/>
+          <w:szCs w:val="16"/>
+        </w:rPr>
+        <w:tab/>
+      </w:r>
+      <w:r>
+        <w:rPr>
+          <w:rFonts w:ascii="Century" w:hAnsi="Century"/>
+          <w:sz w:val="16"/>
+          <w:szCs w:val="16"/>
+        </w:rPr>
+        <w:tab/>
+        <w:t xml:space="preserve">{igSocial} Social Studies</w:t>
+      </w:r>
+      <w:r>
+        <w:rPr>
+          <w:rFonts w:ascii="Century" w:hAnsi="Century"/>
+          <w:sz w:val="16"/>
+          <w:szCs w:val="16"/>
+        </w:rPr>
+        <w:tab/>
+        <w:t xml:space="preserve">{igOther} Others</w:t>
+      </w:r>
+    </w:p>
+    <w:p>
+      <w:pPr>
+        <w:rPr>
+          <w:rFonts w:ascii="Century" w:hAnsi="Century"/>
+          <w:sz w:val="16"/>
+          <w:szCs w:val="16"/>
+        </w:rPr>
+      </w:pPr>
+      <w:r>
+        <w:rPr>
+          <w:rFonts w:ascii="Century" w:hAnsi="Century"/>
+          <w:sz w:val="16"/>
+          <w:szCs w:val="16"/>
+        </w:rPr>
+        <w:t xml:space="preserve">{igReligious} Religious</w:t>
       </w:r>
       <w:r>
         <w:rPr>
@@ -3115,16 +4429,26 @@
           <w:sz w:val="16"/>
           <w:szCs w:val="16"/>
         </w:rPr>
-        <w:t>Have you consulted/been sent to see the Guidance Counselor before?  {consultedYes} Yes</w:t>
-      </w:r>
-      <w:r>
-        <w:rPr>
-          <w:rFonts w:ascii="Century" w:hAnsi="Century"/>
-          <w:sz w:val="16"/>
-          <w:szCs w:val="16"/>
-        </w:rPr>
-        <w:tab/>
-        <w:t>{consultedNo} No</w:t>
+        <w:t xml:space="preserve">Have you consulted/been sent to see the Guidance Counselor before?  {consultedYes} </w:t>
+      </w:r>
+      <w:proofErr w:type="gramStart"/>
+      <w:r>
+        <w:rPr>
+          <w:rFonts w:ascii="Century" w:hAnsi="Century"/>
+          <w:sz w:val="16"/>
+          <w:szCs w:val="16"/>
+        </w:rPr>
+        <w:t>Yes</w:t>
+      </w:r>
+      <w:proofErr w:type="gramEnd"/>
+      <w:r>
+        <w:rPr>
+          <w:rFonts w:ascii="Century" w:hAnsi="Century"/>
+          <w:sz w:val="16"/>
+          <w:szCs w:val="16"/>
+        </w:rPr>
+        <w:tab/>
+        <w:t xml:space="preserve">{consultedNo} No</w:t>
       </w:r>
     </w:p>
     <w:p>
@@ -3158,8 +4482,9 @@
           <w:rFonts w:ascii="Century" w:hAnsi="Century"/>
           <w:sz w:val="16"/>
           <w:szCs w:val="16"/>
-        </w:rPr>
-        <w:t>{consultedReason}</w:t>
+          <w:u w:val="single"/>
+        </w:rPr>
+        <w:t xml:space="preserve">{consultedReason}</w:t>
       </w:r>
     </w:p>
     <w:p>
@@ -3211,7 +4536,7 @@
           <w:sz w:val="16"/>
           <w:szCs w:val="16"/>
         </w:rPr>
-        <w:t>{hnFamily} Family matters</w:t>
+        <w:t xml:space="preserve">{hnFamily} Family matters</w:t>
       </w:r>
       <w:r>
         <w:rPr>
@@ -3245,126 +4570,134 @@
           <w:sz w:val="16"/>
           <w:szCs w:val="16"/>
         </w:rPr>
-        <w:tab/>
-        <w:t xml:space="preserve"> {helpNeededOther}</w:t>
-      </w:r>
-    </w:p>
-    <w:p>
-      <w:pPr>
-        <w:rPr>
-          <w:rFonts w:ascii="Century" w:hAnsi="Century"/>
-          <w:sz w:val="16"/>
-          <w:szCs w:val="16"/>
-        </w:rPr>
-      </w:pPr>
-      <w:r>
-        <w:rPr>
-          <w:rFonts w:ascii="Century" w:hAnsi="Century"/>
-          <w:sz w:val="16"/>
-          <w:szCs w:val="16"/>
-        </w:rPr>
-        <w:t>{hnRelationship} Relationship problems</w:t>
-      </w:r>
-      <w:r>
-        <w:rPr>
-          <w:rFonts w:ascii="Century" w:hAnsi="Century"/>
-          <w:sz w:val="16"/>
-          <w:szCs w:val="16"/>
-        </w:rPr>
-        <w:tab/>
-        <w:t>{hnSelf} Self</w:t>
-      </w:r>
-      <w:r>
-        <w:rPr>
-          <w:rFonts w:ascii="Century" w:hAnsi="Century"/>
-          <w:sz w:val="16"/>
-          <w:szCs w:val="16"/>
-        </w:rPr>
-        <w:tab/>
-      </w:r>
-      <w:r>
-        <w:rPr>
-          <w:rFonts w:ascii="Century" w:hAnsi="Century"/>
-          <w:sz w:val="16"/>
-          <w:szCs w:val="16"/>
-        </w:rPr>
-        <w:tab/>
-      </w:r>
-      <w:r>
-        <w:rPr>
-          <w:rFonts w:ascii="Century" w:hAnsi="Century"/>
-          <w:sz w:val="16"/>
-          <w:szCs w:val="16"/>
-        </w:rPr>
-        <w:tab/>
-      </w:r>
-      <w:r>
-        <w:rPr>
-          <w:rFonts w:ascii="Century" w:hAnsi="Century"/>
-          <w:sz w:val="16"/>
-          <w:szCs w:val="16"/>
-        </w:rPr>
-        <w:tab/>
-      </w:r>
-    </w:p>
-    <w:p>
-      <w:pPr>
-        <w:rPr>
-          <w:rFonts w:ascii="Century" w:hAnsi="Century"/>
-          <w:sz w:val="16"/>
-          <w:szCs w:val="16"/>
-        </w:rPr>
-      </w:pPr>
-      <w:r>
-        <w:rPr>
-          <w:rFonts w:ascii="Century" w:hAnsi="Century"/>
-          <w:sz w:val="16"/>
-          <w:szCs w:val="16"/>
-        </w:rPr>
-        <w:t>{hnTeachers} Concerns with teachers</w:t>
-      </w:r>
-      <w:r>
-        <w:rPr>
-          <w:rFonts w:ascii="Century" w:hAnsi="Century"/>
-          <w:sz w:val="16"/>
-          <w:szCs w:val="16"/>
-        </w:rPr>
-        <w:tab/>
-        <w:t>{hnFinancial} Financial matters</w:t>
-      </w:r>
-    </w:p>
-    <w:p>
-      <w:pPr>
-        <w:rPr>
-          <w:rFonts w:ascii="Century" w:hAnsi="Century"/>
-          <w:sz w:val="16"/>
-          <w:szCs w:val="16"/>
-        </w:rPr>
-      </w:pPr>
-      <w:r>
-        <w:rPr>
-          <w:rFonts w:ascii="Century" w:hAnsi="Century"/>
-          <w:sz w:val="16"/>
-          <w:szCs w:val="16"/>
-        </w:rPr>
-        <w:t>{hnAcademic} Academic concerns</w:t>
-      </w:r>
-      <w:r>
-        <w:rPr>
-          <w:rFonts w:ascii="Century" w:hAnsi="Century"/>
-          <w:sz w:val="16"/>
-          <w:szCs w:val="16"/>
-        </w:rPr>
-        <w:tab/>
-      </w:r>
-      <w:r>
-        <w:rPr>
-          <w:rFonts w:ascii="Century" w:hAnsi="Century"/>
-          <w:sz w:val="16"/>
-          <w:szCs w:val="16"/>
-        </w:rPr>
-        <w:tab/>
-        <w:t>{hnHealth} Health concerns</w:t>
+        <w:t xml:space="preserve"> </w:t>
+      </w:r>
+      <w:r>
+        <w:rPr>
+          <w:rFonts w:ascii="Century" w:hAnsi="Century"/>
+          <w:sz w:val="16"/>
+          <w:szCs w:val="16"/>
+          <w:u w:val="single"/>
+        </w:rPr>
+        <w:t xml:space="preserve">{helpNeededOther}</w:t>
+      </w:r>
+    </w:p>
+    <w:p>
+      <w:pPr>
+        <w:rPr>
+          <w:rFonts w:ascii="Century" w:hAnsi="Century"/>
+          <w:sz w:val="16"/>
+          <w:szCs w:val="16"/>
+        </w:rPr>
+      </w:pPr>
+      <w:r>
+        <w:rPr>
+          <w:rFonts w:ascii="Century" w:hAnsi="Century"/>
+          <w:sz w:val="16"/>
+          <w:szCs w:val="16"/>
+        </w:rPr>
+        <w:t xml:space="preserve">{hnRelationship} Relationship problems</w:t>
+      </w:r>
+      <w:r>
+        <w:rPr>
+          <w:rFonts w:ascii="Century" w:hAnsi="Century"/>
+          <w:sz w:val="16"/>
+          <w:szCs w:val="16"/>
+        </w:rPr>
+        <w:tab/>
+        <w:t xml:space="preserve">{hnSelf} Self</w:t>
+      </w:r>
+      <w:r>
+        <w:rPr>
+          <w:rFonts w:ascii="Century" w:hAnsi="Century"/>
+          <w:sz w:val="16"/>
+          <w:szCs w:val="16"/>
+        </w:rPr>
+        <w:tab/>
+      </w:r>
+      <w:r>
+        <w:rPr>
+          <w:rFonts w:ascii="Century" w:hAnsi="Century"/>
+          <w:sz w:val="16"/>
+          <w:szCs w:val="16"/>
+        </w:rPr>
+        <w:tab/>
+      </w:r>
+      <w:r>
+        <w:rPr>
+          <w:rFonts w:ascii="Century" w:hAnsi="Century"/>
+          <w:sz w:val="16"/>
+          <w:szCs w:val="16"/>
+        </w:rPr>
+        <w:tab/>
+      </w:r>
+      <w:r>
+        <w:rPr>
+          <w:rFonts w:ascii="Century" w:hAnsi="Century"/>
+          <w:sz w:val="16"/>
+          <w:szCs w:val="16"/>
+        </w:rPr>
+        <w:tab/>
+      </w:r>
+    </w:p>
+    <w:p>
+      <w:pPr>
+        <w:rPr>
+          <w:rFonts w:ascii="Century" w:hAnsi="Century"/>
+          <w:sz w:val="16"/>
+          <w:szCs w:val="16"/>
+        </w:rPr>
+      </w:pPr>
+      <w:r>
+        <w:rPr>
+          <w:rFonts w:ascii="Century" w:hAnsi="Century"/>
+          <w:sz w:val="16"/>
+          <w:szCs w:val="16"/>
+        </w:rPr>
+        <w:t xml:space="preserve">{hnTeachers} Concerns with teachers</w:t>
+      </w:r>
+      <w:r>
+        <w:rPr>
+          <w:rFonts w:ascii="Century" w:hAnsi="Century"/>
+          <w:sz w:val="16"/>
+          <w:szCs w:val="16"/>
+        </w:rPr>
+        <w:tab/>
+        <w:t xml:space="preserve">{hnFinancial} Financial matters</w:t>
+      </w:r>
+    </w:p>
+    <w:p>
+      <w:pPr>
+        <w:rPr>
+          <w:rFonts w:ascii="Century" w:hAnsi="Century"/>
+          <w:sz w:val="16"/>
+          <w:szCs w:val="16"/>
+        </w:rPr>
+      </w:pPr>
+      <w:r>
+        <w:rPr>
+          <w:rFonts w:ascii="Century" w:hAnsi="Century"/>
+          <w:sz w:val="16"/>
+          <w:szCs w:val="16"/>
+        </w:rPr>
+        <w:t xml:space="preserve">{hnAcademic} Academic concerns</w:t>
+      </w:r>
+      <w:r>
+        <w:rPr>
+          <w:rFonts w:ascii="Century" w:hAnsi="Century"/>
+          <w:sz w:val="16"/>
+          <w:szCs w:val="16"/>
+        </w:rPr>
+        <w:tab/>
+      </w:r>
+      <w:r>
+        <w:rPr>
+          <w:rFonts w:ascii="Century" w:hAnsi="Century"/>
+          <w:sz w:val="16"/>
+          <w:szCs w:val="16"/>
+        </w:rPr>
+        <w:tab/>
+        <w:t xml:space="preserve">{hnHealth} Health concerns</w:t>
       </w:r>
       <w:r>
         <w:rPr>
@@ -3439,23 +4772,15 @@
           <w:sz w:val="16"/>
           <w:szCs w:val="16"/>
         </w:rPr>
-        <w:t xml:space="preserve">                                                                                         </w:t>
-      </w:r>
-      <w:r>
-        <w:rPr>
-          <w:rFonts w:ascii="Century" w:hAnsi="Century"/>
-          <w:sz w:val="16"/>
-          <w:szCs w:val="16"/>
-        </w:rPr>
-        <w:t xml:space="preserve">                                                                       </w:t>
-      </w:r>
-      <w:r>
-        <w:rPr>
-          <w:rFonts w:ascii="Century" w:hAnsi="Century"/>
-          <w:sz w:val="16"/>
-          <w:szCs w:val="16"/>
-        </w:rPr>
-        <w:t xml:space="preserve"> {%studentSignature}</w:t>
+        <w:t xml:space="preserve">                                                                                          </w:t>
+      </w:r>
+      <w:r>
+        <w:rPr>
+          <w:rFonts w:ascii="Century" w:hAnsi="Century"/>
+          <w:sz w:val="16"/>
+          <w:szCs w:val="16"/>
+        </w:rPr>
+        <w:t xml:space="preserve">{%studentSignature}</w:t>
       </w:r>
     </w:p>
     <w:p>
@@ -3472,83 +4797,42 @@
           <w:rFonts w:ascii="Century" w:hAnsi="Century"/>
           <w:sz w:val="16"/>
           <w:szCs w:val="16"/>
-        </w:rPr>
-        <w:t xml:space="preserve">         </w:t>
-      </w:r>
-      <w:r>
-        <w:rPr>
-          <w:rFonts w:ascii="Century" w:hAnsi="Century"/>
-          <w:sz w:val="16"/>
-          <w:szCs w:val="16"/>
-        </w:rPr>
-        <w:t>{</w:t>
-      </w:r>
-      <w:proofErr w:type="spellStart"/>
-      <w:r>
-        <w:rPr>
-          <w:rFonts w:ascii="Century" w:hAnsi="Century"/>
-          <w:sz w:val="16"/>
-          <w:szCs w:val="16"/>
-        </w:rPr>
-        <w:t>studentPrintedName</w:t>
-      </w:r>
-      <w:proofErr w:type="spellEnd"/>
-      <w:r>
-        <w:rPr>
-          <w:rFonts w:ascii="Century" w:hAnsi="Century"/>
-          <w:sz w:val="16"/>
-          <w:szCs w:val="16"/>
-        </w:rPr>
-        <w:t xml:space="preserve">}                                     </w:t>
-      </w:r>
-      <w:r>
-        <w:rPr>
-          <w:rFonts w:ascii="Century" w:hAnsi="Century"/>
-          <w:sz w:val="16"/>
-          <w:szCs w:val="16"/>
-        </w:rPr>
-        <w:t xml:space="preserve">                                              </w:t>
-      </w:r>
-      <w:r>
-        <w:rPr>
-          <w:rFonts w:ascii="Century" w:hAnsi="Century"/>
-          <w:sz w:val="16"/>
-          <w:szCs w:val="16"/>
-        </w:rPr>
-        <w:t xml:space="preserve">   ________________________________</w:t>
-      </w:r>
-    </w:p>
-    <w:p>
-      <w:pPr>
-        <w:rPr>
-          <w:rFonts w:ascii="Century" w:hAnsi="Century"/>
-          <w:sz w:val="16"/>
-          <w:szCs w:val="16"/>
-        </w:rPr>
-      </w:pPr>
-      <w:r>
-        <w:rPr>
-          <w:rFonts w:ascii="Century" w:hAnsi="Century"/>
-          <w:sz w:val="16"/>
-          <w:szCs w:val="16"/>
-        </w:rPr>
-        <w:t xml:space="preserve">                        Student’s Printed Name                                    </w:t>
-      </w:r>
-      <w:r>
-        <w:rPr>
-          <w:rFonts w:ascii="Century" w:hAnsi="Century"/>
-          <w:sz w:val="16"/>
-          <w:szCs w:val="16"/>
-        </w:rPr>
-        <w:t xml:space="preserve">                                        </w:t>
-      </w:r>
-      <w:r>
-        <w:rPr>
-          <w:rFonts w:ascii="Century" w:hAnsi="Century"/>
-          <w:sz w:val="16"/>
-          <w:szCs w:val="16"/>
-        </w:rPr>
-        <w:t xml:space="preserve">                      Student’s Signature</w:t>
+          <w:u w:val="single"/>
+        </w:rPr>
+        <w:t xml:space="preserve">{studentPrintedName}</w:t>
+      </w:r>
+      <w:r>
+        <w:rPr>
+          <w:rFonts w:ascii="Century" w:hAnsi="Century"/>
+          <w:sz w:val="16"/>
+          <w:szCs w:val="16"/>
+        </w:rPr>
+        <w:t xml:space="preserve">        </w:t>
+      </w:r>
+      <w:r>
+        <w:rPr>
+          <w:rFonts w:ascii="Century" w:hAnsi="Century"/>
+          <w:sz w:val="16"/>
+          <w:szCs w:val="16"/>
+        </w:rPr>
+        <w:t xml:space="preserve">_______________________________________</w:t>
+      </w:r>
+    </w:p>
+    <w:p>
+      <w:pPr>
+        <w:rPr>
+          <w:rFonts w:ascii="Century" w:hAnsi="Century"/>
+          <w:sz w:val="16"/>
+          <w:szCs w:val="16"/>
+        </w:rPr>
+      </w:pPr>
+      <w:r>
+        <w:rPr>
+          <w:rFonts w:ascii="Century" w:hAnsi="Century"/>
+          <w:sz w:val="16"/>
+          <w:szCs w:val="16"/>
+        </w:rPr>
+        <w:t xml:space="preserve">                        Student’s Printed Name                                                          Student’s Signature</w:t>
       </w:r>
     </w:p>
     <w:p>
@@ -3624,7 +4908,7 @@
           </mc:Choice>
           <mc:Fallback>
             <w:pict>
-              <v:line w14:anchorId="66EEC521" id="Straight Connector 1" o:spid="_x0000_s1026" style="position:absolute;z-index:251664384;visibility:visible;mso-wrap-style:square;mso-wrap-distance-left:9pt;mso-wrap-distance-top:0;mso-wrap-distance-right:9pt;mso-wrap-distance-bottom:0;mso-position-horizontal:absolute;mso-position-horizontal-relative:text;mso-position-vertical:absolute;mso-position-vertical-relative:text" from="5.9pt,8.05pt" to="547.6pt,8.05pt" o:gfxdata="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" strokecolor="black [3213]" strokeweight=".5pt">
+              <v:line w14:anchorId="3F418ECE" id="Straight Connector 1" o:spid="_x0000_s1026" style="position:absolute;z-index:251664384;visibility:visible;mso-wrap-style:square;mso-wrap-distance-left:9pt;mso-wrap-distance-top:0;mso-wrap-distance-right:9pt;mso-wrap-distance-bottom:0;mso-position-horizontal:absolute;mso-position-horizontal-relative:text;mso-position-vertical:absolute;mso-position-vertical-relative:text" from="5.9pt,8.05pt" to="547.6pt,8.05pt" o:gfxdata="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" strokecolor="black [3213]" strokeweight=".5pt">
                 <v:stroke dashstyle="dash" joinstyle="miter"/>
               </v:line>
             </w:pict>
@@ -4079,8 +5363,8 @@
       <w:tblPr>
         <w:tblStyle w:val="TableGrid"/>
         <w:tblW w:w="0" w:type="auto"/>
+        <w:tblLayout w:type="fixed"/>
         <w:tblInd w:w="360" w:type="dxa"/>
-        <w:tblLayout w:type="fixed"/>
         <w:tblLook w:val="04A0" w:firstRow="1" w:lastRow="0" w:firstColumn="1" w:lastColumn="0" w:noHBand="0" w:noVBand="1"/>
       </w:tblPr>
       <w:tblGrid>
@@ -4107,7 +5391,15 @@
                 <w:sz w:val="16"/>
                 <w:szCs w:val="16"/>
               </w:rPr>
-              <w:t xml:space="preserve">                                                                                          {%studentSignature}</w:t>
+              <w:t xml:space="preserve">                                                                                          </w:t>
+            </w:r>
+            <w:r>
+              <w:rPr>
+                <w:rFonts w:ascii="Century" w:hAnsi="Century"/>
+                <w:sz w:val="16"/>
+                <w:szCs w:val="16"/>
+              </w:rPr>
+              <w:t xml:space="preserve">{%studentSignature}</w:t>
             </w:r>
           </w:p>
           <w:p>
@@ -4123,8 +5415,25 @@
                 <w:rFonts w:ascii="Century" w:hAnsi="Century"/>
                 <w:sz w:val="14"/>
                 <w:szCs w:val="14"/>
-              </w:rPr>
-              <w:t>{studentPrintedName}                                        ________________________________</w:t>
+                <w:u w:val="single"/>
+              </w:rPr>
+              <w:t xml:space="preserve">{studentPrintedName}</w:t>
+            </w:r>
+            <w:r>
+              <w:rPr>
+                <w:rFonts w:ascii="Century" w:hAnsi="Century"/>
+                <w:sz w:val="14"/>
+                <w:szCs w:val="14"/>
+              </w:rPr>
+              <w:t xml:space="preserve">        </w:t>
+            </w:r>
+            <w:r>
+              <w:rPr>
+                <w:rFonts w:ascii="Century" w:hAnsi="Century"/>
+                <w:sz w:val="14"/>
+                <w:szCs w:val="14"/>
+              </w:rPr>
+              <w:t xml:space="preserve">_______________________________________</w:t>
             </w:r>
           </w:p>
           <w:p>
@@ -4168,58 +5477,16 @@
                 <w:sz w:val="14"/>
                 <w:szCs w:val="14"/>
               </w:rPr>
-              <w:t>Date Signed: {dateAcknowledged}</w:t>
+              <w:t xml:space="preserve">Date Signed: </w:t>
             </w:r>
-          </w:p>
-          <w:p/>
-          <w:p>
             <w:r>
               <w:rPr>
                 <w:rFonts w:ascii="Century" w:hAnsi="Century"/>
-                <w:sz w:val="16"/>
-                <w:szCs w:val="16"/>
-              </w:rPr>
-              <w:t>Attested by:</w:t>
-            </w:r>
-          </w:p>
-          <w:p>
-            <w:r>
-              <w:rPr>
-                <w:rFonts w:ascii="Century" w:hAnsi="Century"/>
-                <w:sz w:val="16"/>
-                <w:szCs w:val="16"/>
-              </w:rPr>
-              <w:t>{%counselorSignature}</w:t>
-            </w:r>
-          </w:p>
-          <w:p>
-            <w:r>
-              <w:rPr>
-                <w:rFonts w:ascii="Century" w:hAnsi="Century"/>
-                <w:sz w:val="16"/>
-                <w:szCs w:val="16"/>
-              </w:rPr>
-              <w:t>____________________________________________________</w:t>
-            </w:r>
-          </w:p>
-          <w:p>
-            <w:r>
-              <w:rPr>
-                <w:rFonts w:ascii="Century" w:hAnsi="Century"/>
-                <w:sz w:val="16"/>
-                <w:szCs w:val="16"/>
-              </w:rPr>
-              <w:t>{counselorPrintedName}</w:t>
-            </w:r>
-          </w:p>
-          <w:p>
-            <w:r>
-              <w:rPr>
-                <w:rFonts w:ascii="Century" w:hAnsi="Century"/>
-                <w:sz w:val="16"/>
-                <w:szCs w:val="16"/>
-              </w:rPr>
-              <w:t>Guidance Counselor's Signature over Printed Name</w:t>
+                <w:sz w:val="14"/>
+                <w:szCs w:val="14"/>
+                <w:u w:val="single"/>
+              </w:rPr>
+              <w:t xml:space="preserve">{dateAcknowledged}</w:t>
             </w:r>
           </w:p>
           <w:p>
@@ -4236,13 +5503,68 @@
       </w:tr>
     </w:tbl>
     <w:p>
-      <w:pPr>
-        <w:jc w:val="both"/>
-        <w:rPr>
-          <w:sz w:val="20"/>
-          <w:szCs w:val="20"/>
-        </w:rPr>
-      </w:pPr>
+      <w:r>
+        <w:rPr>
+          <w:rFonts w:ascii="Century" w:hAnsi="Century"/>
+          <w:sz w:val="16"/>
+          <w:szCs w:val="16"/>
+        </w:rPr>
+        <w:t xml:space="preserve">Attested by:</w:t>
+      </w:r>
+    </w:p>
+    <w:p>
+      <w:r>
+        <w:rPr>
+          <w:rFonts w:ascii="Century" w:hAnsi="Century"/>
+          <w:sz w:val="16"/>
+          <w:szCs w:val="16"/>
+        </w:rPr>
+        <w:t xml:space="preserve">                                                                                          </w:t>
+      </w:r>
+      <w:r>
+        <w:rPr>
+          <w:rFonts w:ascii="Century" w:hAnsi="Century"/>
+          <w:sz w:val="16"/>
+          <w:szCs w:val="16"/>
+        </w:rPr>
+        <w:t xml:space="preserve">{%counselorSignature}</w:t>
+      </w:r>
+    </w:p>
+    <w:p>
+      <w:r>
+        <w:rPr>
+          <w:rFonts w:ascii="Century" w:hAnsi="Century"/>
+          <w:sz w:val="16"/>
+          <w:szCs w:val="16"/>
+        </w:rPr>
+        <w:t xml:space="preserve">{counselorPrintedName}</w:t>
+      </w:r>
+      <w:r>
+        <w:rPr>
+          <w:rFonts w:ascii="Century" w:hAnsi="Century"/>
+          <w:sz w:val="16"/>
+          <w:szCs w:val="16"/>
+        </w:rPr>
+        <w:t xml:space="preserve">        </w:t>
+      </w:r>
+      <w:r>
+        <w:rPr>
+          <w:rFonts w:ascii="Century" w:hAnsi="Century"/>
+          <w:sz w:val="16"/>
+          <w:szCs w:val="16"/>
+        </w:rPr>
+        <w:t xml:space="preserve">____________________________________________________</w:t>
+      </w:r>
+    </w:p>
+    <w:p>
+      <w:r>
+        <w:rPr>
+          <w:rFonts w:ascii="Century" w:hAnsi="Century"/>
+          <w:sz w:val="16"/>
+          <w:szCs w:val="16"/>
+        </w:rPr>
+        <w:t xml:space="preserve">Guidance Counselor's Signature over Printed Name</w:t>
+      </w:r>
     </w:p>
     <w:sectPr>
       <w:headerReference w:type="default" r:id="rId8"/>
@@ -4650,8 +5972,21 @@
               <w:szCs w:val="28"/>
               <w:lang w:val="en-US"/>
             </w:rPr>
-            <w:t>GUIDANCE AND COUNSELING  SECTION</w:t>
+            <w:t xml:space="preserve">GUIDANCE AND </w:t>
           </w:r>
+          <w:proofErr w:type="gramStart"/>
+          <w:r>
+            <w:rPr>
+              <w:rFonts w:ascii="Century" w:hAnsi="Century" w:cs="Century"/>
+              <w:b/>
+              <w:bCs/>
+              <w:sz w:val="20"/>
+              <w:szCs w:val="28"/>
+              <w:lang w:val="en-US"/>
+            </w:rPr>
+            <w:t>COUNSELING  SECTION</w:t>
+          </w:r>
+          <w:proofErr w:type="gramEnd"/>
         </w:p>
       </w:tc>
       <w:tc>

</xml_diff>

<commit_message>
feat: implement student profile management, inventory tracking, and feedback survey system
</commit_message>
<xml_diff>
--- a/backend/templates/individual-inventory-template.docx
+++ b/backend/templates/individual-inventory-template.docx
@@ -361,7 +361,7 @@
                               <w:rPr>
                                 <w:rFonts w:ascii="Century" w:hAnsi="Century"/>
                               </w:rPr>
-                              <w:t>1x1 Picture</w:t>
+                              <w:t xml:space="preserve">{%studentAvatar}</w:t>
                             </w:r>
                           </w:p>
                         </w:txbxContent>
@@ -391,7 +391,7 @@
                         <w:rPr>
                           <w:rFonts w:ascii="Century" w:hAnsi="Century"/>
                         </w:rPr>
-                        <w:t>1x1 Picture</w:t>
+                        <w:t xml:space="preserve">{%studentAvatar}</w:t>
                       </w:r>
                     </w:p>
                   </w:txbxContent>
@@ -3841,6 +3841,7 @@
     </w:p>
     <w:p>
       <w:pPr>
+        <w:pageBreakBefore/>
         <w:jc w:val="center"/>
         <w:rPr>
           <w:rFonts w:ascii="Century" w:hAnsi="Century"/>

</xml_diff>